<commit_message>
Day 13 complete bitch !
</commit_message>
<xml_diff>
--- a/Questions.docx
+++ b/Questions.docx
@@ -235,7 +235,24 @@
           <w:szCs w:val="24"/>
         </w:rPr>
         <w:br/>
-        <w:t xml:space="preserve">stringTimes("Hi", 2) </w:t>
+      </w:r>
+      <w:proofErr w:type="spellStart"/>
+      <w:r>
+        <w:rPr>
+          <w:rFonts w:ascii="Verdana" w:hAnsi="Verdana"/>
+          <w:color w:val="000000"/>
+          <w:szCs w:val="24"/>
+        </w:rPr>
+        <w:t>stringTimes</w:t>
+      </w:r>
+      <w:proofErr w:type="spellEnd"/>
+      <w:r>
+        <w:rPr>
+          <w:rFonts w:ascii="Verdana" w:hAnsi="Verdana"/>
+          <w:color w:val="000000"/>
+          <w:szCs w:val="24"/>
+        </w:rPr>
+        <w:t xml:space="preserve">("Hi", 2) </w:t>
       </w:r>
       <w:r>
         <w:rPr>
@@ -251,7 +268,25 @@
           <w:color w:val="000000"/>
           <w:szCs w:val="24"/>
         </w:rPr>
-        <w:t xml:space="preserve"> "HiHi"</w:t>
+        <w:t xml:space="preserve"> "</w:t>
+      </w:r>
+      <w:proofErr w:type="spellStart"/>
+      <w:r>
+        <w:rPr>
+          <w:rFonts w:ascii="Verdana" w:hAnsi="Verdana"/>
+          <w:color w:val="000000"/>
+          <w:szCs w:val="24"/>
+        </w:rPr>
+        <w:t>HiHi</w:t>
+      </w:r>
+      <w:proofErr w:type="spellEnd"/>
+      <w:r>
+        <w:rPr>
+          <w:rFonts w:ascii="Verdana" w:hAnsi="Verdana"/>
+          <w:color w:val="000000"/>
+          <w:szCs w:val="24"/>
+        </w:rPr>
+        <w:t>"</w:t>
       </w:r>
       <w:r>
         <w:rPr>
@@ -260,7 +295,24 @@
           <w:szCs w:val="24"/>
         </w:rPr>
         <w:br/>
-        <w:t xml:space="preserve">stringTimes("Hi", 3) </w:t>
+      </w:r>
+      <w:proofErr w:type="spellStart"/>
+      <w:r>
+        <w:rPr>
+          <w:rFonts w:ascii="Verdana" w:hAnsi="Verdana"/>
+          <w:color w:val="000000"/>
+          <w:szCs w:val="24"/>
+        </w:rPr>
+        <w:t>stringTimes</w:t>
+      </w:r>
+      <w:proofErr w:type="spellEnd"/>
+      <w:r>
+        <w:rPr>
+          <w:rFonts w:ascii="Verdana" w:hAnsi="Verdana"/>
+          <w:color w:val="000000"/>
+          <w:szCs w:val="24"/>
+        </w:rPr>
+        <w:t xml:space="preserve">("Hi", 3) </w:t>
       </w:r>
       <w:r>
         <w:rPr>
@@ -276,7 +328,25 @@
           <w:color w:val="000000"/>
           <w:szCs w:val="24"/>
         </w:rPr>
-        <w:t xml:space="preserve"> "HiHiHi"</w:t>
+        <w:t xml:space="preserve"> "</w:t>
+      </w:r>
+      <w:proofErr w:type="spellStart"/>
+      <w:r>
+        <w:rPr>
+          <w:rFonts w:ascii="Verdana" w:hAnsi="Verdana"/>
+          <w:color w:val="000000"/>
+          <w:szCs w:val="24"/>
+        </w:rPr>
+        <w:t>HiHiHi</w:t>
+      </w:r>
+      <w:proofErr w:type="spellEnd"/>
+      <w:r>
+        <w:rPr>
+          <w:rFonts w:ascii="Verdana" w:hAnsi="Verdana"/>
+          <w:color w:val="000000"/>
+          <w:szCs w:val="24"/>
+        </w:rPr>
+        <w:t>"</w:t>
       </w:r>
       <w:r>
         <w:rPr>
@@ -285,7 +355,24 @@
           <w:szCs w:val="24"/>
         </w:rPr>
         <w:br/>
-        <w:t xml:space="preserve">stringTimes("Hi", 1) </w:t>
+      </w:r>
+      <w:proofErr w:type="spellStart"/>
+      <w:r>
+        <w:rPr>
+          <w:rFonts w:ascii="Verdana" w:hAnsi="Verdana"/>
+          <w:color w:val="000000"/>
+          <w:szCs w:val="24"/>
+        </w:rPr>
+        <w:t>stringTimes</w:t>
+      </w:r>
+      <w:proofErr w:type="spellEnd"/>
+      <w:r>
+        <w:rPr>
+          <w:rFonts w:ascii="Verdana" w:hAnsi="Verdana"/>
+          <w:color w:val="000000"/>
+          <w:szCs w:val="24"/>
+        </w:rPr>
+        <w:t xml:space="preserve">("Hi", 1) </w:t>
       </w:r>
       <w:r>
         <w:rPr>
@@ -1004,7 +1091,27 @@
           <w:sz w:val="24"/>
           <w:szCs w:val="24"/>
         </w:rPr>
-        <w:t xml:space="preserve">Write a program to reverse the order of words in a string entered, for eg : I am Ram  to  Ram am I </w:t>
+        <w:t xml:space="preserve">Write a program to reverse the order of words in a string entered, for </w:t>
+      </w:r>
+      <w:proofErr w:type="spellStart"/>
+      <w:r>
+        <w:rPr>
+          <w:rFonts w:ascii="Verdana" w:hAnsi="Verdana"/>
+          <w:color w:val="000000"/>
+          <w:sz w:val="24"/>
+          <w:szCs w:val="24"/>
+        </w:rPr>
+        <w:t>eg</w:t>
+      </w:r>
+      <w:proofErr w:type="spellEnd"/>
+      <w:r>
+        <w:rPr>
+          <w:rFonts w:ascii="Verdana" w:hAnsi="Verdana"/>
+          <w:color w:val="000000"/>
+          <w:sz w:val="24"/>
+          <w:szCs w:val="24"/>
+        </w:rPr>
+        <w:t xml:space="preserve"> : I am Ram  to  Ram am I </w:t>
       </w:r>
     </w:p>
     <w:p>
@@ -1549,50 +1656,9 @@
           <w:sz w:val="24"/>
           <w:szCs w:val="24"/>
         </w:rPr>
-        <w:t>only even digits</w:t>
-      </w:r>
-      <w:r>
-        <w:rPr>
-          <w:rFonts w:ascii="Verdana" w:hAnsi="Verdana"/>
-          <w:color w:val="000000"/>
-          <w:sz w:val="24"/>
-          <w:szCs w:val="24"/>
-        </w:rPr>
-        <w:t>.</w:t>
-      </w:r>
-    </w:p>
-    <w:p>
-      <w:pPr>
-        <w:pStyle w:val="max2"/>
-        <w:numPr>
-          <w:ilvl w:val="0"/>
-          <w:numId w:val="12"/>
-        </w:numPr>
-        <w:rPr>
-          <w:rFonts w:ascii="Verdana" w:hAnsi="Verdana"/>
-          <w:color w:val="000000"/>
-          <w:sz w:val="24"/>
-          <w:szCs w:val="24"/>
-        </w:rPr>
-      </w:pPr>
-      <w:r>
-        <w:rPr>
-          <w:rFonts w:ascii="Verdana" w:hAnsi="Verdana"/>
-          <w:color w:val="000000"/>
-          <w:sz w:val="24"/>
-          <w:szCs w:val="24"/>
-        </w:rPr>
-        <w:t>Write a program t</w:t>
-      </w:r>
-      <w:r>
-        <w:rPr>
-          <w:rFonts w:ascii="Verdana" w:hAnsi="Verdana"/>
-          <w:color w:val="000000"/>
-          <w:sz w:val="24"/>
-          <w:szCs w:val="24"/>
-        </w:rPr>
-        <w:t xml:space="preserve">ake a number and process digits </w:t>
-      </w:r>
+        <w:t xml:space="preserve">only </w:t>
+      </w:r>
+      <w:proofErr w:type="spellStart"/>
       <w:r>
         <w:rPr>
           <w:rFonts w:ascii="Verdana" w:hAnsi="Verdana"/>
@@ -1602,79 +1668,9 @@
           <w:sz w:val="24"/>
           <w:szCs w:val="24"/>
         </w:rPr>
-        <w:t>until digit 5 is encountered</w:t>
-      </w:r>
-      <w:r>
-        <w:rPr>
-          <w:rFonts w:ascii="Verdana" w:hAnsi="Verdana"/>
-          <w:color w:val="000000"/>
-          <w:sz w:val="24"/>
-          <w:szCs w:val="24"/>
-        </w:rPr>
-        <w:t>, then stop</w:t>
-      </w:r>
-      <w:r>
-        <w:rPr>
-          <w:rFonts w:ascii="Verdana" w:hAnsi="Verdana"/>
-          <w:color w:val="000000"/>
-          <w:sz w:val="24"/>
-          <w:szCs w:val="24"/>
-        </w:rPr>
-        <w:t>.</w:t>
-      </w:r>
-    </w:p>
-    <w:p>
-      <w:pPr>
-        <w:pStyle w:val="max2"/>
-        <w:rPr>
-          <w:rFonts w:ascii="Verdana" w:hAnsi="Verdana"/>
-          <w:color w:val="000000"/>
-          <w:sz w:val="24"/>
-          <w:szCs w:val="24"/>
-        </w:rPr>
-      </w:pPr>
-      <w:r>
-        <w:rPr>
-          <w:rFonts w:ascii="Verdana" w:hAnsi="Verdana"/>
-          <w:color w:val="000000"/>
-          <w:sz w:val="24"/>
-          <w:szCs w:val="24"/>
-        </w:rPr>
-        <w:t>Day 08</w:t>
-      </w:r>
-      <w:r>
-        <w:rPr>
-          <w:rFonts w:ascii="Verdana" w:hAnsi="Verdana"/>
-          <w:color w:val="000000"/>
-          <w:sz w:val="24"/>
-          <w:szCs w:val="24"/>
-        </w:rPr>
-        <w:t>( stop condition value-based vs count-based )</w:t>
-      </w:r>
-    </w:p>
-    <w:p>
-      <w:pPr>
-        <w:pStyle w:val="max2"/>
-        <w:numPr>
-          <w:ilvl w:val="0"/>
-          <w:numId w:val="13"/>
-        </w:numPr>
-        <w:rPr>
-          <w:rFonts w:ascii="Verdana" w:hAnsi="Verdana"/>
-          <w:color w:val="000000"/>
-          <w:sz w:val="24"/>
-          <w:szCs w:val="24"/>
-        </w:rPr>
-      </w:pPr>
-      <w:r>
-        <w:rPr>
-          <w:rFonts w:ascii="Verdana" w:hAnsi="Verdana"/>
-          <w:color w:val="000000"/>
-          <w:sz w:val="24"/>
-          <w:szCs w:val="24"/>
-        </w:rPr>
-        <w:t xml:space="preserve">Take a number and print digits </w:t>
-      </w:r>
+        <w:t>even</w:t>
+      </w:r>
+      <w:proofErr w:type="spellEnd"/>
       <w:r>
         <w:rPr>
           <w:rFonts w:ascii="Verdana" w:hAnsi="Verdana"/>
@@ -1684,40 +1680,49 @@
           <w:sz w:val="24"/>
           <w:szCs w:val="24"/>
         </w:rPr>
-        <w:t>until you encounter an even digit</w:t>
-      </w:r>
-      <w:r>
-        <w:rPr>
-          <w:rFonts w:ascii="Verdana" w:hAnsi="Verdana"/>
-          <w:color w:val="000000"/>
-          <w:sz w:val="24"/>
-          <w:szCs w:val="24"/>
-        </w:rPr>
-        <w:t>, then stop.</w:t>
-      </w:r>
-    </w:p>
-    <w:p>
-      <w:pPr>
-        <w:pStyle w:val="max2"/>
-        <w:numPr>
-          <w:ilvl w:val="0"/>
-          <w:numId w:val="13"/>
-        </w:numPr>
-        <w:rPr>
-          <w:rFonts w:ascii="Verdana" w:hAnsi="Verdana"/>
-          <w:color w:val="000000"/>
-          <w:sz w:val="24"/>
-          <w:szCs w:val="24"/>
-        </w:rPr>
-      </w:pPr>
-      <w:r>
-        <w:rPr>
-          <w:rFonts w:ascii="Verdana" w:hAnsi="Verdana"/>
-          <w:color w:val="000000"/>
-          <w:sz w:val="24"/>
-          <w:szCs w:val="24"/>
-        </w:rPr>
-        <w:t xml:space="preserve">Take a number and print digits, but </w:t>
+        <w:t xml:space="preserve"> digits</w:t>
+      </w:r>
+      <w:r>
+        <w:rPr>
+          <w:rFonts w:ascii="Verdana" w:hAnsi="Verdana"/>
+          <w:color w:val="000000"/>
+          <w:sz w:val="24"/>
+          <w:szCs w:val="24"/>
+        </w:rPr>
+        <w:t>.</w:t>
+      </w:r>
+    </w:p>
+    <w:p>
+      <w:pPr>
+        <w:pStyle w:val="max2"/>
+        <w:numPr>
+          <w:ilvl w:val="0"/>
+          <w:numId w:val="12"/>
+        </w:numPr>
+        <w:rPr>
+          <w:rFonts w:ascii="Verdana" w:hAnsi="Verdana"/>
+          <w:color w:val="000000"/>
+          <w:sz w:val="24"/>
+          <w:szCs w:val="24"/>
+        </w:rPr>
+      </w:pPr>
+      <w:r>
+        <w:rPr>
+          <w:rFonts w:ascii="Verdana" w:hAnsi="Verdana"/>
+          <w:color w:val="000000"/>
+          <w:sz w:val="24"/>
+          <w:szCs w:val="24"/>
+        </w:rPr>
+        <w:t>Write a program t</w:t>
+      </w:r>
+      <w:r>
+        <w:rPr>
+          <w:rFonts w:ascii="Verdana" w:hAnsi="Verdana"/>
+          <w:color w:val="000000"/>
+          <w:sz w:val="24"/>
+          <w:szCs w:val="24"/>
+        </w:rPr>
+        <w:t xml:space="preserve">ake a number and process digits </w:t>
       </w:r>
       <w:r>
         <w:rPr>
@@ -1728,7 +1733,16 @@
           <w:sz w:val="24"/>
           <w:szCs w:val="24"/>
         </w:rPr>
-        <w:t>stop after printing exactly 3 digits</w:t>
+        <w:t>until digit 5 is encountered</w:t>
+      </w:r>
+      <w:r>
+        <w:rPr>
+          <w:rFonts w:ascii="Verdana" w:hAnsi="Verdana"/>
+          <w:color w:val="000000"/>
+          <w:sz w:val="24"/>
+          <w:szCs w:val="24"/>
+        </w:rPr>
+        <w:t>, then stop</w:t>
       </w:r>
       <w:r>
         <w:rPr>
@@ -1743,6 +1757,35 @@
     <w:p>
       <w:pPr>
         <w:pStyle w:val="max2"/>
+        <w:rPr>
+          <w:rFonts w:ascii="Verdana" w:hAnsi="Verdana"/>
+          <w:color w:val="000000"/>
+          <w:sz w:val="24"/>
+          <w:szCs w:val="24"/>
+        </w:rPr>
+      </w:pPr>
+      <w:r>
+        <w:rPr>
+          <w:rFonts w:ascii="Verdana" w:hAnsi="Verdana"/>
+          <w:color w:val="000000"/>
+          <w:sz w:val="24"/>
+          <w:szCs w:val="24"/>
+        </w:rPr>
+        <w:t>Day 08</w:t>
+      </w:r>
+      <w:r>
+        <w:rPr>
+          <w:rFonts w:ascii="Verdana" w:hAnsi="Verdana"/>
+          <w:color w:val="000000"/>
+          <w:sz w:val="24"/>
+          <w:szCs w:val="24"/>
+        </w:rPr>
+        <w:t>( stop condition value-based vs count-based )</w:t>
+      </w:r>
+    </w:p>
+    <w:p>
+      <w:pPr>
+        <w:pStyle w:val="max2"/>
         <w:numPr>
           <w:ilvl w:val="0"/>
           <w:numId w:val="13"/>
@@ -1761,55 +1804,7 @@
           <w:sz w:val="24"/>
           <w:szCs w:val="24"/>
         </w:rPr>
-        <w:t>Create an array of 5 integers and print all elements.</w:t>
-      </w:r>
-    </w:p>
-    <w:p>
-      <w:pPr>
-        <w:pStyle w:val="max2"/>
-        <w:numPr>
-          <w:ilvl w:val="0"/>
-          <w:numId w:val="13"/>
-        </w:numPr>
-        <w:rPr>
-          <w:rFonts w:ascii="Verdana" w:hAnsi="Verdana"/>
-          <w:color w:val="000000"/>
-          <w:sz w:val="24"/>
-          <w:szCs w:val="24"/>
-        </w:rPr>
-      </w:pPr>
-      <w:r>
-        <w:rPr>
-          <w:rFonts w:ascii="Verdana" w:hAnsi="Verdana"/>
-          <w:color w:val="000000"/>
-          <w:sz w:val="24"/>
-          <w:szCs w:val="24"/>
-        </w:rPr>
-        <w:t>Count how many numbers in the array are even.</w:t>
-      </w:r>
-    </w:p>
-    <w:p>
-      <w:pPr>
-        <w:pStyle w:val="max2"/>
-        <w:numPr>
-          <w:ilvl w:val="0"/>
-          <w:numId w:val="13"/>
-        </w:numPr>
-        <w:rPr>
-          <w:rFonts w:ascii="Verdana" w:hAnsi="Verdana"/>
-          <w:color w:val="000000"/>
-          <w:sz w:val="24"/>
-          <w:szCs w:val="24"/>
-        </w:rPr>
-      </w:pPr>
-      <w:r>
-        <w:rPr>
-          <w:rFonts w:ascii="Verdana" w:hAnsi="Verdana"/>
-          <w:color w:val="000000"/>
-          <w:sz w:val="24"/>
-          <w:szCs w:val="24"/>
-        </w:rPr>
-        <w:t xml:space="preserve">Find the </w:t>
+        <w:t xml:space="preserve">Take a number and print digits </w:t>
       </w:r>
       <w:r>
         <w:rPr>
@@ -1820,6 +1815,142 @@
           <w:sz w:val="24"/>
           <w:szCs w:val="24"/>
         </w:rPr>
+        <w:t>until you encounter an even digit</w:t>
+      </w:r>
+      <w:r>
+        <w:rPr>
+          <w:rFonts w:ascii="Verdana" w:hAnsi="Verdana"/>
+          <w:color w:val="000000"/>
+          <w:sz w:val="24"/>
+          <w:szCs w:val="24"/>
+        </w:rPr>
+        <w:t>, then stop.</w:t>
+      </w:r>
+    </w:p>
+    <w:p>
+      <w:pPr>
+        <w:pStyle w:val="max2"/>
+        <w:numPr>
+          <w:ilvl w:val="0"/>
+          <w:numId w:val="13"/>
+        </w:numPr>
+        <w:rPr>
+          <w:rFonts w:ascii="Verdana" w:hAnsi="Verdana"/>
+          <w:color w:val="000000"/>
+          <w:sz w:val="24"/>
+          <w:szCs w:val="24"/>
+        </w:rPr>
+      </w:pPr>
+      <w:r>
+        <w:rPr>
+          <w:rFonts w:ascii="Verdana" w:hAnsi="Verdana"/>
+          <w:color w:val="000000"/>
+          <w:sz w:val="24"/>
+          <w:szCs w:val="24"/>
+        </w:rPr>
+        <w:t xml:space="preserve">Take a number and print digits, but </w:t>
+      </w:r>
+      <w:r>
+        <w:rPr>
+          <w:rFonts w:ascii="Verdana" w:hAnsi="Verdana"/>
+          <w:b/>
+          <w:bCs/>
+          <w:color w:val="000000"/>
+          <w:sz w:val="24"/>
+          <w:szCs w:val="24"/>
+        </w:rPr>
+        <w:t>stop after printing exactly 3 digits</w:t>
+      </w:r>
+      <w:r>
+        <w:rPr>
+          <w:rFonts w:ascii="Verdana" w:hAnsi="Verdana"/>
+          <w:color w:val="000000"/>
+          <w:sz w:val="24"/>
+          <w:szCs w:val="24"/>
+        </w:rPr>
+        <w:t>.</w:t>
+      </w:r>
+    </w:p>
+    <w:p>
+      <w:pPr>
+        <w:pStyle w:val="max2"/>
+        <w:numPr>
+          <w:ilvl w:val="0"/>
+          <w:numId w:val="13"/>
+        </w:numPr>
+        <w:rPr>
+          <w:rFonts w:ascii="Verdana" w:hAnsi="Verdana"/>
+          <w:color w:val="000000"/>
+          <w:sz w:val="24"/>
+          <w:szCs w:val="24"/>
+        </w:rPr>
+      </w:pPr>
+      <w:r>
+        <w:rPr>
+          <w:rFonts w:ascii="Verdana" w:hAnsi="Verdana"/>
+          <w:color w:val="000000"/>
+          <w:sz w:val="24"/>
+          <w:szCs w:val="24"/>
+        </w:rPr>
+        <w:t>Create an array of 5 integers and print all elements.</w:t>
+      </w:r>
+    </w:p>
+    <w:p>
+      <w:pPr>
+        <w:pStyle w:val="max2"/>
+        <w:numPr>
+          <w:ilvl w:val="0"/>
+          <w:numId w:val="13"/>
+        </w:numPr>
+        <w:rPr>
+          <w:rFonts w:ascii="Verdana" w:hAnsi="Verdana"/>
+          <w:color w:val="000000"/>
+          <w:sz w:val="24"/>
+          <w:szCs w:val="24"/>
+        </w:rPr>
+      </w:pPr>
+      <w:r>
+        <w:rPr>
+          <w:rFonts w:ascii="Verdana" w:hAnsi="Verdana"/>
+          <w:color w:val="000000"/>
+          <w:sz w:val="24"/>
+          <w:szCs w:val="24"/>
+        </w:rPr>
+        <w:t>Count how many numbers in the array are even.</w:t>
+      </w:r>
+    </w:p>
+    <w:p>
+      <w:pPr>
+        <w:pStyle w:val="max2"/>
+        <w:numPr>
+          <w:ilvl w:val="0"/>
+          <w:numId w:val="13"/>
+        </w:numPr>
+        <w:rPr>
+          <w:rFonts w:ascii="Verdana" w:hAnsi="Verdana"/>
+          <w:color w:val="000000"/>
+          <w:sz w:val="24"/>
+          <w:szCs w:val="24"/>
+        </w:rPr>
+      </w:pPr>
+      <w:r>
+        <w:rPr>
+          <w:rFonts w:ascii="Verdana" w:hAnsi="Verdana"/>
+          <w:color w:val="000000"/>
+          <w:sz w:val="24"/>
+          <w:szCs w:val="24"/>
+        </w:rPr>
+        <w:t xml:space="preserve">Find the </w:t>
+      </w:r>
+      <w:r>
+        <w:rPr>
+          <w:rFonts w:ascii="Verdana" w:hAnsi="Verdana"/>
+          <w:b/>
+          <w:bCs/>
+          <w:color w:val="000000"/>
+          <w:sz w:val="24"/>
+          <w:szCs w:val="24"/>
+        </w:rPr>
         <w:t>largest number</w:t>
       </w:r>
       <w:r>
@@ -2083,7 +2214,27 @@
           <w:sz w:val="24"/>
           <w:szCs w:val="24"/>
         </w:rPr>
-        <w:t>(No Stringbuilder) (</w:t>
+        <w:t xml:space="preserve">(No </w:t>
+      </w:r>
+      <w:proofErr w:type="spellStart"/>
+      <w:r>
+        <w:rPr>
+          <w:rFonts w:ascii="Verdana" w:hAnsi="Verdana"/>
+          <w:color w:val="000000"/>
+          <w:sz w:val="24"/>
+          <w:szCs w:val="24"/>
+        </w:rPr>
+        <w:t>Stringbuilder</w:t>
+      </w:r>
+      <w:proofErr w:type="spellEnd"/>
+      <w:r>
+        <w:rPr>
+          <w:rFonts w:ascii="Verdana" w:hAnsi="Verdana"/>
+          <w:color w:val="000000"/>
+          <w:sz w:val="24"/>
+          <w:szCs w:val="24"/>
+        </w:rPr>
+        <w:t>) (</w:t>
       </w:r>
       <w:r>
         <w:rPr>
@@ -2331,7 +2482,27 @@
           <w:sz w:val="24"/>
           <w:szCs w:val="24"/>
         </w:rPr>
-        <w:t xml:space="preserve">Traverse an array.If </w:t>
+        <w:t xml:space="preserve">Traverse an </w:t>
+      </w:r>
+      <w:proofErr w:type="spellStart"/>
+      <w:r>
+        <w:rPr>
+          <w:rFonts w:ascii="Verdana" w:hAnsi="Verdana"/>
+          <w:color w:val="000000"/>
+          <w:sz w:val="24"/>
+          <w:szCs w:val="24"/>
+        </w:rPr>
+        <w:t>array.If</w:t>
+      </w:r>
+      <w:proofErr w:type="spellEnd"/>
+      <w:r>
+        <w:rPr>
+          <w:rFonts w:ascii="Verdana" w:hAnsi="Verdana"/>
+          <w:color w:val="000000"/>
+          <w:sz w:val="24"/>
+          <w:szCs w:val="24"/>
+        </w:rPr>
+        <w:t xml:space="preserve"> </w:t>
       </w:r>
       <w:r>
         <w:rPr>
@@ -2462,49 +2633,31 @@
           <w:sz w:val="24"/>
           <w:szCs w:val="24"/>
         </w:rPr>
-        <w:t xml:space="preserve">Day </w:t>
-      </w:r>
-      <w:r>
-        <w:rPr>
-          <w:rFonts w:ascii="Verdana" w:hAnsi="Verdana"/>
-          <w:color w:val="000000"/>
-          <w:sz w:val="24"/>
-          <w:szCs w:val="24"/>
-        </w:rPr>
-        <w:t>1</w:t>
-      </w:r>
-      <w:r>
-        <w:rPr>
-          <w:rFonts w:ascii="Verdana" w:hAnsi="Verdana"/>
-          <w:color w:val="000000"/>
-          <w:sz w:val="24"/>
-          <w:szCs w:val="24"/>
-        </w:rPr>
-        <w:t>1</w:t>
-      </w:r>
-    </w:p>
-    <w:p>
-      <w:pPr>
-        <w:pStyle w:val="max2"/>
-        <w:numPr>
-          <w:ilvl w:val="0"/>
-          <w:numId w:val="6"/>
-        </w:numPr>
-        <w:rPr>
-          <w:rFonts w:ascii="Verdana" w:hAnsi="Verdana"/>
-          <w:color w:val="000000"/>
-          <w:sz w:val="24"/>
-          <w:szCs w:val="24"/>
-        </w:rPr>
-      </w:pPr>
-      <w:r>
-        <w:rPr>
-          <w:rFonts w:ascii="Verdana" w:hAnsi="Verdana"/>
-          <w:color w:val="000000"/>
-          <w:sz w:val="24"/>
-          <w:szCs w:val="24"/>
-        </w:rPr>
-        <w:t xml:space="preserve">Take a sentence and reverse </w:t>
+        <w:t>Day 11</w:t>
+      </w:r>
+    </w:p>
+    <w:p>
+      <w:pPr>
+        <w:pStyle w:val="max2"/>
+        <w:numPr>
+          <w:ilvl w:val="0"/>
+          <w:numId w:val="16"/>
+        </w:numPr>
+        <w:rPr>
+          <w:rFonts w:ascii="Verdana" w:hAnsi="Verdana"/>
+          <w:color w:val="000000"/>
+          <w:sz w:val="24"/>
+          <w:szCs w:val="24"/>
+        </w:rPr>
+      </w:pPr>
+      <w:r>
+        <w:rPr>
+          <w:rFonts w:ascii="Verdana" w:hAnsi="Verdana"/>
+          <w:color w:val="000000"/>
+          <w:sz w:val="24"/>
+          <w:szCs w:val="24"/>
+        </w:rPr>
+        <w:t xml:space="preserve">Count how many times </w:t>
       </w:r>
       <w:r>
         <w:rPr>
@@ -2515,6 +2668,604 @@
           <w:sz w:val="24"/>
           <w:szCs w:val="24"/>
         </w:rPr>
+        <w:t>two same characters appear next to each other</w:t>
+      </w:r>
+      <w:r>
+        <w:rPr>
+          <w:rFonts w:ascii="Verdana" w:hAnsi="Verdana"/>
+          <w:color w:val="000000"/>
+          <w:sz w:val="24"/>
+          <w:szCs w:val="24"/>
+        </w:rPr>
+        <w:t xml:space="preserve"> in a string</w:t>
+      </w:r>
+      <w:r>
+        <w:rPr>
+          <w:rFonts w:ascii="Verdana" w:hAnsi="Verdana"/>
+          <w:color w:val="000000"/>
+          <w:sz w:val="24"/>
+          <w:szCs w:val="24"/>
+        </w:rPr>
+        <w:t>.</w:t>
+      </w:r>
+      <w:r>
+        <w:rPr>
+          <w:rFonts w:ascii="Verdana" w:hAnsi="Verdana"/>
+          <w:color w:val="000000"/>
+          <w:sz w:val="24"/>
+          <w:szCs w:val="24"/>
+        </w:rPr>
+        <w:t>(</w:t>
+      </w:r>
+      <w:r>
+        <w:rPr>
+          <w:rFonts w:asciiTheme="minorHAnsi" w:eastAsiaTheme="minorHAnsi" w:hAnsiTheme="minorHAnsi" w:cstheme="minorBidi"/>
+          <w:i/>
+          <w:iCs/>
+          <w:kern w:val="2"/>
+          <w:sz w:val="24"/>
+          <w:szCs w:val="21"/>
+          <w14:ligatures w14:val="standardContextual"/>
+        </w:rPr>
+        <w:t xml:space="preserve"> </w:t>
+      </w:r>
+      <w:r>
+        <w:rPr>
+          <w:rFonts w:ascii="Verdana" w:hAnsi="Verdana"/>
+          <w:i/>
+          <w:iCs/>
+          <w:color w:val="000000"/>
+          <w:sz w:val="24"/>
+          <w:szCs w:val="24"/>
+        </w:rPr>
+        <w:t>Index comparison, careful bounds.</w:t>
+      </w:r>
+      <w:r>
+        <w:rPr>
+          <w:rFonts w:ascii="Verdana" w:hAnsi="Verdana"/>
+          <w:i/>
+          <w:iCs/>
+          <w:color w:val="000000"/>
+          <w:sz w:val="24"/>
+          <w:szCs w:val="24"/>
+        </w:rPr>
+        <w:t>)</w:t>
+      </w:r>
+    </w:p>
+    <w:p>
+      <w:pPr>
+        <w:pStyle w:val="max2"/>
+        <w:numPr>
+          <w:ilvl w:val="0"/>
+          <w:numId w:val="16"/>
+        </w:numPr>
+        <w:rPr>
+          <w:rFonts w:ascii="Verdana" w:hAnsi="Verdana"/>
+          <w:color w:val="000000"/>
+          <w:sz w:val="24"/>
+          <w:szCs w:val="24"/>
+        </w:rPr>
+      </w:pPr>
+      <w:r>
+        <w:rPr>
+          <w:rFonts w:ascii="Verdana" w:hAnsi="Verdana"/>
+          <w:color w:val="000000"/>
+          <w:sz w:val="24"/>
+          <w:szCs w:val="24"/>
+        </w:rPr>
+        <w:t xml:space="preserve">Check whether a string is a palindrome </w:t>
+      </w:r>
+      <w:r>
+        <w:rPr>
+          <w:rFonts w:ascii="Verdana" w:hAnsi="Verdana"/>
+          <w:b/>
+          <w:bCs/>
+          <w:color w:val="000000"/>
+          <w:sz w:val="24"/>
+          <w:szCs w:val="24"/>
+        </w:rPr>
+        <w:t>without using reverse methods</w:t>
+      </w:r>
+      <w:r>
+        <w:rPr>
+          <w:rFonts w:ascii="Verdana" w:hAnsi="Verdana"/>
+          <w:color w:val="000000"/>
+          <w:sz w:val="24"/>
+          <w:szCs w:val="24"/>
+        </w:rPr>
+        <w:t>.</w:t>
+      </w:r>
+      <w:r>
+        <w:rPr>
+          <w:rFonts w:ascii="Verdana" w:hAnsi="Verdana"/>
+          <w:color w:val="000000"/>
+          <w:sz w:val="24"/>
+          <w:szCs w:val="24"/>
+        </w:rPr>
+        <w:t>(</w:t>
+      </w:r>
+      <w:r>
+        <w:rPr>
+          <w:rFonts w:asciiTheme="minorHAnsi" w:eastAsiaTheme="minorHAnsi" w:hAnsiTheme="minorHAnsi" w:cstheme="minorBidi"/>
+          <w:kern w:val="2"/>
+          <w:sz w:val="24"/>
+          <w:szCs w:val="21"/>
+          <w14:ligatures w14:val="standardContextual"/>
+        </w:rPr>
+        <w:t xml:space="preserve"> </w:t>
+      </w:r>
+      <w:r>
+        <w:rPr>
+          <w:rFonts w:ascii="Verdana" w:hAnsi="Verdana"/>
+          <w:color w:val="000000"/>
+          <w:sz w:val="24"/>
+          <w:szCs w:val="24"/>
+        </w:rPr>
+        <w:t>Two-pointer logic</w:t>
+      </w:r>
+      <w:r>
+        <w:rPr>
+          <w:rFonts w:ascii="Verdana" w:hAnsi="Verdana"/>
+          <w:color w:val="000000"/>
+          <w:sz w:val="24"/>
+          <w:szCs w:val="24"/>
+        </w:rPr>
+        <w:t>)</w:t>
+      </w:r>
+    </w:p>
+    <w:p>
+      <w:pPr>
+        <w:pStyle w:val="max2"/>
+        <w:numPr>
+          <w:ilvl w:val="0"/>
+          <w:numId w:val="16"/>
+        </w:numPr>
+        <w:rPr>
+          <w:rFonts w:ascii="Verdana" w:hAnsi="Verdana"/>
+          <w:color w:val="000000"/>
+          <w:sz w:val="24"/>
+          <w:szCs w:val="24"/>
+        </w:rPr>
+      </w:pPr>
+      <w:r>
+        <w:rPr>
+          <w:rFonts w:ascii="Verdana" w:hAnsi="Verdana"/>
+          <w:color w:val="000000"/>
+          <w:sz w:val="24"/>
+          <w:szCs w:val="24"/>
+        </w:rPr>
+        <w:t>Given an array and a number x, count how many times x appears.</w:t>
+      </w:r>
+      <w:r>
+        <w:rPr>
+          <w:rFonts w:ascii="Verdana" w:hAnsi="Verdana"/>
+          <w:color w:val="000000"/>
+          <w:sz w:val="24"/>
+          <w:szCs w:val="24"/>
+        </w:rPr>
+        <w:t>(</w:t>
+      </w:r>
+      <w:r>
+        <w:rPr>
+          <w:rFonts w:asciiTheme="minorHAnsi" w:eastAsiaTheme="minorHAnsi" w:hAnsiTheme="minorHAnsi" w:cstheme="minorBidi"/>
+          <w:kern w:val="2"/>
+          <w:sz w:val="24"/>
+          <w:szCs w:val="21"/>
+          <w14:ligatures w14:val="standardContextual"/>
+        </w:rPr>
+        <w:t xml:space="preserve"> </w:t>
+      </w:r>
+      <w:r>
+        <w:rPr>
+          <w:rFonts w:ascii="Verdana" w:hAnsi="Verdana"/>
+          <w:color w:val="000000"/>
+          <w:sz w:val="24"/>
+          <w:szCs w:val="24"/>
+        </w:rPr>
+        <w:t>Classic counter pattern.</w:t>
+      </w:r>
+      <w:r>
+        <w:rPr>
+          <w:rFonts w:ascii="Verdana" w:hAnsi="Verdana"/>
+          <w:color w:val="000000"/>
+          <w:sz w:val="24"/>
+          <w:szCs w:val="24"/>
+        </w:rPr>
+        <w:t>)</w:t>
+      </w:r>
+    </w:p>
+    <w:p>
+      <w:pPr>
+        <w:pStyle w:val="max2"/>
+        <w:numPr>
+          <w:ilvl w:val="0"/>
+          <w:numId w:val="16"/>
+        </w:numPr>
+        <w:rPr>
+          <w:rFonts w:ascii="Verdana" w:hAnsi="Verdana"/>
+          <w:color w:val="000000"/>
+          <w:sz w:val="24"/>
+          <w:szCs w:val="24"/>
+        </w:rPr>
+      </w:pPr>
+      <w:r>
+        <w:rPr>
+          <w:rFonts w:ascii="Verdana" w:hAnsi="Verdana"/>
+          <w:color w:val="000000"/>
+          <w:sz w:val="24"/>
+          <w:szCs w:val="24"/>
+        </w:rPr>
+        <w:t xml:space="preserve">Check whether the array is sorted in </w:t>
+      </w:r>
+      <w:r>
+        <w:rPr>
+          <w:rFonts w:ascii="Verdana" w:hAnsi="Verdana"/>
+          <w:b/>
+          <w:bCs/>
+          <w:color w:val="000000"/>
+          <w:sz w:val="24"/>
+          <w:szCs w:val="24"/>
+        </w:rPr>
+        <w:t>ascending order</w:t>
+      </w:r>
+      <w:r>
+        <w:rPr>
+          <w:rFonts w:ascii="Verdana" w:hAnsi="Verdana"/>
+          <w:color w:val="000000"/>
+          <w:sz w:val="24"/>
+          <w:szCs w:val="24"/>
+        </w:rPr>
+        <w:t>.</w:t>
+      </w:r>
+      <w:r>
+        <w:rPr>
+          <w:rFonts w:ascii="Verdana" w:hAnsi="Verdana"/>
+          <w:color w:val="000000"/>
+          <w:sz w:val="24"/>
+          <w:szCs w:val="24"/>
+        </w:rPr>
+        <w:t>(</w:t>
+      </w:r>
+      <w:r>
+        <w:rPr>
+          <w:rFonts w:asciiTheme="minorHAnsi" w:eastAsiaTheme="minorHAnsi" w:hAnsiTheme="minorHAnsi" w:cstheme="minorBidi"/>
+          <w:kern w:val="2"/>
+          <w:sz w:val="24"/>
+          <w:szCs w:val="21"/>
+          <w14:ligatures w14:val="standardContextual"/>
+        </w:rPr>
+        <w:t xml:space="preserve"> </w:t>
+      </w:r>
+      <w:r>
+        <w:rPr>
+          <w:rFonts w:ascii="Verdana" w:hAnsi="Verdana"/>
+          <w:color w:val="000000"/>
+          <w:sz w:val="24"/>
+          <w:szCs w:val="24"/>
+        </w:rPr>
+        <w:t>Comparison with next element.</w:t>
+      </w:r>
+      <w:r>
+        <w:rPr>
+          <w:rFonts w:ascii="Verdana" w:hAnsi="Verdana"/>
+          <w:color w:val="000000"/>
+          <w:sz w:val="24"/>
+          <w:szCs w:val="24"/>
+        </w:rPr>
+        <w:t>)</w:t>
+      </w:r>
+    </w:p>
+    <w:p>
+      <w:pPr>
+        <w:pStyle w:val="max2"/>
+        <w:numPr>
+          <w:ilvl w:val="0"/>
+          <w:numId w:val="16"/>
+        </w:numPr>
+        <w:rPr>
+          <w:rFonts w:ascii="Verdana" w:hAnsi="Verdana"/>
+          <w:color w:val="000000"/>
+          <w:sz w:val="24"/>
+          <w:szCs w:val="24"/>
+        </w:rPr>
+      </w:pPr>
+      <w:r>
+        <w:rPr>
+          <w:rFonts w:ascii="Verdana" w:hAnsi="Verdana"/>
+          <w:color w:val="000000"/>
+          <w:sz w:val="24"/>
+          <w:szCs w:val="24"/>
+        </w:rPr>
+        <w:t xml:space="preserve">Given an array of numbers, print the </w:t>
+      </w:r>
+      <w:r>
+        <w:rPr>
+          <w:rFonts w:ascii="Verdana" w:hAnsi="Verdana"/>
+          <w:b/>
+          <w:bCs/>
+          <w:color w:val="000000"/>
+          <w:sz w:val="24"/>
+          <w:szCs w:val="24"/>
+        </w:rPr>
+        <w:t>sum of digits of each element</w:t>
+      </w:r>
+      <w:r>
+        <w:rPr>
+          <w:rFonts w:ascii="Verdana" w:hAnsi="Verdana"/>
+          <w:color w:val="000000"/>
+          <w:sz w:val="24"/>
+          <w:szCs w:val="24"/>
+        </w:rPr>
+        <w:t>.</w:t>
+      </w:r>
+      <w:r>
+        <w:rPr>
+          <w:rFonts w:ascii="Verdana" w:hAnsi="Verdana"/>
+          <w:color w:val="000000"/>
+          <w:sz w:val="24"/>
+          <w:szCs w:val="24"/>
+        </w:rPr>
+        <w:t>(</w:t>
+      </w:r>
+      <w:r>
+        <w:rPr>
+          <w:rFonts w:asciiTheme="minorHAnsi" w:eastAsiaTheme="minorHAnsi" w:hAnsiTheme="minorHAnsi" w:cstheme="minorBidi"/>
+          <w:kern w:val="2"/>
+          <w:sz w:val="24"/>
+          <w:szCs w:val="21"/>
+          <w14:ligatures w14:val="standardContextual"/>
+        </w:rPr>
+        <w:t xml:space="preserve"> </w:t>
+      </w:r>
+      <w:r>
+        <w:rPr>
+          <w:rFonts w:ascii="Verdana" w:hAnsi="Verdana"/>
+          <w:color w:val="000000"/>
+          <w:sz w:val="24"/>
+          <w:szCs w:val="24"/>
+        </w:rPr>
+        <w:t>Array loop + digit loop.</w:t>
+      </w:r>
+      <w:r>
+        <w:rPr>
+          <w:rFonts w:ascii="Verdana" w:hAnsi="Verdana"/>
+          <w:color w:val="000000"/>
+          <w:sz w:val="24"/>
+          <w:szCs w:val="24"/>
+        </w:rPr>
+        <w:t>)</w:t>
+      </w:r>
+    </w:p>
+    <w:p>
+      <w:pPr>
+        <w:pStyle w:val="max2"/>
+        <w:numPr>
+          <w:ilvl w:val="0"/>
+          <w:numId w:val="16"/>
+        </w:numPr>
+        <w:rPr>
+          <w:rFonts w:ascii="Verdana" w:hAnsi="Verdana"/>
+          <w:color w:val="000000"/>
+          <w:sz w:val="24"/>
+          <w:szCs w:val="24"/>
+        </w:rPr>
+      </w:pPr>
+      <w:r>
+        <w:rPr>
+          <w:rFonts w:ascii="Verdana" w:hAnsi="Verdana"/>
+          <w:color w:val="000000"/>
+          <w:sz w:val="24"/>
+          <w:szCs w:val="24"/>
+        </w:rPr>
+        <w:t xml:space="preserve">Traverse an array and print the </w:t>
+      </w:r>
+      <w:r>
+        <w:rPr>
+          <w:rFonts w:ascii="Verdana" w:hAnsi="Verdana"/>
+          <w:b/>
+          <w:bCs/>
+          <w:color w:val="000000"/>
+          <w:sz w:val="24"/>
+          <w:szCs w:val="24"/>
+        </w:rPr>
+        <w:t>first palindrome number</w:t>
+      </w:r>
+      <w:r>
+        <w:rPr>
+          <w:rFonts w:ascii="Verdana" w:hAnsi="Verdana"/>
+          <w:color w:val="000000"/>
+          <w:sz w:val="24"/>
+          <w:szCs w:val="24"/>
+        </w:rPr>
+        <w:t>, then stop.</w:t>
+      </w:r>
+      <w:r>
+        <w:rPr>
+          <w:rFonts w:ascii="Verdana" w:hAnsi="Verdana"/>
+          <w:color w:val="000000"/>
+          <w:sz w:val="24"/>
+          <w:szCs w:val="24"/>
+        </w:rPr>
+        <w:t>(</w:t>
+      </w:r>
+      <w:r>
+        <w:rPr>
+          <w:rFonts w:asciiTheme="minorHAnsi" w:eastAsiaTheme="minorHAnsi" w:hAnsiTheme="minorHAnsi" w:cstheme="minorBidi"/>
+          <w:kern w:val="2"/>
+          <w:sz w:val="24"/>
+          <w:szCs w:val="21"/>
+          <w14:ligatures w14:val="standardContextual"/>
+        </w:rPr>
+        <w:t xml:space="preserve"> </w:t>
+      </w:r>
+      <w:r>
+        <w:rPr>
+          <w:rFonts w:ascii="Verdana" w:hAnsi="Verdana"/>
+          <w:color w:val="000000"/>
+          <w:sz w:val="24"/>
+          <w:szCs w:val="24"/>
+        </w:rPr>
+        <w:t>Nested logic + early exit.</w:t>
+      </w:r>
+      <w:r>
+        <w:rPr>
+          <w:rFonts w:ascii="Verdana" w:hAnsi="Verdana"/>
+          <w:color w:val="000000"/>
+          <w:sz w:val="24"/>
+          <w:szCs w:val="24"/>
+        </w:rPr>
+        <w:t>)</w:t>
+      </w:r>
+    </w:p>
+    <w:p>
+      <w:pPr>
+        <w:pStyle w:val="max2"/>
+        <w:rPr>
+          <w:rFonts w:ascii="Verdana" w:hAnsi="Verdana"/>
+          <w:color w:val="000000"/>
+          <w:sz w:val="24"/>
+          <w:szCs w:val="24"/>
+        </w:rPr>
+      </w:pPr>
+      <w:r>
+        <w:rPr>
+          <w:rFonts w:ascii="Verdana" w:hAnsi="Verdana"/>
+          <w:color w:val="000000"/>
+          <w:sz w:val="24"/>
+          <w:szCs w:val="24"/>
+        </w:rPr>
+        <w:t>Day 12</w:t>
+      </w:r>
+    </w:p>
+    <w:p>
+      <w:pPr>
+        <w:pStyle w:val="max2"/>
+        <w:numPr>
+          <w:ilvl w:val="0"/>
+          <w:numId w:val="17"/>
+        </w:numPr>
+        <w:rPr>
+          <w:rFonts w:ascii="Verdana" w:hAnsi="Verdana"/>
+          <w:color w:val="000000"/>
+          <w:sz w:val="24"/>
+          <w:szCs w:val="24"/>
+        </w:rPr>
+      </w:pPr>
+      <w:r>
+        <w:rPr>
+          <w:rFonts w:ascii="Verdana" w:hAnsi="Verdana"/>
+          <w:color w:val="000000"/>
+          <w:sz w:val="24"/>
+          <w:szCs w:val="24"/>
+        </w:rPr>
+        <w:t xml:space="preserve">Write a program to find out whether entered number is place at ones, tens, hundred , thousand </w:t>
+      </w:r>
+      <w:proofErr w:type="spellStart"/>
+      <w:r>
+        <w:rPr>
+          <w:rFonts w:ascii="Verdana" w:hAnsi="Verdana"/>
+          <w:color w:val="000000"/>
+          <w:sz w:val="24"/>
+          <w:szCs w:val="24"/>
+        </w:rPr>
+        <w:t>etc</w:t>
+      </w:r>
+      <w:proofErr w:type="spellEnd"/>
+      <w:r>
+        <w:rPr>
+          <w:rFonts w:ascii="Verdana" w:hAnsi="Verdana"/>
+          <w:color w:val="000000"/>
+          <w:sz w:val="24"/>
+          <w:szCs w:val="24"/>
+        </w:rPr>
+        <w:t>….</w:t>
+      </w:r>
+    </w:p>
+    <w:p>
+      <w:pPr>
+        <w:pStyle w:val="max2"/>
+        <w:numPr>
+          <w:ilvl w:val="0"/>
+          <w:numId w:val="17"/>
+        </w:numPr>
+        <w:rPr>
+          <w:rFonts w:ascii="Verdana" w:hAnsi="Verdana"/>
+          <w:color w:val="000000"/>
+          <w:sz w:val="24"/>
+          <w:szCs w:val="24"/>
+        </w:rPr>
+      </w:pPr>
+    </w:p>
+    <w:p>
+      <w:pPr>
+        <w:pStyle w:val="max2"/>
+        <w:rPr>
+          <w:rFonts w:ascii="Verdana" w:hAnsi="Verdana"/>
+          <w:color w:val="000000"/>
+          <w:sz w:val="24"/>
+          <w:szCs w:val="24"/>
+        </w:rPr>
+      </w:pPr>
+      <w:r>
+        <w:rPr>
+          <w:rFonts w:ascii="Verdana" w:hAnsi="Verdana"/>
+          <w:color w:val="000000"/>
+          <w:sz w:val="24"/>
+          <w:szCs w:val="24"/>
+        </w:rPr>
+        <w:t xml:space="preserve">Day </w:t>
+      </w:r>
+      <w:r>
+        <w:rPr>
+          <w:rFonts w:ascii="Verdana" w:hAnsi="Verdana"/>
+          <w:color w:val="000000"/>
+          <w:sz w:val="24"/>
+          <w:szCs w:val="24"/>
+        </w:rPr>
+        <w:t>1</w:t>
+      </w:r>
+      <w:r>
+        <w:rPr>
+          <w:rFonts w:ascii="Verdana" w:hAnsi="Verdana"/>
+          <w:color w:val="000000"/>
+          <w:sz w:val="24"/>
+          <w:szCs w:val="24"/>
+        </w:rPr>
+        <w:t>3</w:t>
+      </w:r>
+    </w:p>
+    <w:p>
+      <w:pPr>
+        <w:pStyle w:val="max2"/>
+        <w:numPr>
+          <w:ilvl w:val="0"/>
+          <w:numId w:val="6"/>
+        </w:numPr>
+        <w:rPr>
+          <w:rFonts w:ascii="Verdana" w:hAnsi="Verdana"/>
+          <w:color w:val="000000"/>
+          <w:sz w:val="24"/>
+          <w:szCs w:val="24"/>
+        </w:rPr>
+      </w:pPr>
+      <w:r>
+        <w:rPr>
+          <w:rFonts w:ascii="Verdana" w:hAnsi="Verdana"/>
+          <w:color w:val="000000"/>
+          <w:sz w:val="24"/>
+          <w:szCs w:val="24"/>
+        </w:rPr>
+        <w:t xml:space="preserve">Take a sentence and reverse </w:t>
+      </w:r>
+      <w:r>
+        <w:rPr>
+          <w:rFonts w:ascii="Verdana" w:hAnsi="Verdana"/>
+          <w:b/>
+          <w:bCs/>
+          <w:color w:val="000000"/>
+          <w:sz w:val="24"/>
+          <w:szCs w:val="24"/>
+        </w:rPr>
         <w:t>each word individually</w:t>
       </w:r>
       <w:r>
@@ -2572,6 +3323,7 @@
           <w:sz w:val="24"/>
           <w:szCs w:val="24"/>
         </w:rPr>
+        <w:lastRenderedPageBreak/>
         <w:t>Write a java program to sort an array in descending order.</w:t>
       </w:r>
     </w:p>
@@ -2658,7 +3410,7 @@
           <w:sz w:val="24"/>
           <w:szCs w:val="24"/>
         </w:rPr>
-        <w:t>2</w:t>
+        <w:t>4</w:t>
       </w:r>
     </w:p>
     <w:p>
@@ -3516,6 +4268,92 @@
     </w:lvl>
   </w:abstractNum>
   <w:abstractNum w:abstractNumId="8" w15:restartNumberingAfterBreak="0">
+    <w:nsid w:val="40C50921"/>
+    <w:multiLevelType w:val="hybridMultilevel"/>
+    <w:tmpl w:val="AF0A9ABA"/>
+    <w:lvl w:ilvl="0" w:tplc="0409000F">
+      <w:start w:val="1"/>
+      <w:numFmt w:val="decimal"/>
+      <w:lvlText w:val="%1."/>
+      <w:lvlJc w:val="left"/>
+      <w:pPr>
+        <w:ind w:left="720" w:hanging="360"/>
+      </w:pPr>
+    </w:lvl>
+    <w:lvl w:ilvl="1" w:tplc="04090019" w:tentative="1">
+      <w:start w:val="1"/>
+      <w:numFmt w:val="lowerLetter"/>
+      <w:lvlText w:val="%2."/>
+      <w:lvlJc w:val="left"/>
+      <w:pPr>
+        <w:ind w:left="1440" w:hanging="360"/>
+      </w:pPr>
+    </w:lvl>
+    <w:lvl w:ilvl="2" w:tplc="0409001B" w:tentative="1">
+      <w:start w:val="1"/>
+      <w:numFmt w:val="lowerRoman"/>
+      <w:lvlText w:val="%3."/>
+      <w:lvlJc w:val="right"/>
+      <w:pPr>
+        <w:ind w:left="2160" w:hanging="180"/>
+      </w:pPr>
+    </w:lvl>
+    <w:lvl w:ilvl="3" w:tplc="0409000F" w:tentative="1">
+      <w:start w:val="1"/>
+      <w:numFmt w:val="decimal"/>
+      <w:lvlText w:val="%4."/>
+      <w:lvlJc w:val="left"/>
+      <w:pPr>
+        <w:ind w:left="2880" w:hanging="360"/>
+      </w:pPr>
+    </w:lvl>
+    <w:lvl w:ilvl="4" w:tplc="04090019" w:tentative="1">
+      <w:start w:val="1"/>
+      <w:numFmt w:val="lowerLetter"/>
+      <w:lvlText w:val="%5."/>
+      <w:lvlJc w:val="left"/>
+      <w:pPr>
+        <w:ind w:left="3600" w:hanging="360"/>
+      </w:pPr>
+    </w:lvl>
+    <w:lvl w:ilvl="5" w:tplc="0409001B" w:tentative="1">
+      <w:start w:val="1"/>
+      <w:numFmt w:val="lowerRoman"/>
+      <w:lvlText w:val="%6."/>
+      <w:lvlJc w:val="right"/>
+      <w:pPr>
+        <w:ind w:left="4320" w:hanging="180"/>
+      </w:pPr>
+    </w:lvl>
+    <w:lvl w:ilvl="6" w:tplc="0409000F" w:tentative="1">
+      <w:start w:val="1"/>
+      <w:numFmt w:val="decimal"/>
+      <w:lvlText w:val="%7."/>
+      <w:lvlJc w:val="left"/>
+      <w:pPr>
+        <w:ind w:left="5040" w:hanging="360"/>
+      </w:pPr>
+    </w:lvl>
+    <w:lvl w:ilvl="7" w:tplc="04090019" w:tentative="1">
+      <w:start w:val="1"/>
+      <w:numFmt w:val="lowerLetter"/>
+      <w:lvlText w:val="%8."/>
+      <w:lvlJc w:val="left"/>
+      <w:pPr>
+        <w:ind w:left="5760" w:hanging="360"/>
+      </w:pPr>
+    </w:lvl>
+    <w:lvl w:ilvl="8" w:tplc="0409001B" w:tentative="1">
+      <w:start w:val="1"/>
+      <w:numFmt w:val="lowerRoman"/>
+      <w:lvlText w:val="%9."/>
+      <w:lvlJc w:val="right"/>
+      <w:pPr>
+        <w:ind w:left="6480" w:hanging="180"/>
+      </w:pPr>
+    </w:lvl>
+  </w:abstractNum>
+  <w:abstractNum w:abstractNumId="9" w15:restartNumberingAfterBreak="0">
     <w:nsid w:val="41214A0C"/>
     <w:multiLevelType w:val="hybridMultilevel"/>
     <w:tmpl w:val="DC0E80FA"/>
@@ -3601,7 +4439,7 @@
       </w:pPr>
     </w:lvl>
   </w:abstractNum>
-  <w:abstractNum w:abstractNumId="9" w15:restartNumberingAfterBreak="0">
+  <w:abstractNum w:abstractNumId="10" w15:restartNumberingAfterBreak="0">
     <w:nsid w:val="424A52A2"/>
     <w:multiLevelType w:val="hybridMultilevel"/>
     <w:tmpl w:val="A16657D4"/>
@@ -3687,7 +4525,7 @@
       </w:pPr>
     </w:lvl>
   </w:abstractNum>
-  <w:abstractNum w:abstractNumId="10" w15:restartNumberingAfterBreak="0">
+  <w:abstractNum w:abstractNumId="11" w15:restartNumberingAfterBreak="0">
     <w:nsid w:val="47F5408E"/>
     <w:multiLevelType w:val="hybridMultilevel"/>
     <w:tmpl w:val="A16657D4"/>
@@ -3773,7 +4611,93 @@
       </w:pPr>
     </w:lvl>
   </w:abstractNum>
-  <w:abstractNum w:abstractNumId="11" w15:restartNumberingAfterBreak="0">
+  <w:abstractNum w:abstractNumId="12" w15:restartNumberingAfterBreak="0">
+    <w:nsid w:val="4E100B8B"/>
+    <w:multiLevelType w:val="hybridMultilevel"/>
+    <w:tmpl w:val="1D5460BE"/>
+    <w:lvl w:ilvl="0" w:tplc="0409000F">
+      <w:start w:val="1"/>
+      <w:numFmt w:val="decimal"/>
+      <w:lvlText w:val="%1."/>
+      <w:lvlJc w:val="left"/>
+      <w:pPr>
+        <w:ind w:left="720" w:hanging="360"/>
+      </w:pPr>
+    </w:lvl>
+    <w:lvl w:ilvl="1" w:tplc="04090019" w:tentative="1">
+      <w:start w:val="1"/>
+      <w:numFmt w:val="lowerLetter"/>
+      <w:lvlText w:val="%2."/>
+      <w:lvlJc w:val="left"/>
+      <w:pPr>
+        <w:ind w:left="1440" w:hanging="360"/>
+      </w:pPr>
+    </w:lvl>
+    <w:lvl w:ilvl="2" w:tplc="0409001B" w:tentative="1">
+      <w:start w:val="1"/>
+      <w:numFmt w:val="lowerRoman"/>
+      <w:lvlText w:val="%3."/>
+      <w:lvlJc w:val="right"/>
+      <w:pPr>
+        <w:ind w:left="2160" w:hanging="180"/>
+      </w:pPr>
+    </w:lvl>
+    <w:lvl w:ilvl="3" w:tplc="0409000F" w:tentative="1">
+      <w:start w:val="1"/>
+      <w:numFmt w:val="decimal"/>
+      <w:lvlText w:val="%4."/>
+      <w:lvlJc w:val="left"/>
+      <w:pPr>
+        <w:ind w:left="2880" w:hanging="360"/>
+      </w:pPr>
+    </w:lvl>
+    <w:lvl w:ilvl="4" w:tplc="04090019" w:tentative="1">
+      <w:start w:val="1"/>
+      <w:numFmt w:val="lowerLetter"/>
+      <w:lvlText w:val="%5."/>
+      <w:lvlJc w:val="left"/>
+      <w:pPr>
+        <w:ind w:left="3600" w:hanging="360"/>
+      </w:pPr>
+    </w:lvl>
+    <w:lvl w:ilvl="5" w:tplc="0409001B" w:tentative="1">
+      <w:start w:val="1"/>
+      <w:numFmt w:val="lowerRoman"/>
+      <w:lvlText w:val="%6."/>
+      <w:lvlJc w:val="right"/>
+      <w:pPr>
+        <w:ind w:left="4320" w:hanging="180"/>
+      </w:pPr>
+    </w:lvl>
+    <w:lvl w:ilvl="6" w:tplc="0409000F" w:tentative="1">
+      <w:start w:val="1"/>
+      <w:numFmt w:val="decimal"/>
+      <w:lvlText w:val="%7."/>
+      <w:lvlJc w:val="left"/>
+      <w:pPr>
+        <w:ind w:left="5040" w:hanging="360"/>
+      </w:pPr>
+    </w:lvl>
+    <w:lvl w:ilvl="7" w:tplc="04090019" w:tentative="1">
+      <w:start w:val="1"/>
+      <w:numFmt w:val="lowerLetter"/>
+      <w:lvlText w:val="%8."/>
+      <w:lvlJc w:val="left"/>
+      <w:pPr>
+        <w:ind w:left="5760" w:hanging="360"/>
+      </w:pPr>
+    </w:lvl>
+    <w:lvl w:ilvl="8" w:tplc="0409001B" w:tentative="1">
+      <w:start w:val="1"/>
+      <w:numFmt w:val="lowerRoman"/>
+      <w:lvlText w:val="%9."/>
+      <w:lvlJc w:val="right"/>
+      <w:pPr>
+        <w:ind w:left="6480" w:hanging="180"/>
+      </w:pPr>
+    </w:lvl>
+  </w:abstractNum>
+  <w:abstractNum w:abstractNumId="13" w15:restartNumberingAfterBreak="0">
     <w:nsid w:val="5AD15962"/>
     <w:multiLevelType w:val="hybridMultilevel"/>
     <w:tmpl w:val="884AF92E"/>
@@ -3859,7 +4783,7 @@
       </w:pPr>
     </w:lvl>
   </w:abstractNum>
-  <w:abstractNum w:abstractNumId="12" w15:restartNumberingAfterBreak="0">
+  <w:abstractNum w:abstractNumId="14" w15:restartNumberingAfterBreak="0">
     <w:nsid w:val="6AAA50FA"/>
     <w:multiLevelType w:val="hybridMultilevel"/>
     <w:tmpl w:val="829279AA"/>
@@ -3945,7 +4869,7 @@
       </w:pPr>
     </w:lvl>
   </w:abstractNum>
-  <w:abstractNum w:abstractNumId="13" w15:restartNumberingAfterBreak="0">
+  <w:abstractNum w:abstractNumId="15" w15:restartNumberingAfterBreak="0">
     <w:nsid w:val="72E21C6C"/>
     <w:multiLevelType w:val="hybridMultilevel"/>
     <w:tmpl w:val="A548623A"/>
@@ -4031,7 +4955,7 @@
       </w:pPr>
     </w:lvl>
   </w:abstractNum>
-  <w:abstractNum w:abstractNumId="14" w15:restartNumberingAfterBreak="0">
+  <w:abstractNum w:abstractNumId="16" w15:restartNumberingAfterBreak="0">
     <w:nsid w:val="7ABA1038"/>
     <w:multiLevelType w:val="hybridMultilevel"/>
     <w:tmpl w:val="CAE67AD6"/>
@@ -4124,25 +5048,25 @@
     <w:abstractNumId w:val="5"/>
   </w:num>
   <w:num w:numId="3" w16cid:durableId="992101742">
-    <w:abstractNumId w:val="10"/>
+    <w:abstractNumId w:val="11"/>
   </w:num>
   <w:num w:numId="4" w16cid:durableId="271985620">
     <w:abstractNumId w:val="3"/>
   </w:num>
   <w:num w:numId="5" w16cid:durableId="1301619490">
-    <w:abstractNumId w:val="9"/>
+    <w:abstractNumId w:val="10"/>
   </w:num>
   <w:num w:numId="6" w16cid:durableId="1738437273">
     <w:abstractNumId w:val="2"/>
   </w:num>
   <w:num w:numId="7" w16cid:durableId="1879052598">
-    <w:abstractNumId w:val="12"/>
+    <w:abstractNumId w:val="14"/>
   </w:num>
   <w:num w:numId="8" w16cid:durableId="1749188025">
     <w:abstractNumId w:val="6"/>
   </w:num>
   <w:num w:numId="9" w16cid:durableId="101462200">
-    <w:abstractNumId w:val="13"/>
+    <w:abstractNumId w:val="15"/>
   </w:num>
   <w:num w:numId="10" w16cid:durableId="57170953">
     <w:abstractNumId w:val="0"/>
@@ -4151,16 +5075,22 @@
     <w:abstractNumId w:val="4"/>
   </w:num>
   <w:num w:numId="12" w16cid:durableId="1752465261">
-    <w:abstractNumId w:val="11"/>
+    <w:abstractNumId w:val="13"/>
   </w:num>
   <w:num w:numId="13" w16cid:durableId="192882122">
-    <w:abstractNumId w:val="14"/>
+    <w:abstractNumId w:val="16"/>
   </w:num>
   <w:num w:numId="14" w16cid:durableId="1059592124">
-    <w:abstractNumId w:val="8"/>
+    <w:abstractNumId w:val="9"/>
   </w:num>
   <w:num w:numId="15" w16cid:durableId="973172513">
     <w:abstractNumId w:val="1"/>
+  </w:num>
+  <w:num w:numId="16" w16cid:durableId="1242788342">
+    <w:abstractNumId w:val="8"/>
+  </w:num>
+  <w:num w:numId="17" w16cid:durableId="1172834706">
+    <w:abstractNumId w:val="12"/>
   </w:num>
 </w:numbering>
 </file>
@@ -4768,7 +5698,6 @@
   <w:style w:type="character" w:default="1" w:styleId="DefaultParagraphFont">
     <w:name w:val="Default Paragraph Font"/>
     <w:uiPriority w:val="1"/>
-    <w:semiHidden/>
     <w:unhideWhenUsed/>
   </w:style>
   <w:style w:type="table" w:default="1" w:styleId="TableNormal">

</xml_diff>

<commit_message>
Day 15 just getting started
</commit_message>
<xml_diff>
--- a/Questions.docx
+++ b/Questions.docx
@@ -52,41 +52,44 @@
           <w:sz w:val="28"/>
           <w:szCs w:val="22"/>
         </w:rPr>
-        <w:t>Write a java program to check input validation for integer constraints :</w:t>
-      </w:r>
-    </w:p>
-    <w:p>
-      <w:pPr>
-        <w:pStyle w:val="ListParagraph"/>
+        <w:t xml:space="preserve">Write a java program to check input validation for integer </w:t>
+      </w:r>
+      <w:proofErr w:type="gramStart"/>
+      <w:r>
         <w:rPr>
           <w:rFonts w:ascii="Times New Roman" w:hAnsi="Times New Roman" w:cs="Times New Roman"/>
           <w:sz w:val="28"/>
           <w:szCs w:val="22"/>
         </w:rPr>
-      </w:pPr>
-      <w:r>
+        <w:t>constraints :</w:t>
+      </w:r>
+      <w:proofErr w:type="gramEnd"/>
+    </w:p>
+    <w:p>
+      <w:pPr>
+        <w:pStyle w:val="ListParagraph"/>
         <w:rPr>
           <w:rFonts w:ascii="Times New Roman" w:hAnsi="Times New Roman" w:cs="Times New Roman"/>
           <w:sz w:val="28"/>
           <w:szCs w:val="22"/>
         </w:rPr>
-        <w:t>N&lt;</w:t>
-      </w:r>
+      </w:pPr>
       <w:r>
         <w:rPr>
           <w:rFonts w:ascii="Times New Roman" w:hAnsi="Times New Roman" w:cs="Times New Roman"/>
           <w:sz w:val="28"/>
           <w:szCs w:val="22"/>
         </w:rPr>
-        <w:t>10</w:t>
-      </w:r>
+        <w:t>N&lt;</w:t>
+      </w:r>
+      <w:proofErr w:type="gramStart"/>
       <w:r>
         <w:rPr>
           <w:rFonts w:ascii="Times New Roman" w:hAnsi="Times New Roman" w:cs="Times New Roman"/>
           <w:sz w:val="28"/>
           <w:szCs w:val="22"/>
         </w:rPr>
-        <w:t xml:space="preserve"> </w:t>
+        <w:t>10</w:t>
       </w:r>
       <w:r>
         <w:rPr>
@@ -94,7 +97,7 @@
           <w:sz w:val="28"/>
           <w:szCs w:val="22"/>
         </w:rPr>
-        <w:t>,</w:t>
+        <w:t xml:space="preserve"> </w:t>
       </w:r>
       <w:r>
         <w:rPr>
@@ -102,7 +105,7 @@
           <w:sz w:val="28"/>
           <w:szCs w:val="22"/>
         </w:rPr>
-        <w:t>N&gt;</w:t>
+        <w:t>,</w:t>
       </w:r>
       <w:r>
         <w:rPr>
@@ -110,15 +113,16 @@
           <w:sz w:val="28"/>
           <w:szCs w:val="22"/>
         </w:rPr>
-        <w:t xml:space="preserve">0, for string constraints : </w:t>
-      </w:r>
+        <w:t>N</w:t>
+      </w:r>
+      <w:proofErr w:type="gramEnd"/>
       <w:r>
         <w:rPr>
           <w:rFonts w:ascii="Times New Roman" w:hAnsi="Times New Roman" w:cs="Times New Roman"/>
           <w:sz w:val="28"/>
           <w:szCs w:val="22"/>
         </w:rPr>
-        <w:t>S&lt;1</w:t>
+        <w:t>&gt;</w:t>
       </w:r>
       <w:r>
         <w:rPr>
@@ -126,23 +130,25 @@
           <w:sz w:val="28"/>
           <w:szCs w:val="22"/>
         </w:rPr>
-        <w:t>,</w:t>
-      </w:r>
+        <w:t xml:space="preserve">0, for string </w:t>
+      </w:r>
+      <w:proofErr w:type="gramStart"/>
       <w:r>
         <w:rPr>
           <w:rFonts w:ascii="Times New Roman" w:hAnsi="Times New Roman" w:cs="Times New Roman"/>
           <w:sz w:val="28"/>
           <w:szCs w:val="22"/>
         </w:rPr>
-        <w:t xml:space="preserve"> S</w:t>
-      </w:r>
+        <w:t>constraints :</w:t>
+      </w:r>
+      <w:proofErr w:type="gramEnd"/>
       <w:r>
         <w:rPr>
           <w:rFonts w:ascii="Times New Roman" w:hAnsi="Times New Roman" w:cs="Times New Roman"/>
           <w:sz w:val="28"/>
           <w:szCs w:val="22"/>
         </w:rPr>
-        <w:t>&lt;</w:t>
+        <w:t xml:space="preserve"> </w:t>
       </w:r>
       <w:r>
         <w:rPr>
@@ -150,7 +156,7 @@
           <w:sz w:val="28"/>
           <w:szCs w:val="22"/>
         </w:rPr>
-        <w:t>15</w:t>
+        <w:t>S&lt;1</w:t>
       </w:r>
       <w:r>
         <w:rPr>
@@ -158,50 +164,82 @@
           <w:sz w:val="28"/>
           <w:szCs w:val="22"/>
         </w:rPr>
-        <w:t>, (S) string length. And print String as normal as input and double the integer value.</w:t>
-      </w:r>
-    </w:p>
-    <w:p>
-      <w:pPr>
-        <w:pStyle w:val="ListParagraph"/>
-        <w:numPr>
-          <w:ilvl w:val="0"/>
-          <w:numId w:val="1"/>
-        </w:numPr>
+        <w:t>,</w:t>
+      </w:r>
+      <w:r>
         <w:rPr>
           <w:rFonts w:ascii="Times New Roman" w:hAnsi="Times New Roman" w:cs="Times New Roman"/>
           <w:sz w:val="28"/>
           <w:szCs w:val="22"/>
         </w:rPr>
-      </w:pPr>
+        <w:t xml:space="preserve"> S</w:t>
+      </w:r>
       <w:r>
         <w:rPr>
           <w:rFonts w:ascii="Times New Roman" w:hAnsi="Times New Roman" w:cs="Times New Roman"/>
           <w:sz w:val="28"/>
           <w:szCs w:val="22"/>
         </w:rPr>
-        <w:t>Write a java program to check if input number is palindrome or not.</w:t>
-      </w:r>
-    </w:p>
-    <w:p>
-      <w:pPr>
-        <w:pStyle w:val="ListParagraph"/>
-        <w:numPr>
-          <w:ilvl w:val="0"/>
-          <w:numId w:val="1"/>
-        </w:numPr>
+        <w:t>&lt;</w:t>
+      </w:r>
+      <w:r>
         <w:rPr>
           <w:rFonts w:ascii="Times New Roman" w:hAnsi="Times New Roman" w:cs="Times New Roman"/>
           <w:sz w:val="28"/>
           <w:szCs w:val="22"/>
         </w:rPr>
-      </w:pPr>
+        <w:t>15</w:t>
+      </w:r>
       <w:r>
         <w:rPr>
           <w:rFonts w:ascii="Times New Roman" w:hAnsi="Times New Roman" w:cs="Times New Roman"/>
           <w:sz w:val="28"/>
           <w:szCs w:val="22"/>
         </w:rPr>
+        <w:t>, (S) string length. And print String as normal as input and double the integer value.</w:t>
+      </w:r>
+    </w:p>
+    <w:p>
+      <w:pPr>
+        <w:pStyle w:val="ListParagraph"/>
+        <w:numPr>
+          <w:ilvl w:val="0"/>
+          <w:numId w:val="1"/>
+        </w:numPr>
+        <w:rPr>
+          <w:rFonts w:ascii="Times New Roman" w:hAnsi="Times New Roman" w:cs="Times New Roman"/>
+          <w:sz w:val="28"/>
+          <w:szCs w:val="22"/>
+        </w:rPr>
+      </w:pPr>
+      <w:r>
+        <w:rPr>
+          <w:rFonts w:ascii="Times New Roman" w:hAnsi="Times New Roman" w:cs="Times New Roman"/>
+          <w:sz w:val="28"/>
+          <w:szCs w:val="22"/>
+        </w:rPr>
+        <w:t>Write a java program to check if input number is palindrome or not.</w:t>
+      </w:r>
+    </w:p>
+    <w:p>
+      <w:pPr>
+        <w:pStyle w:val="ListParagraph"/>
+        <w:numPr>
+          <w:ilvl w:val="0"/>
+          <w:numId w:val="1"/>
+        </w:numPr>
+        <w:rPr>
+          <w:rFonts w:ascii="Times New Roman" w:hAnsi="Times New Roman" w:cs="Times New Roman"/>
+          <w:sz w:val="28"/>
+          <w:szCs w:val="22"/>
+        </w:rPr>
+      </w:pPr>
+      <w:r>
+        <w:rPr>
+          <w:rFonts w:ascii="Times New Roman" w:hAnsi="Times New Roman" w:cs="Times New Roman"/>
+          <w:sz w:val="28"/>
+          <w:szCs w:val="22"/>
+        </w:rPr>
         <w:t>Write a java program to check if input number is unique number or not.</w:t>
       </w:r>
     </w:p>
@@ -237,6 +275,7 @@
         <w:br/>
       </w:r>
       <w:proofErr w:type="spellStart"/>
+      <w:proofErr w:type="gramStart"/>
       <w:r>
         <w:rPr>
           <w:rFonts w:ascii="Verdana" w:hAnsi="Verdana"/>
@@ -252,7 +291,16 @@
           <w:color w:val="000000"/>
           <w:szCs w:val="24"/>
         </w:rPr>
-        <w:t xml:space="preserve">("Hi", 2) </w:t>
+        <w:t>(</w:t>
+      </w:r>
+      <w:proofErr w:type="gramEnd"/>
+      <w:r>
+        <w:rPr>
+          <w:rFonts w:ascii="Verdana" w:hAnsi="Verdana"/>
+          <w:color w:val="000000"/>
+          <w:szCs w:val="24"/>
+        </w:rPr>
+        <w:t xml:space="preserve">"Hi", 2) </w:t>
       </w:r>
       <w:r>
         <w:rPr>
@@ -297,6 +345,7 @@
         <w:br/>
       </w:r>
       <w:proofErr w:type="spellStart"/>
+      <w:proofErr w:type="gramStart"/>
       <w:r>
         <w:rPr>
           <w:rFonts w:ascii="Verdana" w:hAnsi="Verdana"/>
@@ -312,7 +361,16 @@
           <w:color w:val="000000"/>
           <w:szCs w:val="24"/>
         </w:rPr>
-        <w:t xml:space="preserve">("Hi", 3) </w:t>
+        <w:t>(</w:t>
+      </w:r>
+      <w:proofErr w:type="gramEnd"/>
+      <w:r>
+        <w:rPr>
+          <w:rFonts w:ascii="Verdana" w:hAnsi="Verdana"/>
+          <w:color w:val="000000"/>
+          <w:szCs w:val="24"/>
+        </w:rPr>
+        <w:t xml:space="preserve">"Hi", 3) </w:t>
       </w:r>
       <w:r>
         <w:rPr>
@@ -357,6 +415,7 @@
         <w:br/>
       </w:r>
       <w:proofErr w:type="spellStart"/>
+      <w:proofErr w:type="gramStart"/>
       <w:r>
         <w:rPr>
           <w:rFonts w:ascii="Verdana" w:hAnsi="Verdana"/>
@@ -372,7 +431,16 @@
           <w:color w:val="000000"/>
           <w:szCs w:val="24"/>
         </w:rPr>
-        <w:t xml:space="preserve">("Hi", 1) </w:t>
+        <w:t>(</w:t>
+      </w:r>
+      <w:proofErr w:type="gramEnd"/>
+      <w:r>
+        <w:rPr>
+          <w:rFonts w:ascii="Verdana" w:hAnsi="Verdana"/>
+          <w:color w:val="000000"/>
+          <w:szCs w:val="24"/>
+        </w:rPr>
+        <w:t xml:space="preserve">"Hi", 1) </w:t>
       </w:r>
       <w:r>
         <w:rPr>
@@ -731,7 +799,27 @@
           <w:sz w:val="24"/>
           <w:szCs w:val="24"/>
         </w:rPr>
-        <w:t>Write a java program to find the multiplication of a input number.</w:t>
+        <w:t xml:space="preserve">Write a java program to find the multiplication of </w:t>
+      </w:r>
+      <w:proofErr w:type="gramStart"/>
+      <w:r>
+        <w:rPr>
+          <w:rFonts w:ascii="Verdana" w:hAnsi="Verdana"/>
+          <w:color w:val="000000"/>
+          <w:sz w:val="24"/>
+          <w:szCs w:val="24"/>
+        </w:rPr>
+        <w:t>a</w:t>
+      </w:r>
+      <w:proofErr w:type="gramEnd"/>
+      <w:r>
+        <w:rPr>
+          <w:rFonts w:ascii="Verdana" w:hAnsi="Verdana"/>
+          <w:color w:val="000000"/>
+          <w:sz w:val="24"/>
+          <w:szCs w:val="24"/>
+        </w:rPr>
+        <w:t xml:space="preserve"> input number.</w:t>
       </w:r>
     </w:p>
     <w:p>
@@ -764,7 +852,27 @@
           <w:sz w:val="24"/>
           <w:szCs w:val="24"/>
         </w:rPr>
-        <w:t xml:space="preserve">alculate factorial of a </w:t>
+        <w:t xml:space="preserve">alculate factorial of </w:t>
+      </w:r>
+      <w:proofErr w:type="gramStart"/>
+      <w:r>
+        <w:rPr>
+          <w:rFonts w:ascii="Verdana" w:hAnsi="Verdana"/>
+          <w:color w:val="000000"/>
+          <w:sz w:val="24"/>
+          <w:szCs w:val="24"/>
+        </w:rPr>
+        <w:t>a</w:t>
+      </w:r>
+      <w:proofErr w:type="gramEnd"/>
+      <w:r>
+        <w:rPr>
+          <w:rFonts w:ascii="Verdana" w:hAnsi="Verdana"/>
+          <w:color w:val="000000"/>
+          <w:sz w:val="24"/>
+          <w:szCs w:val="24"/>
+        </w:rPr>
+        <w:t xml:space="preserve"> </w:t>
       </w:r>
       <w:r>
         <w:rPr>
@@ -947,7 +1055,27 @@
           <w:sz w:val="24"/>
           <w:szCs w:val="24"/>
         </w:rPr>
-        <w:t>Write a java to count and sum of digits in a input number.</w:t>
+        <w:t xml:space="preserve">Write a java to count and sum of digits in </w:t>
+      </w:r>
+      <w:proofErr w:type="gramStart"/>
+      <w:r>
+        <w:rPr>
+          <w:rFonts w:ascii="Verdana" w:hAnsi="Verdana"/>
+          <w:color w:val="000000"/>
+          <w:sz w:val="24"/>
+          <w:szCs w:val="24"/>
+        </w:rPr>
+        <w:t>a</w:t>
+      </w:r>
+      <w:proofErr w:type="gramEnd"/>
+      <w:r>
+        <w:rPr>
+          <w:rFonts w:ascii="Verdana" w:hAnsi="Verdana"/>
+          <w:color w:val="000000"/>
+          <w:sz w:val="24"/>
+          <w:szCs w:val="24"/>
+        </w:rPr>
+        <w:t xml:space="preserve"> input number.</w:t>
       </w:r>
     </w:p>
     <w:p>
@@ -1094,6 +1222,7 @@
         <w:t xml:space="preserve">Write a program to reverse the order of words in a string entered, for </w:t>
       </w:r>
       <w:proofErr w:type="spellStart"/>
+      <w:proofErr w:type="gramStart"/>
       <w:r>
         <w:rPr>
           <w:rFonts w:ascii="Verdana" w:hAnsi="Verdana"/>
@@ -1111,7 +1240,37 @@
           <w:sz w:val="24"/>
           <w:szCs w:val="24"/>
         </w:rPr>
-        <w:t xml:space="preserve"> : I am Ram  to  Ram am I </w:t>
+        <w:t xml:space="preserve"> :</w:t>
+      </w:r>
+      <w:proofErr w:type="gramEnd"/>
+      <w:r>
+        <w:rPr>
+          <w:rFonts w:ascii="Verdana" w:hAnsi="Verdana"/>
+          <w:color w:val="000000"/>
+          <w:sz w:val="24"/>
+          <w:szCs w:val="24"/>
+        </w:rPr>
+        <w:t xml:space="preserve"> I am </w:t>
+      </w:r>
+      <w:proofErr w:type="gramStart"/>
+      <w:r>
+        <w:rPr>
+          <w:rFonts w:ascii="Verdana" w:hAnsi="Verdana"/>
+          <w:color w:val="000000"/>
+          <w:sz w:val="24"/>
+          <w:szCs w:val="24"/>
+        </w:rPr>
+        <w:t>Ram  to</w:t>
+      </w:r>
+      <w:proofErr w:type="gramEnd"/>
+      <w:r>
+        <w:rPr>
+          <w:rFonts w:ascii="Verdana" w:hAnsi="Verdana"/>
+          <w:color w:val="000000"/>
+          <w:sz w:val="24"/>
+          <w:szCs w:val="24"/>
+        </w:rPr>
+        <w:t xml:space="preserve">  Ram am I </w:t>
       </w:r>
     </w:p>
     <w:p>
@@ -1771,17 +1930,48 @@
           <w:sz w:val="24"/>
           <w:szCs w:val="24"/>
         </w:rPr>
-        <w:t>Day 08</w:t>
-      </w:r>
-      <w:r>
-        <w:rPr>
-          <w:rFonts w:ascii="Verdana" w:hAnsi="Verdana"/>
-          <w:color w:val="000000"/>
-          <w:sz w:val="24"/>
-          <w:szCs w:val="24"/>
-        </w:rPr>
-        <w:t>( stop condition value-based vs count-based )</w:t>
-      </w:r>
+        <w:t xml:space="preserve">Day </w:t>
+      </w:r>
+      <w:proofErr w:type="gramStart"/>
+      <w:r>
+        <w:rPr>
+          <w:rFonts w:ascii="Verdana" w:hAnsi="Verdana"/>
+          <w:color w:val="000000"/>
+          <w:sz w:val="24"/>
+          <w:szCs w:val="24"/>
+        </w:rPr>
+        <w:t>08</w:t>
+      </w:r>
+      <w:r>
+        <w:rPr>
+          <w:rFonts w:ascii="Verdana" w:hAnsi="Verdana"/>
+          <w:color w:val="000000"/>
+          <w:sz w:val="24"/>
+          <w:szCs w:val="24"/>
+        </w:rPr>
+        <w:t>( stop</w:t>
+      </w:r>
+      <w:proofErr w:type="gramEnd"/>
+      <w:r>
+        <w:rPr>
+          <w:rFonts w:ascii="Verdana" w:hAnsi="Verdana"/>
+          <w:color w:val="000000"/>
+          <w:sz w:val="24"/>
+          <w:szCs w:val="24"/>
+        </w:rPr>
+        <w:t xml:space="preserve"> condition value-based vs count-</w:t>
+      </w:r>
+      <w:proofErr w:type="gramStart"/>
+      <w:r>
+        <w:rPr>
+          <w:rFonts w:ascii="Verdana" w:hAnsi="Verdana"/>
+          <w:color w:val="000000"/>
+          <w:sz w:val="24"/>
+          <w:szCs w:val="24"/>
+        </w:rPr>
+        <w:t>based )</w:t>
+      </w:r>
+      <w:proofErr w:type="gramEnd"/>
     </w:p>
     <w:p>
       <w:pPr>
@@ -2124,7 +2314,17 @@
           <w:sz w:val="24"/>
           <w:szCs w:val="24"/>
         </w:rPr>
-        <w:t xml:space="preserve"> it contains.</w:t>
+        <w:t xml:space="preserve"> it </w:t>
+      </w:r>
+      <w:proofErr w:type="gramStart"/>
+      <w:r>
+        <w:rPr>
+          <w:rFonts w:ascii="Verdana" w:hAnsi="Verdana"/>
+          <w:color w:val="000000"/>
+          <w:sz w:val="24"/>
+          <w:szCs w:val="24"/>
+        </w:rPr>
+        <w:t>contains.</w:t>
       </w:r>
       <w:r>
         <w:rPr>
@@ -2135,6 +2335,7 @@
         </w:rPr>
         <w:t>(</w:t>
       </w:r>
+      <w:proofErr w:type="gramEnd"/>
       <w:r>
         <w:rPr>
           <w:rFonts w:asciiTheme="minorHAnsi" w:eastAsiaTheme="minorHAnsi" w:hAnsiTheme="minorHAnsi" w:cstheme="minorBidi"/>
@@ -2196,88 +2397,9 @@
           <w:sz w:val="24"/>
           <w:szCs w:val="24"/>
         </w:rPr>
-        <w:t>using loop only</w:t>
-      </w:r>
-      <w:r>
-        <w:rPr>
-          <w:rFonts w:ascii="Verdana" w:hAnsi="Verdana"/>
-          <w:color w:val="000000"/>
-          <w:sz w:val="24"/>
-          <w:szCs w:val="24"/>
-        </w:rPr>
-        <w:t>.</w:t>
-      </w:r>
-      <w:r>
-        <w:rPr>
-          <w:rFonts w:ascii="Verdana" w:hAnsi="Verdana"/>
-          <w:color w:val="000000"/>
-          <w:sz w:val="24"/>
-          <w:szCs w:val="24"/>
-        </w:rPr>
-        <w:t xml:space="preserve">(No </w:t>
-      </w:r>
-      <w:proofErr w:type="spellStart"/>
-      <w:r>
-        <w:rPr>
-          <w:rFonts w:ascii="Verdana" w:hAnsi="Verdana"/>
-          <w:color w:val="000000"/>
-          <w:sz w:val="24"/>
-          <w:szCs w:val="24"/>
-        </w:rPr>
-        <w:t>Stringbuilder</w:t>
-      </w:r>
-      <w:proofErr w:type="spellEnd"/>
-      <w:r>
-        <w:rPr>
-          <w:rFonts w:ascii="Verdana" w:hAnsi="Verdana"/>
-          <w:color w:val="000000"/>
-          <w:sz w:val="24"/>
-          <w:szCs w:val="24"/>
-        </w:rPr>
-        <w:t>) (</w:t>
-      </w:r>
-      <w:r>
-        <w:rPr>
-          <w:rFonts w:ascii="Verdana" w:hAnsi="Verdana"/>
-          <w:color w:val="000000"/>
-          <w:sz w:val="24"/>
-          <w:szCs w:val="24"/>
-        </w:rPr>
-        <w:t>Index control + backward traversal</w:t>
-      </w:r>
-      <w:r>
-        <w:rPr>
-          <w:rFonts w:ascii="Verdana" w:hAnsi="Verdana"/>
-          <w:color w:val="000000"/>
-          <w:sz w:val="24"/>
-          <w:szCs w:val="24"/>
-        </w:rPr>
-        <w:t>)</w:t>
-      </w:r>
-    </w:p>
-    <w:p>
-      <w:pPr>
-        <w:pStyle w:val="max2"/>
-        <w:numPr>
-          <w:ilvl w:val="0"/>
-          <w:numId w:val="14"/>
-        </w:numPr>
-        <w:rPr>
-          <w:rFonts w:ascii="Verdana" w:hAnsi="Verdana"/>
-          <w:color w:val="000000"/>
-          <w:sz w:val="24"/>
-          <w:szCs w:val="24"/>
-        </w:rPr>
-      </w:pPr>
-      <w:r>
-        <w:rPr>
-          <w:rFonts w:ascii="Verdana" w:hAnsi="Verdana"/>
-          <w:color w:val="000000"/>
-          <w:sz w:val="24"/>
-          <w:szCs w:val="24"/>
-        </w:rPr>
-        <w:t xml:space="preserve">From an integer array, count how many elements are </w:t>
-      </w:r>
+        <w:t xml:space="preserve">using loop </w:t>
+      </w:r>
+      <w:proofErr w:type="gramStart"/>
       <w:r>
         <w:rPr>
           <w:rFonts w:ascii="Verdana" w:hAnsi="Verdana"/>
@@ -2287,7 +2409,7 @@
           <w:sz w:val="24"/>
           <w:szCs w:val="24"/>
         </w:rPr>
-        <w:t>greater than 50</w:t>
+        <w:t>only</w:t>
       </w:r>
       <w:r>
         <w:rPr>
@@ -2307,6 +2429,120 @@
         </w:rPr>
         <w:t>(</w:t>
       </w:r>
+      <w:proofErr w:type="gramEnd"/>
+      <w:r>
+        <w:rPr>
+          <w:rFonts w:ascii="Verdana" w:hAnsi="Verdana"/>
+          <w:color w:val="000000"/>
+          <w:sz w:val="24"/>
+          <w:szCs w:val="24"/>
+        </w:rPr>
+        <w:t xml:space="preserve">No </w:t>
+      </w:r>
+      <w:proofErr w:type="spellStart"/>
+      <w:r>
+        <w:rPr>
+          <w:rFonts w:ascii="Verdana" w:hAnsi="Verdana"/>
+          <w:color w:val="000000"/>
+          <w:sz w:val="24"/>
+          <w:szCs w:val="24"/>
+        </w:rPr>
+        <w:t>Stringbuilder</w:t>
+      </w:r>
+      <w:proofErr w:type="spellEnd"/>
+      <w:r>
+        <w:rPr>
+          <w:rFonts w:ascii="Verdana" w:hAnsi="Verdana"/>
+          <w:color w:val="000000"/>
+          <w:sz w:val="24"/>
+          <w:szCs w:val="24"/>
+        </w:rPr>
+        <w:t>) (</w:t>
+      </w:r>
+      <w:r>
+        <w:rPr>
+          <w:rFonts w:ascii="Verdana" w:hAnsi="Verdana"/>
+          <w:color w:val="000000"/>
+          <w:sz w:val="24"/>
+          <w:szCs w:val="24"/>
+        </w:rPr>
+        <w:t>Index control + backward traversal</w:t>
+      </w:r>
+      <w:r>
+        <w:rPr>
+          <w:rFonts w:ascii="Verdana" w:hAnsi="Verdana"/>
+          <w:color w:val="000000"/>
+          <w:sz w:val="24"/>
+          <w:szCs w:val="24"/>
+        </w:rPr>
+        <w:t>)</w:t>
+      </w:r>
+    </w:p>
+    <w:p>
+      <w:pPr>
+        <w:pStyle w:val="max2"/>
+        <w:numPr>
+          <w:ilvl w:val="0"/>
+          <w:numId w:val="14"/>
+        </w:numPr>
+        <w:rPr>
+          <w:rFonts w:ascii="Verdana" w:hAnsi="Verdana"/>
+          <w:color w:val="000000"/>
+          <w:sz w:val="24"/>
+          <w:szCs w:val="24"/>
+        </w:rPr>
+      </w:pPr>
+      <w:r>
+        <w:rPr>
+          <w:rFonts w:ascii="Verdana" w:hAnsi="Verdana"/>
+          <w:color w:val="000000"/>
+          <w:sz w:val="24"/>
+          <w:szCs w:val="24"/>
+        </w:rPr>
+        <w:t xml:space="preserve">From an integer array, count how many elements are </w:t>
+      </w:r>
+      <w:r>
+        <w:rPr>
+          <w:rFonts w:ascii="Verdana" w:hAnsi="Verdana"/>
+          <w:b/>
+          <w:bCs/>
+          <w:color w:val="000000"/>
+          <w:sz w:val="24"/>
+          <w:szCs w:val="24"/>
+        </w:rPr>
+        <w:t xml:space="preserve">greater than </w:t>
+      </w:r>
+      <w:proofErr w:type="gramStart"/>
+      <w:r>
+        <w:rPr>
+          <w:rFonts w:ascii="Verdana" w:hAnsi="Verdana"/>
+          <w:b/>
+          <w:bCs/>
+          <w:color w:val="000000"/>
+          <w:sz w:val="24"/>
+          <w:szCs w:val="24"/>
+        </w:rPr>
+        <w:t>50</w:t>
+      </w:r>
+      <w:r>
+        <w:rPr>
+          <w:rFonts w:ascii="Verdana" w:hAnsi="Verdana"/>
+          <w:color w:val="000000"/>
+          <w:sz w:val="24"/>
+          <w:szCs w:val="24"/>
+        </w:rPr>
+        <w:t>.</w:t>
+      </w:r>
+      <w:r>
+        <w:rPr>
+          <w:rFonts w:ascii="Verdana" w:hAnsi="Verdana"/>
+          <w:color w:val="000000"/>
+          <w:sz w:val="24"/>
+          <w:szCs w:val="24"/>
+        </w:rPr>
+        <w:t>(</w:t>
+      </w:r>
+      <w:proofErr w:type="gramEnd"/>
       <w:r>
         <w:rPr>
           <w:rFonts w:asciiTheme="minorHAnsi" w:eastAsiaTheme="minorHAnsi" w:hAnsiTheme="minorHAnsi" w:cstheme="minorBidi"/>
@@ -2421,7 +2657,17 @@
           <w:sz w:val="24"/>
           <w:szCs w:val="24"/>
         </w:rPr>
-        <w:t>Count Even Digits in Each Array Element</w:t>
+        <w:t xml:space="preserve">Count Even Digits in Each Array </w:t>
+      </w:r>
+      <w:proofErr w:type="gramStart"/>
+      <w:r>
+        <w:rPr>
+          <w:rFonts w:ascii="Verdana" w:hAnsi="Verdana"/>
+          <w:color w:val="000000"/>
+          <w:sz w:val="24"/>
+          <w:szCs w:val="24"/>
+        </w:rPr>
+        <w:t>Element</w:t>
       </w:r>
       <w:r>
         <w:rPr>
@@ -2432,6 +2678,7 @@
         </w:rPr>
         <w:t>.(</w:t>
       </w:r>
+      <w:proofErr w:type="gramEnd"/>
       <w:r>
         <w:rPr>
           <w:rFonts w:asciiTheme="minorHAnsi" w:eastAsiaTheme="minorHAnsi" w:hAnsiTheme="minorHAnsi" w:cstheme="minorBidi"/>
@@ -2485,6 +2732,7 @@
         <w:t xml:space="preserve">Traverse an </w:t>
       </w:r>
       <w:proofErr w:type="spellStart"/>
+      <w:proofErr w:type="gramStart"/>
       <w:r>
         <w:rPr>
           <w:rFonts w:ascii="Verdana" w:hAnsi="Verdana"/>
@@ -2495,6 +2743,7 @@
         <w:t>array.If</w:t>
       </w:r>
       <w:proofErr w:type="spellEnd"/>
+      <w:proofErr w:type="gramEnd"/>
       <w:r>
         <w:rPr>
           <w:rFonts w:ascii="Verdana" w:hAnsi="Verdana"/>
@@ -2522,7 +2771,17 @@
           <w:sz w:val="24"/>
           <w:szCs w:val="24"/>
         </w:rPr>
-        <w:t>, stop immediately.</w:t>
+        <w:t xml:space="preserve">, stop </w:t>
+      </w:r>
+      <w:proofErr w:type="gramStart"/>
+      <w:r>
+        <w:rPr>
+          <w:rFonts w:ascii="Verdana" w:hAnsi="Verdana"/>
+          <w:color w:val="000000"/>
+          <w:sz w:val="24"/>
+          <w:szCs w:val="24"/>
+        </w:rPr>
+        <w:t>immediately.</w:t>
       </w:r>
       <w:r>
         <w:rPr>
@@ -2533,6 +2792,7 @@
         </w:rPr>
         <w:t>(</w:t>
       </w:r>
+      <w:proofErr w:type="gramEnd"/>
       <w:r>
         <w:rPr>
           <w:rFonts w:asciiTheme="minorHAnsi" w:eastAsiaTheme="minorHAnsi" w:hAnsiTheme="minorHAnsi" w:cstheme="minorBidi"/>
@@ -2677,7 +2937,17 @@
           <w:sz w:val="24"/>
           <w:szCs w:val="24"/>
         </w:rPr>
-        <w:t xml:space="preserve"> in a string</w:t>
+        <w:t xml:space="preserve"> in a </w:t>
+      </w:r>
+      <w:proofErr w:type="gramStart"/>
+      <w:r>
+        <w:rPr>
+          <w:rFonts w:ascii="Verdana" w:hAnsi="Verdana"/>
+          <w:color w:val="000000"/>
+          <w:sz w:val="24"/>
+          <w:szCs w:val="24"/>
+        </w:rPr>
+        <w:t>string</w:t>
       </w:r>
       <w:r>
         <w:rPr>
@@ -2697,6 +2967,7 @@
         </w:rPr>
         <w:t>(</w:t>
       </w:r>
+      <w:proofErr w:type="gramEnd"/>
       <w:r>
         <w:rPr>
           <w:rFonts w:asciiTheme="minorHAnsi" w:eastAsiaTheme="minorHAnsi" w:hAnsiTheme="minorHAnsi" w:cstheme="minorBidi"/>
@@ -2764,7 +3035,19 @@
           <w:sz w:val="24"/>
           <w:szCs w:val="24"/>
         </w:rPr>
-        <w:t>without using reverse methods</w:t>
+        <w:t xml:space="preserve">without using reverse </w:t>
+      </w:r>
+      <w:proofErr w:type="gramStart"/>
+      <w:r>
+        <w:rPr>
+          <w:rFonts w:ascii="Verdana" w:hAnsi="Verdana"/>
+          <w:b/>
+          <w:bCs/>
+          <w:color w:val="000000"/>
+          <w:sz w:val="24"/>
+          <w:szCs w:val="24"/>
+        </w:rPr>
+        <w:t>methods</w:t>
       </w:r>
       <w:r>
         <w:rPr>
@@ -2784,6 +3067,7 @@
         </w:rPr>
         <w:t>(</w:t>
       </w:r>
+      <w:proofErr w:type="gramEnd"/>
       <w:r>
         <w:rPr>
           <w:rFonts w:asciiTheme="minorHAnsi" w:eastAsiaTheme="minorHAnsi" w:hAnsiTheme="minorHAnsi" w:cstheme="minorBidi"/>
@@ -2834,7 +3118,17 @@
           <w:sz w:val="24"/>
           <w:szCs w:val="24"/>
         </w:rPr>
-        <w:t>Given an array and a number x, count how many times x appears.</w:t>
+        <w:t xml:space="preserve">Given an array and a number x, count how many times x </w:t>
+      </w:r>
+      <w:proofErr w:type="gramStart"/>
+      <w:r>
+        <w:rPr>
+          <w:rFonts w:ascii="Verdana" w:hAnsi="Verdana"/>
+          <w:color w:val="000000"/>
+          <w:sz w:val="24"/>
+          <w:szCs w:val="24"/>
+        </w:rPr>
+        <w:t>appears.</w:t>
       </w:r>
       <w:r>
         <w:rPr>
@@ -2845,6 +3139,7 @@
         </w:rPr>
         <w:t>(</w:t>
       </w:r>
+      <w:proofErr w:type="gramEnd"/>
       <w:r>
         <w:rPr>
           <w:rFonts w:asciiTheme="minorHAnsi" w:eastAsiaTheme="minorHAnsi" w:hAnsiTheme="minorHAnsi" w:cstheme="minorBidi"/>
@@ -2906,7 +3201,19 @@
           <w:sz w:val="24"/>
           <w:szCs w:val="24"/>
         </w:rPr>
-        <w:t>ascending order</w:t>
+        <w:t xml:space="preserve">ascending </w:t>
+      </w:r>
+      <w:proofErr w:type="gramStart"/>
+      <w:r>
+        <w:rPr>
+          <w:rFonts w:ascii="Verdana" w:hAnsi="Verdana"/>
+          <w:b/>
+          <w:bCs/>
+          <w:color w:val="000000"/>
+          <w:sz w:val="24"/>
+          <w:szCs w:val="24"/>
+        </w:rPr>
+        <w:t>order</w:t>
       </w:r>
       <w:r>
         <w:rPr>
@@ -2926,6 +3233,7 @@
         </w:rPr>
         <w:t>(</w:t>
       </w:r>
+      <w:proofErr w:type="gramEnd"/>
       <w:r>
         <w:rPr>
           <w:rFonts w:asciiTheme="minorHAnsi" w:eastAsiaTheme="minorHAnsi" w:hAnsiTheme="minorHAnsi" w:cstheme="minorBidi"/>
@@ -2987,7 +3295,19 @@
           <w:sz w:val="24"/>
           <w:szCs w:val="24"/>
         </w:rPr>
-        <w:t>sum of digits of each element</w:t>
+        <w:t xml:space="preserve">sum of digits of each </w:t>
+      </w:r>
+      <w:proofErr w:type="gramStart"/>
+      <w:r>
+        <w:rPr>
+          <w:rFonts w:ascii="Verdana" w:hAnsi="Verdana"/>
+          <w:b/>
+          <w:bCs/>
+          <w:color w:val="000000"/>
+          <w:sz w:val="24"/>
+          <w:szCs w:val="24"/>
+        </w:rPr>
+        <w:t>element</w:t>
       </w:r>
       <w:r>
         <w:rPr>
@@ -3007,6 +3327,7 @@
         </w:rPr>
         <w:t>(</w:t>
       </w:r>
+      <w:proofErr w:type="gramEnd"/>
       <w:r>
         <w:rPr>
           <w:rFonts w:asciiTheme="minorHAnsi" w:eastAsiaTheme="minorHAnsi" w:hAnsiTheme="minorHAnsi" w:cstheme="minorBidi"/>
@@ -3077,7 +3398,17 @@
           <w:sz w:val="24"/>
           <w:szCs w:val="24"/>
         </w:rPr>
-        <w:t>, then stop.</w:t>
+        <w:t xml:space="preserve">, then </w:t>
+      </w:r>
+      <w:proofErr w:type="gramStart"/>
+      <w:r>
+        <w:rPr>
+          <w:rFonts w:ascii="Verdana" w:hAnsi="Verdana"/>
+          <w:color w:val="000000"/>
+          <w:sz w:val="24"/>
+          <w:szCs w:val="24"/>
+        </w:rPr>
+        <w:t>stop.</w:t>
       </w:r>
       <w:r>
         <w:rPr>
@@ -3088,6 +3419,7 @@
         </w:rPr>
         <w:t>(</w:t>
       </w:r>
+      <w:proofErr w:type="gramEnd"/>
       <w:r>
         <w:rPr>
           <w:rFonts w:asciiTheme="minorHAnsi" w:eastAsiaTheme="minorHAnsi" w:hAnsiTheme="minorHAnsi" w:cstheme="minorBidi"/>
@@ -3158,7 +3490,27 @@
           <w:sz w:val="24"/>
           <w:szCs w:val="24"/>
         </w:rPr>
-        <w:t xml:space="preserve">Write a program to find out whether entered number is place at ones, tens, hundred , thousand </w:t>
+        <w:t xml:space="preserve">Write a program to find out whether entered number is place at ones, tens, </w:t>
+      </w:r>
+      <w:proofErr w:type="gramStart"/>
+      <w:r>
+        <w:rPr>
+          <w:rFonts w:ascii="Verdana" w:hAnsi="Verdana"/>
+          <w:color w:val="000000"/>
+          <w:sz w:val="24"/>
+          <w:szCs w:val="24"/>
+        </w:rPr>
+        <w:t>hundred ,</w:t>
+      </w:r>
+      <w:proofErr w:type="gramEnd"/>
+      <w:r>
+        <w:rPr>
+          <w:rFonts w:ascii="Verdana" w:hAnsi="Verdana"/>
+          <w:color w:val="000000"/>
+          <w:sz w:val="24"/>
+          <w:szCs w:val="24"/>
+        </w:rPr>
+        <w:t xml:space="preserve"> thousand </w:t>
       </w:r>
       <w:proofErr w:type="spellStart"/>
       <w:r>
@@ -3202,7 +3554,27 @@
           <w:sz w:val="24"/>
           <w:szCs w:val="24"/>
         </w:rPr>
-        <w:t xml:space="preserve">Write a program to take a string and a number / integer as prefix for that word or string , and in output just reverse string </w:t>
+        <w:t xml:space="preserve">Write a program to take a string and a number / integer as prefix for that word or </w:t>
+      </w:r>
+      <w:proofErr w:type="gramStart"/>
+      <w:r>
+        <w:rPr>
+          <w:rFonts w:ascii="Verdana" w:hAnsi="Verdana"/>
+          <w:color w:val="000000"/>
+          <w:sz w:val="24"/>
+          <w:szCs w:val="24"/>
+        </w:rPr>
+        <w:t>string ,</w:t>
+      </w:r>
+      <w:proofErr w:type="gramEnd"/>
+      <w:r>
+        <w:rPr>
+          <w:rFonts w:ascii="Verdana" w:hAnsi="Verdana"/>
+          <w:color w:val="000000"/>
+          <w:sz w:val="24"/>
+          <w:szCs w:val="24"/>
+        </w:rPr>
+        <w:t xml:space="preserve"> and in output just reverse string </w:t>
       </w:r>
       <w:proofErr w:type="spellStart"/>
       <w:r>
@@ -3222,16 +3594,56 @@
           <w:sz w:val="24"/>
           <w:szCs w:val="24"/>
         </w:rPr>
-        <w:t xml:space="preserve"> that integer position part, or that prefix part.</w:t>
-      </w:r>
-      <w:r>
-        <w:rPr>
-          <w:rFonts w:ascii="Verdana" w:hAnsi="Verdana"/>
-          <w:color w:val="000000"/>
-          <w:sz w:val="24"/>
-          <w:szCs w:val="24"/>
-        </w:rPr>
-        <w:t>(Practice confusion with size of an array to index of an array ).</w:t>
+        <w:t xml:space="preserve"> that integer position part, or that prefix </w:t>
+      </w:r>
+      <w:proofErr w:type="gramStart"/>
+      <w:r>
+        <w:rPr>
+          <w:rFonts w:ascii="Verdana" w:hAnsi="Verdana"/>
+          <w:color w:val="000000"/>
+          <w:sz w:val="24"/>
+          <w:szCs w:val="24"/>
+        </w:rPr>
+        <w:t>part.</w:t>
+      </w:r>
+      <w:r>
+        <w:rPr>
+          <w:rFonts w:ascii="Verdana" w:hAnsi="Verdana"/>
+          <w:color w:val="000000"/>
+          <w:sz w:val="24"/>
+          <w:szCs w:val="24"/>
+        </w:rPr>
+        <w:t>(</w:t>
+      </w:r>
+      <w:proofErr w:type="gramEnd"/>
+      <w:r>
+        <w:rPr>
+          <w:rFonts w:ascii="Verdana" w:hAnsi="Verdana"/>
+          <w:color w:val="000000"/>
+          <w:sz w:val="24"/>
+          <w:szCs w:val="24"/>
+        </w:rPr>
+        <w:t xml:space="preserve">Practice confusion with size of an array to index of an </w:t>
+      </w:r>
+      <w:proofErr w:type="gramStart"/>
+      <w:r>
+        <w:rPr>
+          <w:rFonts w:ascii="Verdana" w:hAnsi="Verdana"/>
+          <w:color w:val="000000"/>
+          <w:sz w:val="24"/>
+          <w:szCs w:val="24"/>
+        </w:rPr>
+        <w:t>array )</w:t>
+      </w:r>
+      <w:proofErr w:type="gramEnd"/>
+      <w:r>
+        <w:rPr>
+          <w:rFonts w:ascii="Verdana" w:hAnsi="Verdana"/>
+          <w:color w:val="000000"/>
+          <w:sz w:val="24"/>
+          <w:szCs w:val="24"/>
+        </w:rPr>
+        <w:t>.</w:t>
       </w:r>
     </w:p>
     <w:p>
@@ -3255,7 +3667,17 @@
           <w:sz w:val="24"/>
           <w:szCs w:val="24"/>
         </w:rPr>
-        <w:t>Count Words in a String (Single Spaces Only)</w:t>
+        <w:t>Count Words in a String (Single Spaces Only</w:t>
+      </w:r>
+      <w:proofErr w:type="gramStart"/>
+      <w:r>
+        <w:rPr>
+          <w:rFonts w:ascii="Verdana" w:hAnsi="Verdana"/>
+          <w:color w:val="000000"/>
+          <w:sz w:val="24"/>
+          <w:szCs w:val="24"/>
+        </w:rPr>
+        <w:t>)</w:t>
       </w:r>
       <w:r>
         <w:rPr>
@@ -3266,6 +3688,7 @@
         </w:rPr>
         <w:t>.(</w:t>
       </w:r>
+      <w:proofErr w:type="gramEnd"/>
       <w:r>
         <w:rPr>
           <w:rFonts w:asciiTheme="minorHAnsi" w:eastAsiaTheme="minorHAnsi" w:hAnsiTheme="minorHAnsi" w:cstheme="minorBidi"/>
@@ -3341,7 +3764,17 @@
           <w:szCs w:val="24"/>
         </w:rPr>
         <w:lastRenderedPageBreak/>
-        <w:t>Given a string, remove all numeric characters and print the result.</w:t>
+        <w:t xml:space="preserve">Given a string, remove all numeric characters and print the </w:t>
+      </w:r>
+      <w:proofErr w:type="gramStart"/>
+      <w:r>
+        <w:rPr>
+          <w:rFonts w:ascii="Verdana" w:hAnsi="Verdana"/>
+          <w:color w:val="000000"/>
+          <w:sz w:val="24"/>
+          <w:szCs w:val="24"/>
+        </w:rPr>
+        <w:t>result.</w:t>
       </w:r>
       <w:r>
         <w:rPr>
@@ -3352,6 +3785,7 @@
         </w:rPr>
         <w:t>(</w:t>
       </w:r>
+      <w:proofErr w:type="gramEnd"/>
       <w:r>
         <w:rPr>
           <w:rFonts w:asciiTheme="minorHAnsi" w:eastAsiaTheme="minorHAnsi" w:hAnsiTheme="minorHAnsi" w:cstheme="minorBidi"/>
@@ -3449,25 +3883,55 @@
           <w:sz w:val="24"/>
           <w:szCs w:val="24"/>
         </w:rPr>
-        <w:t>Find (maximum – minimum)</w:t>
-      </w:r>
-      <w:r>
-        <w:rPr>
-          <w:rFonts w:ascii="Verdana" w:hAnsi="Verdana"/>
-          <w:color w:val="000000"/>
-          <w:sz w:val="24"/>
-          <w:szCs w:val="24"/>
-        </w:rPr>
-        <w:t>difference between MAX and MIN</w:t>
-      </w:r>
-      <w:r>
-        <w:rPr>
-          <w:rFonts w:ascii="Verdana" w:hAnsi="Verdana"/>
-          <w:color w:val="000000"/>
-          <w:sz w:val="24"/>
-          <w:szCs w:val="24"/>
-        </w:rPr>
-        <w:t xml:space="preserve"> from an integer array.</w:t>
+        <w:t xml:space="preserve">Find (maximum – </w:t>
+      </w:r>
+      <w:proofErr w:type="gramStart"/>
+      <w:r>
+        <w:rPr>
+          <w:rFonts w:ascii="Verdana" w:hAnsi="Verdana"/>
+          <w:color w:val="000000"/>
+          <w:sz w:val="24"/>
+          <w:szCs w:val="24"/>
+        </w:rPr>
+        <w:t>minimum)</w:t>
+      </w:r>
+      <w:r>
+        <w:rPr>
+          <w:rFonts w:ascii="Verdana" w:hAnsi="Verdana"/>
+          <w:color w:val="000000"/>
+          <w:sz w:val="24"/>
+          <w:szCs w:val="24"/>
+        </w:rPr>
+        <w:t>difference</w:t>
+      </w:r>
+      <w:proofErr w:type="gramEnd"/>
+      <w:r>
+        <w:rPr>
+          <w:rFonts w:ascii="Verdana" w:hAnsi="Verdana"/>
+          <w:color w:val="000000"/>
+          <w:sz w:val="24"/>
+          <w:szCs w:val="24"/>
+        </w:rPr>
+        <w:t xml:space="preserve"> between MAX and MIN</w:t>
+      </w:r>
+      <w:r>
+        <w:rPr>
+          <w:rFonts w:ascii="Verdana" w:hAnsi="Verdana"/>
+          <w:color w:val="000000"/>
+          <w:sz w:val="24"/>
+          <w:szCs w:val="24"/>
+        </w:rPr>
+        <w:t xml:space="preserve"> from an integer </w:t>
+      </w:r>
+      <w:proofErr w:type="gramStart"/>
+      <w:r>
+        <w:rPr>
+          <w:rFonts w:ascii="Verdana" w:hAnsi="Verdana"/>
+          <w:color w:val="000000"/>
+          <w:sz w:val="24"/>
+          <w:szCs w:val="24"/>
+        </w:rPr>
+        <w:t>array.</w:t>
       </w:r>
       <w:r>
         <w:rPr>
@@ -3478,6 +3942,7 @@
         </w:rPr>
         <w:t>(</w:t>
       </w:r>
+      <w:proofErr w:type="gramEnd"/>
       <w:r>
         <w:rPr>
           <w:rFonts w:asciiTheme="minorHAnsi" w:eastAsiaTheme="minorHAnsi" w:hAnsiTheme="minorHAnsi" w:cstheme="minorBidi"/>
@@ -3539,7 +4004,19 @@
           <w:sz w:val="24"/>
           <w:szCs w:val="24"/>
         </w:rPr>
-        <w:t>without using extra array</w:t>
+        <w:t xml:space="preserve">without using extra </w:t>
+      </w:r>
+      <w:proofErr w:type="gramStart"/>
+      <w:r>
+        <w:rPr>
+          <w:rFonts w:ascii="Verdana" w:hAnsi="Verdana"/>
+          <w:b/>
+          <w:bCs/>
+          <w:color w:val="000000"/>
+          <w:sz w:val="24"/>
+          <w:szCs w:val="24"/>
+        </w:rPr>
+        <w:t>array</w:t>
       </w:r>
       <w:r>
         <w:rPr>
@@ -3559,6 +4036,7 @@
         </w:rPr>
         <w:t>(</w:t>
       </w:r>
+      <w:proofErr w:type="gramEnd"/>
       <w:r>
         <w:rPr>
           <w:rFonts w:asciiTheme="minorHAnsi" w:eastAsiaTheme="minorHAnsi" w:hAnsiTheme="minorHAnsi" w:cstheme="minorBidi"/>
@@ -3635,7 +4113,17 @@
           <w:sz w:val="24"/>
           <w:szCs w:val="24"/>
         </w:rPr>
-        <w:t xml:space="preserve"> (2, 3, 5, 7) across all elements.</w:t>
+        <w:t xml:space="preserve"> (2, 3, 5, 7) across all </w:t>
+      </w:r>
+      <w:proofErr w:type="gramStart"/>
+      <w:r>
+        <w:rPr>
+          <w:rFonts w:ascii="Verdana" w:hAnsi="Verdana"/>
+          <w:color w:val="000000"/>
+          <w:sz w:val="24"/>
+          <w:szCs w:val="24"/>
+        </w:rPr>
+        <w:t>elements.</w:t>
       </w:r>
       <w:r>
         <w:rPr>
@@ -3646,6 +4134,7 @@
         </w:rPr>
         <w:t>(</w:t>
       </w:r>
+      <w:proofErr w:type="gramEnd"/>
       <w:r>
         <w:rPr>
           <w:rFonts w:asciiTheme="minorHAnsi" w:eastAsiaTheme="minorHAnsi" w:hAnsiTheme="minorHAnsi" w:cstheme="minorBidi"/>
@@ -3714,7 +4203,17 @@
           <w:sz w:val="24"/>
           <w:szCs w:val="24"/>
         </w:rPr>
-        <w:t>Stop when a string contains "java" (case-insensitive).</w:t>
+        <w:t>Stop when a string contains "java" (case-insensitive</w:t>
+      </w:r>
+      <w:proofErr w:type="gramStart"/>
+      <w:r>
+        <w:rPr>
+          <w:rFonts w:ascii="Verdana" w:hAnsi="Verdana"/>
+          <w:color w:val="000000"/>
+          <w:sz w:val="24"/>
+          <w:szCs w:val="24"/>
+        </w:rPr>
+        <w:t>).</w:t>
       </w:r>
       <w:r>
         <w:rPr>
@@ -3725,6 +4224,7 @@
         </w:rPr>
         <w:t>(</w:t>
       </w:r>
+      <w:proofErr w:type="gramEnd"/>
       <w:r>
         <w:rPr>
           <w:rFonts w:asciiTheme="minorHAnsi" w:eastAsiaTheme="minorHAnsi" w:hAnsiTheme="minorHAnsi" w:cstheme="minorBidi"/>
@@ -3781,6 +4281,18 @@
     <w:p>
       <w:pPr>
         <w:pStyle w:val="max2"/>
+        <w:ind w:left="720"/>
+        <w:rPr>
+          <w:rFonts w:ascii="Verdana" w:hAnsi="Verdana"/>
+          <w:color w:val="000000"/>
+          <w:sz w:val="24"/>
+          <w:szCs w:val="24"/>
+        </w:rPr>
+      </w:pPr>
+    </w:p>
+    <w:p>
+      <w:pPr>
+        <w:pStyle w:val="max2"/>
         <w:rPr>
           <w:rFonts w:ascii="Verdana" w:hAnsi="Verdana"/>
           <w:color w:val="000000"/>
@@ -3821,25 +4333,44 @@
         </w:rPr>
         <w:t xml:space="preserve">Count how many letters are repeated in a string or word, or maybe array of </w:t>
       </w:r>
-      <w:proofErr w:type="spellStart"/>
-      <w:r>
-        <w:rPr>
-          <w:rFonts w:ascii="Verdana" w:hAnsi="Verdana"/>
-          <w:color w:val="000000"/>
-          <w:sz w:val="24"/>
-          <w:szCs w:val="24"/>
-        </w:rPr>
-        <w:t>charcters</w:t>
-      </w:r>
-      <w:proofErr w:type="spellEnd"/>
-      <w:r>
-        <w:rPr>
-          <w:rFonts w:ascii="Verdana" w:hAnsi="Verdana"/>
-          <w:color w:val="000000"/>
-          <w:sz w:val="24"/>
-          <w:szCs w:val="24"/>
-        </w:rPr>
-        <w:t>.</w:t>
+      <w:proofErr w:type="gramStart"/>
+      <w:r>
+        <w:rPr>
+          <w:rFonts w:ascii="Verdana" w:hAnsi="Verdana"/>
+          <w:color w:val="000000"/>
+          <w:sz w:val="24"/>
+          <w:szCs w:val="24"/>
+        </w:rPr>
+        <w:t>characters.(</w:t>
+      </w:r>
+      <w:proofErr w:type="gramEnd"/>
+      <w:r>
+        <w:rPr>
+          <w:rFonts w:asciiTheme="minorHAnsi" w:eastAsiaTheme="minorHAnsi" w:hAnsiTheme="minorHAnsi" w:cstheme="minorBidi"/>
+          <w:kern w:val="2"/>
+          <w:sz w:val="24"/>
+          <w:szCs w:val="21"/>
+          <w14:ligatures w14:val="standardContextual"/>
+        </w:rPr>
+        <w:t xml:space="preserve"> </w:t>
+      </w:r>
+      <w:r>
+        <w:rPr>
+          <w:rFonts w:ascii="Verdana" w:hAnsi="Verdana"/>
+          <w:color w:val="000000"/>
+          <w:sz w:val="24"/>
+          <w:szCs w:val="24"/>
+        </w:rPr>
+        <w:t>Count Total Repetitions in a Word</w:t>
+      </w:r>
+      <w:r>
+        <w:rPr>
+          <w:rFonts w:ascii="Verdana" w:hAnsi="Verdana"/>
+          <w:color w:val="000000"/>
+          <w:sz w:val="24"/>
+          <w:szCs w:val="24"/>
+        </w:rPr>
+        <w:t>)</w:t>
       </w:r>
     </w:p>
     <w:p>
@@ -3880,59 +4411,78 @@
           <w:szCs w:val="24"/>
         </w:rPr>
       </w:pPr>
-    </w:p>
-    <w:p>
-      <w:pPr>
-        <w:pStyle w:val="max2"/>
-        <w:rPr>
-          <w:rFonts w:ascii="Verdana" w:hAnsi="Verdana"/>
-          <w:color w:val="000000"/>
-          <w:sz w:val="24"/>
-          <w:szCs w:val="24"/>
-        </w:rPr>
-      </w:pPr>
-      <w:r>
-        <w:rPr>
-          <w:rFonts w:ascii="Verdana" w:hAnsi="Verdana"/>
-          <w:color w:val="000000"/>
-          <w:sz w:val="24"/>
-          <w:szCs w:val="24"/>
-        </w:rPr>
-        <w:t>Day 1</w:t>
-      </w:r>
-      <w:r>
-        <w:rPr>
-          <w:rFonts w:ascii="Verdana" w:hAnsi="Verdana"/>
-          <w:color w:val="000000"/>
-          <w:sz w:val="24"/>
-          <w:szCs w:val="24"/>
-        </w:rPr>
-        <w:t>5</w:t>
-      </w:r>
-    </w:p>
-    <w:p>
-      <w:pPr>
-        <w:pStyle w:val="max2"/>
-        <w:numPr>
-          <w:ilvl w:val="0"/>
-          <w:numId w:val="6"/>
-        </w:numPr>
-        <w:rPr>
-          <w:rFonts w:ascii="Verdana" w:hAnsi="Verdana"/>
-          <w:color w:val="000000"/>
-          <w:sz w:val="24"/>
-          <w:szCs w:val="24"/>
-        </w:rPr>
-      </w:pPr>
-      <w:r>
-        <w:rPr>
-          <w:rFonts w:ascii="Verdana" w:hAnsi="Verdana"/>
-          <w:color w:val="000000"/>
-          <w:sz w:val="24"/>
-          <w:szCs w:val="24"/>
-        </w:rPr>
-        <w:t xml:space="preserve">Take a sentence and reverse </w:t>
-      </w:r>
+      <w:r>
+        <w:rPr>
+          <w:rFonts w:ascii="Verdana" w:hAnsi="Verdana"/>
+          <w:color w:val="000000"/>
+          <w:sz w:val="24"/>
+          <w:szCs w:val="24"/>
+        </w:rPr>
+        <w:t>Find First Non-Repeating Character</w:t>
+      </w:r>
+      <w:r>
+        <w:rPr>
+          <w:rFonts w:ascii="Verdana" w:hAnsi="Verdana"/>
+          <w:color w:val="000000"/>
+          <w:sz w:val="24"/>
+          <w:szCs w:val="24"/>
+        </w:rPr>
+        <w:t xml:space="preserve"> in a </w:t>
+      </w:r>
+      <w:proofErr w:type="gramStart"/>
+      <w:r>
+        <w:rPr>
+          <w:rFonts w:ascii="Verdana" w:hAnsi="Verdana"/>
+          <w:color w:val="000000"/>
+          <w:sz w:val="24"/>
+          <w:szCs w:val="24"/>
+        </w:rPr>
+        <w:t>word.(</w:t>
+      </w:r>
+      <w:proofErr w:type="gramEnd"/>
+      <w:r>
+        <w:rPr>
+          <w:rFonts w:asciiTheme="minorHAnsi" w:eastAsiaTheme="minorHAnsi" w:hAnsiTheme="minorHAnsi" w:cstheme="minorBidi"/>
+          <w:kern w:val="2"/>
+          <w:sz w:val="24"/>
+          <w:szCs w:val="21"/>
+          <w14:ligatures w14:val="standardContextual"/>
+        </w:rPr>
+        <w:t xml:space="preserve"> </w:t>
+      </w:r>
+      <w:r>
+        <w:rPr>
+          <w:rFonts w:ascii="Verdana" w:hAnsi="Verdana"/>
+          <w:color w:val="000000"/>
+          <w:sz w:val="24"/>
+          <w:szCs w:val="24"/>
+        </w:rPr>
+        <w:t>Nested comparison logic.</w:t>
+      </w:r>
+      <w:r>
+        <w:rPr>
+          <w:rFonts w:ascii="Verdana" w:hAnsi="Verdana"/>
+          <w:color w:val="000000"/>
+          <w:sz w:val="24"/>
+          <w:szCs w:val="24"/>
+        </w:rPr>
+        <w:t>)</w:t>
+      </w:r>
+    </w:p>
+    <w:p>
+      <w:pPr>
+        <w:pStyle w:val="max2"/>
+        <w:numPr>
+          <w:ilvl w:val="0"/>
+          <w:numId w:val="19"/>
+        </w:numPr>
+        <w:rPr>
+          <w:rFonts w:ascii="Verdana" w:hAnsi="Verdana"/>
+          <w:color w:val="000000"/>
+          <w:sz w:val="24"/>
+          <w:szCs w:val="24"/>
+        </w:rPr>
+      </w:pPr>
       <w:r>
         <w:rPr>
           <w:rFonts w:ascii="Verdana" w:hAnsi="Verdana"/>
@@ -3942,6 +4492,503 @@
           <w:sz w:val="24"/>
           <w:szCs w:val="24"/>
         </w:rPr>
+        <w:t>Print each unique value once, when you encounter its last occurrence</w:t>
+      </w:r>
+      <w:r>
+        <w:rPr>
+          <w:rFonts w:ascii="Verdana" w:hAnsi="Verdana"/>
+          <w:color w:val="000000"/>
+          <w:sz w:val="24"/>
+          <w:szCs w:val="24"/>
+        </w:rPr>
+        <w:t>.</w:t>
+      </w:r>
+    </w:p>
+    <w:p>
+      <w:pPr>
+        <w:pStyle w:val="max2"/>
+        <w:numPr>
+          <w:ilvl w:val="0"/>
+          <w:numId w:val="19"/>
+        </w:numPr>
+        <w:rPr>
+          <w:rFonts w:ascii="Verdana" w:hAnsi="Verdana"/>
+          <w:color w:val="000000"/>
+          <w:sz w:val="24"/>
+          <w:szCs w:val="24"/>
+        </w:rPr>
+      </w:pPr>
+      <w:r>
+        <w:rPr>
+          <w:rFonts w:ascii="Verdana" w:hAnsi="Verdana"/>
+          <w:color w:val="000000"/>
+          <w:sz w:val="24"/>
+          <w:szCs w:val="24"/>
+        </w:rPr>
+        <w:t xml:space="preserve">Write a program to count and print unique or non-repeated characters / number in an </w:t>
+      </w:r>
+      <w:proofErr w:type="gramStart"/>
+      <w:r>
+        <w:rPr>
+          <w:rFonts w:ascii="Verdana" w:hAnsi="Verdana"/>
+          <w:color w:val="000000"/>
+          <w:sz w:val="24"/>
+          <w:szCs w:val="24"/>
+        </w:rPr>
+        <w:t>array.(</w:t>
+      </w:r>
+      <w:proofErr w:type="gramEnd"/>
+      <w:r>
+        <w:rPr>
+          <w:rFonts w:ascii="Verdana" w:hAnsi="Verdana"/>
+          <w:b/>
+          <w:bCs/>
+          <w:color w:val="000000"/>
+          <w:sz w:val="24"/>
+          <w:szCs w:val="24"/>
+        </w:rPr>
+        <w:t>Print elements that appear only once in the array</w:t>
+      </w:r>
+      <w:r>
+        <w:rPr>
+          <w:rFonts w:ascii="Verdana" w:hAnsi="Verdana"/>
+          <w:b/>
+          <w:bCs/>
+          <w:color w:val="000000"/>
+          <w:sz w:val="24"/>
+          <w:szCs w:val="24"/>
+        </w:rPr>
+        <w:t>)</w:t>
+      </w:r>
+      <w:r>
+        <w:rPr>
+          <w:rFonts w:ascii="Verdana" w:hAnsi="Verdana"/>
+          <w:color w:val="000000"/>
+          <w:sz w:val="24"/>
+          <w:szCs w:val="24"/>
+        </w:rPr>
+        <w:t>.</w:t>
+      </w:r>
+    </w:p>
+    <w:p>
+      <w:pPr>
+        <w:pStyle w:val="max2"/>
+        <w:numPr>
+          <w:ilvl w:val="0"/>
+          <w:numId w:val="19"/>
+        </w:numPr>
+        <w:rPr>
+          <w:rFonts w:ascii="Verdana" w:hAnsi="Verdana"/>
+          <w:color w:val="000000"/>
+          <w:sz w:val="24"/>
+          <w:szCs w:val="24"/>
+        </w:rPr>
+      </w:pPr>
+    </w:p>
+    <w:p>
+      <w:pPr>
+        <w:pStyle w:val="max2"/>
+        <w:rPr>
+          <w:rFonts w:ascii="Verdana" w:hAnsi="Verdana"/>
+          <w:color w:val="000000"/>
+          <w:sz w:val="24"/>
+          <w:szCs w:val="24"/>
+        </w:rPr>
+      </w:pPr>
+      <w:r>
+        <w:rPr>
+          <w:rFonts w:ascii="Verdana" w:hAnsi="Verdana"/>
+          <w:color w:val="000000"/>
+          <w:sz w:val="24"/>
+          <w:szCs w:val="24"/>
+        </w:rPr>
+        <w:t>Day 15</w:t>
+      </w:r>
+    </w:p>
+    <w:p>
+      <w:pPr>
+        <w:pStyle w:val="max2"/>
+        <w:numPr>
+          <w:ilvl w:val="0"/>
+          <w:numId w:val="20"/>
+        </w:numPr>
+        <w:rPr>
+          <w:rFonts w:ascii="Verdana" w:hAnsi="Verdana"/>
+          <w:color w:val="000000"/>
+          <w:sz w:val="24"/>
+          <w:szCs w:val="24"/>
+        </w:rPr>
+      </w:pPr>
+      <w:r>
+        <w:rPr>
+          <w:rFonts w:ascii="Verdana" w:hAnsi="Verdana"/>
+          <w:color w:val="000000"/>
+          <w:sz w:val="24"/>
+          <w:szCs w:val="24"/>
+        </w:rPr>
+        <w:t xml:space="preserve">Count how many elements are </w:t>
+      </w:r>
+      <w:r>
+        <w:rPr>
+          <w:rFonts w:ascii="Verdana" w:hAnsi="Verdana"/>
+          <w:b/>
+          <w:bCs/>
+          <w:color w:val="000000"/>
+          <w:sz w:val="24"/>
+          <w:szCs w:val="24"/>
+        </w:rPr>
+        <w:t>repeated</w:t>
+      </w:r>
+      <w:r>
+        <w:rPr>
+          <w:rFonts w:ascii="Verdana" w:hAnsi="Verdana"/>
+          <w:color w:val="000000"/>
+          <w:sz w:val="24"/>
+          <w:szCs w:val="24"/>
+        </w:rPr>
+        <w:t xml:space="preserve"> in an </w:t>
+      </w:r>
+      <w:proofErr w:type="gramStart"/>
+      <w:r>
+        <w:rPr>
+          <w:rFonts w:ascii="Verdana" w:hAnsi="Verdana"/>
+          <w:color w:val="000000"/>
+          <w:sz w:val="24"/>
+          <w:szCs w:val="24"/>
+        </w:rPr>
+        <w:t>array.</w:t>
+      </w:r>
+      <w:r>
+        <w:rPr>
+          <w:rFonts w:ascii="Verdana" w:hAnsi="Verdana"/>
+          <w:color w:val="000000"/>
+          <w:sz w:val="24"/>
+          <w:szCs w:val="24"/>
+        </w:rPr>
+        <w:t>(</w:t>
+      </w:r>
+      <w:proofErr w:type="gramEnd"/>
+      <w:r>
+        <w:rPr>
+          <w:rFonts w:asciiTheme="minorHAnsi" w:eastAsiaTheme="minorHAnsi" w:hAnsiTheme="minorHAnsi" w:cstheme="minorBidi"/>
+          <w:kern w:val="2"/>
+          <w:sz w:val="24"/>
+          <w:szCs w:val="21"/>
+          <w14:ligatures w14:val="standardContextual"/>
+        </w:rPr>
+        <w:t xml:space="preserve"> </w:t>
+      </w:r>
+      <w:r>
+        <w:rPr>
+          <w:rFonts w:ascii="Verdana" w:hAnsi="Verdana"/>
+          <w:color w:val="000000"/>
+          <w:sz w:val="24"/>
+          <w:szCs w:val="24"/>
+        </w:rPr>
+        <w:t>Same logic as string repetition.</w:t>
+      </w:r>
+      <w:r>
+        <w:rPr>
+          <w:rFonts w:ascii="Verdana" w:hAnsi="Verdana"/>
+          <w:color w:val="000000"/>
+          <w:sz w:val="24"/>
+          <w:szCs w:val="24"/>
+        </w:rPr>
+        <w:t>)</w:t>
+      </w:r>
+    </w:p>
+    <w:p>
+      <w:pPr>
+        <w:pStyle w:val="max2"/>
+        <w:numPr>
+          <w:ilvl w:val="0"/>
+          <w:numId w:val="20"/>
+        </w:numPr>
+        <w:rPr>
+          <w:rFonts w:ascii="Verdana" w:hAnsi="Verdana"/>
+          <w:color w:val="000000"/>
+          <w:sz w:val="24"/>
+          <w:szCs w:val="24"/>
+        </w:rPr>
+      </w:pPr>
+      <w:r>
+        <w:rPr>
+          <w:rFonts w:ascii="Verdana" w:hAnsi="Verdana"/>
+          <w:b/>
+          <w:bCs/>
+          <w:color w:val="000000"/>
+          <w:sz w:val="24"/>
+          <w:szCs w:val="24"/>
+        </w:rPr>
+        <w:t>Print first occurrence of each unique element</w:t>
+      </w:r>
+      <w:r>
+        <w:rPr>
+          <w:rFonts w:ascii="Verdana" w:hAnsi="Verdana"/>
+          <w:color w:val="000000"/>
+          <w:sz w:val="24"/>
+          <w:szCs w:val="24"/>
+        </w:rPr>
+        <w:t>.</w:t>
+      </w:r>
+    </w:p>
+    <w:p>
+      <w:pPr>
+        <w:pStyle w:val="max2"/>
+        <w:numPr>
+          <w:ilvl w:val="0"/>
+          <w:numId w:val="20"/>
+        </w:numPr>
+        <w:rPr>
+          <w:rFonts w:ascii="Verdana" w:hAnsi="Verdana"/>
+          <w:color w:val="000000"/>
+          <w:sz w:val="24"/>
+          <w:szCs w:val="24"/>
+        </w:rPr>
+      </w:pPr>
+      <w:r>
+        <w:rPr>
+          <w:rFonts w:ascii="Verdana" w:hAnsi="Verdana"/>
+          <w:color w:val="000000"/>
+          <w:sz w:val="24"/>
+          <w:szCs w:val="24"/>
+        </w:rPr>
+        <w:t>Write a program to count and print unique or non-repeated characters / number in an array. Using frequency count.</w:t>
+      </w:r>
+    </w:p>
+    <w:p>
+      <w:pPr>
+        <w:pStyle w:val="max2"/>
+        <w:numPr>
+          <w:ilvl w:val="0"/>
+          <w:numId w:val="20"/>
+        </w:numPr>
+        <w:rPr>
+          <w:rFonts w:ascii="Verdana" w:hAnsi="Verdana"/>
+          <w:color w:val="000000"/>
+          <w:sz w:val="24"/>
+          <w:szCs w:val="24"/>
+        </w:rPr>
+      </w:pPr>
+      <w:r>
+        <w:rPr>
+          <w:rFonts w:ascii="Verdana" w:hAnsi="Verdana"/>
+          <w:color w:val="000000"/>
+          <w:sz w:val="24"/>
+          <w:szCs w:val="24"/>
+        </w:rPr>
+        <w:t>Remove Duplicates (Print Only Unique Elements</w:t>
+      </w:r>
+      <w:proofErr w:type="gramStart"/>
+      <w:r>
+        <w:rPr>
+          <w:rFonts w:ascii="Verdana" w:hAnsi="Verdana"/>
+          <w:color w:val="000000"/>
+          <w:sz w:val="24"/>
+          <w:szCs w:val="24"/>
+        </w:rPr>
+        <w:t>)</w:t>
+      </w:r>
+      <w:r>
+        <w:rPr>
+          <w:rFonts w:ascii="Verdana" w:hAnsi="Verdana"/>
+          <w:color w:val="000000"/>
+          <w:sz w:val="24"/>
+          <w:szCs w:val="24"/>
+        </w:rPr>
+        <w:t>.(</w:t>
+      </w:r>
+      <w:proofErr w:type="gramEnd"/>
+      <w:r>
+        <w:rPr>
+          <w:rFonts w:asciiTheme="minorHAnsi" w:eastAsiaTheme="minorHAnsi" w:hAnsiTheme="minorHAnsi" w:cstheme="minorBidi"/>
+          <w:kern w:val="2"/>
+          <w:sz w:val="24"/>
+          <w:szCs w:val="21"/>
+          <w14:ligatures w14:val="standardContextual"/>
+        </w:rPr>
+        <w:t xml:space="preserve"> </w:t>
+      </w:r>
+      <w:r>
+        <w:rPr>
+          <w:rFonts w:ascii="Verdana" w:hAnsi="Verdana"/>
+          <w:color w:val="000000"/>
+          <w:sz w:val="24"/>
+          <w:szCs w:val="24"/>
+        </w:rPr>
+        <w:t>Control printing using flags.</w:t>
+      </w:r>
+      <w:r>
+        <w:rPr>
+          <w:rFonts w:ascii="Verdana" w:hAnsi="Verdana"/>
+          <w:color w:val="000000"/>
+          <w:sz w:val="24"/>
+          <w:szCs w:val="24"/>
+        </w:rPr>
+        <w:t>)</w:t>
+      </w:r>
+    </w:p>
+    <w:p>
+      <w:pPr>
+        <w:pStyle w:val="max2"/>
+        <w:numPr>
+          <w:ilvl w:val="0"/>
+          <w:numId w:val="20"/>
+        </w:numPr>
+        <w:rPr>
+          <w:rFonts w:ascii="Verdana" w:hAnsi="Verdana"/>
+          <w:color w:val="000000"/>
+          <w:sz w:val="24"/>
+          <w:szCs w:val="24"/>
+        </w:rPr>
+      </w:pPr>
+      <w:r>
+        <w:rPr>
+          <w:rFonts w:ascii="Verdana" w:hAnsi="Verdana"/>
+          <w:color w:val="000000"/>
+          <w:sz w:val="24"/>
+          <w:szCs w:val="24"/>
+        </w:rPr>
+        <w:t>Count Total Repeating Digits in Array</w:t>
+      </w:r>
+      <w:r>
+        <w:rPr>
+          <w:rFonts w:ascii="Verdana" w:hAnsi="Verdana"/>
+          <w:color w:val="000000"/>
+          <w:sz w:val="24"/>
+          <w:szCs w:val="24"/>
+        </w:rPr>
+        <w:t>.</w:t>
+      </w:r>
+    </w:p>
+    <w:p>
+      <w:pPr>
+        <w:pStyle w:val="max2"/>
+        <w:numPr>
+          <w:ilvl w:val="0"/>
+          <w:numId w:val="20"/>
+        </w:numPr>
+        <w:rPr>
+          <w:rFonts w:ascii="Verdana" w:hAnsi="Verdana"/>
+          <w:color w:val="000000"/>
+          <w:sz w:val="24"/>
+          <w:szCs w:val="24"/>
+        </w:rPr>
+      </w:pPr>
+      <w:r>
+        <w:rPr>
+          <w:rFonts w:ascii="Verdana" w:hAnsi="Verdana"/>
+          <w:color w:val="000000"/>
+          <w:sz w:val="24"/>
+          <w:szCs w:val="24"/>
+        </w:rPr>
+        <w:t xml:space="preserve">Traverse strings array, stop when </w:t>
+      </w:r>
+      <w:r>
+        <w:rPr>
+          <w:rFonts w:ascii="Verdana" w:hAnsi="Verdana"/>
+          <w:b/>
+          <w:bCs/>
+          <w:color w:val="000000"/>
+          <w:sz w:val="24"/>
+          <w:szCs w:val="24"/>
+        </w:rPr>
+        <w:t>any string has repeated characters</w:t>
+      </w:r>
+      <w:r>
+        <w:rPr>
+          <w:rFonts w:ascii="Verdana" w:hAnsi="Verdana"/>
+          <w:color w:val="000000"/>
+          <w:sz w:val="24"/>
+          <w:szCs w:val="24"/>
+        </w:rPr>
+        <w:t>.</w:t>
+      </w:r>
+    </w:p>
+    <w:p>
+      <w:pPr>
+        <w:pStyle w:val="max2"/>
+        <w:rPr>
+          <w:rFonts w:ascii="Verdana" w:hAnsi="Verdana"/>
+          <w:color w:val="000000"/>
+          <w:sz w:val="24"/>
+          <w:szCs w:val="24"/>
+        </w:rPr>
+      </w:pPr>
+    </w:p>
+    <w:p>
+      <w:pPr>
+        <w:pStyle w:val="max2"/>
+        <w:rPr>
+          <w:rFonts w:ascii="Verdana" w:hAnsi="Verdana"/>
+          <w:color w:val="000000"/>
+          <w:sz w:val="24"/>
+          <w:szCs w:val="24"/>
+        </w:rPr>
+      </w:pPr>
+    </w:p>
+    <w:p>
+      <w:pPr>
+        <w:pStyle w:val="max2"/>
+        <w:rPr>
+          <w:rFonts w:ascii="Verdana" w:hAnsi="Verdana"/>
+          <w:color w:val="000000"/>
+          <w:sz w:val="24"/>
+          <w:szCs w:val="24"/>
+        </w:rPr>
+      </w:pPr>
+      <w:r>
+        <w:rPr>
+          <w:rFonts w:ascii="Verdana" w:hAnsi="Verdana"/>
+          <w:color w:val="000000"/>
+          <w:sz w:val="24"/>
+          <w:szCs w:val="24"/>
+        </w:rPr>
+        <w:lastRenderedPageBreak/>
+        <w:t>Day 1</w:t>
+      </w:r>
+      <w:r>
+        <w:rPr>
+          <w:rFonts w:ascii="Verdana" w:hAnsi="Verdana"/>
+          <w:color w:val="000000"/>
+          <w:sz w:val="24"/>
+          <w:szCs w:val="24"/>
+        </w:rPr>
+        <w:t>5</w:t>
+      </w:r>
+    </w:p>
+    <w:p>
+      <w:pPr>
+        <w:pStyle w:val="max2"/>
+        <w:numPr>
+          <w:ilvl w:val="0"/>
+          <w:numId w:val="6"/>
+        </w:numPr>
+        <w:rPr>
+          <w:rFonts w:ascii="Verdana" w:hAnsi="Verdana"/>
+          <w:color w:val="000000"/>
+          <w:sz w:val="24"/>
+          <w:szCs w:val="24"/>
+        </w:rPr>
+      </w:pPr>
+      <w:r>
+        <w:rPr>
+          <w:rFonts w:ascii="Verdana" w:hAnsi="Verdana"/>
+          <w:color w:val="000000"/>
+          <w:sz w:val="24"/>
+          <w:szCs w:val="24"/>
+        </w:rPr>
+        <w:t xml:space="preserve">Take a sentence and reverse </w:t>
+      </w:r>
+      <w:r>
+        <w:rPr>
+          <w:rFonts w:ascii="Verdana" w:hAnsi="Verdana"/>
+          <w:b/>
+          <w:bCs/>
+          <w:color w:val="000000"/>
+          <w:sz w:val="24"/>
+          <w:szCs w:val="24"/>
+        </w:rPr>
         <w:t>each word individually</w:t>
       </w:r>
       <w:r>
@@ -4047,8 +5094,19 @@
           <w:sz w:val="24"/>
           <w:szCs w:val="24"/>
         </w:rPr>
-        <w:t>Write a java program to find if the input number is a prime or not .</w:t>
-      </w:r>
+        <w:t xml:space="preserve">Write a java program to find if the input number is a prime or </w:t>
+      </w:r>
+      <w:proofErr w:type="gramStart"/>
+      <w:r>
+        <w:rPr>
+          <w:rFonts w:ascii="Verdana" w:hAnsi="Verdana"/>
+          <w:color w:val="000000"/>
+          <w:sz w:val="24"/>
+          <w:szCs w:val="24"/>
+        </w:rPr>
+        <w:t>not .</w:t>
+      </w:r>
+      <w:proofErr w:type="gramEnd"/>
     </w:p>
     <w:p>
       <w:pPr>
@@ -5373,6 +6431,92 @@
     </w:lvl>
   </w:abstractNum>
   <w:abstractNum w:abstractNumId="13" w15:restartNumberingAfterBreak="0">
+    <w:nsid w:val="49173750"/>
+    <w:multiLevelType w:val="hybridMultilevel"/>
+    <w:tmpl w:val="6FEADD56"/>
+    <w:lvl w:ilvl="0" w:tplc="0409000F">
+      <w:start w:val="1"/>
+      <w:numFmt w:val="decimal"/>
+      <w:lvlText w:val="%1."/>
+      <w:lvlJc w:val="left"/>
+      <w:pPr>
+        <w:ind w:left="720" w:hanging="360"/>
+      </w:pPr>
+    </w:lvl>
+    <w:lvl w:ilvl="1" w:tplc="04090019" w:tentative="1">
+      <w:start w:val="1"/>
+      <w:numFmt w:val="lowerLetter"/>
+      <w:lvlText w:val="%2."/>
+      <w:lvlJc w:val="left"/>
+      <w:pPr>
+        <w:ind w:left="1440" w:hanging="360"/>
+      </w:pPr>
+    </w:lvl>
+    <w:lvl w:ilvl="2" w:tplc="0409001B" w:tentative="1">
+      <w:start w:val="1"/>
+      <w:numFmt w:val="lowerRoman"/>
+      <w:lvlText w:val="%3."/>
+      <w:lvlJc w:val="right"/>
+      <w:pPr>
+        <w:ind w:left="2160" w:hanging="180"/>
+      </w:pPr>
+    </w:lvl>
+    <w:lvl w:ilvl="3" w:tplc="0409000F" w:tentative="1">
+      <w:start w:val="1"/>
+      <w:numFmt w:val="decimal"/>
+      <w:lvlText w:val="%4."/>
+      <w:lvlJc w:val="left"/>
+      <w:pPr>
+        <w:ind w:left="2880" w:hanging="360"/>
+      </w:pPr>
+    </w:lvl>
+    <w:lvl w:ilvl="4" w:tplc="04090019" w:tentative="1">
+      <w:start w:val="1"/>
+      <w:numFmt w:val="lowerLetter"/>
+      <w:lvlText w:val="%5."/>
+      <w:lvlJc w:val="left"/>
+      <w:pPr>
+        <w:ind w:left="3600" w:hanging="360"/>
+      </w:pPr>
+    </w:lvl>
+    <w:lvl w:ilvl="5" w:tplc="0409001B" w:tentative="1">
+      <w:start w:val="1"/>
+      <w:numFmt w:val="lowerRoman"/>
+      <w:lvlText w:val="%6."/>
+      <w:lvlJc w:val="right"/>
+      <w:pPr>
+        <w:ind w:left="4320" w:hanging="180"/>
+      </w:pPr>
+    </w:lvl>
+    <w:lvl w:ilvl="6" w:tplc="0409000F" w:tentative="1">
+      <w:start w:val="1"/>
+      <w:numFmt w:val="decimal"/>
+      <w:lvlText w:val="%7."/>
+      <w:lvlJc w:val="left"/>
+      <w:pPr>
+        <w:ind w:left="5040" w:hanging="360"/>
+      </w:pPr>
+    </w:lvl>
+    <w:lvl w:ilvl="7" w:tplc="04090019" w:tentative="1">
+      <w:start w:val="1"/>
+      <w:numFmt w:val="lowerLetter"/>
+      <w:lvlText w:val="%8."/>
+      <w:lvlJc w:val="left"/>
+      <w:pPr>
+        <w:ind w:left="5760" w:hanging="360"/>
+      </w:pPr>
+    </w:lvl>
+    <w:lvl w:ilvl="8" w:tplc="0409001B" w:tentative="1">
+      <w:start w:val="1"/>
+      <w:numFmt w:val="lowerRoman"/>
+      <w:lvlText w:val="%9."/>
+      <w:lvlJc w:val="right"/>
+      <w:pPr>
+        <w:ind w:left="6480" w:hanging="180"/>
+      </w:pPr>
+    </w:lvl>
+  </w:abstractNum>
+  <w:abstractNum w:abstractNumId="14" w15:restartNumberingAfterBreak="0">
     <w:nsid w:val="4E100B8B"/>
     <w:multiLevelType w:val="hybridMultilevel"/>
     <w:tmpl w:val="1D5460BE"/>
@@ -5458,7 +6602,7 @@
       </w:pPr>
     </w:lvl>
   </w:abstractNum>
-  <w:abstractNum w:abstractNumId="14" w15:restartNumberingAfterBreak="0">
+  <w:abstractNum w:abstractNumId="15" w15:restartNumberingAfterBreak="0">
     <w:nsid w:val="5AD15962"/>
     <w:multiLevelType w:val="hybridMultilevel"/>
     <w:tmpl w:val="884AF92E"/>
@@ -5544,7 +6688,7 @@
       </w:pPr>
     </w:lvl>
   </w:abstractNum>
-  <w:abstractNum w:abstractNumId="15" w15:restartNumberingAfterBreak="0">
+  <w:abstractNum w:abstractNumId="16" w15:restartNumberingAfterBreak="0">
     <w:nsid w:val="6AAA50FA"/>
     <w:multiLevelType w:val="hybridMultilevel"/>
     <w:tmpl w:val="829279AA"/>
@@ -5630,7 +6774,7 @@
       </w:pPr>
     </w:lvl>
   </w:abstractNum>
-  <w:abstractNum w:abstractNumId="16" w15:restartNumberingAfterBreak="0">
+  <w:abstractNum w:abstractNumId="17" w15:restartNumberingAfterBreak="0">
     <w:nsid w:val="72E21C6C"/>
     <w:multiLevelType w:val="hybridMultilevel"/>
     <w:tmpl w:val="A548623A"/>
@@ -5716,7 +6860,7 @@
       </w:pPr>
     </w:lvl>
   </w:abstractNum>
-  <w:abstractNum w:abstractNumId="17" w15:restartNumberingAfterBreak="0">
+  <w:abstractNum w:abstractNumId="18" w15:restartNumberingAfterBreak="0">
     <w:nsid w:val="7ABA1038"/>
     <w:multiLevelType w:val="hybridMultilevel"/>
     <w:tmpl w:val="CAE67AD6"/>
@@ -5802,7 +6946,7 @@
       </w:pPr>
     </w:lvl>
   </w:abstractNum>
-  <w:abstractNum w:abstractNumId="18" w15:restartNumberingAfterBreak="0">
+  <w:abstractNum w:abstractNumId="19" w15:restartNumberingAfterBreak="0">
     <w:nsid w:val="7FBE6D6A"/>
     <w:multiLevelType w:val="hybridMultilevel"/>
     <w:tmpl w:val="7D3272E4"/>
@@ -5907,13 +7051,13 @@
     <w:abstractNumId w:val="2"/>
   </w:num>
   <w:num w:numId="7" w16cid:durableId="1879052598">
-    <w:abstractNumId w:val="15"/>
+    <w:abstractNumId w:val="16"/>
   </w:num>
   <w:num w:numId="8" w16cid:durableId="1749188025">
     <w:abstractNumId w:val="6"/>
   </w:num>
   <w:num w:numId="9" w16cid:durableId="101462200">
-    <w:abstractNumId w:val="16"/>
+    <w:abstractNumId w:val="17"/>
   </w:num>
   <w:num w:numId="10" w16cid:durableId="57170953">
     <w:abstractNumId w:val="0"/>
@@ -5922,10 +7066,10 @@
     <w:abstractNumId w:val="4"/>
   </w:num>
   <w:num w:numId="12" w16cid:durableId="1752465261">
-    <w:abstractNumId w:val="14"/>
+    <w:abstractNumId w:val="15"/>
   </w:num>
   <w:num w:numId="13" w16cid:durableId="192882122">
-    <w:abstractNumId w:val="17"/>
+    <w:abstractNumId w:val="18"/>
   </w:num>
   <w:num w:numId="14" w16cid:durableId="1059592124">
     <w:abstractNumId w:val="10"/>
@@ -5937,13 +7081,16 @@
     <w:abstractNumId w:val="9"/>
   </w:num>
   <w:num w:numId="17" w16cid:durableId="1172834706">
-    <w:abstractNumId w:val="13"/>
+    <w:abstractNumId w:val="14"/>
   </w:num>
   <w:num w:numId="18" w16cid:durableId="1390882741">
-    <w:abstractNumId w:val="18"/>
+    <w:abstractNumId w:val="19"/>
   </w:num>
   <w:num w:numId="19" w16cid:durableId="1705986544">
     <w:abstractNumId w:val="7"/>
+  </w:num>
+  <w:num w:numId="20" w16cid:durableId="178937250">
+    <w:abstractNumId w:val="13"/>
   </w:num>
 </w:numbering>
 </file>

</xml_diff>

<commit_message>
Day 15 compelted bitch !
</commit_message>
<xml_diff>
--- a/Questions.docx
+++ b/Questions.docx
@@ -4573,10 +4573,6 @@
     <w:p>
       <w:pPr>
         <w:pStyle w:val="max2"/>
-        <w:numPr>
-          <w:ilvl w:val="0"/>
-          <w:numId w:val="19"/>
-        </w:numPr>
         <w:rPr>
           <w:rFonts w:ascii="Verdana" w:hAnsi="Verdana"/>
           <w:color w:val="000000"/>

</xml_diff>

<commit_message>
Day 26 completed !q
</commit_message>
<xml_diff>
--- a/Questions.docx
+++ b/Questions.docx
@@ -7809,6 +7809,50 @@
           <w:szCs w:val="24"/>
         </w:rPr>
       </w:pPr>
+    </w:p>
+    <w:p>
+      <w:pPr>
+        <w:pStyle w:val="max2"/>
+        <w:rPr>
+          <w:rFonts w:ascii="Verdana" w:hAnsi="Verdana"/>
+          <w:color w:val="000000"/>
+          <w:sz w:val="24"/>
+          <w:szCs w:val="24"/>
+        </w:rPr>
+      </w:pPr>
+    </w:p>
+    <w:p>
+      <w:pPr>
+        <w:pStyle w:val="max2"/>
+        <w:rPr>
+          <w:rFonts w:ascii="Verdana" w:hAnsi="Verdana"/>
+          <w:color w:val="000000"/>
+          <w:sz w:val="24"/>
+          <w:szCs w:val="24"/>
+        </w:rPr>
+      </w:pPr>
+    </w:p>
+    <w:p>
+      <w:pPr>
+        <w:pStyle w:val="max2"/>
+        <w:rPr>
+          <w:rFonts w:ascii="Verdana" w:hAnsi="Verdana"/>
+          <w:color w:val="000000"/>
+          <w:sz w:val="24"/>
+          <w:szCs w:val="24"/>
+        </w:rPr>
+      </w:pPr>
+    </w:p>
+    <w:p>
+      <w:pPr>
+        <w:pStyle w:val="max2"/>
+        <w:rPr>
+          <w:rFonts w:ascii="Verdana" w:hAnsi="Verdana"/>
+          <w:color w:val="000000"/>
+          <w:sz w:val="24"/>
+          <w:szCs w:val="24"/>
+        </w:rPr>
+      </w:pPr>
       <w:r>
         <w:rPr>
           <w:rFonts w:ascii="Verdana" w:hAnsi="Verdana"/>
@@ -8058,17 +8102,636 @@
     </w:p>
     <w:p>
       <w:pPr>
-        <w:pStyle w:val="max2"/>
+        <w:pStyle w:val="ListParagraph"/>
         <w:numPr>
           <w:ilvl w:val="0"/>
           <w:numId w:val="39"/>
         </w:numPr>
-        <w:rPr>
-          <w:rFonts w:ascii="Verdana" w:hAnsi="Verdana"/>
-          <w:color w:val="000000"/>
-          <w:szCs w:val="24"/>
-        </w:rPr>
-      </w:pPr>
+        <w:spacing w:before="100" w:beforeAutospacing="1" w:after="100" w:afterAutospacing="1" w:line="240" w:lineRule="auto"/>
+        <w:outlineLvl w:val="1"/>
+        <w:rPr>
+          <w:rFonts w:ascii="Times New Roman" w:eastAsia="Times New Roman" w:hAnsi="Times New Roman" w:cs="Times New Roman"/>
+          <w:b/>
+          <w:bCs/>
+          <w:kern w:val="0"/>
+          <w:szCs w:val="24"/>
+          <w14:ligatures w14:val="none"/>
+        </w:rPr>
+      </w:pPr>
+      <w:r>
+        <w:rPr>
+          <w:rFonts w:ascii="Times New Roman" w:eastAsia="Times New Roman" w:hAnsi="Times New Roman" w:cs="Times New Roman"/>
+          <w:b/>
+          <w:bCs/>
+          <w:kern w:val="0"/>
+          <w:szCs w:val="24"/>
+          <w14:ligatures w14:val="none"/>
+        </w:rPr>
+        <w:t>Longest Repeating Character Count</w:t>
+      </w:r>
+    </w:p>
+    <w:p>
+      <w:pPr>
+        <w:pStyle w:val="ListParagraph"/>
+        <w:spacing w:before="100" w:beforeAutospacing="1" w:after="100" w:afterAutospacing="1" w:line="240" w:lineRule="auto"/>
+        <w:ind w:left="1080"/>
+        <w:rPr>
+          <w:rFonts w:ascii="Mangal" w:eastAsia="Times New Roman" w:hAnsi="Mangal" w:cs="Mangal"/>
+          <w:kern w:val="0"/>
+          <w:sz w:val="20"/>
+          <w:szCs w:val="20"/>
+          <w14:ligatures w14:val="none"/>
+        </w:rPr>
+      </w:pPr>
+      <w:r>
+        <w:rPr>
+          <w:rFonts w:ascii="Mangal" w:eastAsia="Times New Roman" w:hAnsi="Mangal" w:cs="Mangal"/>
+          <w:kern w:val="0"/>
+          <w:sz w:val="20"/>
+          <w:szCs w:val="20"/>
+          <w14:ligatures w14:val="none"/>
+        </w:rPr>
+        <w:t>Input: "aaabbccccd"</w:t>
+      </w:r>
+      <w:r>
+        <w:rPr>
+          <w:rFonts w:ascii="Mangal" w:eastAsia="Times New Roman" w:hAnsi="Mangal" w:cs="Mangal"/>
+          <w:kern w:val="0"/>
+          <w:sz w:val="20"/>
+          <w:szCs w:val="20"/>
+          <w14:ligatures w14:val="none"/>
+        </w:rPr>
+        <w:br/>
+        <w:t>Output: 4 (because of "cccc")</w:t>
+      </w:r>
+    </w:p>
+    <w:p>
+      <w:pPr>
+        <w:pStyle w:val="ListParagraph"/>
+        <w:numPr>
+          <w:ilvl w:val="0"/>
+          <w:numId w:val="39"/>
+        </w:numPr>
+        <w:spacing w:before="100" w:beforeAutospacing="1" w:after="100" w:afterAutospacing="1" w:line="240" w:lineRule="auto"/>
+        <w:outlineLvl w:val="1"/>
+        <w:rPr>
+          <w:rFonts w:ascii="Times New Roman" w:eastAsia="Times New Roman" w:hAnsi="Times New Roman" w:cs="Times New Roman"/>
+          <w:b/>
+          <w:bCs/>
+          <w:kern w:val="0"/>
+          <w:szCs w:val="24"/>
+          <w14:ligatures w14:val="none"/>
+        </w:rPr>
+      </w:pPr>
+      <w:r>
+        <w:rPr>
+          <w:rFonts w:ascii="Times New Roman" w:eastAsia="Times New Roman" w:hAnsi="Times New Roman" w:cs="Times New Roman"/>
+          <w:b/>
+          <w:bCs/>
+          <w:kern w:val="0"/>
+          <w:szCs w:val="24"/>
+          <w14:ligatures w14:val="none"/>
+        </w:rPr>
+        <w:t>Check If One String Is Rotation of Another</w:t>
+      </w:r>
+    </w:p>
+    <w:p>
+      <w:pPr>
+        <w:pStyle w:val="ListParagraph"/>
+        <w:spacing w:before="100" w:beforeAutospacing="1" w:after="100" w:afterAutospacing="1" w:line="240" w:lineRule="auto"/>
+        <w:ind w:left="1080"/>
+        <w:rPr>
+          <w:rFonts w:ascii="Mangal" w:eastAsia="Times New Roman" w:hAnsi="Mangal" w:cs="Mangal"/>
+          <w:kern w:val="0"/>
+          <w:sz w:val="20"/>
+          <w:szCs w:val="20"/>
+          <w14:ligatures w14:val="none"/>
+        </w:rPr>
+      </w:pPr>
+      <w:r>
+        <w:rPr>
+          <w:rFonts w:ascii="Mangal" w:eastAsia="Times New Roman" w:hAnsi="Mangal" w:cs="Mangal"/>
+          <w:kern w:val="0"/>
+          <w:sz w:val="20"/>
+          <w:szCs w:val="20"/>
+          <w14:ligatures w14:val="none"/>
+        </w:rPr>
+        <w:lastRenderedPageBreak/>
+        <w:t xml:space="preserve">Input: "abcd", "cdab" </w:t>
+      </w:r>
+      <w:r>
+        <w:rPr>
+          <w:rFonts w:ascii="Times New Roman" w:eastAsia="Times New Roman" w:hAnsi="Times New Roman" w:cs="Times New Roman"/>
+          <w:kern w:val="0"/>
+          <w:sz w:val="20"/>
+          <w:szCs w:val="20"/>
+          <w14:ligatures w14:val="none"/>
+        </w:rPr>
+        <w:t>→</w:t>
+      </w:r>
+      <w:r>
+        <w:rPr>
+          <w:rFonts w:ascii="Mangal" w:eastAsia="Times New Roman" w:hAnsi="Mangal" w:cs="Mangal"/>
+          <w:kern w:val="0"/>
+          <w:sz w:val="20"/>
+          <w:szCs w:val="20"/>
+          <w14:ligatures w14:val="none"/>
+        </w:rPr>
+        <w:t xml:space="preserve"> true</w:t>
+      </w:r>
+      <w:r>
+        <w:rPr>
+          <w:rFonts w:ascii="Mangal" w:eastAsia="Times New Roman" w:hAnsi="Mangal" w:cs="Mangal"/>
+          <w:kern w:val="0"/>
+          <w:sz w:val="20"/>
+          <w:szCs w:val="20"/>
+          <w14:ligatures w14:val="none"/>
+        </w:rPr>
+        <w:br/>
+        <w:t xml:space="preserve">Input: "abcd", "acbd" </w:t>
+      </w:r>
+      <w:r>
+        <w:rPr>
+          <w:rFonts w:ascii="Times New Roman" w:eastAsia="Times New Roman" w:hAnsi="Times New Roman" w:cs="Times New Roman"/>
+          <w:kern w:val="0"/>
+          <w:sz w:val="20"/>
+          <w:szCs w:val="20"/>
+          <w14:ligatures w14:val="none"/>
+        </w:rPr>
+        <w:t>→</w:t>
+      </w:r>
+      <w:r>
+        <w:rPr>
+          <w:rFonts w:ascii="Mangal" w:eastAsia="Times New Roman" w:hAnsi="Mangal" w:cs="Mangal"/>
+          <w:kern w:val="0"/>
+          <w:sz w:val="20"/>
+          <w:szCs w:val="20"/>
+          <w14:ligatures w14:val="none"/>
+        </w:rPr>
+        <w:t xml:space="preserve"> false</w:t>
+      </w:r>
+    </w:p>
+    <w:p>
+      <w:pPr>
+        <w:pStyle w:val="ListParagraph"/>
+        <w:numPr>
+          <w:ilvl w:val="0"/>
+          <w:numId w:val="39"/>
+        </w:numPr>
+        <w:spacing w:before="100" w:beforeAutospacing="1" w:after="100" w:afterAutospacing="1" w:line="240" w:lineRule="auto"/>
+        <w:outlineLvl w:val="1"/>
+        <w:rPr>
+          <w:rFonts w:ascii="Times New Roman" w:eastAsia="Times New Roman" w:hAnsi="Times New Roman" w:cs="Times New Roman"/>
+          <w:b/>
+          <w:bCs/>
+          <w:kern w:val="0"/>
+          <w:szCs w:val="24"/>
+          <w14:ligatures w14:val="none"/>
+        </w:rPr>
+      </w:pPr>
+      <w:r>
+        <w:rPr>
+          <w:rFonts w:ascii="Times New Roman" w:eastAsia="Times New Roman" w:hAnsi="Times New Roman" w:cs="Times New Roman"/>
+          <w:b/>
+          <w:bCs/>
+          <w:kern w:val="0"/>
+          <w:szCs w:val="24"/>
+          <w14:ligatures w14:val="none"/>
+        </w:rPr>
+        <w:t>Print Diamond Half Pattern</w:t>
+      </w:r>
+    </w:p>
+    <w:p>
+      <w:pPr>
+        <w:spacing w:before="100" w:beforeAutospacing="1" w:after="100" w:afterAutospacing="1" w:line="240" w:lineRule="auto"/>
+        <w:ind w:left="720"/>
+        <w:rPr>
+          <w:rFonts w:ascii="Mangal" w:eastAsia="Times New Roman" w:hAnsi="Mangal" w:cs="Mangal"/>
+          <w:kern w:val="0"/>
+          <w:sz w:val="20"/>
+          <w:szCs w:val="20"/>
+          <w14:ligatures w14:val="none"/>
+        </w:rPr>
+      </w:pPr>
+      <w:r>
+        <w:rPr>
+          <w:rFonts w:ascii="Mangal" w:eastAsia="Times New Roman" w:hAnsi="Mangal" w:cs="Mangal"/>
+          <w:kern w:val="0"/>
+          <w:sz w:val="20"/>
+          <w:szCs w:val="20"/>
+          <w14:ligatures w14:val="none"/>
+        </w:rPr>
+        <w:t>Input: n = 4</w:t>
+      </w:r>
+    </w:p>
+    <w:p>
+      <w:pPr>
+        <w:tabs>
+          <w:tab w:val="left" w:pos="916"/>
+          <w:tab w:val="left" w:pos="1832"/>
+          <w:tab w:val="left" w:pos="2748"/>
+          <w:tab w:val="left" w:pos="3664"/>
+          <w:tab w:val="left" w:pos="4580"/>
+          <w:tab w:val="left" w:pos="5496"/>
+          <w:tab w:val="left" w:pos="6412"/>
+          <w:tab w:val="left" w:pos="7328"/>
+          <w:tab w:val="left" w:pos="8244"/>
+          <w:tab w:val="left" w:pos="9160"/>
+          <w:tab w:val="left" w:pos="10076"/>
+          <w:tab w:val="left" w:pos="10992"/>
+          <w:tab w:val="left" w:pos="11908"/>
+          <w:tab w:val="left" w:pos="12824"/>
+          <w:tab w:val="left" w:pos="13740"/>
+          <w:tab w:val="left" w:pos="14656"/>
+        </w:tabs>
+        <w:spacing w:after="0" w:line="240" w:lineRule="auto"/>
+        <w:ind w:left="720"/>
+        <w:rPr>
+          <w:rFonts w:ascii="Mangal" w:eastAsia="Times New Roman" w:hAnsi="Mangal" w:cs="Mangal"/>
+          <w:kern w:val="0"/>
+          <w:sz w:val="20"/>
+          <w:szCs w:val="20"/>
+          <w14:ligatures w14:val="none"/>
+        </w:rPr>
+      </w:pPr>
+      <w:r>
+        <w:rPr>
+          <w:rFonts w:ascii="Mangal" w:eastAsia="Times New Roman" w:hAnsi="Mangal" w:cs="Mangal"/>
+          <w:kern w:val="0"/>
+          <w:sz w:val="20"/>
+          <w:szCs w:val="20"/>
+          <w14:ligatures w14:val="none"/>
+        </w:rPr>
+        <w:t>*</w:t>
+      </w:r>
+    </w:p>
+    <w:p>
+      <w:pPr>
+        <w:tabs>
+          <w:tab w:val="left" w:pos="916"/>
+          <w:tab w:val="left" w:pos="1832"/>
+          <w:tab w:val="left" w:pos="2748"/>
+          <w:tab w:val="left" w:pos="3664"/>
+          <w:tab w:val="left" w:pos="4580"/>
+          <w:tab w:val="left" w:pos="5496"/>
+          <w:tab w:val="left" w:pos="6412"/>
+          <w:tab w:val="left" w:pos="7328"/>
+          <w:tab w:val="left" w:pos="8244"/>
+          <w:tab w:val="left" w:pos="9160"/>
+          <w:tab w:val="left" w:pos="10076"/>
+          <w:tab w:val="left" w:pos="10992"/>
+          <w:tab w:val="left" w:pos="11908"/>
+          <w:tab w:val="left" w:pos="12824"/>
+          <w:tab w:val="left" w:pos="13740"/>
+          <w:tab w:val="left" w:pos="14656"/>
+        </w:tabs>
+        <w:spacing w:after="0" w:line="240" w:lineRule="auto"/>
+        <w:ind w:left="720"/>
+        <w:rPr>
+          <w:rFonts w:ascii="Mangal" w:eastAsia="Times New Roman" w:hAnsi="Mangal" w:cs="Mangal"/>
+          <w:kern w:val="0"/>
+          <w:sz w:val="20"/>
+          <w:szCs w:val="20"/>
+          <w14:ligatures w14:val="none"/>
+        </w:rPr>
+      </w:pPr>
+      <w:r>
+        <w:rPr>
+          <w:rFonts w:ascii="Mangal" w:eastAsia="Times New Roman" w:hAnsi="Mangal" w:cs="Mangal"/>
+          <w:kern w:val="0"/>
+          <w:sz w:val="20"/>
+          <w:szCs w:val="20"/>
+          <w14:ligatures w14:val="none"/>
+        </w:rPr>
+        <w:t>**</w:t>
+      </w:r>
+    </w:p>
+    <w:p>
+      <w:pPr>
+        <w:tabs>
+          <w:tab w:val="left" w:pos="916"/>
+          <w:tab w:val="left" w:pos="1832"/>
+          <w:tab w:val="left" w:pos="2748"/>
+          <w:tab w:val="left" w:pos="3664"/>
+          <w:tab w:val="left" w:pos="4580"/>
+          <w:tab w:val="left" w:pos="5496"/>
+          <w:tab w:val="left" w:pos="6412"/>
+          <w:tab w:val="left" w:pos="7328"/>
+          <w:tab w:val="left" w:pos="8244"/>
+          <w:tab w:val="left" w:pos="9160"/>
+          <w:tab w:val="left" w:pos="10076"/>
+          <w:tab w:val="left" w:pos="10992"/>
+          <w:tab w:val="left" w:pos="11908"/>
+          <w:tab w:val="left" w:pos="12824"/>
+          <w:tab w:val="left" w:pos="13740"/>
+          <w:tab w:val="left" w:pos="14656"/>
+        </w:tabs>
+        <w:spacing w:after="0" w:line="240" w:lineRule="auto"/>
+        <w:ind w:left="720"/>
+        <w:rPr>
+          <w:rFonts w:ascii="Mangal" w:eastAsia="Times New Roman" w:hAnsi="Mangal" w:cs="Mangal"/>
+          <w:kern w:val="0"/>
+          <w:sz w:val="20"/>
+          <w:szCs w:val="20"/>
+          <w14:ligatures w14:val="none"/>
+        </w:rPr>
+      </w:pPr>
+      <w:r>
+        <w:rPr>
+          <w:rFonts w:ascii="Mangal" w:eastAsia="Times New Roman" w:hAnsi="Mangal" w:cs="Mangal"/>
+          <w:kern w:val="0"/>
+          <w:sz w:val="20"/>
+          <w:szCs w:val="20"/>
+          <w14:ligatures w14:val="none"/>
+        </w:rPr>
+        <w:t>***</w:t>
+      </w:r>
+    </w:p>
+    <w:p>
+      <w:pPr>
+        <w:tabs>
+          <w:tab w:val="left" w:pos="916"/>
+          <w:tab w:val="left" w:pos="1832"/>
+          <w:tab w:val="left" w:pos="2748"/>
+          <w:tab w:val="left" w:pos="3664"/>
+          <w:tab w:val="left" w:pos="4580"/>
+          <w:tab w:val="left" w:pos="5496"/>
+          <w:tab w:val="left" w:pos="6412"/>
+          <w:tab w:val="left" w:pos="7328"/>
+          <w:tab w:val="left" w:pos="8244"/>
+          <w:tab w:val="left" w:pos="9160"/>
+          <w:tab w:val="left" w:pos="10076"/>
+          <w:tab w:val="left" w:pos="10992"/>
+          <w:tab w:val="left" w:pos="11908"/>
+          <w:tab w:val="left" w:pos="12824"/>
+          <w:tab w:val="left" w:pos="13740"/>
+          <w:tab w:val="left" w:pos="14656"/>
+        </w:tabs>
+        <w:spacing w:after="0" w:line="240" w:lineRule="auto"/>
+        <w:ind w:left="720"/>
+        <w:rPr>
+          <w:rFonts w:ascii="Mangal" w:eastAsia="Times New Roman" w:hAnsi="Mangal" w:cs="Mangal"/>
+          <w:kern w:val="0"/>
+          <w:sz w:val="20"/>
+          <w:szCs w:val="20"/>
+          <w14:ligatures w14:val="none"/>
+        </w:rPr>
+      </w:pPr>
+      <w:r>
+        <w:rPr>
+          <w:rFonts w:ascii="Mangal" w:eastAsia="Times New Roman" w:hAnsi="Mangal" w:cs="Mangal"/>
+          <w:kern w:val="0"/>
+          <w:sz w:val="20"/>
+          <w:szCs w:val="20"/>
+          <w14:ligatures w14:val="none"/>
+        </w:rPr>
+        <w:t>****</w:t>
+      </w:r>
+    </w:p>
+    <w:p>
+      <w:pPr>
+        <w:tabs>
+          <w:tab w:val="left" w:pos="916"/>
+          <w:tab w:val="left" w:pos="1832"/>
+          <w:tab w:val="left" w:pos="2748"/>
+          <w:tab w:val="left" w:pos="3664"/>
+          <w:tab w:val="left" w:pos="4580"/>
+          <w:tab w:val="left" w:pos="5496"/>
+          <w:tab w:val="left" w:pos="6412"/>
+          <w:tab w:val="left" w:pos="7328"/>
+          <w:tab w:val="left" w:pos="8244"/>
+          <w:tab w:val="left" w:pos="9160"/>
+          <w:tab w:val="left" w:pos="10076"/>
+          <w:tab w:val="left" w:pos="10992"/>
+          <w:tab w:val="left" w:pos="11908"/>
+          <w:tab w:val="left" w:pos="12824"/>
+          <w:tab w:val="left" w:pos="13740"/>
+          <w:tab w:val="left" w:pos="14656"/>
+        </w:tabs>
+        <w:spacing w:after="0" w:line="240" w:lineRule="auto"/>
+        <w:ind w:left="720"/>
+        <w:rPr>
+          <w:rFonts w:ascii="Mangal" w:eastAsia="Times New Roman" w:hAnsi="Mangal" w:cs="Mangal"/>
+          <w:kern w:val="0"/>
+          <w:sz w:val="20"/>
+          <w:szCs w:val="20"/>
+          <w14:ligatures w14:val="none"/>
+        </w:rPr>
+      </w:pPr>
+      <w:r>
+        <w:rPr>
+          <w:rFonts w:ascii="Mangal" w:eastAsia="Times New Roman" w:hAnsi="Mangal" w:cs="Mangal"/>
+          <w:kern w:val="0"/>
+          <w:sz w:val="20"/>
+          <w:szCs w:val="20"/>
+          <w14:ligatures w14:val="none"/>
+        </w:rPr>
+        <w:t>***</w:t>
+      </w:r>
+    </w:p>
+    <w:p>
+      <w:pPr>
+        <w:tabs>
+          <w:tab w:val="left" w:pos="916"/>
+          <w:tab w:val="left" w:pos="1832"/>
+          <w:tab w:val="left" w:pos="2748"/>
+          <w:tab w:val="left" w:pos="3664"/>
+          <w:tab w:val="left" w:pos="4580"/>
+          <w:tab w:val="left" w:pos="5496"/>
+          <w:tab w:val="left" w:pos="6412"/>
+          <w:tab w:val="left" w:pos="7328"/>
+          <w:tab w:val="left" w:pos="8244"/>
+          <w:tab w:val="left" w:pos="9160"/>
+          <w:tab w:val="left" w:pos="10076"/>
+          <w:tab w:val="left" w:pos="10992"/>
+          <w:tab w:val="left" w:pos="11908"/>
+          <w:tab w:val="left" w:pos="12824"/>
+          <w:tab w:val="left" w:pos="13740"/>
+          <w:tab w:val="left" w:pos="14656"/>
+        </w:tabs>
+        <w:spacing w:after="0" w:line="240" w:lineRule="auto"/>
+        <w:ind w:left="720"/>
+        <w:rPr>
+          <w:rFonts w:ascii="Mangal" w:eastAsia="Times New Roman" w:hAnsi="Mangal" w:cs="Mangal"/>
+          <w:kern w:val="0"/>
+          <w:sz w:val="20"/>
+          <w:szCs w:val="20"/>
+          <w14:ligatures w14:val="none"/>
+        </w:rPr>
+      </w:pPr>
+      <w:r>
+        <w:rPr>
+          <w:rFonts w:ascii="Mangal" w:eastAsia="Times New Roman" w:hAnsi="Mangal" w:cs="Mangal"/>
+          <w:kern w:val="0"/>
+          <w:sz w:val="20"/>
+          <w:szCs w:val="20"/>
+          <w14:ligatures w14:val="none"/>
+        </w:rPr>
+        <w:t>**</w:t>
+      </w:r>
+    </w:p>
+    <w:p>
+      <w:pPr>
+        <w:tabs>
+          <w:tab w:val="left" w:pos="916"/>
+          <w:tab w:val="left" w:pos="1832"/>
+          <w:tab w:val="left" w:pos="2748"/>
+          <w:tab w:val="left" w:pos="3664"/>
+          <w:tab w:val="left" w:pos="4580"/>
+          <w:tab w:val="left" w:pos="5496"/>
+          <w:tab w:val="left" w:pos="6412"/>
+          <w:tab w:val="left" w:pos="7328"/>
+          <w:tab w:val="left" w:pos="8244"/>
+          <w:tab w:val="left" w:pos="9160"/>
+          <w:tab w:val="left" w:pos="10076"/>
+          <w:tab w:val="left" w:pos="10992"/>
+          <w:tab w:val="left" w:pos="11908"/>
+          <w:tab w:val="left" w:pos="12824"/>
+          <w:tab w:val="left" w:pos="13740"/>
+          <w:tab w:val="left" w:pos="14656"/>
+        </w:tabs>
+        <w:spacing w:after="0" w:line="240" w:lineRule="auto"/>
+        <w:ind w:left="720"/>
+        <w:rPr>
+          <w:rFonts w:ascii="Mangal" w:eastAsia="Times New Roman" w:hAnsi="Mangal" w:cs="Mangal"/>
+          <w:kern w:val="0"/>
+          <w:sz w:val="20"/>
+          <w:szCs w:val="20"/>
+          <w14:ligatures w14:val="none"/>
+        </w:rPr>
+      </w:pPr>
+      <w:r>
+        <w:rPr>
+          <w:rFonts w:ascii="Mangal" w:eastAsia="Times New Roman" w:hAnsi="Mangal" w:cs="Mangal"/>
+          <w:kern w:val="0"/>
+          <w:sz w:val="20"/>
+          <w:szCs w:val="20"/>
+          <w14:ligatures w14:val="none"/>
+        </w:rPr>
+        <w:t>*</w:t>
+      </w:r>
+    </w:p>
+    <w:p>
+      <w:pPr>
+        <w:pStyle w:val="ListParagraph"/>
+        <w:numPr>
+          <w:ilvl w:val="0"/>
+          <w:numId w:val="39"/>
+        </w:numPr>
+        <w:spacing w:before="100" w:beforeAutospacing="1" w:after="100" w:afterAutospacing="1" w:line="240" w:lineRule="auto"/>
+        <w:outlineLvl w:val="1"/>
+        <w:rPr>
+          <w:rFonts w:ascii="Times New Roman" w:eastAsia="Times New Roman" w:hAnsi="Times New Roman" w:cs="Times New Roman"/>
+          <w:b/>
+          <w:bCs/>
+          <w:kern w:val="0"/>
+          <w:szCs w:val="24"/>
+          <w14:ligatures w14:val="none"/>
+        </w:rPr>
+      </w:pPr>
+      <w:r>
+        <w:rPr>
+          <w:rFonts w:ascii="Times New Roman" w:eastAsia="Times New Roman" w:hAnsi="Times New Roman" w:cs="Times New Roman"/>
+          <w:b/>
+          <w:bCs/>
+          <w:kern w:val="0"/>
+          <w:szCs w:val="24"/>
+          <w14:ligatures w14:val="none"/>
+        </w:rPr>
+        <w:t>Find Element That Appears Only Once</w:t>
+      </w:r>
+    </w:p>
+    <w:p>
+      <w:pPr>
+        <w:spacing w:before="100" w:beforeAutospacing="1" w:after="100" w:afterAutospacing="1" w:line="240" w:lineRule="auto"/>
+        <w:ind w:left="720"/>
+        <w:rPr>
+          <w:rFonts w:ascii="Mangal" w:eastAsia="Times New Roman" w:hAnsi="Mangal" w:cs="Mangal"/>
+          <w:kern w:val="0"/>
+          <w:sz w:val="20"/>
+          <w:szCs w:val="20"/>
+          <w14:ligatures w14:val="none"/>
+        </w:rPr>
+      </w:pPr>
+      <w:r>
+        <w:rPr>
+          <w:rFonts w:ascii="Mangal" w:eastAsia="Times New Roman" w:hAnsi="Mangal" w:cs="Mangal"/>
+          <w:kern w:val="0"/>
+          <w:sz w:val="20"/>
+          <w:szCs w:val="20"/>
+          <w14:ligatures w14:val="none"/>
+        </w:rPr>
+        <w:t>Input: {4,1,2,1,2}</w:t>
+      </w:r>
+      <w:r>
+        <w:rPr>
+          <w:rFonts w:ascii="Mangal" w:eastAsia="Times New Roman" w:hAnsi="Mangal" w:cs="Mangal"/>
+          <w:kern w:val="0"/>
+          <w:sz w:val="20"/>
+          <w:szCs w:val="20"/>
+          <w14:ligatures w14:val="none"/>
+        </w:rPr>
+        <w:br/>
+        <w:t>Output: 4</w:t>
+      </w:r>
+    </w:p>
+    <w:p>
+      <w:pPr>
+        <w:spacing w:before="100" w:beforeAutospacing="1" w:after="100" w:afterAutospacing="1" w:line="240" w:lineRule="auto"/>
+        <w:ind w:left="720"/>
+        <w:rPr>
+          <w:rFonts w:ascii="Mangal" w:eastAsia="Times New Roman" w:hAnsi="Mangal" w:cs="Mangal"/>
+          <w:kern w:val="0"/>
+          <w:sz w:val="20"/>
+          <w:szCs w:val="20"/>
+          <w14:ligatures w14:val="none"/>
+        </w:rPr>
+      </w:pPr>
+      <w:r>
+        <w:rPr>
+          <w:rFonts w:ascii="Mangal" w:eastAsia="Times New Roman" w:hAnsi="Mangal" w:cs="Mangal"/>
+          <w:kern w:val="0"/>
+          <w:sz w:val="20"/>
+          <w:szCs w:val="20"/>
+          <w14:ligatures w14:val="none"/>
+        </w:rPr>
+        <w:t>Can use frequency OR XOR (optional advanced).</w:t>
+      </w:r>
+    </w:p>
+    <w:p>
+      <w:pPr>
+        <w:spacing w:before="100" w:beforeAutospacing="1" w:after="100" w:afterAutospacing="1" w:line="240" w:lineRule="auto"/>
+        <w:ind w:left="720"/>
+        <w:rPr>
+          <w:rFonts w:ascii="Mangal" w:eastAsia="Times New Roman" w:hAnsi="Mangal" w:cs="Mangal"/>
+          <w:kern w:val="0"/>
+          <w:sz w:val="20"/>
+          <w:szCs w:val="20"/>
+          <w14:ligatures w14:val="none"/>
+        </w:rPr>
+      </w:pPr>
+      <w:r>
+        <w:rPr>
+          <w:rFonts w:ascii="Mangal" w:eastAsia="Times New Roman" w:hAnsi="Mangal" w:cs="Mangal"/>
+          <w:b/>
+          <w:bCs/>
+          <w:kern w:val="0"/>
+          <w:sz w:val="20"/>
+          <w:szCs w:val="20"/>
+          <w14:ligatures w14:val="none"/>
+        </w:rPr>
+        <w:t>Pattern:</w:t>
+      </w:r>
+      <w:r>
+        <w:rPr>
+          <w:rFonts w:ascii="Mangal" w:eastAsia="Times New Roman" w:hAnsi="Mangal" w:cs="Mangal"/>
+          <w:kern w:val="0"/>
+          <w:sz w:val="20"/>
+          <w:szCs w:val="20"/>
+          <w14:ligatures w14:val="none"/>
+        </w:rPr>
+        <w:t xml:space="preserve"> Unique element detection</w:t>
+      </w:r>
     </w:p>
     <w:p>
       <w:pPr>
@@ -8380,7 +9043,6 @@
           <w:sz w:val="24"/>
           <w:szCs w:val="24"/>
         </w:rPr>
-        <w:lastRenderedPageBreak/>
         <w:t>Count Strings Starting and Ending With Same Characte</w:t>
       </w:r>
       <w:r>
@@ -13064,6 +13726,7 @@
   <w:style w:type="character" w:default="1" w:styleId="DefaultParagraphFont">
     <w:name w:val="Default Paragraph Font"/>
     <w:uiPriority w:val="1"/>
+    <w:semiHidden/>
     <w:unhideWhenUsed/>
   </w:style>
   <w:style w:type="table" w:default="1" w:styleId="TableNormal">
@@ -13491,6 +14154,16 @@
     <w:basedOn w:val="DefaultParagraphFont"/>
     <w:rsid w:val="001A5C33"/>
   </w:style>
+  <w:style w:type="character" w:customStyle="1" w:styleId="hljs-bullet">
+    <w:name w:val="hljs-bullet"/>
+    <w:basedOn w:val="DefaultParagraphFont"/>
+    <w:rsid w:val="001B310A"/>
+  </w:style>
+  <w:style w:type="character" w:customStyle="1" w:styleId="hljs-strong">
+    <w:name w:val="hljs-strong"/>
+    <w:basedOn w:val="DefaultParagraphFont"/>
+    <w:rsid w:val="001B310A"/>
+  </w:style>
 </w:styles>
 </file>
 

</xml_diff>

<commit_message>
LAb report 6 completed
</commit_message>
<xml_diff>
--- a/Questions.docx
+++ b/Questions.docx
@@ -52,41 +52,44 @@
           <w:sz w:val="28"/>
           <w:szCs w:val="22"/>
         </w:rPr>
-        <w:t>Write a java program to check input validation for integer constraints :</w:t>
-      </w:r>
-    </w:p>
-    <w:p>
-      <w:pPr>
-        <w:pStyle w:val="ListParagraph"/>
+        <w:t xml:space="preserve">Write a java program to check input validation for integer </w:t>
+      </w:r>
+      <w:proofErr w:type="gramStart"/>
+      <w:r>
         <w:rPr>
           <w:rFonts w:ascii="Times New Roman" w:hAnsi="Times New Roman" w:cs="Times New Roman"/>
           <w:sz w:val="28"/>
           <w:szCs w:val="22"/>
         </w:rPr>
-      </w:pPr>
-      <w:r>
+        <w:t>constraints :</w:t>
+      </w:r>
+      <w:proofErr w:type="gramEnd"/>
+    </w:p>
+    <w:p>
+      <w:pPr>
+        <w:pStyle w:val="ListParagraph"/>
         <w:rPr>
           <w:rFonts w:ascii="Times New Roman" w:hAnsi="Times New Roman" w:cs="Times New Roman"/>
           <w:sz w:val="28"/>
           <w:szCs w:val="22"/>
         </w:rPr>
-        <w:t>N&lt;</w:t>
-      </w:r>
+      </w:pPr>
       <w:r>
         <w:rPr>
           <w:rFonts w:ascii="Times New Roman" w:hAnsi="Times New Roman" w:cs="Times New Roman"/>
           <w:sz w:val="28"/>
           <w:szCs w:val="22"/>
         </w:rPr>
-        <w:t>10</w:t>
-      </w:r>
+        <w:t>N&lt;</w:t>
+      </w:r>
+      <w:proofErr w:type="gramStart"/>
       <w:r>
         <w:rPr>
           <w:rFonts w:ascii="Times New Roman" w:hAnsi="Times New Roman" w:cs="Times New Roman"/>
           <w:sz w:val="28"/>
           <w:szCs w:val="22"/>
         </w:rPr>
-        <w:t xml:space="preserve"> </w:t>
+        <w:t>10</w:t>
       </w:r>
       <w:r>
         <w:rPr>
@@ -94,7 +97,7 @@
           <w:sz w:val="28"/>
           <w:szCs w:val="22"/>
         </w:rPr>
-        <w:t>,</w:t>
+        <w:t xml:space="preserve"> </w:t>
       </w:r>
       <w:r>
         <w:rPr>
@@ -102,7 +105,7 @@
           <w:sz w:val="28"/>
           <w:szCs w:val="22"/>
         </w:rPr>
-        <w:t>N&gt;</w:t>
+        <w:t>,</w:t>
       </w:r>
       <w:r>
         <w:rPr>
@@ -110,7 +113,42 @@
           <w:sz w:val="28"/>
           <w:szCs w:val="22"/>
         </w:rPr>
-        <w:t xml:space="preserve">0, for string constraints : </w:t>
+        <w:t>N</w:t>
+      </w:r>
+      <w:proofErr w:type="gramEnd"/>
+      <w:r>
+        <w:rPr>
+          <w:rFonts w:ascii="Times New Roman" w:hAnsi="Times New Roman" w:cs="Times New Roman"/>
+          <w:sz w:val="28"/>
+          <w:szCs w:val="22"/>
+        </w:rPr>
+        <w:t>&gt;</w:t>
+      </w:r>
+      <w:r>
+        <w:rPr>
+          <w:rFonts w:ascii="Times New Roman" w:hAnsi="Times New Roman" w:cs="Times New Roman"/>
+          <w:sz w:val="28"/>
+          <w:szCs w:val="22"/>
+        </w:rPr>
+        <w:t xml:space="preserve">0, for string </w:t>
+      </w:r>
+      <w:proofErr w:type="gramStart"/>
+      <w:r>
+        <w:rPr>
+          <w:rFonts w:ascii="Times New Roman" w:hAnsi="Times New Roman" w:cs="Times New Roman"/>
+          <w:sz w:val="28"/>
+          <w:szCs w:val="22"/>
+        </w:rPr>
+        <w:t>constraints :</w:t>
+      </w:r>
+      <w:proofErr w:type="gramEnd"/>
+      <w:r>
+        <w:rPr>
+          <w:rFonts w:ascii="Times New Roman" w:hAnsi="Times New Roman" w:cs="Times New Roman"/>
+          <w:sz w:val="28"/>
+          <w:szCs w:val="22"/>
+        </w:rPr>
+        <w:t xml:space="preserve"> </w:t>
       </w:r>
       <w:r>
         <w:rPr>
@@ -235,7 +273,34 @@
           <w:szCs w:val="24"/>
         </w:rPr>
         <w:br/>
-        <w:t xml:space="preserve">stringTimes("Hi", 2) </w:t>
+      </w:r>
+      <w:proofErr w:type="spellStart"/>
+      <w:proofErr w:type="gramStart"/>
+      <w:r>
+        <w:rPr>
+          <w:rFonts w:ascii="Verdana" w:hAnsi="Verdana"/>
+          <w:color w:val="000000"/>
+          <w:szCs w:val="24"/>
+        </w:rPr>
+        <w:t>stringTimes</w:t>
+      </w:r>
+      <w:proofErr w:type="spellEnd"/>
+      <w:r>
+        <w:rPr>
+          <w:rFonts w:ascii="Verdana" w:hAnsi="Verdana"/>
+          <w:color w:val="000000"/>
+          <w:szCs w:val="24"/>
+        </w:rPr>
+        <w:t>(</w:t>
+      </w:r>
+      <w:proofErr w:type="gramEnd"/>
+      <w:r>
+        <w:rPr>
+          <w:rFonts w:ascii="Verdana" w:hAnsi="Verdana"/>
+          <w:color w:val="000000"/>
+          <w:szCs w:val="24"/>
+        </w:rPr>
+        <w:t xml:space="preserve">"Hi", 2) </w:t>
       </w:r>
       <w:r>
         <w:rPr>
@@ -251,7 +316,25 @@
           <w:color w:val="000000"/>
           <w:szCs w:val="24"/>
         </w:rPr>
-        <w:t xml:space="preserve"> "HiHi"</w:t>
+        <w:t xml:space="preserve"> "</w:t>
+      </w:r>
+      <w:proofErr w:type="spellStart"/>
+      <w:r>
+        <w:rPr>
+          <w:rFonts w:ascii="Verdana" w:hAnsi="Verdana"/>
+          <w:color w:val="000000"/>
+          <w:szCs w:val="24"/>
+        </w:rPr>
+        <w:t>HiHi</w:t>
+      </w:r>
+      <w:proofErr w:type="spellEnd"/>
+      <w:r>
+        <w:rPr>
+          <w:rFonts w:ascii="Verdana" w:hAnsi="Verdana"/>
+          <w:color w:val="000000"/>
+          <w:szCs w:val="24"/>
+        </w:rPr>
+        <w:t>"</w:t>
       </w:r>
       <w:r>
         <w:rPr>
@@ -260,7 +343,34 @@
           <w:szCs w:val="24"/>
         </w:rPr>
         <w:br/>
-        <w:t xml:space="preserve">stringTimes("Hi", 3) </w:t>
+      </w:r>
+      <w:proofErr w:type="spellStart"/>
+      <w:proofErr w:type="gramStart"/>
+      <w:r>
+        <w:rPr>
+          <w:rFonts w:ascii="Verdana" w:hAnsi="Verdana"/>
+          <w:color w:val="000000"/>
+          <w:szCs w:val="24"/>
+        </w:rPr>
+        <w:t>stringTimes</w:t>
+      </w:r>
+      <w:proofErr w:type="spellEnd"/>
+      <w:r>
+        <w:rPr>
+          <w:rFonts w:ascii="Verdana" w:hAnsi="Verdana"/>
+          <w:color w:val="000000"/>
+          <w:szCs w:val="24"/>
+        </w:rPr>
+        <w:t>(</w:t>
+      </w:r>
+      <w:proofErr w:type="gramEnd"/>
+      <w:r>
+        <w:rPr>
+          <w:rFonts w:ascii="Verdana" w:hAnsi="Verdana"/>
+          <w:color w:val="000000"/>
+          <w:szCs w:val="24"/>
+        </w:rPr>
+        <w:t xml:space="preserve">"Hi", 3) </w:t>
       </w:r>
       <w:r>
         <w:rPr>
@@ -276,7 +386,25 @@
           <w:color w:val="000000"/>
           <w:szCs w:val="24"/>
         </w:rPr>
-        <w:t xml:space="preserve"> "HiHiHi"</w:t>
+        <w:t xml:space="preserve"> "</w:t>
+      </w:r>
+      <w:proofErr w:type="spellStart"/>
+      <w:r>
+        <w:rPr>
+          <w:rFonts w:ascii="Verdana" w:hAnsi="Verdana"/>
+          <w:color w:val="000000"/>
+          <w:szCs w:val="24"/>
+        </w:rPr>
+        <w:t>HiHiHi</w:t>
+      </w:r>
+      <w:proofErr w:type="spellEnd"/>
+      <w:r>
+        <w:rPr>
+          <w:rFonts w:ascii="Verdana" w:hAnsi="Verdana"/>
+          <w:color w:val="000000"/>
+          <w:szCs w:val="24"/>
+        </w:rPr>
+        <w:t>"</w:t>
       </w:r>
       <w:r>
         <w:rPr>
@@ -285,7 +413,34 @@
           <w:szCs w:val="24"/>
         </w:rPr>
         <w:br/>
-        <w:t xml:space="preserve">stringTimes("Hi", 1) </w:t>
+      </w:r>
+      <w:proofErr w:type="spellStart"/>
+      <w:proofErr w:type="gramStart"/>
+      <w:r>
+        <w:rPr>
+          <w:rFonts w:ascii="Verdana" w:hAnsi="Verdana"/>
+          <w:color w:val="000000"/>
+          <w:szCs w:val="24"/>
+        </w:rPr>
+        <w:t>stringTimes</w:t>
+      </w:r>
+      <w:proofErr w:type="spellEnd"/>
+      <w:r>
+        <w:rPr>
+          <w:rFonts w:ascii="Verdana" w:hAnsi="Verdana"/>
+          <w:color w:val="000000"/>
+          <w:szCs w:val="24"/>
+        </w:rPr>
+        <w:t>(</w:t>
+      </w:r>
+      <w:proofErr w:type="gramEnd"/>
+      <w:r>
+        <w:rPr>
+          <w:rFonts w:ascii="Verdana" w:hAnsi="Verdana"/>
+          <w:color w:val="000000"/>
+          <w:szCs w:val="24"/>
+        </w:rPr>
+        <w:t xml:space="preserve">"Hi", 1) </w:t>
       </w:r>
       <w:r>
         <w:rPr>
@@ -644,7 +799,27 @@
           <w:sz w:val="24"/>
           <w:szCs w:val="24"/>
         </w:rPr>
-        <w:t>Write a java program to find the multiplication of a input number.</w:t>
+        <w:t xml:space="preserve">Write a java program to find the multiplication of </w:t>
+      </w:r>
+      <w:proofErr w:type="gramStart"/>
+      <w:r>
+        <w:rPr>
+          <w:rFonts w:ascii="Verdana" w:hAnsi="Verdana"/>
+          <w:color w:val="000000"/>
+          <w:sz w:val="24"/>
+          <w:szCs w:val="24"/>
+        </w:rPr>
+        <w:t>a</w:t>
+      </w:r>
+      <w:proofErr w:type="gramEnd"/>
+      <w:r>
+        <w:rPr>
+          <w:rFonts w:ascii="Verdana" w:hAnsi="Verdana"/>
+          <w:color w:val="000000"/>
+          <w:sz w:val="24"/>
+          <w:szCs w:val="24"/>
+        </w:rPr>
+        <w:t xml:space="preserve"> input number.</w:t>
       </w:r>
     </w:p>
     <w:p>
@@ -677,7 +852,27 @@
           <w:sz w:val="24"/>
           <w:szCs w:val="24"/>
         </w:rPr>
-        <w:t xml:space="preserve">alculate factorial of a </w:t>
+        <w:t xml:space="preserve">alculate factorial of </w:t>
+      </w:r>
+      <w:proofErr w:type="gramStart"/>
+      <w:r>
+        <w:rPr>
+          <w:rFonts w:ascii="Verdana" w:hAnsi="Verdana"/>
+          <w:color w:val="000000"/>
+          <w:sz w:val="24"/>
+          <w:szCs w:val="24"/>
+        </w:rPr>
+        <w:t>a</w:t>
+      </w:r>
+      <w:proofErr w:type="gramEnd"/>
+      <w:r>
+        <w:rPr>
+          <w:rFonts w:ascii="Verdana" w:hAnsi="Verdana"/>
+          <w:color w:val="000000"/>
+          <w:sz w:val="24"/>
+          <w:szCs w:val="24"/>
+        </w:rPr>
+        <w:t xml:space="preserve"> </w:t>
       </w:r>
       <w:r>
         <w:rPr>
@@ -860,7 +1055,27 @@
           <w:sz w:val="24"/>
           <w:szCs w:val="24"/>
         </w:rPr>
-        <w:t>Write a java to count and sum of digits in a input number.</w:t>
+        <w:t xml:space="preserve">Write a java to count and sum of digits in </w:t>
+      </w:r>
+      <w:proofErr w:type="gramStart"/>
+      <w:r>
+        <w:rPr>
+          <w:rFonts w:ascii="Verdana" w:hAnsi="Verdana"/>
+          <w:color w:val="000000"/>
+          <w:sz w:val="24"/>
+          <w:szCs w:val="24"/>
+        </w:rPr>
+        <w:t>a</w:t>
+      </w:r>
+      <w:proofErr w:type="gramEnd"/>
+      <w:r>
+        <w:rPr>
+          <w:rFonts w:ascii="Verdana" w:hAnsi="Verdana"/>
+          <w:color w:val="000000"/>
+          <w:sz w:val="24"/>
+          <w:szCs w:val="24"/>
+        </w:rPr>
+        <w:t xml:space="preserve"> input number.</w:t>
       </w:r>
     </w:p>
     <w:p>
@@ -1004,7 +1219,58 @@
           <w:sz w:val="24"/>
           <w:szCs w:val="24"/>
         </w:rPr>
-        <w:t xml:space="preserve">Write a program to reverse the order of words in a string entered, for eg : I am Ram  to  Ram am I </w:t>
+        <w:t xml:space="preserve">Write a program to reverse the order of words in a string entered, for </w:t>
+      </w:r>
+      <w:proofErr w:type="spellStart"/>
+      <w:proofErr w:type="gramStart"/>
+      <w:r>
+        <w:rPr>
+          <w:rFonts w:ascii="Verdana" w:hAnsi="Verdana"/>
+          <w:color w:val="000000"/>
+          <w:sz w:val="24"/>
+          <w:szCs w:val="24"/>
+        </w:rPr>
+        <w:t>eg</w:t>
+      </w:r>
+      <w:proofErr w:type="spellEnd"/>
+      <w:r>
+        <w:rPr>
+          <w:rFonts w:ascii="Verdana" w:hAnsi="Verdana"/>
+          <w:color w:val="000000"/>
+          <w:sz w:val="24"/>
+          <w:szCs w:val="24"/>
+        </w:rPr>
+        <w:t xml:space="preserve"> :</w:t>
+      </w:r>
+      <w:proofErr w:type="gramEnd"/>
+      <w:r>
+        <w:rPr>
+          <w:rFonts w:ascii="Verdana" w:hAnsi="Verdana"/>
+          <w:color w:val="000000"/>
+          <w:sz w:val="24"/>
+          <w:szCs w:val="24"/>
+        </w:rPr>
+        <w:t xml:space="preserve"> I am </w:t>
+      </w:r>
+      <w:proofErr w:type="gramStart"/>
+      <w:r>
+        <w:rPr>
+          <w:rFonts w:ascii="Verdana" w:hAnsi="Verdana"/>
+          <w:color w:val="000000"/>
+          <w:sz w:val="24"/>
+          <w:szCs w:val="24"/>
+        </w:rPr>
+        <w:t>Ram  to</w:t>
+      </w:r>
+      <w:proofErr w:type="gramEnd"/>
+      <w:r>
+        <w:rPr>
+          <w:rFonts w:ascii="Verdana" w:hAnsi="Verdana"/>
+          <w:color w:val="000000"/>
+          <w:sz w:val="24"/>
+          <w:szCs w:val="24"/>
+        </w:rPr>
+        <w:t xml:space="preserve">  Ram am I </w:t>
       </w:r>
     </w:p>
     <w:p>
@@ -1549,7 +1815,31 @@
           <w:sz w:val="24"/>
           <w:szCs w:val="24"/>
         </w:rPr>
-        <w:t>only even digits</w:t>
+        <w:t xml:space="preserve">only </w:t>
+      </w:r>
+      <w:proofErr w:type="spellStart"/>
+      <w:r>
+        <w:rPr>
+          <w:rFonts w:ascii="Verdana" w:hAnsi="Verdana"/>
+          <w:b/>
+          <w:bCs/>
+          <w:color w:val="000000"/>
+          <w:sz w:val="24"/>
+          <w:szCs w:val="24"/>
+        </w:rPr>
+        <w:t>even</w:t>
+      </w:r>
+      <w:proofErr w:type="spellEnd"/>
+      <w:r>
+        <w:rPr>
+          <w:rFonts w:ascii="Verdana" w:hAnsi="Verdana"/>
+          <w:b/>
+          <w:bCs/>
+          <w:color w:val="000000"/>
+          <w:sz w:val="24"/>
+          <w:szCs w:val="24"/>
+        </w:rPr>
+        <w:t xml:space="preserve"> digits</w:t>
       </w:r>
       <w:r>
         <w:rPr>
@@ -1640,17 +1930,48 @@
           <w:sz w:val="24"/>
           <w:szCs w:val="24"/>
         </w:rPr>
-        <w:t>Day 08</w:t>
-      </w:r>
-      <w:r>
-        <w:rPr>
-          <w:rFonts w:ascii="Verdana" w:hAnsi="Verdana"/>
-          <w:color w:val="000000"/>
-          <w:sz w:val="24"/>
-          <w:szCs w:val="24"/>
-        </w:rPr>
-        <w:t>( stop condition value-based vs count-based )</w:t>
-      </w:r>
+        <w:t xml:space="preserve">Day </w:t>
+      </w:r>
+      <w:proofErr w:type="gramStart"/>
+      <w:r>
+        <w:rPr>
+          <w:rFonts w:ascii="Verdana" w:hAnsi="Verdana"/>
+          <w:color w:val="000000"/>
+          <w:sz w:val="24"/>
+          <w:szCs w:val="24"/>
+        </w:rPr>
+        <w:t>08</w:t>
+      </w:r>
+      <w:r>
+        <w:rPr>
+          <w:rFonts w:ascii="Verdana" w:hAnsi="Verdana"/>
+          <w:color w:val="000000"/>
+          <w:sz w:val="24"/>
+          <w:szCs w:val="24"/>
+        </w:rPr>
+        <w:t>( stop</w:t>
+      </w:r>
+      <w:proofErr w:type="gramEnd"/>
+      <w:r>
+        <w:rPr>
+          <w:rFonts w:ascii="Verdana" w:hAnsi="Verdana"/>
+          <w:color w:val="000000"/>
+          <w:sz w:val="24"/>
+          <w:szCs w:val="24"/>
+        </w:rPr>
+        <w:t xml:space="preserve"> condition value-based vs count-</w:t>
+      </w:r>
+      <w:proofErr w:type="gramStart"/>
+      <w:r>
+        <w:rPr>
+          <w:rFonts w:ascii="Verdana" w:hAnsi="Verdana"/>
+          <w:color w:val="000000"/>
+          <w:sz w:val="24"/>
+          <w:szCs w:val="24"/>
+        </w:rPr>
+        <w:t>based )</w:t>
+      </w:r>
+      <w:proofErr w:type="gramEnd"/>
     </w:p>
     <w:p>
       <w:pPr>
@@ -1993,7 +2314,17 @@
           <w:sz w:val="24"/>
           <w:szCs w:val="24"/>
         </w:rPr>
-        <w:t xml:space="preserve"> it contains.</w:t>
+        <w:t xml:space="preserve"> it </w:t>
+      </w:r>
+      <w:proofErr w:type="gramStart"/>
+      <w:r>
+        <w:rPr>
+          <w:rFonts w:ascii="Verdana" w:hAnsi="Verdana"/>
+          <w:color w:val="000000"/>
+          <w:sz w:val="24"/>
+          <w:szCs w:val="24"/>
+        </w:rPr>
+        <w:t>contains.</w:t>
       </w:r>
       <w:r>
         <w:rPr>
@@ -2004,6 +2335,7 @@
         </w:rPr>
         <w:t>(</w:t>
       </w:r>
+      <w:proofErr w:type="gramEnd"/>
       <w:r>
         <w:rPr>
           <w:rFonts w:asciiTheme="minorHAnsi" w:eastAsiaTheme="minorHAnsi" w:hAnsiTheme="minorHAnsi" w:cstheme="minorBidi"/>
@@ -2065,7 +2397,19 @@
           <w:sz w:val="24"/>
           <w:szCs w:val="24"/>
         </w:rPr>
-        <w:t>using loop only</w:t>
+        <w:t xml:space="preserve">using loop </w:t>
+      </w:r>
+      <w:proofErr w:type="gramStart"/>
+      <w:r>
+        <w:rPr>
+          <w:rFonts w:ascii="Verdana" w:hAnsi="Verdana"/>
+          <w:b/>
+          <w:bCs/>
+          <w:color w:val="000000"/>
+          <w:sz w:val="24"/>
+          <w:szCs w:val="24"/>
+        </w:rPr>
+        <w:t>only</w:t>
       </w:r>
       <w:r>
         <w:rPr>
@@ -2083,7 +2427,37 @@
           <w:sz w:val="24"/>
           <w:szCs w:val="24"/>
         </w:rPr>
-        <w:t>(No Stringbuilder) (</w:t>
+        <w:t>(</w:t>
+      </w:r>
+      <w:proofErr w:type="gramEnd"/>
+      <w:r>
+        <w:rPr>
+          <w:rFonts w:ascii="Verdana" w:hAnsi="Verdana"/>
+          <w:color w:val="000000"/>
+          <w:sz w:val="24"/>
+          <w:szCs w:val="24"/>
+        </w:rPr>
+        <w:t xml:space="preserve">No </w:t>
+      </w:r>
+      <w:proofErr w:type="spellStart"/>
+      <w:r>
+        <w:rPr>
+          <w:rFonts w:ascii="Verdana" w:hAnsi="Verdana"/>
+          <w:color w:val="000000"/>
+          <w:sz w:val="24"/>
+          <w:szCs w:val="24"/>
+        </w:rPr>
+        <w:t>Stringbuilder</w:t>
+      </w:r>
+      <w:proofErr w:type="spellEnd"/>
+      <w:r>
+        <w:rPr>
+          <w:rFonts w:ascii="Verdana" w:hAnsi="Verdana"/>
+          <w:color w:val="000000"/>
+          <w:sz w:val="24"/>
+          <w:szCs w:val="24"/>
+        </w:rPr>
+        <w:t>) (</w:t>
       </w:r>
       <w:r>
         <w:rPr>
@@ -2136,7 +2510,19 @@
           <w:sz w:val="24"/>
           <w:szCs w:val="24"/>
         </w:rPr>
-        <w:t>greater than 50</w:t>
+        <w:t xml:space="preserve">greater than </w:t>
+      </w:r>
+      <w:proofErr w:type="gramStart"/>
+      <w:r>
+        <w:rPr>
+          <w:rFonts w:ascii="Verdana" w:hAnsi="Verdana"/>
+          <w:b/>
+          <w:bCs/>
+          <w:color w:val="000000"/>
+          <w:sz w:val="24"/>
+          <w:szCs w:val="24"/>
+        </w:rPr>
+        <w:t>50</w:t>
       </w:r>
       <w:r>
         <w:rPr>
@@ -2156,6 +2542,7 @@
         </w:rPr>
         <w:t>(</w:t>
       </w:r>
+      <w:proofErr w:type="gramEnd"/>
       <w:r>
         <w:rPr>
           <w:rFonts w:asciiTheme="minorHAnsi" w:eastAsiaTheme="minorHAnsi" w:hAnsiTheme="minorHAnsi" w:cstheme="minorBidi"/>
@@ -2270,7 +2657,17 @@
           <w:sz w:val="24"/>
           <w:szCs w:val="24"/>
         </w:rPr>
-        <w:t>Count Even Digits in Each Array Element</w:t>
+        <w:t xml:space="preserve">Count Even Digits in Each Array </w:t>
+      </w:r>
+      <w:proofErr w:type="gramStart"/>
+      <w:r>
+        <w:rPr>
+          <w:rFonts w:ascii="Verdana" w:hAnsi="Verdana"/>
+          <w:color w:val="000000"/>
+          <w:sz w:val="24"/>
+          <w:szCs w:val="24"/>
+        </w:rPr>
+        <w:t>Element</w:t>
       </w:r>
       <w:r>
         <w:rPr>
@@ -2281,6 +2678,7 @@
         </w:rPr>
         <w:t>.(</w:t>
       </w:r>
+      <w:proofErr w:type="gramEnd"/>
       <w:r>
         <w:rPr>
           <w:rFonts w:asciiTheme="minorHAnsi" w:eastAsiaTheme="minorHAnsi" w:hAnsiTheme="minorHAnsi" w:cstheme="minorBidi"/>
@@ -2331,7 +2729,29 @@
           <w:sz w:val="24"/>
           <w:szCs w:val="24"/>
         </w:rPr>
-        <w:t xml:space="preserve">Traverse an array.If </w:t>
+        <w:t xml:space="preserve">Traverse an </w:t>
+      </w:r>
+      <w:proofErr w:type="spellStart"/>
+      <w:proofErr w:type="gramStart"/>
+      <w:r>
+        <w:rPr>
+          <w:rFonts w:ascii="Verdana" w:hAnsi="Verdana"/>
+          <w:color w:val="000000"/>
+          <w:sz w:val="24"/>
+          <w:szCs w:val="24"/>
+        </w:rPr>
+        <w:t>array.If</w:t>
+      </w:r>
+      <w:proofErr w:type="spellEnd"/>
+      <w:proofErr w:type="gramEnd"/>
+      <w:r>
+        <w:rPr>
+          <w:rFonts w:ascii="Verdana" w:hAnsi="Verdana"/>
+          <w:color w:val="000000"/>
+          <w:sz w:val="24"/>
+          <w:szCs w:val="24"/>
+        </w:rPr>
+        <w:t xml:space="preserve"> </w:t>
       </w:r>
       <w:r>
         <w:rPr>
@@ -2351,7 +2771,17 @@
           <w:sz w:val="24"/>
           <w:szCs w:val="24"/>
         </w:rPr>
-        <w:t>, stop immediately.</w:t>
+        <w:t xml:space="preserve">, stop </w:t>
+      </w:r>
+      <w:proofErr w:type="gramStart"/>
+      <w:r>
+        <w:rPr>
+          <w:rFonts w:ascii="Verdana" w:hAnsi="Verdana"/>
+          <w:color w:val="000000"/>
+          <w:sz w:val="24"/>
+          <w:szCs w:val="24"/>
+        </w:rPr>
+        <w:t>immediately.</w:t>
       </w:r>
       <w:r>
         <w:rPr>
@@ -2362,6 +2792,7 @@
         </w:rPr>
         <w:t>(</w:t>
       </w:r>
+      <w:proofErr w:type="gramEnd"/>
       <w:r>
         <w:rPr>
           <w:rFonts w:asciiTheme="minorHAnsi" w:eastAsiaTheme="minorHAnsi" w:hAnsiTheme="minorHAnsi" w:cstheme="minorBidi"/>
@@ -2506,7 +2937,17 @@
           <w:sz w:val="24"/>
           <w:szCs w:val="24"/>
         </w:rPr>
-        <w:t xml:space="preserve"> in a string</w:t>
+        <w:t xml:space="preserve"> in a </w:t>
+      </w:r>
+      <w:proofErr w:type="gramStart"/>
+      <w:r>
+        <w:rPr>
+          <w:rFonts w:ascii="Verdana" w:hAnsi="Verdana"/>
+          <w:color w:val="000000"/>
+          <w:sz w:val="24"/>
+          <w:szCs w:val="24"/>
+        </w:rPr>
+        <w:t>string</w:t>
       </w:r>
       <w:r>
         <w:rPr>
@@ -2526,6 +2967,7 @@
         </w:rPr>
         <w:t>(</w:t>
       </w:r>
+      <w:proofErr w:type="gramEnd"/>
       <w:r>
         <w:rPr>
           <w:rFonts w:asciiTheme="minorHAnsi" w:eastAsiaTheme="minorHAnsi" w:hAnsiTheme="minorHAnsi" w:cstheme="minorBidi"/>
@@ -2593,7 +3035,19 @@
           <w:sz w:val="24"/>
           <w:szCs w:val="24"/>
         </w:rPr>
-        <w:t>without using reverse methods</w:t>
+        <w:t xml:space="preserve">without using reverse </w:t>
+      </w:r>
+      <w:proofErr w:type="gramStart"/>
+      <w:r>
+        <w:rPr>
+          <w:rFonts w:ascii="Verdana" w:hAnsi="Verdana"/>
+          <w:b/>
+          <w:bCs/>
+          <w:color w:val="000000"/>
+          <w:sz w:val="24"/>
+          <w:szCs w:val="24"/>
+        </w:rPr>
+        <w:t>methods</w:t>
       </w:r>
       <w:r>
         <w:rPr>
@@ -2613,6 +3067,7 @@
         </w:rPr>
         <w:t>(</w:t>
       </w:r>
+      <w:proofErr w:type="gramEnd"/>
       <w:r>
         <w:rPr>
           <w:rFonts w:asciiTheme="minorHAnsi" w:eastAsiaTheme="minorHAnsi" w:hAnsiTheme="minorHAnsi" w:cstheme="minorBidi"/>
@@ -2663,7 +3118,17 @@
           <w:sz w:val="24"/>
           <w:szCs w:val="24"/>
         </w:rPr>
-        <w:t>Given an array and a number x, count how many times x appears.</w:t>
+        <w:t xml:space="preserve">Given an array and a number x, count how many times x </w:t>
+      </w:r>
+      <w:proofErr w:type="gramStart"/>
+      <w:r>
+        <w:rPr>
+          <w:rFonts w:ascii="Verdana" w:hAnsi="Verdana"/>
+          <w:color w:val="000000"/>
+          <w:sz w:val="24"/>
+          <w:szCs w:val="24"/>
+        </w:rPr>
+        <w:t>appears.</w:t>
       </w:r>
       <w:r>
         <w:rPr>
@@ -2674,6 +3139,7 @@
         </w:rPr>
         <w:t>(</w:t>
       </w:r>
+      <w:proofErr w:type="gramEnd"/>
       <w:r>
         <w:rPr>
           <w:rFonts w:asciiTheme="minorHAnsi" w:eastAsiaTheme="minorHAnsi" w:hAnsiTheme="minorHAnsi" w:cstheme="minorBidi"/>
@@ -2735,7 +3201,19 @@
           <w:sz w:val="24"/>
           <w:szCs w:val="24"/>
         </w:rPr>
-        <w:t>ascending order</w:t>
+        <w:t xml:space="preserve">ascending </w:t>
+      </w:r>
+      <w:proofErr w:type="gramStart"/>
+      <w:r>
+        <w:rPr>
+          <w:rFonts w:ascii="Verdana" w:hAnsi="Verdana"/>
+          <w:b/>
+          <w:bCs/>
+          <w:color w:val="000000"/>
+          <w:sz w:val="24"/>
+          <w:szCs w:val="24"/>
+        </w:rPr>
+        <w:t>order</w:t>
       </w:r>
       <w:r>
         <w:rPr>
@@ -2755,6 +3233,7 @@
         </w:rPr>
         <w:t>(</w:t>
       </w:r>
+      <w:proofErr w:type="gramEnd"/>
       <w:r>
         <w:rPr>
           <w:rFonts w:asciiTheme="minorHAnsi" w:eastAsiaTheme="minorHAnsi" w:hAnsiTheme="minorHAnsi" w:cstheme="minorBidi"/>
@@ -2816,7 +3295,19 @@
           <w:sz w:val="24"/>
           <w:szCs w:val="24"/>
         </w:rPr>
-        <w:t>sum of digits of each element</w:t>
+        <w:t xml:space="preserve">sum of digits of each </w:t>
+      </w:r>
+      <w:proofErr w:type="gramStart"/>
+      <w:r>
+        <w:rPr>
+          <w:rFonts w:ascii="Verdana" w:hAnsi="Verdana"/>
+          <w:b/>
+          <w:bCs/>
+          <w:color w:val="000000"/>
+          <w:sz w:val="24"/>
+          <w:szCs w:val="24"/>
+        </w:rPr>
+        <w:t>element</w:t>
       </w:r>
       <w:r>
         <w:rPr>
@@ -2836,6 +3327,7 @@
         </w:rPr>
         <w:t>(</w:t>
       </w:r>
+      <w:proofErr w:type="gramEnd"/>
       <w:r>
         <w:rPr>
           <w:rFonts w:asciiTheme="minorHAnsi" w:eastAsiaTheme="minorHAnsi" w:hAnsiTheme="minorHAnsi" w:cstheme="minorBidi"/>
@@ -2906,7 +3398,17 @@
           <w:sz w:val="24"/>
           <w:szCs w:val="24"/>
         </w:rPr>
-        <w:t>, then stop.</w:t>
+        <w:t xml:space="preserve">, then </w:t>
+      </w:r>
+      <w:proofErr w:type="gramStart"/>
+      <w:r>
+        <w:rPr>
+          <w:rFonts w:ascii="Verdana" w:hAnsi="Verdana"/>
+          <w:color w:val="000000"/>
+          <w:sz w:val="24"/>
+          <w:szCs w:val="24"/>
+        </w:rPr>
+        <w:t>stop.</w:t>
       </w:r>
       <w:r>
         <w:rPr>
@@ -2917,6 +3419,7 @@
         </w:rPr>
         <w:t>(</w:t>
       </w:r>
+      <w:proofErr w:type="gramEnd"/>
       <w:r>
         <w:rPr>
           <w:rFonts w:asciiTheme="minorHAnsi" w:eastAsiaTheme="minorHAnsi" w:hAnsiTheme="minorHAnsi" w:cstheme="minorBidi"/>
@@ -2987,7 +3490,47 @@
           <w:sz w:val="24"/>
           <w:szCs w:val="24"/>
         </w:rPr>
-        <w:t>Write a program to find out whether entered number is place at ones, tens, hundred , thousand etc….</w:t>
+        <w:t xml:space="preserve">Write a program to find out whether entered number is place at ones, tens, </w:t>
+      </w:r>
+      <w:proofErr w:type="gramStart"/>
+      <w:r>
+        <w:rPr>
+          <w:rFonts w:ascii="Verdana" w:hAnsi="Verdana"/>
+          <w:color w:val="000000"/>
+          <w:sz w:val="24"/>
+          <w:szCs w:val="24"/>
+        </w:rPr>
+        <w:t>hundred ,</w:t>
+      </w:r>
+      <w:proofErr w:type="gramEnd"/>
+      <w:r>
+        <w:rPr>
+          <w:rFonts w:ascii="Verdana" w:hAnsi="Verdana"/>
+          <w:color w:val="000000"/>
+          <w:sz w:val="24"/>
+          <w:szCs w:val="24"/>
+        </w:rPr>
+        <w:t xml:space="preserve"> thousand </w:t>
+      </w:r>
+      <w:proofErr w:type="spellStart"/>
+      <w:r>
+        <w:rPr>
+          <w:rFonts w:ascii="Verdana" w:hAnsi="Verdana"/>
+          <w:color w:val="000000"/>
+          <w:sz w:val="24"/>
+          <w:szCs w:val="24"/>
+        </w:rPr>
+        <w:t>etc</w:t>
+      </w:r>
+      <w:proofErr w:type="spellEnd"/>
+      <w:r>
+        <w:rPr>
+          <w:rFonts w:ascii="Verdana" w:hAnsi="Verdana"/>
+          <w:color w:val="000000"/>
+          <w:sz w:val="24"/>
+          <w:szCs w:val="24"/>
+        </w:rPr>
+        <w:t>….</w:t>
       </w:r>
     </w:p>
     <w:p>
@@ -3011,16 +3554,96 @@
           <w:sz w:val="24"/>
           <w:szCs w:val="24"/>
         </w:rPr>
-        <w:t>Write a program to take a string and a number / integer as prefix for that word or string , and in output just reverse string upto that integer position part, or that prefix part.</w:t>
-      </w:r>
-      <w:r>
-        <w:rPr>
-          <w:rFonts w:ascii="Verdana" w:hAnsi="Verdana"/>
-          <w:color w:val="000000"/>
-          <w:sz w:val="24"/>
-          <w:szCs w:val="24"/>
-        </w:rPr>
-        <w:t>(Practice confusion with size of an array to index of an array ).</w:t>
+        <w:t xml:space="preserve">Write a program to take a string and a number / integer as prefix for that word or </w:t>
+      </w:r>
+      <w:proofErr w:type="gramStart"/>
+      <w:r>
+        <w:rPr>
+          <w:rFonts w:ascii="Verdana" w:hAnsi="Verdana"/>
+          <w:color w:val="000000"/>
+          <w:sz w:val="24"/>
+          <w:szCs w:val="24"/>
+        </w:rPr>
+        <w:t>string ,</w:t>
+      </w:r>
+      <w:proofErr w:type="gramEnd"/>
+      <w:r>
+        <w:rPr>
+          <w:rFonts w:ascii="Verdana" w:hAnsi="Verdana"/>
+          <w:color w:val="000000"/>
+          <w:sz w:val="24"/>
+          <w:szCs w:val="24"/>
+        </w:rPr>
+        <w:t xml:space="preserve"> and in output just reverse string </w:t>
+      </w:r>
+      <w:proofErr w:type="spellStart"/>
+      <w:r>
+        <w:rPr>
+          <w:rFonts w:ascii="Verdana" w:hAnsi="Verdana"/>
+          <w:color w:val="000000"/>
+          <w:sz w:val="24"/>
+          <w:szCs w:val="24"/>
+        </w:rPr>
+        <w:t>upto</w:t>
+      </w:r>
+      <w:proofErr w:type="spellEnd"/>
+      <w:r>
+        <w:rPr>
+          <w:rFonts w:ascii="Verdana" w:hAnsi="Verdana"/>
+          <w:color w:val="000000"/>
+          <w:sz w:val="24"/>
+          <w:szCs w:val="24"/>
+        </w:rPr>
+        <w:t xml:space="preserve"> that integer position part, or that prefix </w:t>
+      </w:r>
+      <w:proofErr w:type="gramStart"/>
+      <w:r>
+        <w:rPr>
+          <w:rFonts w:ascii="Verdana" w:hAnsi="Verdana"/>
+          <w:color w:val="000000"/>
+          <w:sz w:val="24"/>
+          <w:szCs w:val="24"/>
+        </w:rPr>
+        <w:t>part.</w:t>
+      </w:r>
+      <w:r>
+        <w:rPr>
+          <w:rFonts w:ascii="Verdana" w:hAnsi="Verdana"/>
+          <w:color w:val="000000"/>
+          <w:sz w:val="24"/>
+          <w:szCs w:val="24"/>
+        </w:rPr>
+        <w:t>(</w:t>
+      </w:r>
+      <w:proofErr w:type="gramEnd"/>
+      <w:r>
+        <w:rPr>
+          <w:rFonts w:ascii="Verdana" w:hAnsi="Verdana"/>
+          <w:color w:val="000000"/>
+          <w:sz w:val="24"/>
+          <w:szCs w:val="24"/>
+        </w:rPr>
+        <w:t xml:space="preserve">Practice confusion with size of an array to index of an </w:t>
+      </w:r>
+      <w:proofErr w:type="gramStart"/>
+      <w:r>
+        <w:rPr>
+          <w:rFonts w:ascii="Verdana" w:hAnsi="Verdana"/>
+          <w:color w:val="000000"/>
+          <w:sz w:val="24"/>
+          <w:szCs w:val="24"/>
+        </w:rPr>
+        <w:t>array )</w:t>
+      </w:r>
+      <w:proofErr w:type="gramEnd"/>
+      <w:r>
+        <w:rPr>
+          <w:rFonts w:ascii="Verdana" w:hAnsi="Verdana"/>
+          <w:color w:val="000000"/>
+          <w:sz w:val="24"/>
+          <w:szCs w:val="24"/>
+        </w:rPr>
+        <w:t>.</w:t>
       </w:r>
     </w:p>
     <w:p>
@@ -3044,7 +3667,17 @@
           <w:sz w:val="24"/>
           <w:szCs w:val="24"/>
         </w:rPr>
-        <w:t>Count Words in a String (Single Spaces Only)</w:t>
+        <w:t>Count Words in a String (Single Spaces Only</w:t>
+      </w:r>
+      <w:proofErr w:type="gramStart"/>
+      <w:r>
+        <w:rPr>
+          <w:rFonts w:ascii="Verdana" w:hAnsi="Verdana"/>
+          <w:color w:val="000000"/>
+          <w:sz w:val="24"/>
+          <w:szCs w:val="24"/>
+        </w:rPr>
+        <w:t>)</w:t>
       </w:r>
       <w:r>
         <w:rPr>
@@ -3055,6 +3688,7 @@
         </w:rPr>
         <w:t>.(</w:t>
       </w:r>
+      <w:proofErr w:type="gramEnd"/>
       <w:r>
         <w:rPr>
           <w:rFonts w:asciiTheme="minorHAnsi" w:eastAsiaTheme="minorHAnsi" w:hAnsiTheme="minorHAnsi" w:cstheme="minorBidi"/>
@@ -3130,7 +3764,17 @@
           <w:szCs w:val="24"/>
         </w:rPr>
         <w:lastRenderedPageBreak/>
-        <w:t>Given a string, remove all numeric characters and print the result.</w:t>
+        <w:t xml:space="preserve">Given a string, remove all numeric characters and print the </w:t>
+      </w:r>
+      <w:proofErr w:type="gramStart"/>
+      <w:r>
+        <w:rPr>
+          <w:rFonts w:ascii="Verdana" w:hAnsi="Verdana"/>
+          <w:color w:val="000000"/>
+          <w:sz w:val="24"/>
+          <w:szCs w:val="24"/>
+        </w:rPr>
+        <w:t>result.</w:t>
       </w:r>
       <w:r>
         <w:rPr>
@@ -3141,6 +3785,7 @@
         </w:rPr>
         <w:t>(</w:t>
       </w:r>
+      <w:proofErr w:type="gramEnd"/>
       <w:r>
         <w:rPr>
           <w:rFonts w:asciiTheme="minorHAnsi" w:eastAsiaTheme="minorHAnsi" w:hAnsiTheme="minorHAnsi" w:cstheme="minorBidi"/>
@@ -3238,25 +3883,55 @@
           <w:sz w:val="24"/>
           <w:szCs w:val="24"/>
         </w:rPr>
-        <w:t>Find (maximum – minimum)</w:t>
-      </w:r>
-      <w:r>
-        <w:rPr>
-          <w:rFonts w:ascii="Verdana" w:hAnsi="Verdana"/>
-          <w:color w:val="000000"/>
-          <w:sz w:val="24"/>
-          <w:szCs w:val="24"/>
-        </w:rPr>
-        <w:t>difference between MAX and MIN</w:t>
-      </w:r>
-      <w:r>
-        <w:rPr>
-          <w:rFonts w:ascii="Verdana" w:hAnsi="Verdana"/>
-          <w:color w:val="000000"/>
-          <w:sz w:val="24"/>
-          <w:szCs w:val="24"/>
-        </w:rPr>
-        <w:t xml:space="preserve"> from an integer array.</w:t>
+        <w:t xml:space="preserve">Find (maximum – </w:t>
+      </w:r>
+      <w:proofErr w:type="gramStart"/>
+      <w:r>
+        <w:rPr>
+          <w:rFonts w:ascii="Verdana" w:hAnsi="Verdana"/>
+          <w:color w:val="000000"/>
+          <w:sz w:val="24"/>
+          <w:szCs w:val="24"/>
+        </w:rPr>
+        <w:t>minimum)</w:t>
+      </w:r>
+      <w:r>
+        <w:rPr>
+          <w:rFonts w:ascii="Verdana" w:hAnsi="Verdana"/>
+          <w:color w:val="000000"/>
+          <w:sz w:val="24"/>
+          <w:szCs w:val="24"/>
+        </w:rPr>
+        <w:t>difference</w:t>
+      </w:r>
+      <w:proofErr w:type="gramEnd"/>
+      <w:r>
+        <w:rPr>
+          <w:rFonts w:ascii="Verdana" w:hAnsi="Verdana"/>
+          <w:color w:val="000000"/>
+          <w:sz w:val="24"/>
+          <w:szCs w:val="24"/>
+        </w:rPr>
+        <w:t xml:space="preserve"> between MAX and MIN</w:t>
+      </w:r>
+      <w:r>
+        <w:rPr>
+          <w:rFonts w:ascii="Verdana" w:hAnsi="Verdana"/>
+          <w:color w:val="000000"/>
+          <w:sz w:val="24"/>
+          <w:szCs w:val="24"/>
+        </w:rPr>
+        <w:t xml:space="preserve"> from an integer </w:t>
+      </w:r>
+      <w:proofErr w:type="gramStart"/>
+      <w:r>
+        <w:rPr>
+          <w:rFonts w:ascii="Verdana" w:hAnsi="Verdana"/>
+          <w:color w:val="000000"/>
+          <w:sz w:val="24"/>
+          <w:szCs w:val="24"/>
+        </w:rPr>
+        <w:t>array.</w:t>
       </w:r>
       <w:r>
         <w:rPr>
@@ -3267,6 +3942,7 @@
         </w:rPr>
         <w:t>(</w:t>
       </w:r>
+      <w:proofErr w:type="gramEnd"/>
       <w:r>
         <w:rPr>
           <w:rFonts w:asciiTheme="minorHAnsi" w:eastAsiaTheme="minorHAnsi" w:hAnsiTheme="minorHAnsi" w:cstheme="minorBidi"/>
@@ -3328,7 +4004,19 @@
           <w:sz w:val="24"/>
           <w:szCs w:val="24"/>
         </w:rPr>
-        <w:t>without using extra array</w:t>
+        <w:t xml:space="preserve">without using extra </w:t>
+      </w:r>
+      <w:proofErr w:type="gramStart"/>
+      <w:r>
+        <w:rPr>
+          <w:rFonts w:ascii="Verdana" w:hAnsi="Verdana"/>
+          <w:b/>
+          <w:bCs/>
+          <w:color w:val="000000"/>
+          <w:sz w:val="24"/>
+          <w:szCs w:val="24"/>
+        </w:rPr>
+        <w:t>array</w:t>
       </w:r>
       <w:r>
         <w:rPr>
@@ -3348,6 +4036,7 @@
         </w:rPr>
         <w:t>(</w:t>
       </w:r>
+      <w:proofErr w:type="gramEnd"/>
       <w:r>
         <w:rPr>
           <w:rFonts w:asciiTheme="minorHAnsi" w:eastAsiaTheme="minorHAnsi" w:hAnsiTheme="minorHAnsi" w:cstheme="minorBidi"/>
@@ -3424,7 +4113,17 @@
           <w:sz w:val="24"/>
           <w:szCs w:val="24"/>
         </w:rPr>
-        <w:t xml:space="preserve"> (2, 3, 5, 7) across all elements.</w:t>
+        <w:t xml:space="preserve"> (2, 3, 5, 7) across all </w:t>
+      </w:r>
+      <w:proofErr w:type="gramStart"/>
+      <w:r>
+        <w:rPr>
+          <w:rFonts w:ascii="Verdana" w:hAnsi="Verdana"/>
+          <w:color w:val="000000"/>
+          <w:sz w:val="24"/>
+          <w:szCs w:val="24"/>
+        </w:rPr>
+        <w:t>elements.</w:t>
       </w:r>
       <w:r>
         <w:rPr>
@@ -3435,6 +4134,7 @@
         </w:rPr>
         <w:t>(</w:t>
       </w:r>
+      <w:proofErr w:type="gramEnd"/>
       <w:r>
         <w:rPr>
           <w:rFonts w:asciiTheme="minorHAnsi" w:eastAsiaTheme="minorHAnsi" w:hAnsiTheme="minorHAnsi" w:cstheme="minorBidi"/>
@@ -3503,7 +4203,17 @@
           <w:sz w:val="24"/>
           <w:szCs w:val="24"/>
         </w:rPr>
-        <w:t>Stop when a string contains "java" (case-insensitive).</w:t>
+        <w:t>Stop when a string contains "java" (case-insensitive</w:t>
+      </w:r>
+      <w:proofErr w:type="gramStart"/>
+      <w:r>
+        <w:rPr>
+          <w:rFonts w:ascii="Verdana" w:hAnsi="Verdana"/>
+          <w:color w:val="000000"/>
+          <w:sz w:val="24"/>
+          <w:szCs w:val="24"/>
+        </w:rPr>
+        <w:t>).</w:t>
       </w:r>
       <w:r>
         <w:rPr>
@@ -3514,6 +4224,7 @@
         </w:rPr>
         <w:t>(</w:t>
       </w:r>
+      <w:proofErr w:type="gramEnd"/>
       <w:r>
         <w:rPr>
           <w:rFonts w:asciiTheme="minorHAnsi" w:eastAsiaTheme="minorHAnsi" w:hAnsiTheme="minorHAnsi" w:cstheme="minorBidi"/>
@@ -3620,8 +4331,19 @@
           <w:sz w:val="24"/>
           <w:szCs w:val="24"/>
         </w:rPr>
-        <w:t>Count how many letters are repeated in a string or word, or maybe array of characters.(</w:t>
-      </w:r>
+        <w:t xml:space="preserve">Count how many letters are repeated in a string or word, or maybe array of </w:t>
+      </w:r>
+      <w:proofErr w:type="gramStart"/>
+      <w:r>
+        <w:rPr>
+          <w:rFonts w:ascii="Verdana" w:hAnsi="Verdana"/>
+          <w:color w:val="000000"/>
+          <w:sz w:val="24"/>
+          <w:szCs w:val="24"/>
+        </w:rPr>
+        <w:t>characters.(</w:t>
+      </w:r>
+      <w:proofErr w:type="gramEnd"/>
       <w:r>
         <w:rPr>
           <w:rFonts w:asciiTheme="minorHAnsi" w:eastAsiaTheme="minorHAnsi" w:hAnsiTheme="minorHAnsi" w:cstheme="minorBidi"/>
@@ -3705,8 +4427,19 @@
           <w:sz w:val="24"/>
           <w:szCs w:val="24"/>
         </w:rPr>
-        <w:t xml:space="preserve"> in a word.(</w:t>
-      </w:r>
+        <w:t xml:space="preserve"> in a </w:t>
+      </w:r>
+      <w:proofErr w:type="gramStart"/>
+      <w:r>
+        <w:rPr>
+          <w:rFonts w:ascii="Verdana" w:hAnsi="Verdana"/>
+          <w:color w:val="000000"/>
+          <w:sz w:val="24"/>
+          <w:szCs w:val="24"/>
+        </w:rPr>
+        <w:t>word.(</w:t>
+      </w:r>
+      <w:proofErr w:type="gramEnd"/>
       <w:r>
         <w:rPr>
           <w:rFonts w:asciiTheme="minorHAnsi" w:eastAsiaTheme="minorHAnsi" w:hAnsiTheme="minorHAnsi" w:cstheme="minorBidi"/>
@@ -3792,8 +4525,19 @@
           <w:sz w:val="24"/>
           <w:szCs w:val="24"/>
         </w:rPr>
-        <w:t>Write a program to count and print unique or non-repeated characters / number in an array.(</w:t>
-      </w:r>
+        <w:t xml:space="preserve">Write a program to count and print unique or non-repeated characters / number in an </w:t>
+      </w:r>
+      <w:proofErr w:type="gramStart"/>
+      <w:r>
+        <w:rPr>
+          <w:rFonts w:ascii="Verdana" w:hAnsi="Verdana"/>
+          <w:color w:val="000000"/>
+          <w:sz w:val="24"/>
+          <w:szCs w:val="24"/>
+        </w:rPr>
+        <w:t>array.(</w:t>
+      </w:r>
+      <w:proofErr w:type="gramEnd"/>
       <w:r>
         <w:rPr>
           <w:rFonts w:ascii="Verdana" w:hAnsi="Verdana"/>
@@ -3898,7 +4642,17 @@
           <w:sz w:val="24"/>
           <w:szCs w:val="24"/>
         </w:rPr>
-        <w:t xml:space="preserve"> in an array.</w:t>
+        <w:t xml:space="preserve"> in an </w:t>
+      </w:r>
+      <w:proofErr w:type="gramStart"/>
+      <w:r>
+        <w:rPr>
+          <w:rFonts w:ascii="Verdana" w:hAnsi="Verdana"/>
+          <w:color w:val="000000"/>
+          <w:sz w:val="24"/>
+          <w:szCs w:val="24"/>
+        </w:rPr>
+        <w:t>array.</w:t>
       </w:r>
       <w:r>
         <w:rPr>
@@ -3909,6 +4663,7 @@
         </w:rPr>
         <w:t>(</w:t>
       </w:r>
+      <w:proofErr w:type="gramEnd"/>
       <w:r>
         <w:rPr>
           <w:rFonts w:asciiTheme="minorHAnsi" w:eastAsiaTheme="minorHAnsi" w:hAnsiTheme="minorHAnsi" w:cstheme="minorBidi"/>
@@ -4018,7 +4773,17 @@
           <w:sz w:val="24"/>
           <w:szCs w:val="24"/>
         </w:rPr>
-        <w:t>Remove Duplicates (Print Only Unique Elements)</w:t>
+        <w:t>Remove Duplicates (Print Only Unique Elements</w:t>
+      </w:r>
+      <w:proofErr w:type="gramStart"/>
+      <w:r>
+        <w:rPr>
+          <w:rFonts w:ascii="Verdana" w:hAnsi="Verdana"/>
+          <w:color w:val="000000"/>
+          <w:sz w:val="24"/>
+          <w:szCs w:val="24"/>
+        </w:rPr>
+        <w:t>)</w:t>
       </w:r>
       <w:r>
         <w:rPr>
@@ -4029,6 +4794,7 @@
         </w:rPr>
         <w:t>.(</w:t>
       </w:r>
+      <w:proofErr w:type="gramEnd"/>
       <w:r>
         <w:rPr>
           <w:rFonts w:asciiTheme="minorHAnsi" w:eastAsiaTheme="minorHAnsi" w:hAnsiTheme="minorHAnsi" w:cstheme="minorBidi"/>
@@ -4209,8 +4975,39 @@
           <w:szCs w:val="24"/>
         </w:rPr>
         <w:lastRenderedPageBreak/>
-        <w:t>DSA Foundation questions(Day 16) :</w:t>
-      </w:r>
+        <w:t xml:space="preserve">DSA Foundation </w:t>
+      </w:r>
+      <w:proofErr w:type="gramStart"/>
+      <w:r>
+        <w:rPr>
+          <w:rFonts w:ascii="Verdana" w:hAnsi="Verdana"/>
+          <w:color w:val="000000"/>
+          <w:sz w:val="24"/>
+          <w:szCs w:val="24"/>
+        </w:rPr>
+        <w:t>questions(</w:t>
+      </w:r>
+      <w:proofErr w:type="gramEnd"/>
+      <w:r>
+        <w:rPr>
+          <w:rFonts w:ascii="Verdana" w:hAnsi="Verdana"/>
+          <w:color w:val="000000"/>
+          <w:sz w:val="24"/>
+          <w:szCs w:val="24"/>
+        </w:rPr>
+        <w:t>Day 16</w:t>
+      </w:r>
+      <w:proofErr w:type="gramStart"/>
+      <w:r>
+        <w:rPr>
+          <w:rFonts w:ascii="Verdana" w:hAnsi="Verdana"/>
+          <w:color w:val="000000"/>
+          <w:sz w:val="24"/>
+          <w:szCs w:val="24"/>
+        </w:rPr>
+        <w:t>) :</w:t>
+      </w:r>
+      <w:proofErr w:type="gramEnd"/>
     </w:p>
     <w:p>
       <w:pPr>
@@ -4257,8 +5054,9 @@
           <w:szCs w:val="20"/>
           <w14:ligatures w14:val="none"/>
         </w:rPr>
-        <w:t>Given an array of integers nums and an integer target, return indices of the two numbers such that they add up to target.</w:t>
-      </w:r>
+        <w:t xml:space="preserve">Given an array of integers </w:t>
+      </w:r>
+      <w:proofErr w:type="spellStart"/>
       <w:r>
         <w:rPr>
           <w:rFonts w:ascii="Courier New" w:eastAsia="Times New Roman" w:hAnsi="Courier New" w:cs="Courier New"/>
@@ -4268,8 +5066,9 @@
           <w:szCs w:val="20"/>
           <w14:ligatures w14:val="none"/>
         </w:rPr>
-        <w:br/>
-      </w:r>
+        <w:t>nums</w:t>
+      </w:r>
+      <w:proofErr w:type="spellEnd"/>
       <w:r>
         <w:rPr>
           <w:rFonts w:ascii="Courier New" w:eastAsia="Times New Roman" w:hAnsi="Courier New" w:cs="Courier New"/>
@@ -4279,6 +5078,28 @@
           <w:szCs w:val="20"/>
           <w14:ligatures w14:val="none"/>
         </w:rPr>
+        <w:t xml:space="preserve"> and an integer target, return indices of the two numbers such that they add up to target.</w:t>
+      </w:r>
+      <w:r>
+        <w:rPr>
+          <w:rFonts w:ascii="Courier New" w:eastAsia="Times New Roman" w:hAnsi="Courier New" w:cs="Courier New"/>
+          <w:color w:val="F2F2F2" w:themeColor="background1" w:themeShade="F2"/>
+          <w:kern w:val="0"/>
+          <w:sz w:val="20"/>
+          <w:szCs w:val="20"/>
+          <w14:ligatures w14:val="none"/>
+        </w:rPr>
+        <w:br/>
+      </w:r>
+      <w:r>
+        <w:rPr>
+          <w:rFonts w:ascii="Courier New" w:eastAsia="Times New Roman" w:hAnsi="Courier New" w:cs="Courier New"/>
+          <w:color w:val="F2F2F2" w:themeColor="background1" w:themeShade="F2"/>
+          <w:kern w:val="0"/>
+          <w:sz w:val="20"/>
+          <w:szCs w:val="20"/>
+          <w14:ligatures w14:val="none"/>
+        </w:rPr>
         <w:br/>
         <w:t>You may assume that each input would have exactly one solution, and you may not use the same element twice.</w:t>
       </w:r>
@@ -4327,8 +5148,9 @@
           <w14:ligatures w14:val="none"/>
         </w:rPr>
         <w:br/>
-        <w:t>Input: nums = [2,7,11,15], target = 9</w:t>
-      </w:r>
+        <w:t xml:space="preserve">Input: </w:t>
+      </w:r>
+      <w:proofErr w:type="spellStart"/>
       <w:r>
         <w:rPr>
           <w:rFonts w:ascii="Courier New" w:eastAsia="Times New Roman" w:hAnsi="Courier New" w:cs="Courier New"/>
@@ -4338,6 +5160,29 @@
           <w:szCs w:val="20"/>
           <w14:ligatures w14:val="none"/>
         </w:rPr>
+        <w:t>nums</w:t>
+      </w:r>
+      <w:proofErr w:type="spellEnd"/>
+      <w:r>
+        <w:rPr>
+          <w:rFonts w:ascii="Courier New" w:eastAsia="Times New Roman" w:hAnsi="Courier New" w:cs="Courier New"/>
+          <w:color w:val="F2F2F2" w:themeColor="background1" w:themeShade="F2"/>
+          <w:kern w:val="0"/>
+          <w:sz w:val="20"/>
+          <w:szCs w:val="20"/>
+          <w14:ligatures w14:val="none"/>
+        </w:rPr>
+        <w:t xml:space="preserve"> = [2,7,11,15], target = 9</w:t>
+      </w:r>
+      <w:r>
+        <w:rPr>
+          <w:rFonts w:ascii="Courier New" w:eastAsia="Times New Roman" w:hAnsi="Courier New" w:cs="Courier New"/>
+          <w:color w:val="F2F2F2" w:themeColor="background1" w:themeShade="F2"/>
+          <w:kern w:val="0"/>
+          <w:sz w:val="20"/>
+          <w:szCs w:val="20"/>
+          <w14:ligatures w14:val="none"/>
+        </w:rPr>
         <w:br/>
         <w:t>Output: [0,1]</w:t>
       </w:r>
@@ -4351,8 +5196,9 @@
           <w14:ligatures w14:val="none"/>
         </w:rPr>
         <w:br/>
-        <w:t>Explanation: Because nums[0] + nums[1] == 9, we return [0, 1].</w:t>
-      </w:r>
+        <w:t xml:space="preserve">Explanation: Because </w:t>
+      </w:r>
+      <w:proofErr w:type="spellStart"/>
       <w:r>
         <w:rPr>
           <w:rFonts w:ascii="Courier New" w:eastAsia="Times New Roman" w:hAnsi="Courier New" w:cs="Courier New"/>
@@ -4362,6 +5208,53 @@
           <w:szCs w:val="20"/>
           <w14:ligatures w14:val="none"/>
         </w:rPr>
+        <w:t>nums</w:t>
+      </w:r>
+      <w:proofErr w:type="spellEnd"/>
+      <w:r>
+        <w:rPr>
+          <w:rFonts w:ascii="Courier New" w:eastAsia="Times New Roman" w:hAnsi="Courier New" w:cs="Courier New"/>
+          <w:color w:val="F2F2F2" w:themeColor="background1" w:themeShade="F2"/>
+          <w:kern w:val="0"/>
+          <w:sz w:val="20"/>
+          <w:szCs w:val="20"/>
+          <w14:ligatures w14:val="none"/>
+        </w:rPr>
+        <w:t xml:space="preserve">[0] + </w:t>
+      </w:r>
+      <w:proofErr w:type="spellStart"/>
+      <w:r>
+        <w:rPr>
+          <w:rFonts w:ascii="Courier New" w:eastAsia="Times New Roman" w:hAnsi="Courier New" w:cs="Courier New"/>
+          <w:color w:val="F2F2F2" w:themeColor="background1" w:themeShade="F2"/>
+          <w:kern w:val="0"/>
+          <w:sz w:val="20"/>
+          <w:szCs w:val="20"/>
+          <w14:ligatures w14:val="none"/>
+        </w:rPr>
+        <w:t>nums</w:t>
+      </w:r>
+      <w:proofErr w:type="spellEnd"/>
+      <w:r>
+        <w:rPr>
+          <w:rFonts w:ascii="Courier New" w:eastAsia="Times New Roman" w:hAnsi="Courier New" w:cs="Courier New"/>
+          <w:color w:val="F2F2F2" w:themeColor="background1" w:themeShade="F2"/>
+          <w:kern w:val="0"/>
+          <w:sz w:val="20"/>
+          <w:szCs w:val="20"/>
+          <w14:ligatures w14:val="none"/>
+        </w:rPr>
+        <w:t>[1] == 9, we return [0, 1].</w:t>
+      </w:r>
+      <w:r>
+        <w:rPr>
+          <w:rFonts w:ascii="Courier New" w:eastAsia="Times New Roman" w:hAnsi="Courier New" w:cs="Courier New"/>
+          <w:color w:val="F2F2F2" w:themeColor="background1" w:themeShade="F2"/>
+          <w:kern w:val="0"/>
+          <w:sz w:val="20"/>
+          <w:szCs w:val="20"/>
+          <w14:ligatures w14:val="none"/>
+        </w:rPr>
         <w:br/>
         <w:t>Example 2:</w:t>
       </w:r>
@@ -4375,7 +5268,31 @@
           <w14:ligatures w14:val="none"/>
         </w:rPr>
         <w:br/>
-        <w:t>Input: nums = [3,2,4], target = 6</w:t>
+        <w:t xml:space="preserve">Input: </w:t>
+      </w:r>
+      <w:proofErr w:type="spellStart"/>
+      <w:r>
+        <w:rPr>
+          <w:rFonts w:ascii="Courier New" w:eastAsia="Times New Roman" w:hAnsi="Courier New" w:cs="Courier New"/>
+          <w:color w:val="F2F2F2" w:themeColor="background1" w:themeShade="F2"/>
+          <w:kern w:val="0"/>
+          <w:sz w:val="20"/>
+          <w:szCs w:val="20"/>
+          <w14:ligatures w14:val="none"/>
+        </w:rPr>
+        <w:t>nums</w:t>
+      </w:r>
+      <w:proofErr w:type="spellEnd"/>
+      <w:r>
+        <w:rPr>
+          <w:rFonts w:ascii="Courier New" w:eastAsia="Times New Roman" w:hAnsi="Courier New" w:cs="Courier New"/>
+          <w:color w:val="F2F2F2" w:themeColor="background1" w:themeShade="F2"/>
+          <w:kern w:val="0"/>
+          <w:sz w:val="20"/>
+          <w:szCs w:val="20"/>
+          <w14:ligatures w14:val="none"/>
+        </w:rPr>
+        <w:t xml:space="preserve"> = [3,2,4], target = 6</w:t>
       </w:r>
       <w:r>
         <w:rPr>
@@ -4559,14 +5476,25 @@
         </w:rPr>
         <w:t xml:space="preserve">Day 17(Array in DSA </w:t>
       </w:r>
-      <w:r>
-        <w:rPr>
-          <w:rFonts w:ascii="Verdana" w:hAnsi="Verdana"/>
-          <w:color w:val="000000"/>
-          <w:sz w:val="24"/>
-          <w:szCs w:val="24"/>
-        </w:rPr>
-        <w:t>basic : sorting, searching and reversing</w:t>
+      <w:proofErr w:type="gramStart"/>
+      <w:r>
+        <w:rPr>
+          <w:rFonts w:ascii="Verdana" w:hAnsi="Verdana"/>
+          <w:color w:val="000000"/>
+          <w:sz w:val="24"/>
+          <w:szCs w:val="24"/>
+        </w:rPr>
+        <w:t>basic :</w:t>
+      </w:r>
+      <w:proofErr w:type="gramEnd"/>
+      <w:r>
+        <w:rPr>
+          <w:rFonts w:ascii="Verdana" w:hAnsi="Verdana"/>
+          <w:color w:val="000000"/>
+          <w:sz w:val="24"/>
+          <w:szCs w:val="24"/>
+        </w:rPr>
+        <w:t xml:space="preserve"> sorting, searching and reversing</w:t>
       </w:r>
       <w:r>
         <w:rPr>
@@ -4600,16 +5528,36 @@
           <w:sz w:val="24"/>
           <w:szCs w:val="24"/>
         </w:rPr>
-        <w:t>Write a program to find the largest element in an array using both brute force and optimal solution possible.</w:t>
-      </w:r>
-      <w:r>
-        <w:rPr>
-          <w:rFonts w:ascii="Verdana" w:hAnsi="Verdana"/>
-          <w:color w:val="000000"/>
-          <w:sz w:val="24"/>
-          <w:szCs w:val="24"/>
-        </w:rPr>
-        <w:t>(Sorting)</w:t>
+        <w:t xml:space="preserve">Write a program to find the largest element in an array using both brute force and optimal solution </w:t>
+      </w:r>
+      <w:proofErr w:type="gramStart"/>
+      <w:r>
+        <w:rPr>
+          <w:rFonts w:ascii="Verdana" w:hAnsi="Verdana"/>
+          <w:color w:val="000000"/>
+          <w:sz w:val="24"/>
+          <w:szCs w:val="24"/>
+        </w:rPr>
+        <w:t>possible.</w:t>
+      </w:r>
+      <w:r>
+        <w:rPr>
+          <w:rFonts w:ascii="Verdana" w:hAnsi="Verdana"/>
+          <w:color w:val="000000"/>
+          <w:sz w:val="24"/>
+          <w:szCs w:val="24"/>
+        </w:rPr>
+        <w:t>(</w:t>
+      </w:r>
+      <w:proofErr w:type="gramEnd"/>
+      <w:r>
+        <w:rPr>
+          <w:rFonts w:ascii="Verdana" w:hAnsi="Verdana"/>
+          <w:color w:val="000000"/>
+          <w:sz w:val="24"/>
+          <w:szCs w:val="24"/>
+        </w:rPr>
+        <w:t>Sorting)</w:t>
       </w:r>
     </w:p>
     <w:bookmarkEnd w:id="0"/>
@@ -4814,6 +5762,7 @@
         </w:rPr>
         <w:t>Given an array, </w:t>
       </w:r>
+      <w:proofErr w:type="gramStart"/>
       <w:r>
         <w:rPr>
           <w:rFonts w:ascii="Verdana" w:hAnsi="Verdana"/>
@@ -4823,17 +5772,9 @@
           <w:sz w:val="24"/>
           <w:szCs w:val="24"/>
         </w:rPr>
-        <w:t>a[]</w:t>
-      </w:r>
-      <w:r>
-        <w:rPr>
-          <w:rFonts w:ascii="Verdana" w:hAnsi="Verdana"/>
-          <w:color w:val="000000"/>
-          <w:sz w:val="24"/>
-          <w:szCs w:val="24"/>
-        </w:rPr>
-        <w:t> of n integers, and an integer element </w:t>
-      </w:r>
+        <w:t>a[</w:t>
+      </w:r>
+      <w:proofErr w:type="gramEnd"/>
       <w:r>
         <w:rPr>
           <w:rFonts w:ascii="Verdana" w:hAnsi="Verdana"/>
@@ -4843,6 +5784,26 @@
           <w:sz w:val="24"/>
           <w:szCs w:val="24"/>
         </w:rPr>
+        <w:t>]</w:t>
+      </w:r>
+      <w:r>
+        <w:rPr>
+          <w:rFonts w:ascii="Verdana" w:hAnsi="Verdana"/>
+          <w:color w:val="000000"/>
+          <w:sz w:val="24"/>
+          <w:szCs w:val="24"/>
+        </w:rPr>
+        <w:t> of n integers, and an integer element </w:t>
+      </w:r>
+      <w:r>
+        <w:rPr>
+          <w:rFonts w:ascii="Verdana" w:hAnsi="Verdana"/>
+          <w:b/>
+          <w:bCs/>
+          <w:color w:val="000000"/>
+          <w:sz w:val="24"/>
+          <w:szCs w:val="24"/>
+        </w:rPr>
         <w:t>x</w:t>
       </w:r>
       <w:r>
@@ -4890,7 +5851,47 @@
           <w:sz w:val="24"/>
           <w:szCs w:val="24"/>
         </w:rPr>
-        <w:t xml:space="preserve"> ( Array in DSA part 2 : bubble sorting</w:t>
+        <w:t xml:space="preserve"> </w:t>
+      </w:r>
+      <w:proofErr w:type="gramStart"/>
+      <w:r>
+        <w:rPr>
+          <w:rFonts w:ascii="Verdana" w:hAnsi="Verdana"/>
+          <w:color w:val="000000"/>
+          <w:sz w:val="24"/>
+          <w:szCs w:val="24"/>
+        </w:rPr>
+        <w:t>( Array</w:t>
+      </w:r>
+      <w:proofErr w:type="gramEnd"/>
+      <w:r>
+        <w:rPr>
+          <w:rFonts w:ascii="Verdana" w:hAnsi="Verdana"/>
+          <w:color w:val="000000"/>
+          <w:sz w:val="24"/>
+          <w:szCs w:val="24"/>
+        </w:rPr>
+        <w:t xml:space="preserve"> in DSA part </w:t>
+      </w:r>
+      <w:proofErr w:type="gramStart"/>
+      <w:r>
+        <w:rPr>
+          <w:rFonts w:ascii="Verdana" w:hAnsi="Verdana"/>
+          <w:color w:val="000000"/>
+          <w:sz w:val="24"/>
+          <w:szCs w:val="24"/>
+        </w:rPr>
+        <w:t>2 :</w:t>
+      </w:r>
+      <w:proofErr w:type="gramEnd"/>
+      <w:r>
+        <w:rPr>
+          <w:rFonts w:ascii="Verdana" w:hAnsi="Verdana"/>
+          <w:color w:val="000000"/>
+          <w:sz w:val="24"/>
+          <w:szCs w:val="24"/>
+        </w:rPr>
+        <w:t xml:space="preserve"> bubble sorting</w:t>
       </w:r>
       <w:r>
         <w:rPr>
@@ -5047,8 +6048,9 @@
           <w:szCs w:val="27"/>
           <w14:ligatures w14:val="none"/>
         </w:rPr>
-        <w:t>Rotate Array Right by 1 (In-place)</w:t>
-      </w:r>
+        <w:t>Rotate Array Right by 1 (In-place</w:t>
+      </w:r>
+      <w:proofErr w:type="gramStart"/>
       <w:r>
         <w:rPr>
           <w:rFonts w:ascii="Mangal" w:eastAsia="Times New Roman" w:hAnsi="Mangal" w:cs="Mangal"/>
@@ -5059,8 +6061,21 @@
           <w:szCs w:val="27"/>
           <w14:ligatures w14:val="none"/>
         </w:rPr>
+        <w:t>)</w:t>
+      </w:r>
+      <w:r>
+        <w:rPr>
+          <w:rFonts w:ascii="Mangal" w:eastAsia="Times New Roman" w:hAnsi="Mangal" w:cs="Mangal"/>
+          <w:b/>
+          <w:bCs/>
+          <w:kern w:val="0"/>
+          <w:sz w:val="27"/>
+          <w:szCs w:val="27"/>
+          <w14:ligatures w14:val="none"/>
+        </w:rPr>
         <w:t>.(</w:t>
       </w:r>
+      <w:proofErr w:type="gramEnd"/>
       <w:r>
         <w:rPr>
           <w:rFonts w:ascii="Mangal" w:eastAsia="Times New Roman" w:hAnsi="Mangal" w:cs="Mangal"/>
@@ -5301,7 +6316,27 @@
           <w:sz w:val="24"/>
           <w:szCs w:val="24"/>
         </w:rPr>
-        <w:t>. Use split().</w:t>
+        <w:t xml:space="preserve">. Use </w:t>
+      </w:r>
+      <w:proofErr w:type="gramStart"/>
+      <w:r>
+        <w:rPr>
+          <w:rFonts w:ascii="Verdana" w:hAnsi="Verdana"/>
+          <w:color w:val="000000"/>
+          <w:sz w:val="24"/>
+          <w:szCs w:val="24"/>
+        </w:rPr>
+        <w:t>split(</w:t>
+      </w:r>
+      <w:proofErr w:type="gramEnd"/>
+      <w:r>
+        <w:rPr>
+          <w:rFonts w:ascii="Verdana" w:hAnsi="Verdana"/>
+          <w:color w:val="000000"/>
+          <w:sz w:val="24"/>
+          <w:szCs w:val="24"/>
+        </w:rPr>
+        <w:t>).</w:t>
       </w:r>
     </w:p>
     <w:p>
@@ -5343,25 +6378,87 @@
           <w:sz w:val="24"/>
           <w:szCs w:val="24"/>
         </w:rPr>
-        <w:t xml:space="preserve">. Use  </w:t>
-      </w:r>
-      <w:r>
-        <w:rPr>
-          <w:rFonts w:ascii="Verdana" w:hAnsi="Verdana"/>
-          <w:color w:val="000000"/>
-          <w:sz w:val="24"/>
-          <w:szCs w:val="24"/>
-        </w:rPr>
-        <w:t>toCharArray(), Arrays.sort()</w:t>
-      </w:r>
-      <w:r>
-        <w:rPr>
-          <w:rFonts w:ascii="Verdana" w:hAnsi="Verdana"/>
-          <w:color w:val="000000"/>
-          <w:sz w:val="24"/>
-          <w:szCs w:val="24"/>
-        </w:rPr>
-        <w:t>, Arrays.equal()</w:t>
+        <w:t xml:space="preserve">. </w:t>
+      </w:r>
+      <w:proofErr w:type="gramStart"/>
+      <w:r>
+        <w:rPr>
+          <w:rFonts w:ascii="Verdana" w:hAnsi="Verdana"/>
+          <w:color w:val="000000"/>
+          <w:sz w:val="24"/>
+          <w:szCs w:val="24"/>
+        </w:rPr>
+        <w:t xml:space="preserve">Use  </w:t>
+      </w:r>
+      <w:proofErr w:type="spellStart"/>
+      <w:r>
+        <w:rPr>
+          <w:rFonts w:ascii="Verdana" w:hAnsi="Verdana"/>
+          <w:color w:val="000000"/>
+          <w:sz w:val="24"/>
+          <w:szCs w:val="24"/>
+        </w:rPr>
+        <w:t>toCharArray</w:t>
+      </w:r>
+      <w:proofErr w:type="spellEnd"/>
+      <w:proofErr w:type="gramEnd"/>
+      <w:r>
+        <w:rPr>
+          <w:rFonts w:ascii="Verdana" w:hAnsi="Verdana"/>
+          <w:color w:val="000000"/>
+          <w:sz w:val="24"/>
+          <w:szCs w:val="24"/>
+        </w:rPr>
+        <w:t xml:space="preserve">(), </w:t>
+      </w:r>
+      <w:proofErr w:type="spellStart"/>
+      <w:r>
+        <w:rPr>
+          <w:rFonts w:ascii="Verdana" w:hAnsi="Verdana"/>
+          <w:color w:val="000000"/>
+          <w:sz w:val="24"/>
+          <w:szCs w:val="24"/>
+        </w:rPr>
+        <w:t>Arrays.sort</w:t>
+      </w:r>
+      <w:proofErr w:type="spellEnd"/>
+      <w:r>
+        <w:rPr>
+          <w:rFonts w:ascii="Verdana" w:hAnsi="Verdana"/>
+          <w:color w:val="000000"/>
+          <w:sz w:val="24"/>
+          <w:szCs w:val="24"/>
+        </w:rPr>
+        <w:t>()</w:t>
+      </w:r>
+      <w:r>
+        <w:rPr>
+          <w:rFonts w:ascii="Verdana" w:hAnsi="Verdana"/>
+          <w:color w:val="000000"/>
+          <w:sz w:val="24"/>
+          <w:szCs w:val="24"/>
+        </w:rPr>
+        <w:t xml:space="preserve">, </w:t>
+      </w:r>
+      <w:proofErr w:type="spellStart"/>
+      <w:r>
+        <w:rPr>
+          <w:rFonts w:ascii="Verdana" w:hAnsi="Verdana"/>
+          <w:color w:val="000000"/>
+          <w:sz w:val="24"/>
+          <w:szCs w:val="24"/>
+        </w:rPr>
+        <w:t>Arrays.equal</w:t>
+      </w:r>
+      <w:proofErr w:type="spellEnd"/>
+      <w:r>
+        <w:rPr>
+          <w:rFonts w:ascii="Verdana" w:hAnsi="Verdana"/>
+          <w:color w:val="000000"/>
+          <w:sz w:val="24"/>
+          <w:szCs w:val="24"/>
+        </w:rPr>
+        <w:t>()</w:t>
       </w:r>
       <w:r>
         <w:rPr>
@@ -5426,7 +6523,35 @@
           <w:color w:val="000000"/>
           <w:szCs w:val="24"/>
         </w:rPr>
-        <w:t>Input: "swiss"  Output: 'w'</w:t>
+        <w:t>Input: "</w:t>
+      </w:r>
+      <w:proofErr w:type="spellStart"/>
+      <w:r>
+        <w:rPr>
+          <w:rFonts w:ascii="Verdana" w:hAnsi="Verdana"/>
+          <w:color w:val="000000"/>
+          <w:szCs w:val="24"/>
+        </w:rPr>
+        <w:t>swiss</w:t>
+      </w:r>
+      <w:proofErr w:type="spellEnd"/>
+      <w:proofErr w:type="gramStart"/>
+      <w:r>
+        <w:rPr>
+          <w:rFonts w:ascii="Verdana" w:hAnsi="Verdana"/>
+          <w:color w:val="000000"/>
+          <w:szCs w:val="24"/>
+        </w:rPr>
+        <w:t>"  Output</w:t>
+      </w:r>
+      <w:proofErr w:type="gramEnd"/>
+      <w:r>
+        <w:rPr>
+          <w:rFonts w:ascii="Verdana" w:hAnsi="Verdana"/>
+          <w:color w:val="000000"/>
+          <w:szCs w:val="24"/>
+        </w:rPr>
+        <w:t>: 'w'</w:t>
       </w:r>
       <w:r>
         <w:rPr>
@@ -5568,7 +6693,27 @@
           <w:sz w:val="24"/>
           <w:szCs w:val="24"/>
         </w:rPr>
-        <w:t>0(Array and Arraylist)</w:t>
+        <w:t xml:space="preserve">0(Array and </w:t>
+      </w:r>
+      <w:proofErr w:type="spellStart"/>
+      <w:r>
+        <w:rPr>
+          <w:rFonts w:ascii="Verdana" w:hAnsi="Verdana"/>
+          <w:color w:val="000000"/>
+          <w:sz w:val="24"/>
+          <w:szCs w:val="24"/>
+        </w:rPr>
+        <w:t>Arraylist</w:t>
+      </w:r>
+      <w:proofErr w:type="spellEnd"/>
+      <w:r>
+        <w:rPr>
+          <w:rFonts w:ascii="Verdana" w:hAnsi="Verdana"/>
+          <w:color w:val="000000"/>
+          <w:sz w:val="24"/>
+          <w:szCs w:val="24"/>
+        </w:rPr>
+        <w:t>)</w:t>
       </w:r>
     </w:p>
     <w:p>
@@ -6133,8 +7278,36 @@
           <w:sz w:val="28"/>
           <w:szCs w:val="22"/>
         </w:rPr>
-        <w:t xml:space="preserve"> ( Array in Java Lab – 5 )</w:t>
-      </w:r>
+        <w:t xml:space="preserve"> </w:t>
+      </w:r>
+      <w:proofErr w:type="gramStart"/>
+      <w:r>
+        <w:rPr>
+          <w:rFonts w:ascii="Times New Roman" w:hAnsi="Times New Roman" w:cs="Times New Roman"/>
+          <w:sz w:val="28"/>
+          <w:szCs w:val="22"/>
+        </w:rPr>
+        <w:t>( Array</w:t>
+      </w:r>
+      <w:proofErr w:type="gramEnd"/>
+      <w:r>
+        <w:rPr>
+          <w:rFonts w:ascii="Times New Roman" w:hAnsi="Times New Roman" w:cs="Times New Roman"/>
+          <w:sz w:val="28"/>
+          <w:szCs w:val="22"/>
+        </w:rPr>
+        <w:t xml:space="preserve"> in Java Lab – </w:t>
+      </w:r>
+      <w:proofErr w:type="gramStart"/>
+      <w:r>
+        <w:rPr>
+          <w:rFonts w:ascii="Times New Roman" w:hAnsi="Times New Roman" w:cs="Times New Roman"/>
+          <w:sz w:val="28"/>
+          <w:szCs w:val="22"/>
+        </w:rPr>
+        <w:t>5 )</w:t>
+      </w:r>
+      <w:proofErr w:type="gramEnd"/>
     </w:p>
     <w:p>
       <w:pPr>
@@ -6452,7 +7625,29 @@
           <w:szCs w:val="20"/>
           <w14:ligatures w14:val="none"/>
         </w:rPr>
-        <w:t>Input: "HeLLoWorLD"</w:t>
+        <w:t>Input: "</w:t>
+      </w:r>
+      <w:proofErr w:type="spellStart"/>
+      <w:r>
+        <w:rPr>
+          <w:rFonts w:ascii="Mangal" w:eastAsia="Times New Roman" w:hAnsi="Mangal" w:cs="Mangal"/>
+          <w:kern w:val="0"/>
+          <w:sz w:val="20"/>
+          <w:szCs w:val="20"/>
+          <w14:ligatures w14:val="none"/>
+        </w:rPr>
+        <w:t>HeLLoWorLD</w:t>
+      </w:r>
+      <w:proofErr w:type="spellEnd"/>
+      <w:r>
+        <w:rPr>
+          <w:rFonts w:ascii="Mangal" w:eastAsia="Times New Roman" w:hAnsi="Mangal" w:cs="Mangal"/>
+          <w:kern w:val="0"/>
+          <w:sz w:val="20"/>
+          <w:szCs w:val="20"/>
+          <w14:ligatures w14:val="none"/>
+        </w:rPr>
+        <w:t>"</w:t>
       </w:r>
       <w:r>
         <w:rPr>
@@ -6463,8 +7658,42 @@
           <w14:ligatures w14:val="none"/>
         </w:rPr>
         <w:br/>
-        <w:t>Output: Upper = ?, Lower = ?</w:t>
-      </w:r>
+        <w:t xml:space="preserve">Output: Upper </w:t>
+      </w:r>
+      <w:proofErr w:type="gramStart"/>
+      <w:r>
+        <w:rPr>
+          <w:rFonts w:ascii="Mangal" w:eastAsia="Times New Roman" w:hAnsi="Mangal" w:cs="Mangal"/>
+          <w:kern w:val="0"/>
+          <w:sz w:val="20"/>
+          <w:szCs w:val="20"/>
+          <w14:ligatures w14:val="none"/>
+        </w:rPr>
+        <w:t>= ?</w:t>
+      </w:r>
+      <w:proofErr w:type="gramEnd"/>
+      <w:r>
+        <w:rPr>
+          <w:rFonts w:ascii="Mangal" w:eastAsia="Times New Roman" w:hAnsi="Mangal" w:cs="Mangal"/>
+          <w:kern w:val="0"/>
+          <w:sz w:val="20"/>
+          <w:szCs w:val="20"/>
+          <w14:ligatures w14:val="none"/>
+        </w:rPr>
+        <w:t xml:space="preserve">, Lower </w:t>
+      </w:r>
+      <w:proofErr w:type="gramStart"/>
+      <w:r>
+        <w:rPr>
+          <w:rFonts w:ascii="Mangal" w:eastAsia="Times New Roman" w:hAnsi="Mangal" w:cs="Mangal"/>
+          <w:kern w:val="0"/>
+          <w:sz w:val="20"/>
+          <w:szCs w:val="20"/>
+          <w14:ligatures w14:val="none"/>
+        </w:rPr>
+        <w:t>= ?</w:t>
+      </w:r>
+      <w:proofErr w:type="gramEnd"/>
     </w:p>
     <w:p>
       <w:pPr>
@@ -6530,7 +7759,29 @@
           <w14:ligatures w14:val="none"/>
         </w:rPr>
         <w:br/>
-        <w:t>Output: "IloveJava"</w:t>
+        <w:t>Output: "</w:t>
+      </w:r>
+      <w:proofErr w:type="spellStart"/>
+      <w:r>
+        <w:rPr>
+          <w:rFonts w:ascii="Mangal" w:eastAsia="Times New Roman" w:hAnsi="Mangal" w:cs="Mangal"/>
+          <w:kern w:val="0"/>
+          <w:sz w:val="20"/>
+          <w:szCs w:val="20"/>
+          <w14:ligatures w14:val="none"/>
+        </w:rPr>
+        <w:t>IloveJava</w:t>
+      </w:r>
+      <w:proofErr w:type="spellEnd"/>
+      <w:r>
+        <w:rPr>
+          <w:rFonts w:ascii="Mangal" w:eastAsia="Times New Roman" w:hAnsi="Mangal" w:cs="Mangal"/>
+          <w:kern w:val="0"/>
+          <w:sz w:val="20"/>
+          <w:szCs w:val="20"/>
+          <w14:ligatures w14:val="none"/>
+        </w:rPr>
+        <w:t>"</w:t>
       </w:r>
     </w:p>
     <w:p>
@@ -6763,7 +8014,27 @@
           <w:sz w:val="24"/>
           <w:szCs w:val="24"/>
         </w:rPr>
-        <w:t>Given an array, write a java program to right rotate it by k elements, let elements be 1,2,3,4,5,6,7,8,9,10. If k = 3, after right rotation it becomes 8, 9, 10, 1 , 2, 3, 4, 5, 6, 7.</w:t>
+        <w:t xml:space="preserve">Given an array, write a java program to right rotate it by k elements, let elements be 1,2,3,4,5,6,7,8,9,10. If k = 3, after right rotation it becomes 8, 9, 10, </w:t>
+      </w:r>
+      <w:proofErr w:type="gramStart"/>
+      <w:r>
+        <w:rPr>
+          <w:rFonts w:ascii="Verdana" w:hAnsi="Verdana"/>
+          <w:color w:val="000000"/>
+          <w:sz w:val="24"/>
+          <w:szCs w:val="24"/>
+        </w:rPr>
+        <w:t>1 ,</w:t>
+      </w:r>
+      <w:proofErr w:type="gramEnd"/>
+      <w:r>
+        <w:rPr>
+          <w:rFonts w:ascii="Verdana" w:hAnsi="Verdana"/>
+          <w:color w:val="000000"/>
+          <w:sz w:val="24"/>
+          <w:szCs w:val="24"/>
+        </w:rPr>
+        <w:t xml:space="preserve"> 2, 3, 4, 5, 6, 7.</w:t>
       </w:r>
     </w:p>
     <w:p>
@@ -6980,17 +8251,39 @@
           <w:szCs w:val="20"/>
           <w14:ligatures w14:val="none"/>
         </w:rPr>
-        <w:t>Find average</w:t>
-      </w:r>
-      <w:r>
-        <w:rPr>
-          <w:rFonts w:ascii="Mangal" w:eastAsia="Times New Roman" w:hAnsi="Mangal" w:cs="Mangal"/>
-          <w:kern w:val="0"/>
-          <w:sz w:val="20"/>
-          <w:szCs w:val="20"/>
-          <w14:ligatures w14:val="none"/>
-        </w:rPr>
-        <w:t xml:space="preserve"> , </w:t>
+        <w:t xml:space="preserve">Find </w:t>
+      </w:r>
+      <w:proofErr w:type="gramStart"/>
+      <w:r>
+        <w:rPr>
+          <w:rFonts w:ascii="Mangal" w:eastAsia="Times New Roman" w:hAnsi="Mangal" w:cs="Mangal"/>
+          <w:kern w:val="0"/>
+          <w:sz w:val="20"/>
+          <w:szCs w:val="20"/>
+          <w14:ligatures w14:val="none"/>
+        </w:rPr>
+        <w:t>average</w:t>
+      </w:r>
+      <w:r>
+        <w:rPr>
+          <w:rFonts w:ascii="Mangal" w:eastAsia="Times New Roman" w:hAnsi="Mangal" w:cs="Mangal"/>
+          <w:kern w:val="0"/>
+          <w:sz w:val="20"/>
+          <w:szCs w:val="20"/>
+          <w14:ligatures w14:val="none"/>
+        </w:rPr>
+        <w:t xml:space="preserve"> ,</w:t>
+      </w:r>
+      <w:proofErr w:type="gramEnd"/>
+      <w:r>
+        <w:rPr>
+          <w:rFonts w:ascii="Mangal" w:eastAsia="Times New Roman" w:hAnsi="Mangal" w:cs="Mangal"/>
+          <w:kern w:val="0"/>
+          <w:sz w:val="20"/>
+          <w:szCs w:val="20"/>
+          <w14:ligatures w14:val="none"/>
+        </w:rPr>
+        <w:t xml:space="preserve"> </w:t>
       </w:r>
       <w:r>
         <w:rPr>
@@ -7053,7 +8346,29 @@
           <w:szCs w:val="20"/>
           <w14:ligatures w14:val="none"/>
         </w:rPr>
-        <w:t>Input: "JaVa"</w:t>
+        <w:t>Input: "</w:t>
+      </w:r>
+      <w:proofErr w:type="spellStart"/>
+      <w:r>
+        <w:rPr>
+          <w:rFonts w:ascii="Mangal" w:eastAsia="Times New Roman" w:hAnsi="Mangal" w:cs="Mangal"/>
+          <w:kern w:val="0"/>
+          <w:sz w:val="20"/>
+          <w:szCs w:val="20"/>
+          <w14:ligatures w14:val="none"/>
+        </w:rPr>
+        <w:t>JaVa</w:t>
+      </w:r>
+      <w:proofErr w:type="spellEnd"/>
+      <w:r>
+        <w:rPr>
+          <w:rFonts w:ascii="Mangal" w:eastAsia="Times New Roman" w:hAnsi="Mangal" w:cs="Mangal"/>
+          <w:kern w:val="0"/>
+          <w:sz w:val="20"/>
+          <w:szCs w:val="20"/>
+          <w14:ligatures w14:val="none"/>
+        </w:rPr>
+        <w:t>"</w:t>
       </w:r>
       <w:r>
         <w:rPr>
@@ -7064,7 +8379,29 @@
           <w14:ligatures w14:val="none"/>
         </w:rPr>
         <w:br/>
-        <w:t>Output: "jAvA"</w:t>
+        <w:t>Output: "</w:t>
+      </w:r>
+      <w:proofErr w:type="spellStart"/>
+      <w:r>
+        <w:rPr>
+          <w:rFonts w:ascii="Mangal" w:eastAsia="Times New Roman" w:hAnsi="Mangal" w:cs="Mangal"/>
+          <w:kern w:val="0"/>
+          <w:sz w:val="20"/>
+          <w:szCs w:val="20"/>
+          <w14:ligatures w14:val="none"/>
+        </w:rPr>
+        <w:t>jAvA</w:t>
+      </w:r>
+      <w:proofErr w:type="spellEnd"/>
+      <w:r>
+        <w:rPr>
+          <w:rFonts w:ascii="Mangal" w:eastAsia="Times New Roman" w:hAnsi="Mangal" w:cs="Mangal"/>
+          <w:kern w:val="0"/>
+          <w:sz w:val="20"/>
+          <w:szCs w:val="20"/>
+          <w14:ligatures w14:val="none"/>
+        </w:rPr>
+        <w:t>"</w:t>
       </w:r>
     </w:p>
     <w:p>
@@ -7099,15 +8436,38 @@
         </w:rPr>
         <w:t xml:space="preserve">  </w:t>
       </w:r>
-      <w:r>
-        <w:rPr>
-          <w:rFonts w:ascii="Mangal" w:eastAsia="Times New Roman" w:hAnsi="Mangal" w:cs="Mangal"/>
-          <w:kern w:val="0"/>
-          <w:sz w:val="20"/>
-          <w:szCs w:val="20"/>
-          <w14:ligatures w14:val="none"/>
-        </w:rPr>
-        <w:t>Character.isUpperCase()</w:t>
+      <w:proofErr w:type="spellStart"/>
+      <w:r>
+        <w:rPr>
+          <w:rFonts w:ascii="Mangal" w:eastAsia="Times New Roman" w:hAnsi="Mangal" w:cs="Mangal"/>
+          <w:kern w:val="0"/>
+          <w:sz w:val="20"/>
+          <w:szCs w:val="20"/>
+          <w14:ligatures w14:val="none"/>
+        </w:rPr>
+        <w:t>Character.isUpperCase</w:t>
+      </w:r>
+      <w:proofErr w:type="spellEnd"/>
+      <w:r>
+        <w:rPr>
+          <w:rFonts w:ascii="Mangal" w:eastAsia="Times New Roman" w:hAnsi="Mangal" w:cs="Mangal"/>
+          <w:kern w:val="0"/>
+          <w:sz w:val="20"/>
+          <w:szCs w:val="20"/>
+          <w14:ligatures w14:val="none"/>
+        </w:rPr>
+        <w:t>(</w:t>
+      </w:r>
+      <w:proofErr w:type="gramStart"/>
+      <w:r>
+        <w:rPr>
+          <w:rFonts w:ascii="Mangal" w:eastAsia="Times New Roman" w:hAnsi="Mangal" w:cs="Mangal"/>
+          <w:kern w:val="0"/>
+          <w:sz w:val="20"/>
+          <w:szCs w:val="20"/>
+          <w14:ligatures w14:val="none"/>
+        </w:rPr>
+        <w:t>)</w:t>
       </w:r>
       <w:r>
         <w:rPr>
@@ -7119,15 +8479,39 @@
         </w:rPr>
         <w:t xml:space="preserve">,  </w:t>
       </w:r>
-      <w:r>
-        <w:rPr>
-          <w:rFonts w:ascii="Mangal" w:eastAsia="Times New Roman" w:hAnsi="Mangal" w:cs="Mangal"/>
-          <w:kern w:val="0"/>
-          <w:sz w:val="20"/>
-          <w:szCs w:val="20"/>
-          <w14:ligatures w14:val="none"/>
-        </w:rPr>
-        <w:t>toLowerCase(),</w:t>
+      <w:proofErr w:type="spellStart"/>
+      <w:r>
+        <w:rPr>
+          <w:rFonts w:ascii="Mangal" w:eastAsia="Times New Roman" w:hAnsi="Mangal" w:cs="Mangal"/>
+          <w:kern w:val="0"/>
+          <w:sz w:val="20"/>
+          <w:szCs w:val="20"/>
+          <w14:ligatures w14:val="none"/>
+        </w:rPr>
+        <w:t>toLowerCase</w:t>
+      </w:r>
+      <w:proofErr w:type="spellEnd"/>
+      <w:proofErr w:type="gramEnd"/>
+      <w:r>
+        <w:rPr>
+          <w:rFonts w:ascii="Mangal" w:eastAsia="Times New Roman" w:hAnsi="Mangal" w:cs="Mangal"/>
+          <w:kern w:val="0"/>
+          <w:sz w:val="20"/>
+          <w:szCs w:val="20"/>
+          <w14:ligatures w14:val="none"/>
+        </w:rPr>
+        <w:t>(</w:t>
+      </w:r>
+      <w:proofErr w:type="gramStart"/>
+      <w:r>
+        <w:rPr>
+          <w:rFonts w:ascii="Mangal" w:eastAsia="Times New Roman" w:hAnsi="Mangal" w:cs="Mangal"/>
+          <w:kern w:val="0"/>
+          <w:sz w:val="20"/>
+          <w:szCs w:val="20"/>
+          <w14:ligatures w14:val="none"/>
+        </w:rPr>
+        <w:t>),</w:t>
       </w:r>
       <w:r>
         <w:rPr>
@@ -7147,7 +8531,30 @@
           <w:szCs w:val="20"/>
           <w14:ligatures w14:val="none"/>
         </w:rPr>
-        <w:t xml:space="preserve"> toUpperCase()</w:t>
+        <w:t xml:space="preserve"> </w:t>
+      </w:r>
+      <w:proofErr w:type="spellStart"/>
+      <w:r>
+        <w:rPr>
+          <w:rFonts w:ascii="Mangal" w:eastAsia="Times New Roman" w:hAnsi="Mangal" w:cs="Mangal"/>
+          <w:kern w:val="0"/>
+          <w:sz w:val="20"/>
+          <w:szCs w:val="20"/>
+          <w14:ligatures w14:val="none"/>
+        </w:rPr>
+        <w:t>toUpperCase</w:t>
+      </w:r>
+      <w:proofErr w:type="spellEnd"/>
+      <w:proofErr w:type="gramEnd"/>
+      <w:r>
+        <w:rPr>
+          <w:rFonts w:ascii="Mangal" w:eastAsia="Times New Roman" w:hAnsi="Mangal" w:cs="Mangal"/>
+          <w:kern w:val="0"/>
+          <w:sz w:val="20"/>
+          <w:szCs w:val="20"/>
+          <w14:ligatures w14:val="none"/>
+        </w:rPr>
+        <w:t>()</w:t>
       </w:r>
     </w:p>
     <w:p>
@@ -7232,6 +8639,7 @@
         </w:rPr>
         <w:t xml:space="preserve"> = </w:t>
       </w:r>
+      <w:proofErr w:type="gramStart"/>
       <w:r>
         <w:rPr>
           <w:rStyle w:val="hljs-number"/>
@@ -7253,6 +8661,7 @@
         </w:rPr>
         <w:t>a</w:t>
       </w:r>
+      <w:proofErr w:type="gramEnd"/>
       <w:r>
         <w:rPr>
           <w:rStyle w:val="HTMLCode"/>
@@ -7260,6 +8669,7 @@
         </w:rPr>
         <w:t xml:space="preserve"> = </w:t>
       </w:r>
+      <w:proofErr w:type="gramStart"/>
       <w:r>
         <w:rPr>
           <w:rStyle w:val="hljs-number"/>
@@ -7281,6 +8691,7 @@
         </w:rPr>
         <w:t>n</w:t>
       </w:r>
+      <w:proofErr w:type="gramEnd"/>
       <w:r>
         <w:rPr>
           <w:rStyle w:val="HTMLCode"/>
@@ -7307,12 +8718,21 @@
       <w:r>
         <w:t xml:space="preserve">You can use:  Nested loops (manual) Or </w:t>
       </w:r>
+      <w:proofErr w:type="gramStart"/>
       <w:r>
         <w:rPr>
           <w:rStyle w:val="HTMLCode"/>
           <w:rFonts w:eastAsiaTheme="majorEastAsia"/>
         </w:rPr>
-        <w:t>int[256]</w:t>
+        <w:t>int[</w:t>
+      </w:r>
+      <w:proofErr w:type="gramEnd"/>
+      <w:r>
+        <w:rPr>
+          <w:rStyle w:val="HTMLCode"/>
+          <w:rFonts w:eastAsiaTheme="majorEastAsia"/>
+        </w:rPr>
+        <w:t>256]</w:t>
       </w:r>
       <w:r>
         <w:t xml:space="preserve"> frequency array (smart)</w:t>
@@ -7751,7 +9171,31 @@
         </w:rPr>
       </w:pPr>
       <w:r>
-        <w:t>Write a class Circle containing private variable radius of type float, suitable constructors, and two methods findArea and findCircumference to find area and circumference of circles respectively. Write a separate class MyCircle containing main method to create and use circle objects.</w:t>
+        <w:t xml:space="preserve">Write a class Circle containing private variable radius of type float, suitable constructors, and two methods </w:t>
+      </w:r>
+      <w:proofErr w:type="spellStart"/>
+      <w:r>
+        <w:t>findArea</w:t>
+      </w:r>
+      <w:proofErr w:type="spellEnd"/>
+      <w:r>
+        <w:t xml:space="preserve"> and </w:t>
+      </w:r>
+      <w:proofErr w:type="spellStart"/>
+      <w:r>
+        <w:t>findCircumference</w:t>
+      </w:r>
+      <w:proofErr w:type="spellEnd"/>
+      <w:r>
+        <w:t xml:space="preserve"> to find area and circumference of circles respectively. Write a separate class </w:t>
+      </w:r>
+      <w:proofErr w:type="spellStart"/>
+      <w:r>
+        <w:t>MyCircle</w:t>
+      </w:r>
+      <w:proofErr w:type="spellEnd"/>
+      <w:r>
+        <w:t xml:space="preserve"> containing main method to create and use circle objects.</w:t>
       </w:r>
     </w:p>
     <w:p>
@@ -7769,7 +9213,15 @@
         </w:rPr>
       </w:pPr>
       <w:r>
-        <w:t>Write a Java program to create a class student having property name, address and roll. Set default and user defined value of these property using constructors and then display values of these property.</w:t>
+        <w:t xml:space="preserve">Write a Java program to create a class student having property name, address and roll. Set default and user defined value of these property using constructors and then display values of </w:t>
+      </w:r>
+      <w:proofErr w:type="gramStart"/>
+      <w:r>
+        <w:t>these property</w:t>
+      </w:r>
+      <w:proofErr w:type="gramEnd"/>
+      <w:r>
+        <w:t>.</w:t>
       </w:r>
     </w:p>
     <w:p>
@@ -7781,7 +9233,15 @@
         </w:numPr>
       </w:pPr>
       <w:r>
-        <w:t>Write a class Box with private variables width, height and depth and methods to find volume and surface area. Use suitable constructors. Implement the class to find volume and surface area of two boxes.</w:t>
+        <w:t xml:space="preserve">Write a class </w:t>
+      </w:r>
+      <w:proofErr w:type="gramStart"/>
+      <w:r>
+        <w:t>Box</w:t>
+      </w:r>
+      <w:proofErr w:type="gramEnd"/>
+      <w:r>
+        <w:t xml:space="preserve"> with private variables width, height and depth and methods to find volume and surface area. Use suitable constructors. Implement the class to find volume and surface area of two boxes.</w:t>
       </w:r>
     </w:p>
     <w:p>
@@ -7798,50 +9258,67 @@
           <w:szCs w:val="24"/>
         </w:rPr>
       </w:pPr>
+      <w:r>
+        <w:t xml:space="preserve">Write a class Distance containing private variables feet of type int and inches of type int, suitable constructors, and two methods </w:t>
+      </w:r>
+      <w:proofErr w:type="spellStart"/>
+      <w:r>
+        <w:t>addDistance</w:t>
+      </w:r>
+      <w:proofErr w:type="spellEnd"/>
+      <w:r>
+        <w:t xml:space="preserve"> and </w:t>
+      </w:r>
+      <w:proofErr w:type="spellStart"/>
+      <w:r>
+        <w:t>displayDistance</w:t>
+      </w:r>
+      <w:proofErr w:type="spellEnd"/>
+      <w:r>
+        <w:t xml:space="preserve"> for adding and displaying distance objects. Write a separate class </w:t>
+      </w:r>
+      <w:proofErr w:type="spellStart"/>
+      <w:r>
+        <w:t>MyDistance</w:t>
+      </w:r>
+      <w:proofErr w:type="spellEnd"/>
+      <w:r>
+        <w:t xml:space="preserve"> containing main method to create and use distance objects.</w:t>
+      </w:r>
     </w:p>
     <w:p>
       <w:pPr>
         <w:pStyle w:val="max2"/>
-        <w:rPr>
-          <w:rFonts w:ascii="Verdana" w:hAnsi="Verdana"/>
-          <w:color w:val="000000"/>
-          <w:sz w:val="24"/>
-          <w:szCs w:val="24"/>
-        </w:rPr>
-      </w:pPr>
-    </w:p>
-    <w:p>
-      <w:pPr>
-        <w:pStyle w:val="max2"/>
-        <w:rPr>
-          <w:rFonts w:ascii="Verdana" w:hAnsi="Verdana"/>
-          <w:color w:val="000000"/>
-          <w:sz w:val="24"/>
-          <w:szCs w:val="24"/>
-        </w:rPr>
-      </w:pPr>
-    </w:p>
-    <w:p>
-      <w:pPr>
-        <w:pStyle w:val="max2"/>
-        <w:rPr>
-          <w:rFonts w:ascii="Verdana" w:hAnsi="Verdana"/>
-          <w:color w:val="000000"/>
-          <w:sz w:val="24"/>
-          <w:szCs w:val="24"/>
-        </w:rPr>
-      </w:pPr>
-    </w:p>
-    <w:p>
-      <w:pPr>
-        <w:pStyle w:val="max2"/>
-        <w:rPr>
-          <w:rFonts w:ascii="Verdana" w:hAnsi="Verdana"/>
-          <w:color w:val="000000"/>
-          <w:sz w:val="24"/>
-          <w:szCs w:val="24"/>
-        </w:rPr>
-      </w:pPr>
+        <w:numPr>
+          <w:ilvl w:val="0"/>
+          <w:numId w:val="38"/>
+        </w:numPr>
+        <w:rPr>
+          <w:rFonts w:ascii="Verdana" w:hAnsi="Verdana"/>
+          <w:color w:val="000000"/>
+          <w:sz w:val="24"/>
+          <w:szCs w:val="24"/>
+        </w:rPr>
+      </w:pPr>
+      <w:r>
+        <w:t>Create a Java class Time with three attributes hours, minutes, and seconds. Use appropriate constructors to initialize instance variables. Use methods to display time in HH:</w:t>
+      </w:r>
+      <w:proofErr w:type="gramStart"/>
+      <w:r>
+        <w:t>MM:SS</w:t>
+      </w:r>
+      <w:proofErr w:type="gramEnd"/>
+      <w:r>
+        <w:t xml:space="preserve"> format, add and subtract </w:t>
+      </w:r>
+      <w:proofErr w:type="gramStart"/>
+      <w:r>
+        <w:t>two time</w:t>
+      </w:r>
+      <w:proofErr w:type="gramEnd"/>
+      <w:r>
+        <w:t xml:space="preserve"> objects. Implement the class to add, subtract and display time objects.</w:t>
+      </w:r>
     </w:p>
     <w:p>
       <w:pPr>
@@ -7886,7 +9363,29 @@
           <w:color w:val="000000"/>
           <w:szCs w:val="24"/>
         </w:rPr>
-        <w:t>Find Pair With Given Sum</w:t>
+        <w:t xml:space="preserve">Find Pair </w:t>
+      </w:r>
+      <w:proofErr w:type="gramStart"/>
+      <w:r>
+        <w:rPr>
+          <w:rFonts w:ascii="Verdana" w:hAnsi="Verdana"/>
+          <w:b/>
+          <w:bCs/>
+          <w:color w:val="000000"/>
+          <w:szCs w:val="24"/>
+        </w:rPr>
+        <w:t>With</w:t>
+      </w:r>
+      <w:proofErr w:type="gramEnd"/>
+      <w:r>
+        <w:rPr>
+          <w:rFonts w:ascii="Verdana" w:hAnsi="Verdana"/>
+          <w:b/>
+          <w:bCs/>
+          <w:color w:val="000000"/>
+          <w:szCs w:val="24"/>
+        </w:rPr>
+        <w:t xml:space="preserve"> Given Sum</w:t>
       </w:r>
     </w:p>
     <w:p>
@@ -7933,7 +9432,16 @@
           <w:color w:val="000000"/>
           <w:szCs w:val="24"/>
         </w:rPr>
-        <w:t>Use nested loop (basic)</w:t>
+        <w:t>Use nested loop (</w:t>
+      </w:r>
+      <w:proofErr w:type="gramStart"/>
+      <w:r>
+        <w:rPr>
+          <w:rFonts w:ascii="Verdana" w:hAnsi="Verdana"/>
+          <w:color w:val="000000"/>
+          <w:szCs w:val="24"/>
+        </w:rPr>
+        <w:t>basic)</w:t>
       </w:r>
       <w:r>
         <w:rPr>
@@ -7943,6 +9451,7 @@
         </w:rPr>
         <w:t xml:space="preserve">   </w:t>
       </w:r>
+      <w:proofErr w:type="gramEnd"/>
       <w:r>
         <w:rPr>
           <w:rFonts w:ascii="Verdana" w:hAnsi="Verdana"/>
@@ -8042,7 +9551,18 @@
           <w14:ligatures w14:val="none"/>
         </w:rPr>
         <w:br/>
-        <w:t>Output: {2,2}</w:t>
+        <w:t>Output: {2,2</w:t>
+      </w:r>
+      <w:proofErr w:type="gramStart"/>
+      <w:r>
+        <w:rPr>
+          <w:rFonts w:ascii="Mangal" w:eastAsia="Times New Roman" w:hAnsi="Mangal" w:cs="Mangal"/>
+          <w:kern w:val="0"/>
+          <w:sz w:val="20"/>
+          <w:szCs w:val="20"/>
+          <w14:ligatures w14:val="none"/>
+        </w:rPr>
+        <w:t>}</w:t>
       </w:r>
       <w:r>
         <w:rPr>
@@ -8062,7 +9582,18 @@
           <w:szCs w:val="20"/>
           <w14:ligatures w14:val="none"/>
         </w:rPr>
-        <w:t>Don’t create a new array if possible.</w:t>
+        <w:t>Don’t</w:t>
+      </w:r>
+      <w:proofErr w:type="gramEnd"/>
+      <w:r>
+        <w:rPr>
+          <w:rFonts w:ascii="Mangal" w:eastAsia="Times New Roman" w:hAnsi="Mangal" w:cs="Mangal"/>
+          <w:kern w:val="0"/>
+          <w:sz w:val="20"/>
+          <w:szCs w:val="20"/>
+          <w14:ligatures w14:val="none"/>
+        </w:rPr>
+        <w:t xml:space="preserve"> create a new array if possible.</w:t>
       </w:r>
     </w:p>
     <w:p>
@@ -8151,7 +9682,29 @@
           <w:szCs w:val="20"/>
           <w14:ligatures w14:val="none"/>
         </w:rPr>
-        <w:t>Input: "aaabbccccd"</w:t>
+        <w:t>Input: "</w:t>
+      </w:r>
+      <w:proofErr w:type="spellStart"/>
+      <w:r>
+        <w:rPr>
+          <w:rFonts w:ascii="Mangal" w:eastAsia="Times New Roman" w:hAnsi="Mangal" w:cs="Mangal"/>
+          <w:kern w:val="0"/>
+          <w:sz w:val="20"/>
+          <w:szCs w:val="20"/>
+          <w14:ligatures w14:val="none"/>
+        </w:rPr>
+        <w:t>aaabbccccd</w:t>
+      </w:r>
+      <w:proofErr w:type="spellEnd"/>
+      <w:r>
+        <w:rPr>
+          <w:rFonts w:ascii="Mangal" w:eastAsia="Times New Roman" w:hAnsi="Mangal" w:cs="Mangal"/>
+          <w:kern w:val="0"/>
+          <w:sz w:val="20"/>
+          <w:szCs w:val="20"/>
+          <w14:ligatures w14:val="none"/>
+        </w:rPr>
+        <w:t>"</w:t>
       </w:r>
       <w:r>
         <w:rPr>
@@ -8162,8 +9715,58 @@
           <w14:ligatures w14:val="none"/>
         </w:rPr>
         <w:br/>
-        <w:t>Output: 4 (because of "cccc")</w:t>
-      </w:r>
+        <w:t>Output: 4 (because of "</w:t>
+      </w:r>
+      <w:proofErr w:type="spellStart"/>
+      <w:r>
+        <w:rPr>
+          <w:rFonts w:ascii="Mangal" w:eastAsia="Times New Roman" w:hAnsi="Mangal" w:cs="Mangal"/>
+          <w:kern w:val="0"/>
+          <w:sz w:val="20"/>
+          <w:szCs w:val="20"/>
+          <w14:ligatures w14:val="none"/>
+        </w:rPr>
+        <w:t>cccc</w:t>
+      </w:r>
+      <w:proofErr w:type="spellEnd"/>
+      <w:r>
+        <w:rPr>
+          <w:rFonts w:ascii="Mangal" w:eastAsia="Times New Roman" w:hAnsi="Mangal" w:cs="Mangal"/>
+          <w:kern w:val="0"/>
+          <w:sz w:val="20"/>
+          <w:szCs w:val="20"/>
+          <w14:ligatures w14:val="none"/>
+        </w:rPr>
+        <w:t>")</w:t>
+      </w:r>
+    </w:p>
+    <w:p>
+      <w:pPr>
+        <w:pStyle w:val="ListParagraph"/>
+        <w:spacing w:before="100" w:beforeAutospacing="1" w:after="100" w:afterAutospacing="1" w:line="240" w:lineRule="auto"/>
+        <w:ind w:left="1080"/>
+        <w:rPr>
+          <w:rFonts w:ascii="Mangal" w:eastAsia="Times New Roman" w:hAnsi="Mangal" w:cs="Mangal"/>
+          <w:kern w:val="0"/>
+          <w:sz w:val="20"/>
+          <w:szCs w:val="20"/>
+          <w14:ligatures w14:val="none"/>
+        </w:rPr>
+      </w:pPr>
+    </w:p>
+    <w:p>
+      <w:pPr>
+        <w:pStyle w:val="ListParagraph"/>
+        <w:spacing w:before="100" w:beforeAutospacing="1" w:after="100" w:afterAutospacing="1" w:line="240" w:lineRule="auto"/>
+        <w:ind w:left="1080"/>
+        <w:rPr>
+          <w:rFonts w:ascii="Mangal" w:eastAsia="Times New Roman" w:hAnsi="Mangal" w:cs="Mangal"/>
+          <w:kern w:val="0"/>
+          <w:sz w:val="20"/>
+          <w:szCs w:val="20"/>
+          <w14:ligatures w14:val="none"/>
+        </w:rPr>
+      </w:pPr>
     </w:p>
     <w:p>
       <w:pPr>
@@ -8192,6 +9795,7 @@
           <w:szCs w:val="24"/>
           <w14:ligatures w14:val="none"/>
         </w:rPr>
+        <w:lastRenderedPageBreak/>
         <w:t>Check If One String Is Rotation of Another</w:t>
       </w:r>
     </w:p>
@@ -8216,8 +9820,51 @@
           <w:szCs w:val="20"/>
           <w14:ligatures w14:val="none"/>
         </w:rPr>
-        <w:lastRenderedPageBreak/>
-        <w:t xml:space="preserve">Input: "abcd", "cdab" </w:t>
+        <w:t>Input: "</w:t>
+      </w:r>
+      <w:proofErr w:type="spellStart"/>
+      <w:r>
+        <w:rPr>
+          <w:rFonts w:ascii="Mangal" w:eastAsia="Times New Roman" w:hAnsi="Mangal" w:cs="Mangal"/>
+          <w:kern w:val="0"/>
+          <w:sz w:val="20"/>
+          <w:szCs w:val="20"/>
+          <w14:ligatures w14:val="none"/>
+        </w:rPr>
+        <w:t>abcd</w:t>
+      </w:r>
+      <w:proofErr w:type="spellEnd"/>
+      <w:r>
+        <w:rPr>
+          <w:rFonts w:ascii="Mangal" w:eastAsia="Times New Roman" w:hAnsi="Mangal" w:cs="Mangal"/>
+          <w:kern w:val="0"/>
+          <w:sz w:val="20"/>
+          <w:szCs w:val="20"/>
+          <w14:ligatures w14:val="none"/>
+        </w:rPr>
+        <w:t>", "</w:t>
+      </w:r>
+      <w:proofErr w:type="spellStart"/>
+      <w:r>
+        <w:rPr>
+          <w:rFonts w:ascii="Mangal" w:eastAsia="Times New Roman" w:hAnsi="Mangal" w:cs="Mangal"/>
+          <w:kern w:val="0"/>
+          <w:sz w:val="20"/>
+          <w:szCs w:val="20"/>
+          <w14:ligatures w14:val="none"/>
+        </w:rPr>
+        <w:t>cdab</w:t>
+      </w:r>
+      <w:proofErr w:type="spellEnd"/>
+      <w:r>
+        <w:rPr>
+          <w:rFonts w:ascii="Mangal" w:eastAsia="Times New Roman" w:hAnsi="Mangal" w:cs="Mangal"/>
+          <w:kern w:val="0"/>
+          <w:sz w:val="20"/>
+          <w:szCs w:val="20"/>
+          <w14:ligatures w14:val="none"/>
+        </w:rPr>
+        <w:t xml:space="preserve">" </w:t>
       </w:r>
       <w:r>
         <w:rPr>
@@ -8248,7 +9895,51 @@
           <w14:ligatures w14:val="none"/>
         </w:rPr>
         <w:br/>
-        <w:t xml:space="preserve">Input: "abcd", "acbd" </w:t>
+        <w:t>Input: "</w:t>
+      </w:r>
+      <w:proofErr w:type="spellStart"/>
+      <w:r>
+        <w:rPr>
+          <w:rFonts w:ascii="Mangal" w:eastAsia="Times New Roman" w:hAnsi="Mangal" w:cs="Mangal"/>
+          <w:kern w:val="0"/>
+          <w:sz w:val="20"/>
+          <w:szCs w:val="20"/>
+          <w14:ligatures w14:val="none"/>
+        </w:rPr>
+        <w:t>abcd</w:t>
+      </w:r>
+      <w:proofErr w:type="spellEnd"/>
+      <w:r>
+        <w:rPr>
+          <w:rFonts w:ascii="Mangal" w:eastAsia="Times New Roman" w:hAnsi="Mangal" w:cs="Mangal"/>
+          <w:kern w:val="0"/>
+          <w:sz w:val="20"/>
+          <w:szCs w:val="20"/>
+          <w14:ligatures w14:val="none"/>
+        </w:rPr>
+        <w:t>", "</w:t>
+      </w:r>
+      <w:proofErr w:type="spellStart"/>
+      <w:r>
+        <w:rPr>
+          <w:rFonts w:ascii="Mangal" w:eastAsia="Times New Roman" w:hAnsi="Mangal" w:cs="Mangal"/>
+          <w:kern w:val="0"/>
+          <w:sz w:val="20"/>
+          <w:szCs w:val="20"/>
+          <w14:ligatures w14:val="none"/>
+        </w:rPr>
+        <w:t>acbd</w:t>
+      </w:r>
+      <w:proofErr w:type="spellEnd"/>
+      <w:r>
+        <w:rPr>
+          <w:rFonts w:ascii="Mangal" w:eastAsia="Times New Roman" w:hAnsi="Mangal" w:cs="Mangal"/>
+          <w:kern w:val="0"/>
+          <w:sz w:val="20"/>
+          <w:szCs w:val="20"/>
+          <w14:ligatures w14:val="none"/>
+        </w:rPr>
+        <w:t xml:space="preserve">" </w:t>
       </w:r>
       <w:r>
         <w:rPr>
@@ -8270,6 +9961,20 @@
         </w:rPr>
         <w:t xml:space="preserve"> false</w:t>
       </w:r>
+    </w:p>
+    <w:p>
+      <w:pPr>
+        <w:pStyle w:val="ListParagraph"/>
+        <w:spacing w:before="100" w:beforeAutospacing="1" w:after="100" w:afterAutospacing="1" w:line="240" w:lineRule="auto"/>
+        <w:ind w:left="1080"/>
+        <w:rPr>
+          <w:rFonts w:ascii="Mangal" w:eastAsia="Times New Roman" w:hAnsi="Mangal" w:cs="Mangal"/>
+          <w:kern w:val="0"/>
+          <w:sz w:val="20"/>
+          <w:szCs w:val="20"/>
+          <w14:ligatures w14:val="none"/>
+        </w:rPr>
+      </w:pPr>
     </w:p>
     <w:p>
       <w:pPr>
@@ -9043,7 +10748,27 @@
           <w:sz w:val="24"/>
           <w:szCs w:val="24"/>
         </w:rPr>
-        <w:t>Count Strings Starting and Ending With Same Characte</w:t>
+        <w:t xml:space="preserve">Count Strings Starting and Ending </w:t>
+      </w:r>
+      <w:proofErr w:type="gramStart"/>
+      <w:r>
+        <w:rPr>
+          <w:rStyle w:val="Strong"/>
+          <w:rFonts w:ascii="Times New Roman" w:eastAsiaTheme="majorEastAsia" w:hAnsi="Times New Roman" w:cs="Times New Roman"/>
+          <w:sz w:val="24"/>
+          <w:szCs w:val="24"/>
+        </w:rPr>
+        <w:t>With</w:t>
+      </w:r>
+      <w:proofErr w:type="gramEnd"/>
+      <w:r>
+        <w:rPr>
+          <w:rStyle w:val="Strong"/>
+          <w:rFonts w:ascii="Times New Roman" w:eastAsiaTheme="majorEastAsia" w:hAnsi="Times New Roman" w:cs="Times New Roman"/>
+          <w:sz w:val="24"/>
+          <w:szCs w:val="24"/>
+        </w:rPr>
+        <w:t xml:space="preserve"> Same Characte</w:t>
       </w:r>
       <w:r>
         <w:rPr>
@@ -9069,16 +10794,9 @@
           <w:sz w:val="28"/>
           <w:szCs w:val="28"/>
         </w:rPr>
-        <w:t>{"abc", "aaa", "kite", "pop"}</w:t>
-      </w:r>
-      <w:r>
-        <w:rPr>
-          <w:rFonts w:ascii="Times New Roman" w:hAnsi="Times New Roman" w:cs="Times New Roman"/>
-          <w:sz w:val="28"/>
-          <w:szCs w:val="28"/>
-        </w:rPr>
-        <w:t xml:space="preserve"> → Output: </w:t>
-      </w:r>
+        <w:t>{"</w:t>
+      </w:r>
+      <w:proofErr w:type="spellStart"/>
       <w:r>
         <w:rPr>
           <w:rStyle w:val="HTMLCode"/>
@@ -9086,16 +10804,9 @@
           <w:sz w:val="28"/>
           <w:szCs w:val="28"/>
         </w:rPr>
-        <w:t>3</w:t>
-      </w:r>
-      <w:r>
-        <w:rPr>
-          <w:rFonts w:ascii="Times New Roman" w:hAnsi="Times New Roman" w:cs="Times New Roman"/>
-          <w:sz w:val="28"/>
-          <w:szCs w:val="28"/>
-        </w:rPr>
-        <w:t xml:space="preserve"> (</w:t>
-      </w:r>
+        <w:t>abc</w:t>
+      </w:r>
+      <w:proofErr w:type="spellEnd"/>
       <w:r>
         <w:rPr>
           <w:rStyle w:val="HTMLCode"/>
@@ -9103,8 +10814,64 @@
           <w:sz w:val="28"/>
           <w:szCs w:val="28"/>
         </w:rPr>
+        <w:t>", "</w:t>
+      </w:r>
+      <w:proofErr w:type="spellStart"/>
+      <w:r>
+        <w:rPr>
+          <w:rStyle w:val="HTMLCode"/>
+          <w:rFonts w:ascii="Times New Roman" w:eastAsiaTheme="majorEastAsia" w:hAnsi="Times New Roman" w:cs="Times New Roman"/>
+          <w:sz w:val="28"/>
+          <w:szCs w:val="28"/>
+        </w:rPr>
         <w:t>aaa</w:t>
       </w:r>
+      <w:proofErr w:type="spellEnd"/>
+      <w:r>
+        <w:rPr>
+          <w:rStyle w:val="HTMLCode"/>
+          <w:rFonts w:ascii="Times New Roman" w:eastAsiaTheme="majorEastAsia" w:hAnsi="Times New Roman" w:cs="Times New Roman"/>
+          <w:sz w:val="28"/>
+          <w:szCs w:val="28"/>
+        </w:rPr>
+        <w:t>", "kite", "pop"}</w:t>
+      </w:r>
+      <w:r>
+        <w:rPr>
+          <w:rFonts w:ascii="Times New Roman" w:hAnsi="Times New Roman" w:cs="Times New Roman"/>
+          <w:sz w:val="28"/>
+          <w:szCs w:val="28"/>
+        </w:rPr>
+        <w:t xml:space="preserve"> → Output: </w:t>
+      </w:r>
+      <w:r>
+        <w:rPr>
+          <w:rStyle w:val="HTMLCode"/>
+          <w:rFonts w:ascii="Times New Roman" w:eastAsiaTheme="majorEastAsia" w:hAnsi="Times New Roman" w:cs="Times New Roman"/>
+          <w:sz w:val="28"/>
+          <w:szCs w:val="28"/>
+        </w:rPr>
+        <w:t>3</w:t>
+      </w:r>
+      <w:r>
+        <w:rPr>
+          <w:rFonts w:ascii="Times New Roman" w:hAnsi="Times New Roman" w:cs="Times New Roman"/>
+          <w:sz w:val="28"/>
+          <w:szCs w:val="28"/>
+        </w:rPr>
+        <w:t xml:space="preserve"> (</w:t>
+      </w:r>
+      <w:proofErr w:type="spellStart"/>
+      <w:r>
+        <w:rPr>
+          <w:rStyle w:val="HTMLCode"/>
+          <w:rFonts w:ascii="Times New Roman" w:eastAsiaTheme="majorEastAsia" w:hAnsi="Times New Roman" w:cs="Times New Roman"/>
+          <w:sz w:val="28"/>
+          <w:szCs w:val="28"/>
+        </w:rPr>
+        <w:t>aaa</w:t>
+      </w:r>
+      <w:proofErr w:type="spellEnd"/>
       <w:r>
         <w:rPr>
           <w:rFonts w:ascii="Times New Roman" w:hAnsi="Times New Roman" w:cs="Times New Roman"/>

</xml_diff>

<commit_message>
Day 29 half completed
</commit_message>
<xml_diff>
--- a/Questions.docx
+++ b/Questions.docx
@@ -52,41 +52,44 @@
           <w:sz w:val="28"/>
           <w:szCs w:val="22"/>
         </w:rPr>
-        <w:t>Write a java program to check input validation for integer constraints :</w:t>
-      </w:r>
-    </w:p>
-    <w:p>
-      <w:pPr>
-        <w:pStyle w:val="ListParagraph"/>
+        <w:t xml:space="preserve">Write a java program to check input validation for integer </w:t>
+      </w:r>
+      <w:proofErr w:type="gramStart"/>
+      <w:r>
         <w:rPr>
           <w:rFonts w:ascii="Times New Roman" w:hAnsi="Times New Roman" w:cs="Times New Roman"/>
           <w:sz w:val="28"/>
           <w:szCs w:val="22"/>
         </w:rPr>
-      </w:pPr>
-      <w:r>
+        <w:t>constraints :</w:t>
+      </w:r>
+      <w:proofErr w:type="gramEnd"/>
+    </w:p>
+    <w:p>
+      <w:pPr>
+        <w:pStyle w:val="ListParagraph"/>
         <w:rPr>
           <w:rFonts w:ascii="Times New Roman" w:hAnsi="Times New Roman" w:cs="Times New Roman"/>
           <w:sz w:val="28"/>
           <w:szCs w:val="22"/>
         </w:rPr>
-        <w:t>N&lt;</w:t>
-      </w:r>
+      </w:pPr>
       <w:r>
         <w:rPr>
           <w:rFonts w:ascii="Times New Roman" w:hAnsi="Times New Roman" w:cs="Times New Roman"/>
           <w:sz w:val="28"/>
           <w:szCs w:val="22"/>
         </w:rPr>
-        <w:t>10</w:t>
-      </w:r>
+        <w:t>N&lt;</w:t>
+      </w:r>
+      <w:proofErr w:type="gramStart"/>
       <w:r>
         <w:rPr>
           <w:rFonts w:ascii="Times New Roman" w:hAnsi="Times New Roman" w:cs="Times New Roman"/>
           <w:sz w:val="28"/>
           <w:szCs w:val="22"/>
         </w:rPr>
-        <w:t xml:space="preserve"> </w:t>
+        <w:t>10</w:t>
       </w:r>
       <w:r>
         <w:rPr>
@@ -94,7 +97,7 @@
           <w:sz w:val="28"/>
           <w:szCs w:val="22"/>
         </w:rPr>
-        <w:t>,</w:t>
+        <w:t xml:space="preserve"> </w:t>
       </w:r>
       <w:r>
         <w:rPr>
@@ -102,7 +105,7 @@
           <w:sz w:val="28"/>
           <w:szCs w:val="22"/>
         </w:rPr>
-        <w:t>N&gt;</w:t>
+        <w:t>,</w:t>
       </w:r>
       <w:r>
         <w:rPr>
@@ -110,7 +113,42 @@
           <w:sz w:val="28"/>
           <w:szCs w:val="22"/>
         </w:rPr>
-        <w:t xml:space="preserve">0, for string constraints : </w:t>
+        <w:t>N</w:t>
+      </w:r>
+      <w:proofErr w:type="gramEnd"/>
+      <w:r>
+        <w:rPr>
+          <w:rFonts w:ascii="Times New Roman" w:hAnsi="Times New Roman" w:cs="Times New Roman"/>
+          <w:sz w:val="28"/>
+          <w:szCs w:val="22"/>
+        </w:rPr>
+        <w:t>&gt;</w:t>
+      </w:r>
+      <w:r>
+        <w:rPr>
+          <w:rFonts w:ascii="Times New Roman" w:hAnsi="Times New Roman" w:cs="Times New Roman"/>
+          <w:sz w:val="28"/>
+          <w:szCs w:val="22"/>
+        </w:rPr>
+        <w:t xml:space="preserve">0, for string </w:t>
+      </w:r>
+      <w:proofErr w:type="gramStart"/>
+      <w:r>
+        <w:rPr>
+          <w:rFonts w:ascii="Times New Roman" w:hAnsi="Times New Roman" w:cs="Times New Roman"/>
+          <w:sz w:val="28"/>
+          <w:szCs w:val="22"/>
+        </w:rPr>
+        <w:t>constraints :</w:t>
+      </w:r>
+      <w:proofErr w:type="gramEnd"/>
+      <w:r>
+        <w:rPr>
+          <w:rFonts w:ascii="Times New Roman" w:hAnsi="Times New Roman" w:cs="Times New Roman"/>
+          <w:sz w:val="28"/>
+          <w:szCs w:val="22"/>
+        </w:rPr>
+        <w:t xml:space="preserve"> </w:t>
       </w:r>
       <w:r>
         <w:rPr>
@@ -235,7 +273,34 @@
           <w:szCs w:val="24"/>
         </w:rPr>
         <w:br/>
-        <w:t xml:space="preserve">stringTimes("Hi", 2) </w:t>
+      </w:r>
+      <w:proofErr w:type="spellStart"/>
+      <w:proofErr w:type="gramStart"/>
+      <w:r>
+        <w:rPr>
+          <w:rFonts w:ascii="Verdana" w:hAnsi="Verdana"/>
+          <w:color w:val="000000"/>
+          <w:szCs w:val="24"/>
+        </w:rPr>
+        <w:t>stringTimes</w:t>
+      </w:r>
+      <w:proofErr w:type="spellEnd"/>
+      <w:r>
+        <w:rPr>
+          <w:rFonts w:ascii="Verdana" w:hAnsi="Verdana"/>
+          <w:color w:val="000000"/>
+          <w:szCs w:val="24"/>
+        </w:rPr>
+        <w:t>(</w:t>
+      </w:r>
+      <w:proofErr w:type="gramEnd"/>
+      <w:r>
+        <w:rPr>
+          <w:rFonts w:ascii="Verdana" w:hAnsi="Verdana"/>
+          <w:color w:val="000000"/>
+          <w:szCs w:val="24"/>
+        </w:rPr>
+        <w:t xml:space="preserve">"Hi", 2) </w:t>
       </w:r>
       <w:r>
         <w:rPr>
@@ -251,7 +316,25 @@
           <w:color w:val="000000"/>
           <w:szCs w:val="24"/>
         </w:rPr>
-        <w:t xml:space="preserve"> "HiHi"</w:t>
+        <w:t xml:space="preserve"> "</w:t>
+      </w:r>
+      <w:proofErr w:type="spellStart"/>
+      <w:r>
+        <w:rPr>
+          <w:rFonts w:ascii="Verdana" w:hAnsi="Verdana"/>
+          <w:color w:val="000000"/>
+          <w:szCs w:val="24"/>
+        </w:rPr>
+        <w:t>HiHi</w:t>
+      </w:r>
+      <w:proofErr w:type="spellEnd"/>
+      <w:r>
+        <w:rPr>
+          <w:rFonts w:ascii="Verdana" w:hAnsi="Verdana"/>
+          <w:color w:val="000000"/>
+          <w:szCs w:val="24"/>
+        </w:rPr>
+        <w:t>"</w:t>
       </w:r>
       <w:r>
         <w:rPr>
@@ -260,7 +343,34 @@
           <w:szCs w:val="24"/>
         </w:rPr>
         <w:br/>
-        <w:t xml:space="preserve">stringTimes("Hi", 3) </w:t>
+      </w:r>
+      <w:proofErr w:type="spellStart"/>
+      <w:proofErr w:type="gramStart"/>
+      <w:r>
+        <w:rPr>
+          <w:rFonts w:ascii="Verdana" w:hAnsi="Verdana"/>
+          <w:color w:val="000000"/>
+          <w:szCs w:val="24"/>
+        </w:rPr>
+        <w:t>stringTimes</w:t>
+      </w:r>
+      <w:proofErr w:type="spellEnd"/>
+      <w:r>
+        <w:rPr>
+          <w:rFonts w:ascii="Verdana" w:hAnsi="Verdana"/>
+          <w:color w:val="000000"/>
+          <w:szCs w:val="24"/>
+        </w:rPr>
+        <w:t>(</w:t>
+      </w:r>
+      <w:proofErr w:type="gramEnd"/>
+      <w:r>
+        <w:rPr>
+          <w:rFonts w:ascii="Verdana" w:hAnsi="Verdana"/>
+          <w:color w:val="000000"/>
+          <w:szCs w:val="24"/>
+        </w:rPr>
+        <w:t xml:space="preserve">"Hi", 3) </w:t>
       </w:r>
       <w:r>
         <w:rPr>
@@ -276,7 +386,25 @@
           <w:color w:val="000000"/>
           <w:szCs w:val="24"/>
         </w:rPr>
-        <w:t xml:space="preserve"> "HiHiHi"</w:t>
+        <w:t xml:space="preserve"> "</w:t>
+      </w:r>
+      <w:proofErr w:type="spellStart"/>
+      <w:r>
+        <w:rPr>
+          <w:rFonts w:ascii="Verdana" w:hAnsi="Verdana"/>
+          <w:color w:val="000000"/>
+          <w:szCs w:val="24"/>
+        </w:rPr>
+        <w:t>HiHiHi</w:t>
+      </w:r>
+      <w:proofErr w:type="spellEnd"/>
+      <w:r>
+        <w:rPr>
+          <w:rFonts w:ascii="Verdana" w:hAnsi="Verdana"/>
+          <w:color w:val="000000"/>
+          <w:szCs w:val="24"/>
+        </w:rPr>
+        <w:t>"</w:t>
       </w:r>
       <w:r>
         <w:rPr>
@@ -285,7 +413,34 @@
           <w:szCs w:val="24"/>
         </w:rPr>
         <w:br/>
-        <w:t xml:space="preserve">stringTimes("Hi", 1) </w:t>
+      </w:r>
+      <w:proofErr w:type="spellStart"/>
+      <w:proofErr w:type="gramStart"/>
+      <w:r>
+        <w:rPr>
+          <w:rFonts w:ascii="Verdana" w:hAnsi="Verdana"/>
+          <w:color w:val="000000"/>
+          <w:szCs w:val="24"/>
+        </w:rPr>
+        <w:t>stringTimes</w:t>
+      </w:r>
+      <w:proofErr w:type="spellEnd"/>
+      <w:r>
+        <w:rPr>
+          <w:rFonts w:ascii="Verdana" w:hAnsi="Verdana"/>
+          <w:color w:val="000000"/>
+          <w:szCs w:val="24"/>
+        </w:rPr>
+        <w:t>(</w:t>
+      </w:r>
+      <w:proofErr w:type="gramEnd"/>
+      <w:r>
+        <w:rPr>
+          <w:rFonts w:ascii="Verdana" w:hAnsi="Verdana"/>
+          <w:color w:val="000000"/>
+          <w:szCs w:val="24"/>
+        </w:rPr>
+        <w:t xml:space="preserve">"Hi", 1) </w:t>
       </w:r>
       <w:r>
         <w:rPr>
@@ -644,7 +799,27 @@
           <w:sz w:val="24"/>
           <w:szCs w:val="24"/>
         </w:rPr>
-        <w:t>Write a java program to find the multiplication of a input number.</w:t>
+        <w:t xml:space="preserve">Write a java program to find the multiplication of </w:t>
+      </w:r>
+      <w:proofErr w:type="gramStart"/>
+      <w:r>
+        <w:rPr>
+          <w:rFonts w:ascii="Verdana" w:hAnsi="Verdana"/>
+          <w:color w:val="000000"/>
+          <w:sz w:val="24"/>
+          <w:szCs w:val="24"/>
+        </w:rPr>
+        <w:t>a</w:t>
+      </w:r>
+      <w:proofErr w:type="gramEnd"/>
+      <w:r>
+        <w:rPr>
+          <w:rFonts w:ascii="Verdana" w:hAnsi="Verdana"/>
+          <w:color w:val="000000"/>
+          <w:sz w:val="24"/>
+          <w:szCs w:val="24"/>
+        </w:rPr>
+        <w:t xml:space="preserve"> input number.</w:t>
       </w:r>
     </w:p>
     <w:p>
@@ -677,7 +852,27 @@
           <w:sz w:val="24"/>
           <w:szCs w:val="24"/>
         </w:rPr>
-        <w:t xml:space="preserve">alculate factorial of a </w:t>
+        <w:t xml:space="preserve">alculate factorial of </w:t>
+      </w:r>
+      <w:proofErr w:type="gramStart"/>
+      <w:r>
+        <w:rPr>
+          <w:rFonts w:ascii="Verdana" w:hAnsi="Verdana"/>
+          <w:color w:val="000000"/>
+          <w:sz w:val="24"/>
+          <w:szCs w:val="24"/>
+        </w:rPr>
+        <w:t>a</w:t>
+      </w:r>
+      <w:proofErr w:type="gramEnd"/>
+      <w:r>
+        <w:rPr>
+          <w:rFonts w:ascii="Verdana" w:hAnsi="Verdana"/>
+          <w:color w:val="000000"/>
+          <w:sz w:val="24"/>
+          <w:szCs w:val="24"/>
+        </w:rPr>
+        <w:t xml:space="preserve"> </w:t>
       </w:r>
       <w:r>
         <w:rPr>
@@ -860,7 +1055,27 @@
           <w:sz w:val="24"/>
           <w:szCs w:val="24"/>
         </w:rPr>
-        <w:t>Write a java to count and sum of digits in a input number.</w:t>
+        <w:t xml:space="preserve">Write a java to count and sum of digits in </w:t>
+      </w:r>
+      <w:proofErr w:type="gramStart"/>
+      <w:r>
+        <w:rPr>
+          <w:rFonts w:ascii="Verdana" w:hAnsi="Verdana"/>
+          <w:color w:val="000000"/>
+          <w:sz w:val="24"/>
+          <w:szCs w:val="24"/>
+        </w:rPr>
+        <w:t>a</w:t>
+      </w:r>
+      <w:proofErr w:type="gramEnd"/>
+      <w:r>
+        <w:rPr>
+          <w:rFonts w:ascii="Verdana" w:hAnsi="Verdana"/>
+          <w:color w:val="000000"/>
+          <w:sz w:val="24"/>
+          <w:szCs w:val="24"/>
+        </w:rPr>
+        <w:t xml:space="preserve"> input number.</w:t>
       </w:r>
     </w:p>
     <w:p>
@@ -1004,7 +1219,58 @@
           <w:sz w:val="24"/>
           <w:szCs w:val="24"/>
         </w:rPr>
-        <w:t xml:space="preserve">Write a program to reverse the order of words in a string entered, for eg : I am Ram  to  Ram am I </w:t>
+        <w:t xml:space="preserve">Write a program to reverse the order of words in a string entered, for </w:t>
+      </w:r>
+      <w:proofErr w:type="spellStart"/>
+      <w:proofErr w:type="gramStart"/>
+      <w:r>
+        <w:rPr>
+          <w:rFonts w:ascii="Verdana" w:hAnsi="Verdana"/>
+          <w:color w:val="000000"/>
+          <w:sz w:val="24"/>
+          <w:szCs w:val="24"/>
+        </w:rPr>
+        <w:t>eg</w:t>
+      </w:r>
+      <w:proofErr w:type="spellEnd"/>
+      <w:r>
+        <w:rPr>
+          <w:rFonts w:ascii="Verdana" w:hAnsi="Verdana"/>
+          <w:color w:val="000000"/>
+          <w:sz w:val="24"/>
+          <w:szCs w:val="24"/>
+        </w:rPr>
+        <w:t xml:space="preserve"> :</w:t>
+      </w:r>
+      <w:proofErr w:type="gramEnd"/>
+      <w:r>
+        <w:rPr>
+          <w:rFonts w:ascii="Verdana" w:hAnsi="Verdana"/>
+          <w:color w:val="000000"/>
+          <w:sz w:val="24"/>
+          <w:szCs w:val="24"/>
+        </w:rPr>
+        <w:t xml:space="preserve"> I am </w:t>
+      </w:r>
+      <w:proofErr w:type="gramStart"/>
+      <w:r>
+        <w:rPr>
+          <w:rFonts w:ascii="Verdana" w:hAnsi="Verdana"/>
+          <w:color w:val="000000"/>
+          <w:sz w:val="24"/>
+          <w:szCs w:val="24"/>
+        </w:rPr>
+        <w:t>Ram  to</w:t>
+      </w:r>
+      <w:proofErr w:type="gramEnd"/>
+      <w:r>
+        <w:rPr>
+          <w:rFonts w:ascii="Verdana" w:hAnsi="Verdana"/>
+          <w:color w:val="000000"/>
+          <w:sz w:val="24"/>
+          <w:szCs w:val="24"/>
+        </w:rPr>
+        <w:t xml:space="preserve">  Ram am I </w:t>
       </w:r>
     </w:p>
     <w:p>
@@ -1549,7 +1815,31 @@
           <w:sz w:val="24"/>
           <w:szCs w:val="24"/>
         </w:rPr>
-        <w:t>only even digits</w:t>
+        <w:t xml:space="preserve">only </w:t>
+      </w:r>
+      <w:proofErr w:type="spellStart"/>
+      <w:r>
+        <w:rPr>
+          <w:rFonts w:ascii="Verdana" w:hAnsi="Verdana"/>
+          <w:b/>
+          <w:bCs/>
+          <w:color w:val="000000"/>
+          <w:sz w:val="24"/>
+          <w:szCs w:val="24"/>
+        </w:rPr>
+        <w:t>even</w:t>
+      </w:r>
+      <w:proofErr w:type="spellEnd"/>
+      <w:r>
+        <w:rPr>
+          <w:rFonts w:ascii="Verdana" w:hAnsi="Verdana"/>
+          <w:b/>
+          <w:bCs/>
+          <w:color w:val="000000"/>
+          <w:sz w:val="24"/>
+          <w:szCs w:val="24"/>
+        </w:rPr>
+        <w:t xml:space="preserve"> digits</w:t>
       </w:r>
       <w:r>
         <w:rPr>
@@ -1640,17 +1930,48 @@
           <w:sz w:val="24"/>
           <w:szCs w:val="24"/>
         </w:rPr>
-        <w:t>Day 08</w:t>
-      </w:r>
-      <w:r>
-        <w:rPr>
-          <w:rFonts w:ascii="Verdana" w:hAnsi="Verdana"/>
-          <w:color w:val="000000"/>
-          <w:sz w:val="24"/>
-          <w:szCs w:val="24"/>
-        </w:rPr>
-        <w:t>( stop condition value-based vs count-based )</w:t>
-      </w:r>
+        <w:t xml:space="preserve">Day </w:t>
+      </w:r>
+      <w:proofErr w:type="gramStart"/>
+      <w:r>
+        <w:rPr>
+          <w:rFonts w:ascii="Verdana" w:hAnsi="Verdana"/>
+          <w:color w:val="000000"/>
+          <w:sz w:val="24"/>
+          <w:szCs w:val="24"/>
+        </w:rPr>
+        <w:t>08</w:t>
+      </w:r>
+      <w:r>
+        <w:rPr>
+          <w:rFonts w:ascii="Verdana" w:hAnsi="Verdana"/>
+          <w:color w:val="000000"/>
+          <w:sz w:val="24"/>
+          <w:szCs w:val="24"/>
+        </w:rPr>
+        <w:t>( stop</w:t>
+      </w:r>
+      <w:proofErr w:type="gramEnd"/>
+      <w:r>
+        <w:rPr>
+          <w:rFonts w:ascii="Verdana" w:hAnsi="Verdana"/>
+          <w:color w:val="000000"/>
+          <w:sz w:val="24"/>
+          <w:szCs w:val="24"/>
+        </w:rPr>
+        <w:t xml:space="preserve"> condition value-based vs count-</w:t>
+      </w:r>
+      <w:proofErr w:type="gramStart"/>
+      <w:r>
+        <w:rPr>
+          <w:rFonts w:ascii="Verdana" w:hAnsi="Verdana"/>
+          <w:color w:val="000000"/>
+          <w:sz w:val="24"/>
+          <w:szCs w:val="24"/>
+        </w:rPr>
+        <w:t>based )</w:t>
+      </w:r>
+      <w:proofErr w:type="gramEnd"/>
     </w:p>
     <w:p>
       <w:pPr>
@@ -1993,7 +2314,17 @@
           <w:sz w:val="24"/>
           <w:szCs w:val="24"/>
         </w:rPr>
-        <w:t xml:space="preserve"> it contains.</w:t>
+        <w:t xml:space="preserve"> it </w:t>
+      </w:r>
+      <w:proofErr w:type="gramStart"/>
+      <w:r>
+        <w:rPr>
+          <w:rFonts w:ascii="Verdana" w:hAnsi="Verdana"/>
+          <w:color w:val="000000"/>
+          <w:sz w:val="24"/>
+          <w:szCs w:val="24"/>
+        </w:rPr>
+        <w:t>contains.</w:t>
       </w:r>
       <w:r>
         <w:rPr>
@@ -2004,6 +2335,7 @@
         </w:rPr>
         <w:t>(</w:t>
       </w:r>
+      <w:proofErr w:type="gramEnd"/>
       <w:r>
         <w:rPr>
           <w:rFonts w:asciiTheme="minorHAnsi" w:eastAsiaTheme="minorHAnsi" w:hAnsiTheme="minorHAnsi" w:cstheme="minorBidi"/>
@@ -2065,7 +2397,19 @@
           <w:sz w:val="24"/>
           <w:szCs w:val="24"/>
         </w:rPr>
-        <w:t>using loop only</w:t>
+        <w:t xml:space="preserve">using loop </w:t>
+      </w:r>
+      <w:proofErr w:type="gramStart"/>
+      <w:r>
+        <w:rPr>
+          <w:rFonts w:ascii="Verdana" w:hAnsi="Verdana"/>
+          <w:b/>
+          <w:bCs/>
+          <w:color w:val="000000"/>
+          <w:sz w:val="24"/>
+          <w:szCs w:val="24"/>
+        </w:rPr>
+        <w:t>only</w:t>
       </w:r>
       <w:r>
         <w:rPr>
@@ -2083,7 +2427,37 @@
           <w:sz w:val="24"/>
           <w:szCs w:val="24"/>
         </w:rPr>
-        <w:t>(No Stringbuilder) (</w:t>
+        <w:t>(</w:t>
+      </w:r>
+      <w:proofErr w:type="gramEnd"/>
+      <w:r>
+        <w:rPr>
+          <w:rFonts w:ascii="Verdana" w:hAnsi="Verdana"/>
+          <w:color w:val="000000"/>
+          <w:sz w:val="24"/>
+          <w:szCs w:val="24"/>
+        </w:rPr>
+        <w:t xml:space="preserve">No </w:t>
+      </w:r>
+      <w:proofErr w:type="spellStart"/>
+      <w:r>
+        <w:rPr>
+          <w:rFonts w:ascii="Verdana" w:hAnsi="Verdana"/>
+          <w:color w:val="000000"/>
+          <w:sz w:val="24"/>
+          <w:szCs w:val="24"/>
+        </w:rPr>
+        <w:t>Stringbuilder</w:t>
+      </w:r>
+      <w:proofErr w:type="spellEnd"/>
+      <w:r>
+        <w:rPr>
+          <w:rFonts w:ascii="Verdana" w:hAnsi="Verdana"/>
+          <w:color w:val="000000"/>
+          <w:sz w:val="24"/>
+          <w:szCs w:val="24"/>
+        </w:rPr>
+        <w:t>) (</w:t>
       </w:r>
       <w:r>
         <w:rPr>
@@ -2136,7 +2510,19 @@
           <w:sz w:val="24"/>
           <w:szCs w:val="24"/>
         </w:rPr>
-        <w:t>greater than 50</w:t>
+        <w:t xml:space="preserve">greater than </w:t>
+      </w:r>
+      <w:proofErr w:type="gramStart"/>
+      <w:r>
+        <w:rPr>
+          <w:rFonts w:ascii="Verdana" w:hAnsi="Verdana"/>
+          <w:b/>
+          <w:bCs/>
+          <w:color w:val="000000"/>
+          <w:sz w:val="24"/>
+          <w:szCs w:val="24"/>
+        </w:rPr>
+        <w:t>50</w:t>
       </w:r>
       <w:r>
         <w:rPr>
@@ -2156,6 +2542,7 @@
         </w:rPr>
         <w:t>(</w:t>
       </w:r>
+      <w:proofErr w:type="gramEnd"/>
       <w:r>
         <w:rPr>
           <w:rFonts w:asciiTheme="minorHAnsi" w:eastAsiaTheme="minorHAnsi" w:hAnsiTheme="minorHAnsi" w:cstheme="minorBidi"/>
@@ -2270,7 +2657,17 @@
           <w:sz w:val="24"/>
           <w:szCs w:val="24"/>
         </w:rPr>
-        <w:t>Count Even Digits in Each Array Element</w:t>
+        <w:t xml:space="preserve">Count Even Digits in Each Array </w:t>
+      </w:r>
+      <w:proofErr w:type="gramStart"/>
+      <w:r>
+        <w:rPr>
+          <w:rFonts w:ascii="Verdana" w:hAnsi="Verdana"/>
+          <w:color w:val="000000"/>
+          <w:sz w:val="24"/>
+          <w:szCs w:val="24"/>
+        </w:rPr>
+        <w:t>Element</w:t>
       </w:r>
       <w:r>
         <w:rPr>
@@ -2281,6 +2678,7 @@
         </w:rPr>
         <w:t>.(</w:t>
       </w:r>
+      <w:proofErr w:type="gramEnd"/>
       <w:r>
         <w:rPr>
           <w:rFonts w:asciiTheme="minorHAnsi" w:eastAsiaTheme="minorHAnsi" w:hAnsiTheme="minorHAnsi" w:cstheme="minorBidi"/>
@@ -2331,7 +2729,29 @@
           <w:sz w:val="24"/>
           <w:szCs w:val="24"/>
         </w:rPr>
-        <w:t xml:space="preserve">Traverse an array.If </w:t>
+        <w:t xml:space="preserve">Traverse an </w:t>
+      </w:r>
+      <w:proofErr w:type="spellStart"/>
+      <w:proofErr w:type="gramStart"/>
+      <w:r>
+        <w:rPr>
+          <w:rFonts w:ascii="Verdana" w:hAnsi="Verdana"/>
+          <w:color w:val="000000"/>
+          <w:sz w:val="24"/>
+          <w:szCs w:val="24"/>
+        </w:rPr>
+        <w:t>array.If</w:t>
+      </w:r>
+      <w:proofErr w:type="spellEnd"/>
+      <w:proofErr w:type="gramEnd"/>
+      <w:r>
+        <w:rPr>
+          <w:rFonts w:ascii="Verdana" w:hAnsi="Verdana"/>
+          <w:color w:val="000000"/>
+          <w:sz w:val="24"/>
+          <w:szCs w:val="24"/>
+        </w:rPr>
+        <w:t xml:space="preserve"> </w:t>
       </w:r>
       <w:r>
         <w:rPr>
@@ -2351,7 +2771,17 @@
           <w:sz w:val="24"/>
           <w:szCs w:val="24"/>
         </w:rPr>
-        <w:t>, stop immediately.</w:t>
+        <w:t xml:space="preserve">, stop </w:t>
+      </w:r>
+      <w:proofErr w:type="gramStart"/>
+      <w:r>
+        <w:rPr>
+          <w:rFonts w:ascii="Verdana" w:hAnsi="Verdana"/>
+          <w:color w:val="000000"/>
+          <w:sz w:val="24"/>
+          <w:szCs w:val="24"/>
+        </w:rPr>
+        <w:t>immediately.</w:t>
       </w:r>
       <w:r>
         <w:rPr>
@@ -2362,6 +2792,7 @@
         </w:rPr>
         <w:t>(</w:t>
       </w:r>
+      <w:proofErr w:type="gramEnd"/>
       <w:r>
         <w:rPr>
           <w:rFonts w:asciiTheme="minorHAnsi" w:eastAsiaTheme="minorHAnsi" w:hAnsiTheme="minorHAnsi" w:cstheme="minorBidi"/>
@@ -2506,7 +2937,17 @@
           <w:sz w:val="24"/>
           <w:szCs w:val="24"/>
         </w:rPr>
-        <w:t xml:space="preserve"> in a string</w:t>
+        <w:t xml:space="preserve"> in a </w:t>
+      </w:r>
+      <w:proofErr w:type="gramStart"/>
+      <w:r>
+        <w:rPr>
+          <w:rFonts w:ascii="Verdana" w:hAnsi="Verdana"/>
+          <w:color w:val="000000"/>
+          <w:sz w:val="24"/>
+          <w:szCs w:val="24"/>
+        </w:rPr>
+        <w:t>string</w:t>
       </w:r>
       <w:r>
         <w:rPr>
@@ -2526,6 +2967,7 @@
         </w:rPr>
         <w:t>(</w:t>
       </w:r>
+      <w:proofErr w:type="gramEnd"/>
       <w:r>
         <w:rPr>
           <w:rFonts w:asciiTheme="minorHAnsi" w:eastAsiaTheme="minorHAnsi" w:hAnsiTheme="minorHAnsi" w:cstheme="minorBidi"/>
@@ -2593,7 +3035,19 @@
           <w:sz w:val="24"/>
           <w:szCs w:val="24"/>
         </w:rPr>
-        <w:t>without using reverse methods</w:t>
+        <w:t xml:space="preserve">without using reverse </w:t>
+      </w:r>
+      <w:proofErr w:type="gramStart"/>
+      <w:r>
+        <w:rPr>
+          <w:rFonts w:ascii="Verdana" w:hAnsi="Verdana"/>
+          <w:b/>
+          <w:bCs/>
+          <w:color w:val="000000"/>
+          <w:sz w:val="24"/>
+          <w:szCs w:val="24"/>
+        </w:rPr>
+        <w:t>methods</w:t>
       </w:r>
       <w:r>
         <w:rPr>
@@ -2613,6 +3067,7 @@
         </w:rPr>
         <w:t>(</w:t>
       </w:r>
+      <w:proofErr w:type="gramEnd"/>
       <w:r>
         <w:rPr>
           <w:rFonts w:asciiTheme="minorHAnsi" w:eastAsiaTheme="minorHAnsi" w:hAnsiTheme="minorHAnsi" w:cstheme="minorBidi"/>
@@ -2663,7 +3118,17 @@
           <w:sz w:val="24"/>
           <w:szCs w:val="24"/>
         </w:rPr>
-        <w:t>Given an array and a number x, count how many times x appears.</w:t>
+        <w:t xml:space="preserve">Given an array and a number x, count how many times x </w:t>
+      </w:r>
+      <w:proofErr w:type="gramStart"/>
+      <w:r>
+        <w:rPr>
+          <w:rFonts w:ascii="Verdana" w:hAnsi="Verdana"/>
+          <w:color w:val="000000"/>
+          <w:sz w:val="24"/>
+          <w:szCs w:val="24"/>
+        </w:rPr>
+        <w:t>appears.</w:t>
       </w:r>
       <w:r>
         <w:rPr>
@@ -2674,6 +3139,7 @@
         </w:rPr>
         <w:t>(</w:t>
       </w:r>
+      <w:proofErr w:type="gramEnd"/>
       <w:r>
         <w:rPr>
           <w:rFonts w:asciiTheme="minorHAnsi" w:eastAsiaTheme="minorHAnsi" w:hAnsiTheme="minorHAnsi" w:cstheme="minorBidi"/>
@@ -2735,7 +3201,19 @@
           <w:sz w:val="24"/>
           <w:szCs w:val="24"/>
         </w:rPr>
-        <w:t>ascending order</w:t>
+        <w:t xml:space="preserve">ascending </w:t>
+      </w:r>
+      <w:proofErr w:type="gramStart"/>
+      <w:r>
+        <w:rPr>
+          <w:rFonts w:ascii="Verdana" w:hAnsi="Verdana"/>
+          <w:b/>
+          <w:bCs/>
+          <w:color w:val="000000"/>
+          <w:sz w:val="24"/>
+          <w:szCs w:val="24"/>
+        </w:rPr>
+        <w:t>order</w:t>
       </w:r>
       <w:r>
         <w:rPr>
@@ -2755,6 +3233,7 @@
         </w:rPr>
         <w:t>(</w:t>
       </w:r>
+      <w:proofErr w:type="gramEnd"/>
       <w:r>
         <w:rPr>
           <w:rFonts w:asciiTheme="minorHAnsi" w:eastAsiaTheme="minorHAnsi" w:hAnsiTheme="minorHAnsi" w:cstheme="minorBidi"/>
@@ -2816,7 +3295,19 @@
           <w:sz w:val="24"/>
           <w:szCs w:val="24"/>
         </w:rPr>
-        <w:t>sum of digits of each element</w:t>
+        <w:t xml:space="preserve">sum of digits of each </w:t>
+      </w:r>
+      <w:proofErr w:type="gramStart"/>
+      <w:r>
+        <w:rPr>
+          <w:rFonts w:ascii="Verdana" w:hAnsi="Verdana"/>
+          <w:b/>
+          <w:bCs/>
+          <w:color w:val="000000"/>
+          <w:sz w:val="24"/>
+          <w:szCs w:val="24"/>
+        </w:rPr>
+        <w:t>element</w:t>
       </w:r>
       <w:r>
         <w:rPr>
@@ -2836,6 +3327,7 @@
         </w:rPr>
         <w:t>(</w:t>
       </w:r>
+      <w:proofErr w:type="gramEnd"/>
       <w:r>
         <w:rPr>
           <w:rFonts w:asciiTheme="minorHAnsi" w:eastAsiaTheme="minorHAnsi" w:hAnsiTheme="minorHAnsi" w:cstheme="minorBidi"/>
@@ -2906,7 +3398,17 @@
           <w:sz w:val="24"/>
           <w:szCs w:val="24"/>
         </w:rPr>
-        <w:t>, then stop.</w:t>
+        <w:t xml:space="preserve">, then </w:t>
+      </w:r>
+      <w:proofErr w:type="gramStart"/>
+      <w:r>
+        <w:rPr>
+          <w:rFonts w:ascii="Verdana" w:hAnsi="Verdana"/>
+          <w:color w:val="000000"/>
+          <w:sz w:val="24"/>
+          <w:szCs w:val="24"/>
+        </w:rPr>
+        <w:t>stop.</w:t>
       </w:r>
       <w:r>
         <w:rPr>
@@ -2917,6 +3419,7 @@
         </w:rPr>
         <w:t>(</w:t>
       </w:r>
+      <w:proofErr w:type="gramEnd"/>
       <w:r>
         <w:rPr>
           <w:rFonts w:asciiTheme="minorHAnsi" w:eastAsiaTheme="minorHAnsi" w:hAnsiTheme="minorHAnsi" w:cstheme="minorBidi"/>
@@ -2987,7 +3490,47 @@
           <w:sz w:val="24"/>
           <w:szCs w:val="24"/>
         </w:rPr>
-        <w:t>Write a program to find out whether entered number is place at ones, tens, hundred , thousand etc….</w:t>
+        <w:t xml:space="preserve">Write a program to find out whether entered number is place at ones, tens, </w:t>
+      </w:r>
+      <w:proofErr w:type="gramStart"/>
+      <w:r>
+        <w:rPr>
+          <w:rFonts w:ascii="Verdana" w:hAnsi="Verdana"/>
+          <w:color w:val="000000"/>
+          <w:sz w:val="24"/>
+          <w:szCs w:val="24"/>
+        </w:rPr>
+        <w:t>hundred ,</w:t>
+      </w:r>
+      <w:proofErr w:type="gramEnd"/>
+      <w:r>
+        <w:rPr>
+          <w:rFonts w:ascii="Verdana" w:hAnsi="Verdana"/>
+          <w:color w:val="000000"/>
+          <w:sz w:val="24"/>
+          <w:szCs w:val="24"/>
+        </w:rPr>
+        <w:t xml:space="preserve"> thousand </w:t>
+      </w:r>
+      <w:proofErr w:type="spellStart"/>
+      <w:r>
+        <w:rPr>
+          <w:rFonts w:ascii="Verdana" w:hAnsi="Verdana"/>
+          <w:color w:val="000000"/>
+          <w:sz w:val="24"/>
+          <w:szCs w:val="24"/>
+        </w:rPr>
+        <w:t>etc</w:t>
+      </w:r>
+      <w:proofErr w:type="spellEnd"/>
+      <w:r>
+        <w:rPr>
+          <w:rFonts w:ascii="Verdana" w:hAnsi="Verdana"/>
+          <w:color w:val="000000"/>
+          <w:sz w:val="24"/>
+          <w:szCs w:val="24"/>
+        </w:rPr>
+        <w:t>….</w:t>
       </w:r>
     </w:p>
     <w:p>
@@ -3011,16 +3554,96 @@
           <w:sz w:val="24"/>
           <w:szCs w:val="24"/>
         </w:rPr>
-        <w:t>Write a program to take a string and a number / integer as prefix for that word or string , and in output just reverse string upto that integer position part, or that prefix part.</w:t>
-      </w:r>
-      <w:r>
-        <w:rPr>
-          <w:rFonts w:ascii="Verdana" w:hAnsi="Verdana"/>
-          <w:color w:val="000000"/>
-          <w:sz w:val="24"/>
-          <w:szCs w:val="24"/>
-        </w:rPr>
-        <w:t>(Practice confusion with size of an array to index of an array ).</w:t>
+        <w:t xml:space="preserve">Write a program to take a string and a number / integer as prefix for that word or </w:t>
+      </w:r>
+      <w:proofErr w:type="gramStart"/>
+      <w:r>
+        <w:rPr>
+          <w:rFonts w:ascii="Verdana" w:hAnsi="Verdana"/>
+          <w:color w:val="000000"/>
+          <w:sz w:val="24"/>
+          <w:szCs w:val="24"/>
+        </w:rPr>
+        <w:t>string ,</w:t>
+      </w:r>
+      <w:proofErr w:type="gramEnd"/>
+      <w:r>
+        <w:rPr>
+          <w:rFonts w:ascii="Verdana" w:hAnsi="Verdana"/>
+          <w:color w:val="000000"/>
+          <w:sz w:val="24"/>
+          <w:szCs w:val="24"/>
+        </w:rPr>
+        <w:t xml:space="preserve"> and in output just reverse string </w:t>
+      </w:r>
+      <w:proofErr w:type="spellStart"/>
+      <w:r>
+        <w:rPr>
+          <w:rFonts w:ascii="Verdana" w:hAnsi="Verdana"/>
+          <w:color w:val="000000"/>
+          <w:sz w:val="24"/>
+          <w:szCs w:val="24"/>
+        </w:rPr>
+        <w:t>upto</w:t>
+      </w:r>
+      <w:proofErr w:type="spellEnd"/>
+      <w:r>
+        <w:rPr>
+          <w:rFonts w:ascii="Verdana" w:hAnsi="Verdana"/>
+          <w:color w:val="000000"/>
+          <w:sz w:val="24"/>
+          <w:szCs w:val="24"/>
+        </w:rPr>
+        <w:t xml:space="preserve"> that integer position part, or that prefix </w:t>
+      </w:r>
+      <w:proofErr w:type="gramStart"/>
+      <w:r>
+        <w:rPr>
+          <w:rFonts w:ascii="Verdana" w:hAnsi="Verdana"/>
+          <w:color w:val="000000"/>
+          <w:sz w:val="24"/>
+          <w:szCs w:val="24"/>
+        </w:rPr>
+        <w:t>part.</w:t>
+      </w:r>
+      <w:r>
+        <w:rPr>
+          <w:rFonts w:ascii="Verdana" w:hAnsi="Verdana"/>
+          <w:color w:val="000000"/>
+          <w:sz w:val="24"/>
+          <w:szCs w:val="24"/>
+        </w:rPr>
+        <w:t>(</w:t>
+      </w:r>
+      <w:proofErr w:type="gramEnd"/>
+      <w:r>
+        <w:rPr>
+          <w:rFonts w:ascii="Verdana" w:hAnsi="Verdana"/>
+          <w:color w:val="000000"/>
+          <w:sz w:val="24"/>
+          <w:szCs w:val="24"/>
+        </w:rPr>
+        <w:t xml:space="preserve">Practice confusion with size of an array to index of an </w:t>
+      </w:r>
+      <w:proofErr w:type="gramStart"/>
+      <w:r>
+        <w:rPr>
+          <w:rFonts w:ascii="Verdana" w:hAnsi="Verdana"/>
+          <w:color w:val="000000"/>
+          <w:sz w:val="24"/>
+          <w:szCs w:val="24"/>
+        </w:rPr>
+        <w:t>array )</w:t>
+      </w:r>
+      <w:proofErr w:type="gramEnd"/>
+      <w:r>
+        <w:rPr>
+          <w:rFonts w:ascii="Verdana" w:hAnsi="Verdana"/>
+          <w:color w:val="000000"/>
+          <w:sz w:val="24"/>
+          <w:szCs w:val="24"/>
+        </w:rPr>
+        <w:t>.</w:t>
       </w:r>
     </w:p>
     <w:p>
@@ -3044,7 +3667,17 @@
           <w:sz w:val="24"/>
           <w:szCs w:val="24"/>
         </w:rPr>
-        <w:t>Count Words in a String (Single Spaces Only)</w:t>
+        <w:t>Count Words in a String (Single Spaces Only</w:t>
+      </w:r>
+      <w:proofErr w:type="gramStart"/>
+      <w:r>
+        <w:rPr>
+          <w:rFonts w:ascii="Verdana" w:hAnsi="Verdana"/>
+          <w:color w:val="000000"/>
+          <w:sz w:val="24"/>
+          <w:szCs w:val="24"/>
+        </w:rPr>
+        <w:t>)</w:t>
       </w:r>
       <w:r>
         <w:rPr>
@@ -3055,6 +3688,7 @@
         </w:rPr>
         <w:t>.(</w:t>
       </w:r>
+      <w:proofErr w:type="gramEnd"/>
       <w:r>
         <w:rPr>
           <w:rFonts w:asciiTheme="minorHAnsi" w:eastAsiaTheme="minorHAnsi" w:hAnsiTheme="minorHAnsi" w:cstheme="minorBidi"/>
@@ -3130,7 +3764,17 @@
           <w:szCs w:val="24"/>
         </w:rPr>
         <w:lastRenderedPageBreak/>
-        <w:t>Given a string, remove all numeric characters and print the result.</w:t>
+        <w:t xml:space="preserve">Given a string, remove all numeric characters and print the </w:t>
+      </w:r>
+      <w:proofErr w:type="gramStart"/>
+      <w:r>
+        <w:rPr>
+          <w:rFonts w:ascii="Verdana" w:hAnsi="Verdana"/>
+          <w:color w:val="000000"/>
+          <w:sz w:val="24"/>
+          <w:szCs w:val="24"/>
+        </w:rPr>
+        <w:t>result.</w:t>
       </w:r>
       <w:r>
         <w:rPr>
@@ -3141,6 +3785,7 @@
         </w:rPr>
         <w:t>(</w:t>
       </w:r>
+      <w:proofErr w:type="gramEnd"/>
       <w:r>
         <w:rPr>
           <w:rFonts w:asciiTheme="minorHAnsi" w:eastAsiaTheme="minorHAnsi" w:hAnsiTheme="minorHAnsi" w:cstheme="minorBidi"/>
@@ -3238,25 +3883,55 @@
           <w:sz w:val="24"/>
           <w:szCs w:val="24"/>
         </w:rPr>
-        <w:t>Find (maximum – minimum)</w:t>
-      </w:r>
-      <w:r>
-        <w:rPr>
-          <w:rFonts w:ascii="Verdana" w:hAnsi="Verdana"/>
-          <w:color w:val="000000"/>
-          <w:sz w:val="24"/>
-          <w:szCs w:val="24"/>
-        </w:rPr>
-        <w:t>difference between MAX and MIN</w:t>
-      </w:r>
-      <w:r>
-        <w:rPr>
-          <w:rFonts w:ascii="Verdana" w:hAnsi="Verdana"/>
-          <w:color w:val="000000"/>
-          <w:sz w:val="24"/>
-          <w:szCs w:val="24"/>
-        </w:rPr>
-        <w:t xml:space="preserve"> from an integer array.</w:t>
+        <w:t xml:space="preserve">Find (maximum – </w:t>
+      </w:r>
+      <w:proofErr w:type="gramStart"/>
+      <w:r>
+        <w:rPr>
+          <w:rFonts w:ascii="Verdana" w:hAnsi="Verdana"/>
+          <w:color w:val="000000"/>
+          <w:sz w:val="24"/>
+          <w:szCs w:val="24"/>
+        </w:rPr>
+        <w:t>minimum)</w:t>
+      </w:r>
+      <w:r>
+        <w:rPr>
+          <w:rFonts w:ascii="Verdana" w:hAnsi="Verdana"/>
+          <w:color w:val="000000"/>
+          <w:sz w:val="24"/>
+          <w:szCs w:val="24"/>
+        </w:rPr>
+        <w:t>difference</w:t>
+      </w:r>
+      <w:proofErr w:type="gramEnd"/>
+      <w:r>
+        <w:rPr>
+          <w:rFonts w:ascii="Verdana" w:hAnsi="Verdana"/>
+          <w:color w:val="000000"/>
+          <w:sz w:val="24"/>
+          <w:szCs w:val="24"/>
+        </w:rPr>
+        <w:t xml:space="preserve"> between MAX and MIN</w:t>
+      </w:r>
+      <w:r>
+        <w:rPr>
+          <w:rFonts w:ascii="Verdana" w:hAnsi="Verdana"/>
+          <w:color w:val="000000"/>
+          <w:sz w:val="24"/>
+          <w:szCs w:val="24"/>
+        </w:rPr>
+        <w:t xml:space="preserve"> from an integer </w:t>
+      </w:r>
+      <w:proofErr w:type="gramStart"/>
+      <w:r>
+        <w:rPr>
+          <w:rFonts w:ascii="Verdana" w:hAnsi="Verdana"/>
+          <w:color w:val="000000"/>
+          <w:sz w:val="24"/>
+          <w:szCs w:val="24"/>
+        </w:rPr>
+        <w:t>array.</w:t>
       </w:r>
       <w:r>
         <w:rPr>
@@ -3267,6 +3942,7 @@
         </w:rPr>
         <w:t>(</w:t>
       </w:r>
+      <w:proofErr w:type="gramEnd"/>
       <w:r>
         <w:rPr>
           <w:rFonts w:asciiTheme="minorHAnsi" w:eastAsiaTheme="minorHAnsi" w:hAnsiTheme="minorHAnsi" w:cstheme="minorBidi"/>
@@ -3328,7 +4004,19 @@
           <w:sz w:val="24"/>
           <w:szCs w:val="24"/>
         </w:rPr>
-        <w:t>without using extra array</w:t>
+        <w:t xml:space="preserve">without using extra </w:t>
+      </w:r>
+      <w:proofErr w:type="gramStart"/>
+      <w:r>
+        <w:rPr>
+          <w:rFonts w:ascii="Verdana" w:hAnsi="Verdana"/>
+          <w:b/>
+          <w:bCs/>
+          <w:color w:val="000000"/>
+          <w:sz w:val="24"/>
+          <w:szCs w:val="24"/>
+        </w:rPr>
+        <w:t>array</w:t>
       </w:r>
       <w:r>
         <w:rPr>
@@ -3348,6 +4036,7 @@
         </w:rPr>
         <w:t>(</w:t>
       </w:r>
+      <w:proofErr w:type="gramEnd"/>
       <w:r>
         <w:rPr>
           <w:rFonts w:asciiTheme="minorHAnsi" w:eastAsiaTheme="minorHAnsi" w:hAnsiTheme="minorHAnsi" w:cstheme="minorBidi"/>
@@ -3424,7 +4113,17 @@
           <w:sz w:val="24"/>
           <w:szCs w:val="24"/>
         </w:rPr>
-        <w:t xml:space="preserve"> (2, 3, 5, 7) across all elements.</w:t>
+        <w:t xml:space="preserve"> (2, 3, 5, 7) across all </w:t>
+      </w:r>
+      <w:proofErr w:type="gramStart"/>
+      <w:r>
+        <w:rPr>
+          <w:rFonts w:ascii="Verdana" w:hAnsi="Verdana"/>
+          <w:color w:val="000000"/>
+          <w:sz w:val="24"/>
+          <w:szCs w:val="24"/>
+        </w:rPr>
+        <w:t>elements.</w:t>
       </w:r>
       <w:r>
         <w:rPr>
@@ -3435,6 +4134,7 @@
         </w:rPr>
         <w:t>(</w:t>
       </w:r>
+      <w:proofErr w:type="gramEnd"/>
       <w:r>
         <w:rPr>
           <w:rFonts w:asciiTheme="minorHAnsi" w:eastAsiaTheme="minorHAnsi" w:hAnsiTheme="minorHAnsi" w:cstheme="minorBidi"/>
@@ -3503,7 +4203,17 @@
           <w:sz w:val="24"/>
           <w:szCs w:val="24"/>
         </w:rPr>
-        <w:t>Stop when a string contains "java" (case-insensitive).</w:t>
+        <w:t>Stop when a string contains "java" (case-insensitive</w:t>
+      </w:r>
+      <w:proofErr w:type="gramStart"/>
+      <w:r>
+        <w:rPr>
+          <w:rFonts w:ascii="Verdana" w:hAnsi="Verdana"/>
+          <w:color w:val="000000"/>
+          <w:sz w:val="24"/>
+          <w:szCs w:val="24"/>
+        </w:rPr>
+        <w:t>).</w:t>
       </w:r>
       <w:r>
         <w:rPr>
@@ -3514,6 +4224,7 @@
         </w:rPr>
         <w:t>(</w:t>
       </w:r>
+      <w:proofErr w:type="gramEnd"/>
       <w:r>
         <w:rPr>
           <w:rFonts w:asciiTheme="minorHAnsi" w:eastAsiaTheme="minorHAnsi" w:hAnsiTheme="minorHAnsi" w:cstheme="minorBidi"/>
@@ -3620,8 +4331,19 @@
           <w:sz w:val="24"/>
           <w:szCs w:val="24"/>
         </w:rPr>
-        <w:t>Count how many letters are repeated in a string or word, or maybe array of characters.(</w:t>
-      </w:r>
+        <w:t xml:space="preserve">Count how many letters are repeated in a string or word, or maybe array of </w:t>
+      </w:r>
+      <w:proofErr w:type="gramStart"/>
+      <w:r>
+        <w:rPr>
+          <w:rFonts w:ascii="Verdana" w:hAnsi="Verdana"/>
+          <w:color w:val="000000"/>
+          <w:sz w:val="24"/>
+          <w:szCs w:val="24"/>
+        </w:rPr>
+        <w:t>characters.(</w:t>
+      </w:r>
+      <w:proofErr w:type="gramEnd"/>
       <w:r>
         <w:rPr>
           <w:rFonts w:asciiTheme="minorHAnsi" w:eastAsiaTheme="minorHAnsi" w:hAnsiTheme="minorHAnsi" w:cstheme="minorBidi"/>
@@ -3705,8 +4427,19 @@
           <w:sz w:val="24"/>
           <w:szCs w:val="24"/>
         </w:rPr>
-        <w:t xml:space="preserve"> in a word.(</w:t>
-      </w:r>
+        <w:t xml:space="preserve"> in a </w:t>
+      </w:r>
+      <w:proofErr w:type="gramStart"/>
+      <w:r>
+        <w:rPr>
+          <w:rFonts w:ascii="Verdana" w:hAnsi="Verdana"/>
+          <w:color w:val="000000"/>
+          <w:sz w:val="24"/>
+          <w:szCs w:val="24"/>
+        </w:rPr>
+        <w:t>word.(</w:t>
+      </w:r>
+      <w:proofErr w:type="gramEnd"/>
       <w:r>
         <w:rPr>
           <w:rFonts w:asciiTheme="minorHAnsi" w:eastAsiaTheme="minorHAnsi" w:hAnsiTheme="minorHAnsi" w:cstheme="minorBidi"/>
@@ -3792,8 +4525,19 @@
           <w:sz w:val="24"/>
           <w:szCs w:val="24"/>
         </w:rPr>
-        <w:t>Write a program to count and print unique or non-repeated characters / number in an array.(</w:t>
-      </w:r>
+        <w:t xml:space="preserve">Write a program to count and print unique or non-repeated characters / number in an </w:t>
+      </w:r>
+      <w:proofErr w:type="gramStart"/>
+      <w:r>
+        <w:rPr>
+          <w:rFonts w:ascii="Verdana" w:hAnsi="Verdana"/>
+          <w:color w:val="000000"/>
+          <w:sz w:val="24"/>
+          <w:szCs w:val="24"/>
+        </w:rPr>
+        <w:t>array.(</w:t>
+      </w:r>
+      <w:proofErr w:type="gramEnd"/>
       <w:r>
         <w:rPr>
           <w:rFonts w:ascii="Verdana" w:hAnsi="Verdana"/>
@@ -3898,7 +4642,17 @@
           <w:sz w:val="24"/>
           <w:szCs w:val="24"/>
         </w:rPr>
-        <w:t xml:space="preserve"> in an array.</w:t>
+        <w:t xml:space="preserve"> in an </w:t>
+      </w:r>
+      <w:proofErr w:type="gramStart"/>
+      <w:r>
+        <w:rPr>
+          <w:rFonts w:ascii="Verdana" w:hAnsi="Verdana"/>
+          <w:color w:val="000000"/>
+          <w:sz w:val="24"/>
+          <w:szCs w:val="24"/>
+        </w:rPr>
+        <w:t>array.</w:t>
       </w:r>
       <w:r>
         <w:rPr>
@@ -3909,6 +4663,7 @@
         </w:rPr>
         <w:t>(</w:t>
       </w:r>
+      <w:proofErr w:type="gramEnd"/>
       <w:r>
         <w:rPr>
           <w:rFonts w:asciiTheme="minorHAnsi" w:eastAsiaTheme="minorHAnsi" w:hAnsiTheme="minorHAnsi" w:cstheme="minorBidi"/>
@@ -4018,7 +4773,17 @@
           <w:sz w:val="24"/>
           <w:szCs w:val="24"/>
         </w:rPr>
-        <w:t>Remove Duplicates (Print Only Unique Elements)</w:t>
+        <w:t>Remove Duplicates (Print Only Unique Elements</w:t>
+      </w:r>
+      <w:proofErr w:type="gramStart"/>
+      <w:r>
+        <w:rPr>
+          <w:rFonts w:ascii="Verdana" w:hAnsi="Verdana"/>
+          <w:color w:val="000000"/>
+          <w:sz w:val="24"/>
+          <w:szCs w:val="24"/>
+        </w:rPr>
+        <w:t>)</w:t>
       </w:r>
       <w:r>
         <w:rPr>
@@ -4029,6 +4794,7 @@
         </w:rPr>
         <w:t>.(</w:t>
       </w:r>
+      <w:proofErr w:type="gramEnd"/>
       <w:r>
         <w:rPr>
           <w:rFonts w:asciiTheme="minorHAnsi" w:eastAsiaTheme="minorHAnsi" w:hAnsiTheme="minorHAnsi" w:cstheme="minorBidi"/>
@@ -4209,8 +4975,39 @@
           <w:szCs w:val="24"/>
         </w:rPr>
         <w:lastRenderedPageBreak/>
-        <w:t>DSA Foundation questions(Day 16) :</w:t>
-      </w:r>
+        <w:t xml:space="preserve">DSA Foundation </w:t>
+      </w:r>
+      <w:proofErr w:type="gramStart"/>
+      <w:r>
+        <w:rPr>
+          <w:rFonts w:ascii="Verdana" w:hAnsi="Verdana"/>
+          <w:color w:val="000000"/>
+          <w:sz w:val="24"/>
+          <w:szCs w:val="24"/>
+        </w:rPr>
+        <w:t>questions(</w:t>
+      </w:r>
+      <w:proofErr w:type="gramEnd"/>
+      <w:r>
+        <w:rPr>
+          <w:rFonts w:ascii="Verdana" w:hAnsi="Verdana"/>
+          <w:color w:val="000000"/>
+          <w:sz w:val="24"/>
+          <w:szCs w:val="24"/>
+        </w:rPr>
+        <w:t>Day 16</w:t>
+      </w:r>
+      <w:proofErr w:type="gramStart"/>
+      <w:r>
+        <w:rPr>
+          <w:rFonts w:ascii="Verdana" w:hAnsi="Verdana"/>
+          <w:color w:val="000000"/>
+          <w:sz w:val="24"/>
+          <w:szCs w:val="24"/>
+        </w:rPr>
+        <w:t>) :</w:t>
+      </w:r>
+      <w:proofErr w:type="gramEnd"/>
     </w:p>
     <w:p>
       <w:pPr>
@@ -4257,8 +5054,9 @@
           <w:szCs w:val="20"/>
           <w14:ligatures w14:val="none"/>
         </w:rPr>
-        <w:t>Given an array of integers nums and an integer target, return indices of the two numbers such that they add up to target.</w:t>
-      </w:r>
+        <w:t xml:space="preserve">Given an array of integers </w:t>
+      </w:r>
+      <w:proofErr w:type="spellStart"/>
       <w:r>
         <w:rPr>
           <w:rFonts w:ascii="Courier New" w:eastAsia="Times New Roman" w:hAnsi="Courier New" w:cs="Courier New"/>
@@ -4268,8 +5066,9 @@
           <w:szCs w:val="20"/>
           <w14:ligatures w14:val="none"/>
         </w:rPr>
-        <w:br/>
-      </w:r>
+        <w:t>nums</w:t>
+      </w:r>
+      <w:proofErr w:type="spellEnd"/>
       <w:r>
         <w:rPr>
           <w:rFonts w:ascii="Courier New" w:eastAsia="Times New Roman" w:hAnsi="Courier New" w:cs="Courier New"/>
@@ -4279,6 +5078,28 @@
           <w:szCs w:val="20"/>
           <w14:ligatures w14:val="none"/>
         </w:rPr>
+        <w:t xml:space="preserve"> and an integer target, return indices of the two numbers such that they add up to target.</w:t>
+      </w:r>
+      <w:r>
+        <w:rPr>
+          <w:rFonts w:ascii="Courier New" w:eastAsia="Times New Roman" w:hAnsi="Courier New" w:cs="Courier New"/>
+          <w:color w:val="F2F2F2" w:themeColor="background1" w:themeShade="F2"/>
+          <w:kern w:val="0"/>
+          <w:sz w:val="20"/>
+          <w:szCs w:val="20"/>
+          <w14:ligatures w14:val="none"/>
+        </w:rPr>
+        <w:br/>
+      </w:r>
+      <w:r>
+        <w:rPr>
+          <w:rFonts w:ascii="Courier New" w:eastAsia="Times New Roman" w:hAnsi="Courier New" w:cs="Courier New"/>
+          <w:color w:val="F2F2F2" w:themeColor="background1" w:themeShade="F2"/>
+          <w:kern w:val="0"/>
+          <w:sz w:val="20"/>
+          <w:szCs w:val="20"/>
+          <w14:ligatures w14:val="none"/>
+        </w:rPr>
         <w:br/>
         <w:t>You may assume that each input would have exactly one solution, and you may not use the same element twice.</w:t>
       </w:r>
@@ -4327,8 +5148,9 @@
           <w14:ligatures w14:val="none"/>
         </w:rPr>
         <w:br/>
-        <w:t>Input: nums = [2,7,11,15], target = 9</w:t>
-      </w:r>
+        <w:t xml:space="preserve">Input: </w:t>
+      </w:r>
+      <w:proofErr w:type="spellStart"/>
       <w:r>
         <w:rPr>
           <w:rFonts w:ascii="Courier New" w:eastAsia="Times New Roman" w:hAnsi="Courier New" w:cs="Courier New"/>
@@ -4338,6 +5160,29 @@
           <w:szCs w:val="20"/>
           <w14:ligatures w14:val="none"/>
         </w:rPr>
+        <w:t>nums</w:t>
+      </w:r>
+      <w:proofErr w:type="spellEnd"/>
+      <w:r>
+        <w:rPr>
+          <w:rFonts w:ascii="Courier New" w:eastAsia="Times New Roman" w:hAnsi="Courier New" w:cs="Courier New"/>
+          <w:color w:val="F2F2F2" w:themeColor="background1" w:themeShade="F2"/>
+          <w:kern w:val="0"/>
+          <w:sz w:val="20"/>
+          <w:szCs w:val="20"/>
+          <w14:ligatures w14:val="none"/>
+        </w:rPr>
+        <w:t xml:space="preserve"> = [2,7,11,15], target = 9</w:t>
+      </w:r>
+      <w:r>
+        <w:rPr>
+          <w:rFonts w:ascii="Courier New" w:eastAsia="Times New Roman" w:hAnsi="Courier New" w:cs="Courier New"/>
+          <w:color w:val="F2F2F2" w:themeColor="background1" w:themeShade="F2"/>
+          <w:kern w:val="0"/>
+          <w:sz w:val="20"/>
+          <w:szCs w:val="20"/>
+          <w14:ligatures w14:val="none"/>
+        </w:rPr>
         <w:br/>
         <w:t>Output: [0,1]</w:t>
       </w:r>
@@ -4351,8 +5196,9 @@
           <w14:ligatures w14:val="none"/>
         </w:rPr>
         <w:br/>
-        <w:t>Explanation: Because nums[0] + nums[1] == 9, we return [0, 1].</w:t>
-      </w:r>
+        <w:t xml:space="preserve">Explanation: Because </w:t>
+      </w:r>
+      <w:proofErr w:type="spellStart"/>
       <w:r>
         <w:rPr>
           <w:rFonts w:ascii="Courier New" w:eastAsia="Times New Roman" w:hAnsi="Courier New" w:cs="Courier New"/>
@@ -4362,6 +5208,53 @@
           <w:szCs w:val="20"/>
           <w14:ligatures w14:val="none"/>
         </w:rPr>
+        <w:t>nums</w:t>
+      </w:r>
+      <w:proofErr w:type="spellEnd"/>
+      <w:r>
+        <w:rPr>
+          <w:rFonts w:ascii="Courier New" w:eastAsia="Times New Roman" w:hAnsi="Courier New" w:cs="Courier New"/>
+          <w:color w:val="F2F2F2" w:themeColor="background1" w:themeShade="F2"/>
+          <w:kern w:val="0"/>
+          <w:sz w:val="20"/>
+          <w:szCs w:val="20"/>
+          <w14:ligatures w14:val="none"/>
+        </w:rPr>
+        <w:t xml:space="preserve">[0] + </w:t>
+      </w:r>
+      <w:proofErr w:type="spellStart"/>
+      <w:r>
+        <w:rPr>
+          <w:rFonts w:ascii="Courier New" w:eastAsia="Times New Roman" w:hAnsi="Courier New" w:cs="Courier New"/>
+          <w:color w:val="F2F2F2" w:themeColor="background1" w:themeShade="F2"/>
+          <w:kern w:val="0"/>
+          <w:sz w:val="20"/>
+          <w:szCs w:val="20"/>
+          <w14:ligatures w14:val="none"/>
+        </w:rPr>
+        <w:t>nums</w:t>
+      </w:r>
+      <w:proofErr w:type="spellEnd"/>
+      <w:r>
+        <w:rPr>
+          <w:rFonts w:ascii="Courier New" w:eastAsia="Times New Roman" w:hAnsi="Courier New" w:cs="Courier New"/>
+          <w:color w:val="F2F2F2" w:themeColor="background1" w:themeShade="F2"/>
+          <w:kern w:val="0"/>
+          <w:sz w:val="20"/>
+          <w:szCs w:val="20"/>
+          <w14:ligatures w14:val="none"/>
+        </w:rPr>
+        <w:t>[1] == 9, we return [0, 1].</w:t>
+      </w:r>
+      <w:r>
+        <w:rPr>
+          <w:rFonts w:ascii="Courier New" w:eastAsia="Times New Roman" w:hAnsi="Courier New" w:cs="Courier New"/>
+          <w:color w:val="F2F2F2" w:themeColor="background1" w:themeShade="F2"/>
+          <w:kern w:val="0"/>
+          <w:sz w:val="20"/>
+          <w:szCs w:val="20"/>
+          <w14:ligatures w14:val="none"/>
+        </w:rPr>
         <w:br/>
         <w:t>Example 2:</w:t>
       </w:r>
@@ -4375,7 +5268,31 @@
           <w14:ligatures w14:val="none"/>
         </w:rPr>
         <w:br/>
-        <w:t>Input: nums = [3,2,4], target = 6</w:t>
+        <w:t xml:space="preserve">Input: </w:t>
+      </w:r>
+      <w:proofErr w:type="spellStart"/>
+      <w:r>
+        <w:rPr>
+          <w:rFonts w:ascii="Courier New" w:eastAsia="Times New Roman" w:hAnsi="Courier New" w:cs="Courier New"/>
+          <w:color w:val="F2F2F2" w:themeColor="background1" w:themeShade="F2"/>
+          <w:kern w:val="0"/>
+          <w:sz w:val="20"/>
+          <w:szCs w:val="20"/>
+          <w14:ligatures w14:val="none"/>
+        </w:rPr>
+        <w:t>nums</w:t>
+      </w:r>
+      <w:proofErr w:type="spellEnd"/>
+      <w:r>
+        <w:rPr>
+          <w:rFonts w:ascii="Courier New" w:eastAsia="Times New Roman" w:hAnsi="Courier New" w:cs="Courier New"/>
+          <w:color w:val="F2F2F2" w:themeColor="background1" w:themeShade="F2"/>
+          <w:kern w:val="0"/>
+          <w:sz w:val="20"/>
+          <w:szCs w:val="20"/>
+          <w14:ligatures w14:val="none"/>
+        </w:rPr>
+        <w:t xml:space="preserve"> = [3,2,4], target = 6</w:t>
       </w:r>
       <w:r>
         <w:rPr>
@@ -4559,14 +5476,25 @@
         </w:rPr>
         <w:t xml:space="preserve">Day 17(Array in DSA </w:t>
       </w:r>
-      <w:r>
-        <w:rPr>
-          <w:rFonts w:ascii="Verdana" w:hAnsi="Verdana"/>
-          <w:color w:val="000000"/>
-          <w:sz w:val="24"/>
-          <w:szCs w:val="24"/>
-        </w:rPr>
-        <w:t>basic : sorting, searching and reversing</w:t>
+      <w:proofErr w:type="gramStart"/>
+      <w:r>
+        <w:rPr>
+          <w:rFonts w:ascii="Verdana" w:hAnsi="Verdana"/>
+          <w:color w:val="000000"/>
+          <w:sz w:val="24"/>
+          <w:szCs w:val="24"/>
+        </w:rPr>
+        <w:t>basic :</w:t>
+      </w:r>
+      <w:proofErr w:type="gramEnd"/>
+      <w:r>
+        <w:rPr>
+          <w:rFonts w:ascii="Verdana" w:hAnsi="Verdana"/>
+          <w:color w:val="000000"/>
+          <w:sz w:val="24"/>
+          <w:szCs w:val="24"/>
+        </w:rPr>
+        <w:t xml:space="preserve"> sorting, searching and reversing</w:t>
       </w:r>
       <w:r>
         <w:rPr>
@@ -4600,16 +5528,36 @@
           <w:sz w:val="24"/>
           <w:szCs w:val="24"/>
         </w:rPr>
-        <w:t>Write a program to find the largest element in an array using both brute force and optimal solution possible.</w:t>
-      </w:r>
-      <w:r>
-        <w:rPr>
-          <w:rFonts w:ascii="Verdana" w:hAnsi="Verdana"/>
-          <w:color w:val="000000"/>
-          <w:sz w:val="24"/>
-          <w:szCs w:val="24"/>
-        </w:rPr>
-        <w:t>(Sorting)</w:t>
+        <w:t xml:space="preserve">Write a program to find the largest element in an array using both brute force and optimal solution </w:t>
+      </w:r>
+      <w:proofErr w:type="gramStart"/>
+      <w:r>
+        <w:rPr>
+          <w:rFonts w:ascii="Verdana" w:hAnsi="Verdana"/>
+          <w:color w:val="000000"/>
+          <w:sz w:val="24"/>
+          <w:szCs w:val="24"/>
+        </w:rPr>
+        <w:t>possible.</w:t>
+      </w:r>
+      <w:r>
+        <w:rPr>
+          <w:rFonts w:ascii="Verdana" w:hAnsi="Verdana"/>
+          <w:color w:val="000000"/>
+          <w:sz w:val="24"/>
+          <w:szCs w:val="24"/>
+        </w:rPr>
+        <w:t>(</w:t>
+      </w:r>
+      <w:proofErr w:type="gramEnd"/>
+      <w:r>
+        <w:rPr>
+          <w:rFonts w:ascii="Verdana" w:hAnsi="Verdana"/>
+          <w:color w:val="000000"/>
+          <w:sz w:val="24"/>
+          <w:szCs w:val="24"/>
+        </w:rPr>
+        <w:t>Sorting)</w:t>
       </w:r>
     </w:p>
     <w:bookmarkEnd w:id="0"/>
@@ -4814,6 +5762,7 @@
         </w:rPr>
         <w:t>Given an array, </w:t>
       </w:r>
+      <w:proofErr w:type="gramStart"/>
       <w:r>
         <w:rPr>
           <w:rFonts w:ascii="Verdana" w:hAnsi="Verdana"/>
@@ -4823,17 +5772,9 @@
           <w:sz w:val="24"/>
           <w:szCs w:val="24"/>
         </w:rPr>
-        <w:t>a[]</w:t>
-      </w:r>
-      <w:r>
-        <w:rPr>
-          <w:rFonts w:ascii="Verdana" w:hAnsi="Verdana"/>
-          <w:color w:val="000000"/>
-          <w:sz w:val="24"/>
-          <w:szCs w:val="24"/>
-        </w:rPr>
-        <w:t> of n integers, and an integer element </w:t>
-      </w:r>
+        <w:t>a[</w:t>
+      </w:r>
+      <w:proofErr w:type="gramEnd"/>
       <w:r>
         <w:rPr>
           <w:rFonts w:ascii="Verdana" w:hAnsi="Verdana"/>
@@ -4843,6 +5784,26 @@
           <w:sz w:val="24"/>
           <w:szCs w:val="24"/>
         </w:rPr>
+        <w:t>]</w:t>
+      </w:r>
+      <w:r>
+        <w:rPr>
+          <w:rFonts w:ascii="Verdana" w:hAnsi="Verdana"/>
+          <w:color w:val="000000"/>
+          <w:sz w:val="24"/>
+          <w:szCs w:val="24"/>
+        </w:rPr>
+        <w:t> of n integers, and an integer element </w:t>
+      </w:r>
+      <w:r>
+        <w:rPr>
+          <w:rFonts w:ascii="Verdana" w:hAnsi="Verdana"/>
+          <w:b/>
+          <w:bCs/>
+          <w:color w:val="000000"/>
+          <w:sz w:val="24"/>
+          <w:szCs w:val="24"/>
+        </w:rPr>
         <w:t>x</w:t>
       </w:r>
       <w:r>
@@ -4890,7 +5851,47 @@
           <w:sz w:val="24"/>
           <w:szCs w:val="24"/>
         </w:rPr>
-        <w:t xml:space="preserve"> ( Array in DSA part 2 : bubble sorting</w:t>
+        <w:t xml:space="preserve"> </w:t>
+      </w:r>
+      <w:proofErr w:type="gramStart"/>
+      <w:r>
+        <w:rPr>
+          <w:rFonts w:ascii="Verdana" w:hAnsi="Verdana"/>
+          <w:color w:val="000000"/>
+          <w:sz w:val="24"/>
+          <w:szCs w:val="24"/>
+        </w:rPr>
+        <w:t>( Array</w:t>
+      </w:r>
+      <w:proofErr w:type="gramEnd"/>
+      <w:r>
+        <w:rPr>
+          <w:rFonts w:ascii="Verdana" w:hAnsi="Verdana"/>
+          <w:color w:val="000000"/>
+          <w:sz w:val="24"/>
+          <w:szCs w:val="24"/>
+        </w:rPr>
+        <w:t xml:space="preserve"> in DSA part </w:t>
+      </w:r>
+      <w:proofErr w:type="gramStart"/>
+      <w:r>
+        <w:rPr>
+          <w:rFonts w:ascii="Verdana" w:hAnsi="Verdana"/>
+          <w:color w:val="000000"/>
+          <w:sz w:val="24"/>
+          <w:szCs w:val="24"/>
+        </w:rPr>
+        <w:t>2 :</w:t>
+      </w:r>
+      <w:proofErr w:type="gramEnd"/>
+      <w:r>
+        <w:rPr>
+          <w:rFonts w:ascii="Verdana" w:hAnsi="Verdana"/>
+          <w:color w:val="000000"/>
+          <w:sz w:val="24"/>
+          <w:szCs w:val="24"/>
+        </w:rPr>
+        <w:t xml:space="preserve"> bubble sorting</w:t>
       </w:r>
       <w:r>
         <w:rPr>
@@ -5047,8 +6048,9 @@
           <w:szCs w:val="27"/>
           <w14:ligatures w14:val="none"/>
         </w:rPr>
-        <w:t>Rotate Array Right by 1 (In-place)</w:t>
-      </w:r>
+        <w:t>Rotate Array Right by 1 (In-place</w:t>
+      </w:r>
+      <w:proofErr w:type="gramStart"/>
       <w:r>
         <w:rPr>
           <w:rFonts w:ascii="Mangal" w:eastAsia="Times New Roman" w:hAnsi="Mangal" w:cs="Mangal"/>
@@ -5059,8 +6061,21 @@
           <w:szCs w:val="27"/>
           <w14:ligatures w14:val="none"/>
         </w:rPr>
+        <w:t>)</w:t>
+      </w:r>
+      <w:r>
+        <w:rPr>
+          <w:rFonts w:ascii="Mangal" w:eastAsia="Times New Roman" w:hAnsi="Mangal" w:cs="Mangal"/>
+          <w:b/>
+          <w:bCs/>
+          <w:kern w:val="0"/>
+          <w:sz w:val="27"/>
+          <w:szCs w:val="27"/>
+          <w14:ligatures w14:val="none"/>
+        </w:rPr>
         <w:t>.(</w:t>
       </w:r>
+      <w:proofErr w:type="gramEnd"/>
       <w:r>
         <w:rPr>
           <w:rFonts w:ascii="Mangal" w:eastAsia="Times New Roman" w:hAnsi="Mangal" w:cs="Mangal"/>
@@ -5301,7 +6316,27 @@
           <w:sz w:val="24"/>
           <w:szCs w:val="24"/>
         </w:rPr>
-        <w:t>. Use split().</w:t>
+        <w:t xml:space="preserve">. Use </w:t>
+      </w:r>
+      <w:proofErr w:type="gramStart"/>
+      <w:r>
+        <w:rPr>
+          <w:rFonts w:ascii="Verdana" w:hAnsi="Verdana"/>
+          <w:color w:val="000000"/>
+          <w:sz w:val="24"/>
+          <w:szCs w:val="24"/>
+        </w:rPr>
+        <w:t>split(</w:t>
+      </w:r>
+      <w:proofErr w:type="gramEnd"/>
+      <w:r>
+        <w:rPr>
+          <w:rFonts w:ascii="Verdana" w:hAnsi="Verdana"/>
+          <w:color w:val="000000"/>
+          <w:sz w:val="24"/>
+          <w:szCs w:val="24"/>
+        </w:rPr>
+        <w:t>).</w:t>
       </w:r>
     </w:p>
     <w:p>
@@ -5343,25 +6378,87 @@
           <w:sz w:val="24"/>
           <w:szCs w:val="24"/>
         </w:rPr>
-        <w:t xml:space="preserve">. Use  </w:t>
-      </w:r>
-      <w:r>
-        <w:rPr>
-          <w:rFonts w:ascii="Verdana" w:hAnsi="Verdana"/>
-          <w:color w:val="000000"/>
-          <w:sz w:val="24"/>
-          <w:szCs w:val="24"/>
-        </w:rPr>
-        <w:t>toCharArray(), Arrays.sort()</w:t>
-      </w:r>
-      <w:r>
-        <w:rPr>
-          <w:rFonts w:ascii="Verdana" w:hAnsi="Verdana"/>
-          <w:color w:val="000000"/>
-          <w:sz w:val="24"/>
-          <w:szCs w:val="24"/>
-        </w:rPr>
-        <w:t>, Arrays.equal()</w:t>
+        <w:t xml:space="preserve">. </w:t>
+      </w:r>
+      <w:proofErr w:type="gramStart"/>
+      <w:r>
+        <w:rPr>
+          <w:rFonts w:ascii="Verdana" w:hAnsi="Verdana"/>
+          <w:color w:val="000000"/>
+          <w:sz w:val="24"/>
+          <w:szCs w:val="24"/>
+        </w:rPr>
+        <w:t xml:space="preserve">Use  </w:t>
+      </w:r>
+      <w:proofErr w:type="spellStart"/>
+      <w:r>
+        <w:rPr>
+          <w:rFonts w:ascii="Verdana" w:hAnsi="Verdana"/>
+          <w:color w:val="000000"/>
+          <w:sz w:val="24"/>
+          <w:szCs w:val="24"/>
+        </w:rPr>
+        <w:t>toCharArray</w:t>
+      </w:r>
+      <w:proofErr w:type="spellEnd"/>
+      <w:proofErr w:type="gramEnd"/>
+      <w:r>
+        <w:rPr>
+          <w:rFonts w:ascii="Verdana" w:hAnsi="Verdana"/>
+          <w:color w:val="000000"/>
+          <w:sz w:val="24"/>
+          <w:szCs w:val="24"/>
+        </w:rPr>
+        <w:t xml:space="preserve">(), </w:t>
+      </w:r>
+      <w:proofErr w:type="spellStart"/>
+      <w:r>
+        <w:rPr>
+          <w:rFonts w:ascii="Verdana" w:hAnsi="Verdana"/>
+          <w:color w:val="000000"/>
+          <w:sz w:val="24"/>
+          <w:szCs w:val="24"/>
+        </w:rPr>
+        <w:t>Arrays.sort</w:t>
+      </w:r>
+      <w:proofErr w:type="spellEnd"/>
+      <w:r>
+        <w:rPr>
+          <w:rFonts w:ascii="Verdana" w:hAnsi="Verdana"/>
+          <w:color w:val="000000"/>
+          <w:sz w:val="24"/>
+          <w:szCs w:val="24"/>
+        </w:rPr>
+        <w:t>()</w:t>
+      </w:r>
+      <w:r>
+        <w:rPr>
+          <w:rFonts w:ascii="Verdana" w:hAnsi="Verdana"/>
+          <w:color w:val="000000"/>
+          <w:sz w:val="24"/>
+          <w:szCs w:val="24"/>
+        </w:rPr>
+        <w:t xml:space="preserve">, </w:t>
+      </w:r>
+      <w:proofErr w:type="spellStart"/>
+      <w:r>
+        <w:rPr>
+          <w:rFonts w:ascii="Verdana" w:hAnsi="Verdana"/>
+          <w:color w:val="000000"/>
+          <w:sz w:val="24"/>
+          <w:szCs w:val="24"/>
+        </w:rPr>
+        <w:t>Arrays.equal</w:t>
+      </w:r>
+      <w:proofErr w:type="spellEnd"/>
+      <w:r>
+        <w:rPr>
+          <w:rFonts w:ascii="Verdana" w:hAnsi="Verdana"/>
+          <w:color w:val="000000"/>
+          <w:sz w:val="24"/>
+          <w:szCs w:val="24"/>
+        </w:rPr>
+        <w:t>()</w:t>
       </w:r>
       <w:r>
         <w:rPr>
@@ -5426,7 +6523,35 @@
           <w:color w:val="000000"/>
           <w:szCs w:val="24"/>
         </w:rPr>
-        <w:t>Input: "swiss"  Output: 'w'</w:t>
+        <w:t>Input: "</w:t>
+      </w:r>
+      <w:proofErr w:type="spellStart"/>
+      <w:r>
+        <w:rPr>
+          <w:rFonts w:ascii="Verdana" w:hAnsi="Verdana"/>
+          <w:color w:val="000000"/>
+          <w:szCs w:val="24"/>
+        </w:rPr>
+        <w:t>swiss</w:t>
+      </w:r>
+      <w:proofErr w:type="spellEnd"/>
+      <w:proofErr w:type="gramStart"/>
+      <w:r>
+        <w:rPr>
+          <w:rFonts w:ascii="Verdana" w:hAnsi="Verdana"/>
+          <w:color w:val="000000"/>
+          <w:szCs w:val="24"/>
+        </w:rPr>
+        <w:t>"  Output</w:t>
+      </w:r>
+      <w:proofErr w:type="gramEnd"/>
+      <w:r>
+        <w:rPr>
+          <w:rFonts w:ascii="Verdana" w:hAnsi="Verdana"/>
+          <w:color w:val="000000"/>
+          <w:szCs w:val="24"/>
+        </w:rPr>
+        <w:t>: 'w'</w:t>
       </w:r>
       <w:r>
         <w:rPr>
@@ -5568,7 +6693,27 @@
           <w:sz w:val="24"/>
           <w:szCs w:val="24"/>
         </w:rPr>
-        <w:t>0(Array and Arraylist)</w:t>
+        <w:t xml:space="preserve">0(Array and </w:t>
+      </w:r>
+      <w:proofErr w:type="spellStart"/>
+      <w:r>
+        <w:rPr>
+          <w:rFonts w:ascii="Verdana" w:hAnsi="Verdana"/>
+          <w:color w:val="000000"/>
+          <w:sz w:val="24"/>
+          <w:szCs w:val="24"/>
+        </w:rPr>
+        <w:t>Arraylist</w:t>
+      </w:r>
+      <w:proofErr w:type="spellEnd"/>
+      <w:r>
+        <w:rPr>
+          <w:rFonts w:ascii="Verdana" w:hAnsi="Verdana"/>
+          <w:color w:val="000000"/>
+          <w:sz w:val="24"/>
+          <w:szCs w:val="24"/>
+        </w:rPr>
+        <w:t>)</w:t>
       </w:r>
     </w:p>
     <w:p>
@@ -6133,8 +7278,36 @@
           <w:sz w:val="28"/>
           <w:szCs w:val="22"/>
         </w:rPr>
-        <w:t xml:space="preserve"> ( Array in Java Lab – 5 )</w:t>
-      </w:r>
+        <w:t xml:space="preserve"> </w:t>
+      </w:r>
+      <w:proofErr w:type="gramStart"/>
+      <w:r>
+        <w:rPr>
+          <w:rFonts w:ascii="Times New Roman" w:hAnsi="Times New Roman" w:cs="Times New Roman"/>
+          <w:sz w:val="28"/>
+          <w:szCs w:val="22"/>
+        </w:rPr>
+        <w:t>( Array</w:t>
+      </w:r>
+      <w:proofErr w:type="gramEnd"/>
+      <w:r>
+        <w:rPr>
+          <w:rFonts w:ascii="Times New Roman" w:hAnsi="Times New Roman" w:cs="Times New Roman"/>
+          <w:sz w:val="28"/>
+          <w:szCs w:val="22"/>
+        </w:rPr>
+        <w:t xml:space="preserve"> in Java Lab – </w:t>
+      </w:r>
+      <w:proofErr w:type="gramStart"/>
+      <w:r>
+        <w:rPr>
+          <w:rFonts w:ascii="Times New Roman" w:hAnsi="Times New Roman" w:cs="Times New Roman"/>
+          <w:sz w:val="28"/>
+          <w:szCs w:val="22"/>
+        </w:rPr>
+        <w:t>5 )</w:t>
+      </w:r>
+      <w:proofErr w:type="gramEnd"/>
     </w:p>
     <w:p>
       <w:pPr>
@@ -6452,7 +7625,29 @@
           <w:szCs w:val="20"/>
           <w14:ligatures w14:val="none"/>
         </w:rPr>
-        <w:t>Input: "HeLLoWorLD"</w:t>
+        <w:t>Input: "</w:t>
+      </w:r>
+      <w:proofErr w:type="spellStart"/>
+      <w:r>
+        <w:rPr>
+          <w:rFonts w:ascii="Mangal" w:eastAsia="Times New Roman" w:hAnsi="Mangal" w:cs="Mangal"/>
+          <w:kern w:val="0"/>
+          <w:sz w:val="20"/>
+          <w:szCs w:val="20"/>
+          <w14:ligatures w14:val="none"/>
+        </w:rPr>
+        <w:t>HeLLoWorLD</w:t>
+      </w:r>
+      <w:proofErr w:type="spellEnd"/>
+      <w:r>
+        <w:rPr>
+          <w:rFonts w:ascii="Mangal" w:eastAsia="Times New Roman" w:hAnsi="Mangal" w:cs="Mangal"/>
+          <w:kern w:val="0"/>
+          <w:sz w:val="20"/>
+          <w:szCs w:val="20"/>
+          <w14:ligatures w14:val="none"/>
+        </w:rPr>
+        <w:t>"</w:t>
       </w:r>
       <w:r>
         <w:rPr>
@@ -6463,8 +7658,42 @@
           <w14:ligatures w14:val="none"/>
         </w:rPr>
         <w:br/>
-        <w:t>Output: Upper = ?, Lower = ?</w:t>
-      </w:r>
+        <w:t xml:space="preserve">Output: Upper </w:t>
+      </w:r>
+      <w:proofErr w:type="gramStart"/>
+      <w:r>
+        <w:rPr>
+          <w:rFonts w:ascii="Mangal" w:eastAsia="Times New Roman" w:hAnsi="Mangal" w:cs="Mangal"/>
+          <w:kern w:val="0"/>
+          <w:sz w:val="20"/>
+          <w:szCs w:val="20"/>
+          <w14:ligatures w14:val="none"/>
+        </w:rPr>
+        <w:t>= ?</w:t>
+      </w:r>
+      <w:proofErr w:type="gramEnd"/>
+      <w:r>
+        <w:rPr>
+          <w:rFonts w:ascii="Mangal" w:eastAsia="Times New Roman" w:hAnsi="Mangal" w:cs="Mangal"/>
+          <w:kern w:val="0"/>
+          <w:sz w:val="20"/>
+          <w:szCs w:val="20"/>
+          <w14:ligatures w14:val="none"/>
+        </w:rPr>
+        <w:t xml:space="preserve">, Lower </w:t>
+      </w:r>
+      <w:proofErr w:type="gramStart"/>
+      <w:r>
+        <w:rPr>
+          <w:rFonts w:ascii="Mangal" w:eastAsia="Times New Roman" w:hAnsi="Mangal" w:cs="Mangal"/>
+          <w:kern w:val="0"/>
+          <w:sz w:val="20"/>
+          <w:szCs w:val="20"/>
+          <w14:ligatures w14:val="none"/>
+        </w:rPr>
+        <w:t>= ?</w:t>
+      </w:r>
+      <w:proofErr w:type="gramEnd"/>
     </w:p>
     <w:p>
       <w:pPr>
@@ -6530,7 +7759,29 @@
           <w14:ligatures w14:val="none"/>
         </w:rPr>
         <w:br/>
-        <w:t>Output: "IloveJava"</w:t>
+        <w:t>Output: "</w:t>
+      </w:r>
+      <w:proofErr w:type="spellStart"/>
+      <w:r>
+        <w:rPr>
+          <w:rFonts w:ascii="Mangal" w:eastAsia="Times New Roman" w:hAnsi="Mangal" w:cs="Mangal"/>
+          <w:kern w:val="0"/>
+          <w:sz w:val="20"/>
+          <w:szCs w:val="20"/>
+          <w14:ligatures w14:val="none"/>
+        </w:rPr>
+        <w:t>IloveJava</w:t>
+      </w:r>
+      <w:proofErr w:type="spellEnd"/>
+      <w:r>
+        <w:rPr>
+          <w:rFonts w:ascii="Mangal" w:eastAsia="Times New Roman" w:hAnsi="Mangal" w:cs="Mangal"/>
+          <w:kern w:val="0"/>
+          <w:sz w:val="20"/>
+          <w:szCs w:val="20"/>
+          <w14:ligatures w14:val="none"/>
+        </w:rPr>
+        <w:t>"</w:t>
       </w:r>
     </w:p>
     <w:p>
@@ -6763,7 +8014,27 @@
           <w:sz w:val="24"/>
           <w:szCs w:val="24"/>
         </w:rPr>
-        <w:t>Given an array, write a java program to right rotate it by k elements, let elements be 1,2,3,4,5,6,7,8,9,10. If k = 3, after right rotation it becomes 8, 9, 10, 1 , 2, 3, 4, 5, 6, 7.</w:t>
+        <w:t xml:space="preserve">Given an array, write a java program to right rotate it by k elements, let elements be 1,2,3,4,5,6,7,8,9,10. If k = 3, after right rotation it becomes 8, 9, 10, </w:t>
+      </w:r>
+      <w:proofErr w:type="gramStart"/>
+      <w:r>
+        <w:rPr>
+          <w:rFonts w:ascii="Verdana" w:hAnsi="Verdana"/>
+          <w:color w:val="000000"/>
+          <w:sz w:val="24"/>
+          <w:szCs w:val="24"/>
+        </w:rPr>
+        <w:t>1 ,</w:t>
+      </w:r>
+      <w:proofErr w:type="gramEnd"/>
+      <w:r>
+        <w:rPr>
+          <w:rFonts w:ascii="Verdana" w:hAnsi="Verdana"/>
+          <w:color w:val="000000"/>
+          <w:sz w:val="24"/>
+          <w:szCs w:val="24"/>
+        </w:rPr>
+        <w:t xml:space="preserve"> 2, 3, 4, 5, 6, 7.</w:t>
       </w:r>
     </w:p>
     <w:p>
@@ -6980,17 +8251,39 @@
           <w:szCs w:val="20"/>
           <w14:ligatures w14:val="none"/>
         </w:rPr>
-        <w:t>Find average</w:t>
-      </w:r>
-      <w:r>
-        <w:rPr>
-          <w:rFonts w:ascii="Mangal" w:eastAsia="Times New Roman" w:hAnsi="Mangal" w:cs="Mangal"/>
-          <w:kern w:val="0"/>
-          <w:sz w:val="20"/>
-          <w:szCs w:val="20"/>
-          <w14:ligatures w14:val="none"/>
-        </w:rPr>
-        <w:t xml:space="preserve"> , </w:t>
+        <w:t xml:space="preserve">Find </w:t>
+      </w:r>
+      <w:proofErr w:type="gramStart"/>
+      <w:r>
+        <w:rPr>
+          <w:rFonts w:ascii="Mangal" w:eastAsia="Times New Roman" w:hAnsi="Mangal" w:cs="Mangal"/>
+          <w:kern w:val="0"/>
+          <w:sz w:val="20"/>
+          <w:szCs w:val="20"/>
+          <w14:ligatures w14:val="none"/>
+        </w:rPr>
+        <w:t>average</w:t>
+      </w:r>
+      <w:r>
+        <w:rPr>
+          <w:rFonts w:ascii="Mangal" w:eastAsia="Times New Roman" w:hAnsi="Mangal" w:cs="Mangal"/>
+          <w:kern w:val="0"/>
+          <w:sz w:val="20"/>
+          <w:szCs w:val="20"/>
+          <w14:ligatures w14:val="none"/>
+        </w:rPr>
+        <w:t xml:space="preserve"> ,</w:t>
+      </w:r>
+      <w:proofErr w:type="gramEnd"/>
+      <w:r>
+        <w:rPr>
+          <w:rFonts w:ascii="Mangal" w:eastAsia="Times New Roman" w:hAnsi="Mangal" w:cs="Mangal"/>
+          <w:kern w:val="0"/>
+          <w:sz w:val="20"/>
+          <w:szCs w:val="20"/>
+          <w14:ligatures w14:val="none"/>
+        </w:rPr>
+        <w:t xml:space="preserve"> </w:t>
       </w:r>
       <w:r>
         <w:rPr>
@@ -7053,7 +8346,29 @@
           <w:szCs w:val="20"/>
           <w14:ligatures w14:val="none"/>
         </w:rPr>
-        <w:t>Input: "JaVa"</w:t>
+        <w:t>Input: "</w:t>
+      </w:r>
+      <w:proofErr w:type="spellStart"/>
+      <w:r>
+        <w:rPr>
+          <w:rFonts w:ascii="Mangal" w:eastAsia="Times New Roman" w:hAnsi="Mangal" w:cs="Mangal"/>
+          <w:kern w:val="0"/>
+          <w:sz w:val="20"/>
+          <w:szCs w:val="20"/>
+          <w14:ligatures w14:val="none"/>
+        </w:rPr>
+        <w:t>JaVa</w:t>
+      </w:r>
+      <w:proofErr w:type="spellEnd"/>
+      <w:r>
+        <w:rPr>
+          <w:rFonts w:ascii="Mangal" w:eastAsia="Times New Roman" w:hAnsi="Mangal" w:cs="Mangal"/>
+          <w:kern w:val="0"/>
+          <w:sz w:val="20"/>
+          <w:szCs w:val="20"/>
+          <w14:ligatures w14:val="none"/>
+        </w:rPr>
+        <w:t>"</w:t>
       </w:r>
       <w:r>
         <w:rPr>
@@ -7064,7 +8379,29 @@
           <w14:ligatures w14:val="none"/>
         </w:rPr>
         <w:br/>
-        <w:t>Output: "jAvA"</w:t>
+        <w:t>Output: "</w:t>
+      </w:r>
+      <w:proofErr w:type="spellStart"/>
+      <w:r>
+        <w:rPr>
+          <w:rFonts w:ascii="Mangal" w:eastAsia="Times New Roman" w:hAnsi="Mangal" w:cs="Mangal"/>
+          <w:kern w:val="0"/>
+          <w:sz w:val="20"/>
+          <w:szCs w:val="20"/>
+          <w14:ligatures w14:val="none"/>
+        </w:rPr>
+        <w:t>jAvA</w:t>
+      </w:r>
+      <w:proofErr w:type="spellEnd"/>
+      <w:r>
+        <w:rPr>
+          <w:rFonts w:ascii="Mangal" w:eastAsia="Times New Roman" w:hAnsi="Mangal" w:cs="Mangal"/>
+          <w:kern w:val="0"/>
+          <w:sz w:val="20"/>
+          <w:szCs w:val="20"/>
+          <w14:ligatures w14:val="none"/>
+        </w:rPr>
+        <w:t>"</w:t>
       </w:r>
     </w:p>
     <w:p>
@@ -7099,15 +8436,38 @@
         </w:rPr>
         <w:t xml:space="preserve">  </w:t>
       </w:r>
-      <w:r>
-        <w:rPr>
-          <w:rFonts w:ascii="Mangal" w:eastAsia="Times New Roman" w:hAnsi="Mangal" w:cs="Mangal"/>
-          <w:kern w:val="0"/>
-          <w:sz w:val="20"/>
-          <w:szCs w:val="20"/>
-          <w14:ligatures w14:val="none"/>
-        </w:rPr>
-        <w:t>Character.isUpperCase()</w:t>
+      <w:proofErr w:type="spellStart"/>
+      <w:r>
+        <w:rPr>
+          <w:rFonts w:ascii="Mangal" w:eastAsia="Times New Roman" w:hAnsi="Mangal" w:cs="Mangal"/>
+          <w:kern w:val="0"/>
+          <w:sz w:val="20"/>
+          <w:szCs w:val="20"/>
+          <w14:ligatures w14:val="none"/>
+        </w:rPr>
+        <w:t>Character.isUpperCase</w:t>
+      </w:r>
+      <w:proofErr w:type="spellEnd"/>
+      <w:r>
+        <w:rPr>
+          <w:rFonts w:ascii="Mangal" w:eastAsia="Times New Roman" w:hAnsi="Mangal" w:cs="Mangal"/>
+          <w:kern w:val="0"/>
+          <w:sz w:val="20"/>
+          <w:szCs w:val="20"/>
+          <w14:ligatures w14:val="none"/>
+        </w:rPr>
+        <w:t>(</w:t>
+      </w:r>
+      <w:proofErr w:type="gramStart"/>
+      <w:r>
+        <w:rPr>
+          <w:rFonts w:ascii="Mangal" w:eastAsia="Times New Roman" w:hAnsi="Mangal" w:cs="Mangal"/>
+          <w:kern w:val="0"/>
+          <w:sz w:val="20"/>
+          <w:szCs w:val="20"/>
+          <w14:ligatures w14:val="none"/>
+        </w:rPr>
+        <w:t>)</w:t>
       </w:r>
       <w:r>
         <w:rPr>
@@ -7119,15 +8479,39 @@
         </w:rPr>
         <w:t xml:space="preserve">,  </w:t>
       </w:r>
-      <w:r>
-        <w:rPr>
-          <w:rFonts w:ascii="Mangal" w:eastAsia="Times New Roman" w:hAnsi="Mangal" w:cs="Mangal"/>
-          <w:kern w:val="0"/>
-          <w:sz w:val="20"/>
-          <w:szCs w:val="20"/>
-          <w14:ligatures w14:val="none"/>
-        </w:rPr>
-        <w:t>toLowerCase(),</w:t>
+      <w:proofErr w:type="spellStart"/>
+      <w:r>
+        <w:rPr>
+          <w:rFonts w:ascii="Mangal" w:eastAsia="Times New Roman" w:hAnsi="Mangal" w:cs="Mangal"/>
+          <w:kern w:val="0"/>
+          <w:sz w:val="20"/>
+          <w:szCs w:val="20"/>
+          <w14:ligatures w14:val="none"/>
+        </w:rPr>
+        <w:t>toLowerCase</w:t>
+      </w:r>
+      <w:proofErr w:type="spellEnd"/>
+      <w:proofErr w:type="gramEnd"/>
+      <w:r>
+        <w:rPr>
+          <w:rFonts w:ascii="Mangal" w:eastAsia="Times New Roman" w:hAnsi="Mangal" w:cs="Mangal"/>
+          <w:kern w:val="0"/>
+          <w:sz w:val="20"/>
+          <w:szCs w:val="20"/>
+          <w14:ligatures w14:val="none"/>
+        </w:rPr>
+        <w:t>(</w:t>
+      </w:r>
+      <w:proofErr w:type="gramStart"/>
+      <w:r>
+        <w:rPr>
+          <w:rFonts w:ascii="Mangal" w:eastAsia="Times New Roman" w:hAnsi="Mangal" w:cs="Mangal"/>
+          <w:kern w:val="0"/>
+          <w:sz w:val="20"/>
+          <w:szCs w:val="20"/>
+          <w14:ligatures w14:val="none"/>
+        </w:rPr>
+        <w:t>),</w:t>
       </w:r>
       <w:r>
         <w:rPr>
@@ -7147,7 +8531,30 @@
           <w:szCs w:val="20"/>
           <w14:ligatures w14:val="none"/>
         </w:rPr>
-        <w:t xml:space="preserve"> toUpperCase()</w:t>
+        <w:t xml:space="preserve"> </w:t>
+      </w:r>
+      <w:proofErr w:type="spellStart"/>
+      <w:r>
+        <w:rPr>
+          <w:rFonts w:ascii="Mangal" w:eastAsia="Times New Roman" w:hAnsi="Mangal" w:cs="Mangal"/>
+          <w:kern w:val="0"/>
+          <w:sz w:val="20"/>
+          <w:szCs w:val="20"/>
+          <w14:ligatures w14:val="none"/>
+        </w:rPr>
+        <w:t>toUpperCase</w:t>
+      </w:r>
+      <w:proofErr w:type="spellEnd"/>
+      <w:proofErr w:type="gramEnd"/>
+      <w:r>
+        <w:rPr>
+          <w:rFonts w:ascii="Mangal" w:eastAsia="Times New Roman" w:hAnsi="Mangal" w:cs="Mangal"/>
+          <w:kern w:val="0"/>
+          <w:sz w:val="20"/>
+          <w:szCs w:val="20"/>
+          <w14:ligatures w14:val="none"/>
+        </w:rPr>
+        <w:t>()</w:t>
       </w:r>
     </w:p>
     <w:p>
@@ -7232,6 +8639,7 @@
         </w:rPr>
         <w:t xml:space="preserve"> = </w:t>
       </w:r>
+      <w:proofErr w:type="gramStart"/>
       <w:r>
         <w:rPr>
           <w:rStyle w:val="hljs-number"/>
@@ -7253,6 +8661,7 @@
         </w:rPr>
         <w:t>a</w:t>
       </w:r>
+      <w:proofErr w:type="gramEnd"/>
       <w:r>
         <w:rPr>
           <w:rStyle w:val="HTMLCode"/>
@@ -7260,6 +8669,7 @@
         </w:rPr>
         <w:t xml:space="preserve"> = </w:t>
       </w:r>
+      <w:proofErr w:type="gramStart"/>
       <w:r>
         <w:rPr>
           <w:rStyle w:val="hljs-number"/>
@@ -7281,6 +8691,7 @@
         </w:rPr>
         <w:t>n</w:t>
       </w:r>
+      <w:proofErr w:type="gramEnd"/>
       <w:r>
         <w:rPr>
           <w:rStyle w:val="HTMLCode"/>
@@ -7307,12 +8718,21 @@
       <w:r>
         <w:t xml:space="preserve">You can use:  Nested loops (manual) Or </w:t>
       </w:r>
+      <w:proofErr w:type="gramStart"/>
       <w:r>
         <w:rPr>
           <w:rStyle w:val="HTMLCode"/>
           <w:rFonts w:eastAsiaTheme="majorEastAsia"/>
         </w:rPr>
-        <w:t>int[256]</w:t>
+        <w:t>int[</w:t>
+      </w:r>
+      <w:proofErr w:type="gramEnd"/>
+      <w:r>
+        <w:rPr>
+          <w:rStyle w:val="HTMLCode"/>
+          <w:rFonts w:eastAsiaTheme="majorEastAsia"/>
+        </w:rPr>
+        <w:t>256]</w:t>
       </w:r>
       <w:r>
         <w:t xml:space="preserve"> frequency array (smart)</w:t>
@@ -7751,7 +9171,31 @@
         </w:rPr>
       </w:pPr>
       <w:r>
-        <w:t>Write a class Circle containing private variable radius of type float, suitable constructors, and two methods findArea and findCircumference to find area and circumference of circles respectively. Write a separate class MyCircle containing main method to create and use circle objects.</w:t>
+        <w:t xml:space="preserve">Write a class Circle containing private variable radius of type float, suitable constructors, and two methods </w:t>
+      </w:r>
+      <w:proofErr w:type="spellStart"/>
+      <w:r>
+        <w:t>findArea</w:t>
+      </w:r>
+      <w:proofErr w:type="spellEnd"/>
+      <w:r>
+        <w:t xml:space="preserve"> and </w:t>
+      </w:r>
+      <w:proofErr w:type="spellStart"/>
+      <w:r>
+        <w:t>findCircumference</w:t>
+      </w:r>
+      <w:proofErr w:type="spellEnd"/>
+      <w:r>
+        <w:t xml:space="preserve"> to find area and circumference of circles respectively. Write a separate class </w:t>
+      </w:r>
+      <w:proofErr w:type="spellStart"/>
+      <w:r>
+        <w:t>MyCircle</w:t>
+      </w:r>
+      <w:proofErr w:type="spellEnd"/>
+      <w:r>
+        <w:t xml:space="preserve"> containing main method to create and use circle objects.</w:t>
       </w:r>
     </w:p>
     <w:p>
@@ -7769,7 +9213,15 @@
         </w:rPr>
       </w:pPr>
       <w:r>
-        <w:t>Write a Java program to create a class student having property name, address and roll. Set default and user defined value of these property using constructors and then display values of these property.</w:t>
+        <w:t xml:space="preserve">Write a Java program to create a class student having property name, address and roll. Set default and user defined value of these property using constructors and then display values of </w:t>
+      </w:r>
+      <w:proofErr w:type="gramStart"/>
+      <w:r>
+        <w:t>these property</w:t>
+      </w:r>
+      <w:proofErr w:type="gramEnd"/>
+      <w:r>
+        <w:t>.</w:t>
       </w:r>
     </w:p>
     <w:p>
@@ -7781,7 +9233,15 @@
         </w:numPr>
       </w:pPr>
       <w:r>
-        <w:t>Write a class Box with private variables width, height and depth and methods to find volume and surface area. Use suitable constructors. Implement the class to find volume and surface area of two boxes.</w:t>
+        <w:t xml:space="preserve">Write a class </w:t>
+      </w:r>
+      <w:proofErr w:type="gramStart"/>
+      <w:r>
+        <w:t>Box</w:t>
+      </w:r>
+      <w:proofErr w:type="gramEnd"/>
+      <w:r>
+        <w:t xml:space="preserve"> with private variables width, height and depth and methods to find volume and surface area. Use suitable constructors. Implement the class to find volume and surface area of two boxes.</w:t>
       </w:r>
     </w:p>
     <w:p>
@@ -7799,7 +9259,31 @@
         </w:rPr>
       </w:pPr>
       <w:r>
-        <w:t>Write a class Distance containing private variables feet of type int and inches of type int, suitable constructors, and two methods addDistance and displayDistance for adding and displaying distance objects. Write a separate class MyDistance containing main method to create and use distance objects.</w:t>
+        <w:t xml:space="preserve">Write a class Distance containing private variables feet of type int and inches of type int, suitable constructors, and two methods </w:t>
+      </w:r>
+      <w:proofErr w:type="spellStart"/>
+      <w:r>
+        <w:t>addDistance</w:t>
+      </w:r>
+      <w:proofErr w:type="spellEnd"/>
+      <w:r>
+        <w:t xml:space="preserve"> and </w:t>
+      </w:r>
+      <w:proofErr w:type="spellStart"/>
+      <w:r>
+        <w:t>displayDistance</w:t>
+      </w:r>
+      <w:proofErr w:type="spellEnd"/>
+      <w:r>
+        <w:t xml:space="preserve"> for adding and displaying distance objects. Write a separate class </w:t>
+      </w:r>
+      <w:proofErr w:type="spellStart"/>
+      <w:r>
+        <w:t>MyDistance</w:t>
+      </w:r>
+      <w:proofErr w:type="spellEnd"/>
+      <w:r>
+        <w:t xml:space="preserve"> containing main method to create and use distance objects.</w:t>
       </w:r>
     </w:p>
     <w:p>
@@ -7817,7 +9301,23 @@
         </w:rPr>
       </w:pPr>
       <w:r>
-        <w:t>Create a Java class Time with three attributes hours, minutes, and seconds. Use appropriate constructors to initialize instance variables. Use methods to display time in HH:MM:SS format, add and subtract two time objects. Implement the class to add, subtract and display time objects.</w:t>
+        <w:t>Create a Java class Time with three attributes hours, minutes, and seconds. Use appropriate constructors to initialize instance variables. Use methods to display time in HH:</w:t>
+      </w:r>
+      <w:proofErr w:type="gramStart"/>
+      <w:r>
+        <w:t>MM:SS</w:t>
+      </w:r>
+      <w:proofErr w:type="gramEnd"/>
+      <w:r>
+        <w:t xml:space="preserve"> format, add and subtract </w:t>
+      </w:r>
+      <w:proofErr w:type="gramStart"/>
+      <w:r>
+        <w:t>two time</w:t>
+      </w:r>
+      <w:proofErr w:type="gramEnd"/>
+      <w:r>
+        <w:t xml:space="preserve"> objects. Implement the class to add, subtract and display time objects.</w:t>
       </w:r>
     </w:p>
     <w:p>
@@ -7863,7 +9363,29 @@
           <w:color w:val="000000"/>
           <w:szCs w:val="24"/>
         </w:rPr>
-        <w:t>Find Pair With Given Sum</w:t>
+        <w:t xml:space="preserve">Find Pair </w:t>
+      </w:r>
+      <w:proofErr w:type="gramStart"/>
+      <w:r>
+        <w:rPr>
+          <w:rFonts w:ascii="Verdana" w:hAnsi="Verdana"/>
+          <w:b/>
+          <w:bCs/>
+          <w:color w:val="000000"/>
+          <w:szCs w:val="24"/>
+        </w:rPr>
+        <w:t>With</w:t>
+      </w:r>
+      <w:proofErr w:type="gramEnd"/>
+      <w:r>
+        <w:rPr>
+          <w:rFonts w:ascii="Verdana" w:hAnsi="Verdana"/>
+          <w:b/>
+          <w:bCs/>
+          <w:color w:val="000000"/>
+          <w:szCs w:val="24"/>
+        </w:rPr>
+        <w:t xml:space="preserve"> Given Sum</w:t>
       </w:r>
     </w:p>
     <w:p>
@@ -7910,7 +9432,16 @@
           <w:color w:val="000000"/>
           <w:szCs w:val="24"/>
         </w:rPr>
-        <w:t>Use nested loop (basic)</w:t>
+        <w:t>Use nested loop (</w:t>
+      </w:r>
+      <w:proofErr w:type="gramStart"/>
+      <w:r>
+        <w:rPr>
+          <w:rFonts w:ascii="Verdana" w:hAnsi="Verdana"/>
+          <w:color w:val="000000"/>
+          <w:szCs w:val="24"/>
+        </w:rPr>
+        <w:t>basic)</w:t>
       </w:r>
       <w:r>
         <w:rPr>
@@ -7920,6 +9451,7 @@
         </w:rPr>
         <w:t xml:space="preserve">   </w:t>
       </w:r>
+      <w:proofErr w:type="gramEnd"/>
       <w:r>
         <w:rPr>
           <w:rFonts w:ascii="Verdana" w:hAnsi="Verdana"/>
@@ -8019,7 +9551,18 @@
           <w14:ligatures w14:val="none"/>
         </w:rPr>
         <w:br/>
-        <w:t>Output: {2,2}</w:t>
+        <w:t>Output: {2,2</w:t>
+      </w:r>
+      <w:proofErr w:type="gramStart"/>
+      <w:r>
+        <w:rPr>
+          <w:rFonts w:ascii="Mangal" w:eastAsia="Times New Roman" w:hAnsi="Mangal" w:cs="Mangal"/>
+          <w:kern w:val="0"/>
+          <w:sz w:val="20"/>
+          <w:szCs w:val="20"/>
+          <w14:ligatures w14:val="none"/>
+        </w:rPr>
+        <w:t>}</w:t>
       </w:r>
       <w:r>
         <w:rPr>
@@ -8039,7 +9582,18 @@
           <w:szCs w:val="20"/>
           <w14:ligatures w14:val="none"/>
         </w:rPr>
-        <w:t>Don’t create a new array if possible.</w:t>
+        <w:t>Don’t</w:t>
+      </w:r>
+      <w:proofErr w:type="gramEnd"/>
+      <w:r>
+        <w:rPr>
+          <w:rFonts w:ascii="Mangal" w:eastAsia="Times New Roman" w:hAnsi="Mangal" w:cs="Mangal"/>
+          <w:kern w:val="0"/>
+          <w:sz w:val="20"/>
+          <w:szCs w:val="20"/>
+          <w14:ligatures w14:val="none"/>
+        </w:rPr>
+        <w:t xml:space="preserve"> create a new array if possible.</w:t>
       </w:r>
     </w:p>
     <w:p>
@@ -8128,7 +9682,29 @@
           <w:szCs w:val="20"/>
           <w14:ligatures w14:val="none"/>
         </w:rPr>
-        <w:t>Input: "aaabbccccd"</w:t>
+        <w:t>Input: "</w:t>
+      </w:r>
+      <w:proofErr w:type="spellStart"/>
+      <w:r>
+        <w:rPr>
+          <w:rFonts w:ascii="Mangal" w:eastAsia="Times New Roman" w:hAnsi="Mangal" w:cs="Mangal"/>
+          <w:kern w:val="0"/>
+          <w:sz w:val="20"/>
+          <w:szCs w:val="20"/>
+          <w14:ligatures w14:val="none"/>
+        </w:rPr>
+        <w:t>aaabbccccd</w:t>
+      </w:r>
+      <w:proofErr w:type="spellEnd"/>
+      <w:r>
+        <w:rPr>
+          <w:rFonts w:ascii="Mangal" w:eastAsia="Times New Roman" w:hAnsi="Mangal" w:cs="Mangal"/>
+          <w:kern w:val="0"/>
+          <w:sz w:val="20"/>
+          <w:szCs w:val="20"/>
+          <w14:ligatures w14:val="none"/>
+        </w:rPr>
+        <w:t>"</w:t>
       </w:r>
       <w:r>
         <w:rPr>
@@ -8139,7 +9715,29 @@
           <w14:ligatures w14:val="none"/>
         </w:rPr>
         <w:br/>
-        <w:t>Output: 4 (because of "cccc")</w:t>
+        <w:t>Output: 4 (because of "</w:t>
+      </w:r>
+      <w:proofErr w:type="spellStart"/>
+      <w:r>
+        <w:rPr>
+          <w:rFonts w:ascii="Mangal" w:eastAsia="Times New Roman" w:hAnsi="Mangal" w:cs="Mangal"/>
+          <w:kern w:val="0"/>
+          <w:sz w:val="20"/>
+          <w:szCs w:val="20"/>
+          <w14:ligatures w14:val="none"/>
+        </w:rPr>
+        <w:t>cccc</w:t>
+      </w:r>
+      <w:proofErr w:type="spellEnd"/>
+      <w:r>
+        <w:rPr>
+          <w:rFonts w:ascii="Mangal" w:eastAsia="Times New Roman" w:hAnsi="Mangal" w:cs="Mangal"/>
+          <w:kern w:val="0"/>
+          <w:sz w:val="20"/>
+          <w:szCs w:val="20"/>
+          <w14:ligatures w14:val="none"/>
+        </w:rPr>
+        <w:t>")</w:t>
       </w:r>
     </w:p>
     <w:p>
@@ -8222,7 +9820,51 @@
           <w:szCs w:val="20"/>
           <w14:ligatures w14:val="none"/>
         </w:rPr>
-        <w:t xml:space="preserve">Input: "abcd", "cdab" </w:t>
+        <w:t>Input: "</w:t>
+      </w:r>
+      <w:proofErr w:type="spellStart"/>
+      <w:r>
+        <w:rPr>
+          <w:rFonts w:ascii="Mangal" w:eastAsia="Times New Roman" w:hAnsi="Mangal" w:cs="Mangal"/>
+          <w:kern w:val="0"/>
+          <w:sz w:val="20"/>
+          <w:szCs w:val="20"/>
+          <w14:ligatures w14:val="none"/>
+        </w:rPr>
+        <w:t>abcd</w:t>
+      </w:r>
+      <w:proofErr w:type="spellEnd"/>
+      <w:r>
+        <w:rPr>
+          <w:rFonts w:ascii="Mangal" w:eastAsia="Times New Roman" w:hAnsi="Mangal" w:cs="Mangal"/>
+          <w:kern w:val="0"/>
+          <w:sz w:val="20"/>
+          <w:szCs w:val="20"/>
+          <w14:ligatures w14:val="none"/>
+        </w:rPr>
+        <w:t>", "</w:t>
+      </w:r>
+      <w:proofErr w:type="spellStart"/>
+      <w:r>
+        <w:rPr>
+          <w:rFonts w:ascii="Mangal" w:eastAsia="Times New Roman" w:hAnsi="Mangal" w:cs="Mangal"/>
+          <w:kern w:val="0"/>
+          <w:sz w:val="20"/>
+          <w:szCs w:val="20"/>
+          <w14:ligatures w14:val="none"/>
+        </w:rPr>
+        <w:t>cdab</w:t>
+      </w:r>
+      <w:proofErr w:type="spellEnd"/>
+      <w:r>
+        <w:rPr>
+          <w:rFonts w:ascii="Mangal" w:eastAsia="Times New Roman" w:hAnsi="Mangal" w:cs="Mangal"/>
+          <w:kern w:val="0"/>
+          <w:sz w:val="20"/>
+          <w:szCs w:val="20"/>
+          <w14:ligatures w14:val="none"/>
+        </w:rPr>
+        <w:t xml:space="preserve">" </w:t>
       </w:r>
       <w:r>
         <w:rPr>
@@ -8253,7 +9895,51 @@
           <w14:ligatures w14:val="none"/>
         </w:rPr>
         <w:br/>
-        <w:t xml:space="preserve">Input: "abcd", "acbd" </w:t>
+        <w:t>Input: "</w:t>
+      </w:r>
+      <w:proofErr w:type="spellStart"/>
+      <w:r>
+        <w:rPr>
+          <w:rFonts w:ascii="Mangal" w:eastAsia="Times New Roman" w:hAnsi="Mangal" w:cs="Mangal"/>
+          <w:kern w:val="0"/>
+          <w:sz w:val="20"/>
+          <w:szCs w:val="20"/>
+          <w14:ligatures w14:val="none"/>
+        </w:rPr>
+        <w:t>abcd</w:t>
+      </w:r>
+      <w:proofErr w:type="spellEnd"/>
+      <w:r>
+        <w:rPr>
+          <w:rFonts w:ascii="Mangal" w:eastAsia="Times New Roman" w:hAnsi="Mangal" w:cs="Mangal"/>
+          <w:kern w:val="0"/>
+          <w:sz w:val="20"/>
+          <w:szCs w:val="20"/>
+          <w14:ligatures w14:val="none"/>
+        </w:rPr>
+        <w:t>", "</w:t>
+      </w:r>
+      <w:proofErr w:type="spellStart"/>
+      <w:r>
+        <w:rPr>
+          <w:rFonts w:ascii="Mangal" w:eastAsia="Times New Roman" w:hAnsi="Mangal" w:cs="Mangal"/>
+          <w:kern w:val="0"/>
+          <w:sz w:val="20"/>
+          <w:szCs w:val="20"/>
+          <w14:ligatures w14:val="none"/>
+        </w:rPr>
+        <w:t>acbd</w:t>
+      </w:r>
+      <w:proofErr w:type="spellEnd"/>
+      <w:r>
+        <w:rPr>
+          <w:rFonts w:ascii="Mangal" w:eastAsia="Times New Roman" w:hAnsi="Mangal" w:cs="Mangal"/>
+          <w:kern w:val="0"/>
+          <w:sz w:val="20"/>
+          <w:szCs w:val="20"/>
+          <w14:ligatures w14:val="none"/>
+        </w:rPr>
+        <w:t xml:space="preserve">" </w:t>
       </w:r>
       <w:r>
         <w:rPr>
@@ -8821,7 +10507,27 @@
           <w:szCs w:val="24"/>
           <w14:ligatures w14:val="none"/>
         </w:rPr>
-        <w:t>Find All Pairs With Given Sum</w:t>
+        <w:t xml:space="preserve">Find All Pairs </w:t>
+      </w:r>
+      <w:proofErr w:type="gramStart"/>
+      <w:r>
+        <w:rPr>
+          <w:rFonts w:ascii="Times New Roman" w:eastAsia="Times New Roman" w:hAnsi="Times New Roman" w:cs="Times New Roman"/>
+          <w:kern w:val="0"/>
+          <w:szCs w:val="24"/>
+          <w14:ligatures w14:val="none"/>
+        </w:rPr>
+        <w:t>With</w:t>
+      </w:r>
+      <w:proofErr w:type="gramEnd"/>
+      <w:r>
+        <w:rPr>
+          <w:rFonts w:ascii="Times New Roman" w:eastAsia="Times New Roman" w:hAnsi="Times New Roman" w:cs="Times New Roman"/>
+          <w:kern w:val="0"/>
+          <w:szCs w:val="24"/>
+          <w14:ligatures w14:val="none"/>
+        </w:rPr>
+        <w:t xml:space="preserve"> Given Sum</w:t>
       </w:r>
       <w:r>
         <w:rPr>
@@ -8927,7 +10633,29 @@
           <w:szCs w:val="24"/>
           <w14:ligatures w14:val="none"/>
         </w:rPr>
-        <w:t>Write a java program to find the majority element in an array i,e; which appears more than (n/2) times. Can use either frequency array or simple counting logic.</w:t>
+        <w:t xml:space="preserve">Write a java program to find the majority element in an array </w:t>
+      </w:r>
+      <w:proofErr w:type="spellStart"/>
+      <w:proofErr w:type="gramStart"/>
+      <w:r>
+        <w:rPr>
+          <w:rFonts w:ascii="Times New Roman" w:eastAsia="Times New Roman" w:hAnsi="Times New Roman" w:cs="Times New Roman"/>
+          <w:kern w:val="0"/>
+          <w:szCs w:val="24"/>
+          <w14:ligatures w14:val="none"/>
+        </w:rPr>
+        <w:t>i,e</w:t>
+      </w:r>
+      <w:proofErr w:type="spellEnd"/>
+      <w:proofErr w:type="gramEnd"/>
+      <w:r>
+        <w:rPr>
+          <w:rFonts w:ascii="Times New Roman" w:eastAsia="Times New Roman" w:hAnsi="Times New Roman" w:cs="Times New Roman"/>
+          <w:kern w:val="0"/>
+          <w:szCs w:val="24"/>
+          <w14:ligatures w14:val="none"/>
+        </w:rPr>
+        <w:t>; which appears more than (n/2) times. Can use either frequency array or simple counting logic.</w:t>
       </w:r>
     </w:p>
     <w:p>
@@ -9123,8 +10851,9 @@
           <w:sz w:val="22"/>
           <w:szCs w:val="22"/>
         </w:rPr>
-        <w:t xml:space="preserve"> And also count all occurrence of each unique el</w:t>
-      </w:r>
+        <w:t xml:space="preserve"> And also count all occurrence of each unique </w:t>
+      </w:r>
+      <w:proofErr w:type="gramStart"/>
       <w:r>
         <w:rPr>
           <w:rFonts w:ascii="Verdana" w:hAnsi="Verdana"/>
@@ -9132,7 +10861,7 @@
           <w:sz w:val="22"/>
           <w:szCs w:val="22"/>
         </w:rPr>
-        <w:t>e</w:t>
+        <w:t>el</w:t>
       </w:r>
       <w:r>
         <w:rPr>
@@ -9141,7 +10870,26 @@
           <w:sz w:val="22"/>
           <w:szCs w:val="22"/>
         </w:rPr>
-        <w:t>ments.</w:t>
+        <w:t>e</w:t>
+      </w:r>
+      <w:r>
+        <w:rPr>
+          <w:rFonts w:ascii="Verdana" w:hAnsi="Verdana"/>
+          <w:color w:val="000000"/>
+          <w:sz w:val="22"/>
+          <w:szCs w:val="22"/>
+        </w:rPr>
+        <w:t>ments</w:t>
+      </w:r>
+      <w:proofErr w:type="gramEnd"/>
+      <w:r>
+        <w:rPr>
+          <w:rFonts w:ascii="Verdana" w:hAnsi="Verdana"/>
+          <w:color w:val="000000"/>
+          <w:sz w:val="22"/>
+          <w:szCs w:val="22"/>
+        </w:rPr>
+        <w:t>.</w:t>
       </w:r>
     </w:p>
     <w:p>
@@ -9168,7 +10916,27 @@
           <w:sz w:val="22"/>
           <w:szCs w:val="22"/>
         </w:rPr>
-        <w:t>Write program to find the first repeating elements in an array and print it’s index to make sure.</w:t>
+        <w:t xml:space="preserve">Write program to find the first repeating elements in an array and print </w:t>
+      </w:r>
+      <w:proofErr w:type="gramStart"/>
+      <w:r>
+        <w:rPr>
+          <w:rFonts w:ascii="Verdana" w:hAnsi="Verdana"/>
+          <w:color w:val="000000"/>
+          <w:sz w:val="22"/>
+          <w:szCs w:val="22"/>
+        </w:rPr>
+        <w:t>it’s</w:t>
+      </w:r>
+      <w:proofErr w:type="gramEnd"/>
+      <w:r>
+        <w:rPr>
+          <w:rFonts w:ascii="Verdana" w:hAnsi="Verdana"/>
+          <w:color w:val="000000"/>
+          <w:sz w:val="22"/>
+          <w:szCs w:val="22"/>
+        </w:rPr>
+        <w:t xml:space="preserve"> index to make sure.</w:t>
       </w:r>
     </w:p>
     <w:p>
@@ -9198,7 +10966,33 @@
           <w:sz w:val="22"/>
           <w:szCs w:val="22"/>
         </w:rPr>
-        <w:t>Write a program to count how many pairs have difference of 2 in [ 1, 3, 5, 3, 7 ].</w:t>
+        <w:t xml:space="preserve">Write a program to count how many pairs have difference of 2 in [ 1, 3, 5, 3, </w:t>
+      </w:r>
+      <w:proofErr w:type="gramStart"/>
+      <w:r>
+        <w:rPr>
+          <w:rStyle w:val="Strong"/>
+          <w:rFonts w:ascii="Verdana" w:hAnsi="Verdana"/>
+          <w:b w:val="0"/>
+          <w:bCs w:val="0"/>
+          <w:color w:val="000000"/>
+          <w:sz w:val="22"/>
+          <w:szCs w:val="22"/>
+        </w:rPr>
+        <w:t>7 ]</w:t>
+      </w:r>
+      <w:proofErr w:type="gramEnd"/>
+      <w:r>
+        <w:rPr>
+          <w:rStyle w:val="Strong"/>
+          <w:rFonts w:ascii="Verdana" w:hAnsi="Verdana"/>
+          <w:b w:val="0"/>
+          <w:bCs w:val="0"/>
+          <w:color w:val="000000"/>
+          <w:sz w:val="22"/>
+          <w:szCs w:val="22"/>
+        </w:rPr>
+        <w:t>.</w:t>
       </w:r>
     </w:p>
     <w:p>
@@ -9231,38 +11025,38 @@
           <w:numId w:val="42"/>
         </w:numPr>
         <w:rPr>
-          <w:rFonts w:ascii="Verdana" w:hAnsi="Verdana"/>
-          <w:color w:val="000000"/>
-          <w:sz w:val="22"/>
-          <w:szCs w:val="22"/>
-        </w:rPr>
-      </w:pPr>
-      <w:r>
-        <w:rPr>
-          <w:rFonts w:ascii="Verdana" w:hAnsi="Verdana"/>
-          <w:color w:val="000000"/>
-          <w:sz w:val="22"/>
-          <w:szCs w:val="22"/>
+          <w:rFonts w:ascii="Times New Roman" w:hAnsi="Times New Roman" w:cs="Times New Roman"/>
+          <w:color w:val="000000"/>
+          <w:sz w:val="28"/>
+          <w:szCs w:val="28"/>
+        </w:rPr>
+      </w:pPr>
+      <w:r>
+        <w:rPr>
+          <w:rFonts w:ascii="Times New Roman" w:hAnsi="Times New Roman" w:cs="Times New Roman"/>
+          <w:color w:val="000000"/>
+          <w:sz w:val="28"/>
+          <w:szCs w:val="28"/>
         </w:rPr>
         <w:t xml:space="preserve">Remove duplicate characters from a string </w:t>
       </w:r>
       <w:r>
         <w:rPr>
-          <w:rFonts w:ascii="Verdana" w:hAnsi="Verdana"/>
+          <w:rFonts w:ascii="Times New Roman" w:hAnsi="Times New Roman" w:cs="Times New Roman"/>
           <w:b/>
           <w:bCs/>
           <w:color w:val="000000"/>
-          <w:sz w:val="22"/>
-          <w:szCs w:val="22"/>
+          <w:sz w:val="28"/>
+          <w:szCs w:val="28"/>
         </w:rPr>
         <w:t>without using Set or extra libraries</w:t>
       </w:r>
       <w:r>
         <w:rPr>
-          <w:rFonts w:ascii="Verdana" w:hAnsi="Verdana"/>
-          <w:color w:val="000000"/>
-          <w:sz w:val="22"/>
-          <w:szCs w:val="22"/>
+          <w:rFonts w:ascii="Times New Roman" w:hAnsi="Times New Roman" w:cs="Times New Roman"/>
+          <w:color w:val="000000"/>
+          <w:sz w:val="28"/>
+          <w:szCs w:val="28"/>
         </w:rPr>
         <w:t>.</w:t>
       </w:r>
@@ -9275,18 +11069,18 @@
           <w:numId w:val="42"/>
         </w:numPr>
         <w:rPr>
-          <w:rFonts w:ascii="Verdana" w:hAnsi="Verdana"/>
-          <w:color w:val="000000"/>
-          <w:sz w:val="22"/>
-          <w:szCs w:val="22"/>
-        </w:rPr>
-      </w:pPr>
-      <w:r>
-        <w:rPr>
-          <w:rFonts w:ascii="Verdana" w:hAnsi="Verdana"/>
-          <w:color w:val="000000"/>
-          <w:sz w:val="22"/>
-          <w:szCs w:val="22"/>
+          <w:rFonts w:ascii="Times New Roman" w:hAnsi="Times New Roman" w:cs="Times New Roman"/>
+          <w:color w:val="000000"/>
+          <w:sz w:val="28"/>
+          <w:szCs w:val="28"/>
+        </w:rPr>
+      </w:pPr>
+      <w:r>
+        <w:rPr>
+          <w:rFonts w:ascii="Times New Roman" w:hAnsi="Times New Roman" w:cs="Times New Roman"/>
+          <w:color w:val="000000"/>
+          <w:sz w:val="28"/>
+          <w:szCs w:val="28"/>
         </w:rPr>
         <w:t>Check If a Number is Strong Number.</w:t>
       </w:r>
@@ -9300,49 +11094,41 @@
         </w:numPr>
         <w:rPr>
           <w:rFonts w:ascii="Times New Roman" w:hAnsi="Times New Roman" w:cs="Times New Roman"/>
-          <w:sz w:val="24"/>
-          <w:szCs w:val="24"/>
+          <w:sz w:val="28"/>
+          <w:szCs w:val="28"/>
         </w:rPr>
       </w:pPr>
       <w:r>
         <w:rPr>
           <w:rStyle w:val="Strong"/>
           <w:rFonts w:ascii="Times New Roman" w:eastAsiaTheme="majorEastAsia" w:hAnsi="Times New Roman" w:cs="Times New Roman"/>
-          <w:sz w:val="22"/>
-          <w:szCs w:val="22"/>
+          <w:sz w:val="28"/>
+          <w:szCs w:val="28"/>
         </w:rPr>
         <w:t>Find Palindromic Numbers in Array.</w:t>
       </w:r>
       <w:r>
         <w:rPr>
           <w:rFonts w:ascii="Times New Roman" w:hAnsi="Times New Roman" w:cs="Times New Roman"/>
-          <w:sz w:val="22"/>
-          <w:szCs w:val="22"/>
-        </w:rPr>
-        <w:t xml:space="preserve"> </w:t>
-      </w:r>
-      <w:r>
-        <w:rPr>
-          <w:rFonts w:ascii="Times New Roman" w:hAnsi="Times New Roman" w:cs="Times New Roman"/>
-          <w:sz w:val="24"/>
-          <w:szCs w:val="24"/>
-        </w:rPr>
-        <w:t xml:space="preserve">Input: </w:t>
+          <w:sz w:val="28"/>
+          <w:szCs w:val="28"/>
+        </w:rPr>
+        <w:t xml:space="preserve"> Input: </w:t>
       </w:r>
       <w:r>
         <w:rPr>
           <w:rStyle w:val="HTMLCode"/>
           <w:rFonts w:ascii="Times New Roman" w:eastAsiaTheme="majorEastAsia" w:hAnsi="Times New Roman" w:cs="Times New Roman"/>
-          <w:sz w:val="24"/>
-          <w:szCs w:val="24"/>
+          <w:sz w:val="28"/>
+          <w:szCs w:val="28"/>
         </w:rPr>
         <w:t>{121, 34, 44, 7}</w:t>
       </w:r>
       <w:r>
         <w:rPr>
           <w:rFonts w:ascii="Times New Roman" w:hAnsi="Times New Roman" w:cs="Times New Roman"/>
-          <w:sz w:val="24"/>
-          <w:szCs w:val="24"/>
+          <w:sz w:val="28"/>
+          <w:szCs w:val="28"/>
         </w:rPr>
         <w:t xml:space="preserve"> → Output: </w:t>
       </w:r>
@@ -9350,16 +11136,16 @@
         <w:rPr>
           <w:rStyle w:val="HTMLCode"/>
           <w:rFonts w:ascii="Times New Roman" w:eastAsiaTheme="majorEastAsia" w:hAnsi="Times New Roman" w:cs="Times New Roman"/>
-          <w:sz w:val="24"/>
-          <w:szCs w:val="24"/>
+          <w:sz w:val="28"/>
+          <w:szCs w:val="28"/>
         </w:rPr>
         <w:t>121, 44, 7</w:t>
       </w:r>
       <w:r>
         <w:rPr>
           <w:rFonts w:ascii="Times New Roman" w:hAnsi="Times New Roman" w:cs="Times New Roman"/>
-          <w:sz w:val="24"/>
-          <w:szCs w:val="24"/>
+          <w:sz w:val="28"/>
+          <w:szCs w:val="28"/>
         </w:rPr>
         <w:t>)</w:t>
       </w:r>
@@ -9374,24 +11160,44 @@
         <w:rPr>
           <w:rStyle w:val="HTMLCode"/>
           <w:rFonts w:ascii="Times New Roman" w:hAnsi="Times New Roman" w:cs="Times New Roman"/>
-          <w:sz w:val="24"/>
-          <w:szCs w:val="24"/>
+          <w:sz w:val="28"/>
+          <w:szCs w:val="28"/>
         </w:rPr>
       </w:pPr>
       <w:r>
         <w:rPr>
           <w:rStyle w:val="Strong"/>
           <w:rFonts w:ascii="Times New Roman" w:eastAsiaTheme="majorEastAsia" w:hAnsi="Times New Roman" w:cs="Times New Roman"/>
-          <w:sz w:val="22"/>
-          <w:szCs w:val="22"/>
-        </w:rPr>
-        <w:t xml:space="preserve">Count Strings Starting and Ending With Same Character. </w:t>
+          <w:sz w:val="28"/>
+          <w:szCs w:val="28"/>
+        </w:rPr>
+        <w:t xml:space="preserve">Count Strings Starting and Ending </w:t>
+      </w:r>
+      <w:proofErr w:type="gramStart"/>
+      <w:r>
+        <w:rPr>
+          <w:rStyle w:val="Strong"/>
+          <w:rFonts w:ascii="Times New Roman" w:eastAsiaTheme="majorEastAsia" w:hAnsi="Times New Roman" w:cs="Times New Roman"/>
+          <w:sz w:val="28"/>
+          <w:szCs w:val="28"/>
+        </w:rPr>
+        <w:t>With</w:t>
+      </w:r>
+      <w:proofErr w:type="gramEnd"/>
+      <w:r>
+        <w:rPr>
+          <w:rStyle w:val="Strong"/>
+          <w:rFonts w:ascii="Times New Roman" w:eastAsiaTheme="majorEastAsia" w:hAnsi="Times New Roman" w:cs="Times New Roman"/>
+          <w:sz w:val="28"/>
+          <w:szCs w:val="28"/>
+        </w:rPr>
+        <w:t xml:space="preserve"> Same Character. </w:t>
       </w:r>
       <w:r>
         <w:rPr>
           <w:rFonts w:ascii="Times New Roman" w:hAnsi="Times New Roman" w:cs="Times New Roman"/>
-          <w:sz w:val="24"/>
-          <w:szCs w:val="24"/>
+          <w:sz w:val="28"/>
+          <w:szCs w:val="28"/>
         </w:rPr>
         <w:t xml:space="preserve">Input: </w:t>
       </w:r>
@@ -9399,67 +11205,109 @@
         <w:rPr>
           <w:rStyle w:val="HTMLCode"/>
           <w:rFonts w:ascii="Times New Roman" w:eastAsiaTheme="majorEastAsia" w:hAnsi="Times New Roman" w:cs="Times New Roman"/>
-          <w:sz w:val="24"/>
-          <w:szCs w:val="24"/>
-        </w:rPr>
-        <w:t>{"abc", "aaa", "kite", "pop"}</w:t>
-      </w:r>
-      <w:r>
-        <w:rPr>
-          <w:rFonts w:ascii="Times New Roman" w:hAnsi="Times New Roman" w:cs="Times New Roman"/>
-          <w:sz w:val="24"/>
-          <w:szCs w:val="24"/>
-        </w:rPr>
-        <w:t xml:space="preserve"> → Output: </w:t>
-      </w:r>
+          <w:sz w:val="28"/>
+          <w:szCs w:val="28"/>
+        </w:rPr>
+        <w:t>{"</w:t>
+      </w:r>
+      <w:proofErr w:type="spellStart"/>
       <w:r>
         <w:rPr>
           <w:rStyle w:val="HTMLCode"/>
           <w:rFonts w:ascii="Times New Roman" w:eastAsiaTheme="majorEastAsia" w:hAnsi="Times New Roman" w:cs="Times New Roman"/>
-          <w:sz w:val="24"/>
-          <w:szCs w:val="24"/>
-        </w:rPr>
-        <w:t>3</w:t>
-      </w:r>
-      <w:r>
-        <w:rPr>
-          <w:rFonts w:ascii="Times New Roman" w:hAnsi="Times New Roman" w:cs="Times New Roman"/>
-          <w:sz w:val="24"/>
-          <w:szCs w:val="24"/>
-        </w:rPr>
-        <w:t xml:space="preserve"> (</w:t>
-      </w:r>
+          <w:sz w:val="28"/>
+          <w:szCs w:val="28"/>
+        </w:rPr>
+        <w:t>abc</w:t>
+      </w:r>
+      <w:proofErr w:type="spellEnd"/>
       <w:r>
         <w:rPr>
           <w:rStyle w:val="HTMLCode"/>
           <w:rFonts w:ascii="Times New Roman" w:eastAsiaTheme="majorEastAsia" w:hAnsi="Times New Roman" w:cs="Times New Roman"/>
-          <w:sz w:val="24"/>
-          <w:szCs w:val="24"/>
-        </w:rPr>
-        <w:t>aaa</w:t>
-      </w:r>
-      <w:r>
-        <w:rPr>
-          <w:rFonts w:ascii="Times New Roman" w:hAnsi="Times New Roman" w:cs="Times New Roman"/>
-          <w:sz w:val="24"/>
-          <w:szCs w:val="24"/>
-        </w:rPr>
-        <w:t xml:space="preserve">, </w:t>
-      </w:r>
+          <w:sz w:val="28"/>
+          <w:szCs w:val="28"/>
+        </w:rPr>
+        <w:t>", "</w:t>
+      </w:r>
+      <w:proofErr w:type="spellStart"/>
       <w:r>
         <w:rPr>
           <w:rStyle w:val="HTMLCode"/>
           <w:rFonts w:ascii="Times New Roman" w:eastAsiaTheme="majorEastAsia" w:hAnsi="Times New Roman" w:cs="Times New Roman"/>
-          <w:sz w:val="24"/>
-          <w:szCs w:val="24"/>
+          <w:sz w:val="28"/>
+          <w:szCs w:val="28"/>
+        </w:rPr>
+        <w:t>aaa</w:t>
+      </w:r>
+      <w:proofErr w:type="spellEnd"/>
+      <w:r>
+        <w:rPr>
+          <w:rStyle w:val="HTMLCode"/>
+          <w:rFonts w:ascii="Times New Roman" w:eastAsiaTheme="majorEastAsia" w:hAnsi="Times New Roman" w:cs="Times New Roman"/>
+          <w:sz w:val="28"/>
+          <w:szCs w:val="28"/>
+        </w:rPr>
+        <w:t>", "kite", "pop"}</w:t>
+      </w:r>
+      <w:r>
+        <w:rPr>
+          <w:rFonts w:ascii="Times New Roman" w:hAnsi="Times New Roman" w:cs="Times New Roman"/>
+          <w:sz w:val="28"/>
+          <w:szCs w:val="28"/>
+        </w:rPr>
+        <w:t xml:space="preserve"> → Output: </w:t>
+      </w:r>
+      <w:r>
+        <w:rPr>
+          <w:rStyle w:val="HTMLCode"/>
+          <w:rFonts w:ascii="Times New Roman" w:eastAsiaTheme="majorEastAsia" w:hAnsi="Times New Roman" w:cs="Times New Roman"/>
+          <w:sz w:val="28"/>
+          <w:szCs w:val="28"/>
+        </w:rPr>
+        <w:t>2</w:t>
+      </w:r>
+      <w:r>
+        <w:rPr>
+          <w:rFonts w:ascii="Times New Roman" w:hAnsi="Times New Roman" w:cs="Times New Roman"/>
+          <w:sz w:val="28"/>
+          <w:szCs w:val="28"/>
+        </w:rPr>
+        <w:t xml:space="preserve"> (</w:t>
+      </w:r>
+      <w:proofErr w:type="spellStart"/>
+      <w:r>
+        <w:rPr>
+          <w:rStyle w:val="HTMLCode"/>
+          <w:rFonts w:ascii="Times New Roman" w:eastAsiaTheme="majorEastAsia" w:hAnsi="Times New Roman" w:cs="Times New Roman"/>
+          <w:sz w:val="28"/>
+          <w:szCs w:val="28"/>
+        </w:rPr>
+        <w:t>aaa</w:t>
+      </w:r>
+      <w:proofErr w:type="spellEnd"/>
+      <w:r>
+        <w:rPr>
+          <w:rFonts w:ascii="Times New Roman" w:hAnsi="Times New Roman" w:cs="Times New Roman"/>
+          <w:sz w:val="28"/>
+          <w:szCs w:val="28"/>
+        </w:rPr>
+        <w:t xml:space="preserve">, </w:t>
+      </w:r>
+      <w:r>
+        <w:rPr>
+          <w:rStyle w:val="HTMLCode"/>
+          <w:rFonts w:ascii="Times New Roman" w:eastAsiaTheme="majorEastAsia" w:hAnsi="Times New Roman" w:cs="Times New Roman"/>
+          <w:sz w:val="28"/>
+          <w:szCs w:val="28"/>
         </w:rPr>
         <w:t>pop</w:t>
       </w:r>
       <w:r>
         <w:rPr>
           <w:rFonts w:ascii="Times New Roman" w:hAnsi="Times New Roman" w:cs="Times New Roman"/>
-          <w:sz w:val="24"/>
-          <w:szCs w:val="24"/>
+          <w:sz w:val="28"/>
+          <w:szCs w:val="28"/>
         </w:rPr>
         <w:t>).</w:t>
       </w:r>
@@ -9478,8 +11326,72 @@
           <w:szCs w:val="28"/>
         </w:rPr>
       </w:pPr>
-    </w:p>
-    <w:p/>
+      <w:r>
+        <w:rPr>
+          <w:rStyle w:val="HTMLCode"/>
+          <w:rFonts w:ascii="Times New Roman" w:hAnsi="Times New Roman" w:cs="Times New Roman"/>
+          <w:sz w:val="28"/>
+          <w:szCs w:val="28"/>
+        </w:rPr>
+        <w:t>Write a program to check if an array is a palindrome or not.</w:t>
+      </w:r>
+    </w:p>
+    <w:p>
+      <w:pPr>
+        <w:pStyle w:val="NormalWeb"/>
+        <w:numPr>
+          <w:ilvl w:val="0"/>
+          <w:numId w:val="42"/>
+        </w:numPr>
+        <w:rPr>
+          <w:rStyle w:val="HTMLCode"/>
+          <w:rFonts w:ascii="Times New Roman" w:hAnsi="Times New Roman" w:cs="Times New Roman"/>
+          <w:sz w:val="28"/>
+          <w:szCs w:val="28"/>
+        </w:rPr>
+      </w:pPr>
+      <w:r>
+        <w:rPr>
+          <w:rStyle w:val="HTMLCode"/>
+          <w:rFonts w:ascii="Times New Roman" w:hAnsi="Times New Roman" w:cs="Times New Roman"/>
+          <w:sz w:val="28"/>
+          <w:szCs w:val="28"/>
+        </w:rPr>
+        <w:t>Write a program to find the intersection of two arrays.</w:t>
+      </w:r>
+    </w:p>
+    <w:p>
+      <w:pPr>
+        <w:ind w:firstLine="720"/>
+        <w:rPr>
+          <w:rFonts w:ascii="Times New Roman" w:hAnsi="Times New Roman" w:cs="Times New Roman"/>
+          <w:sz w:val="28"/>
+          <w:szCs w:val="22"/>
+        </w:rPr>
+      </w:pPr>
+      <w:r>
+        <w:rPr>
+          <w:rFonts w:ascii="Times New Roman" w:hAnsi="Times New Roman" w:cs="Times New Roman"/>
+          <w:sz w:val="28"/>
+          <w:szCs w:val="22"/>
+        </w:rPr>
+        <w:t xml:space="preserve">Day 30 </w:t>
+      </w:r>
+    </w:p>
+    <w:p>
+      <w:pPr>
+        <w:pStyle w:val="ListParagraph"/>
+        <w:numPr>
+          <w:ilvl w:val="0"/>
+          <w:numId w:val="43"/>
+        </w:numPr>
+        <w:rPr>
+          <w:rFonts w:ascii="Times New Roman" w:hAnsi="Times New Roman" w:cs="Times New Roman"/>
+          <w:sz w:val="28"/>
+          <w:szCs w:val="22"/>
+        </w:rPr>
+      </w:pPr>
+    </w:p>
     <w:sectPr>
       <w:pgSz w:w="11906" w:h="16838"/>
       <w:pgMar w:top="993" w:right="1440" w:bottom="1440" w:left="1440" w:header="720" w:footer="720" w:gutter="0"/>
@@ -10315,7 +12227,7 @@
   <w:abstractNum w:abstractNumId="8" w15:restartNumberingAfterBreak="0">
     <w:nsid w:val="1F1F31F2"/>
     <w:multiLevelType w:val="hybridMultilevel"/>
-    <w:tmpl w:val="A4668A3E"/>
+    <w:tmpl w:val="86C0DA00"/>
     <w:lvl w:ilvl="0" w:tplc="0409000F">
       <w:start w:val="1"/>
       <w:numFmt w:val="decimal"/>
@@ -12223,6 +14135,95 @@
     </w:lvl>
   </w:abstractNum>
   <w:abstractNum w:abstractNumId="29" w15:restartNumberingAfterBreak="0">
+    <w:nsid w:val="589D3BEE"/>
+    <w:multiLevelType w:val="hybridMultilevel"/>
+    <w:tmpl w:val="8788DCAE"/>
+    <w:lvl w:ilvl="0" w:tplc="C5783FEA">
+      <w:start w:val="1"/>
+      <w:numFmt w:val="decimal"/>
+      <w:lvlText w:val="%1."/>
+      <w:lvlJc w:val="left"/>
+      <w:pPr>
+        <w:ind w:left="1080" w:hanging="360"/>
+      </w:pPr>
+      <w:rPr>
+        <w:rFonts w:hint="default"/>
+      </w:rPr>
+    </w:lvl>
+    <w:lvl w:ilvl="1" w:tplc="04090019" w:tentative="1">
+      <w:start w:val="1"/>
+      <w:numFmt w:val="lowerLetter"/>
+      <w:lvlText w:val="%2."/>
+      <w:lvlJc w:val="left"/>
+      <w:pPr>
+        <w:ind w:left="1800" w:hanging="360"/>
+      </w:pPr>
+    </w:lvl>
+    <w:lvl w:ilvl="2" w:tplc="0409001B" w:tentative="1">
+      <w:start w:val="1"/>
+      <w:numFmt w:val="lowerRoman"/>
+      <w:lvlText w:val="%3."/>
+      <w:lvlJc w:val="right"/>
+      <w:pPr>
+        <w:ind w:left="2520" w:hanging="180"/>
+      </w:pPr>
+    </w:lvl>
+    <w:lvl w:ilvl="3" w:tplc="0409000F" w:tentative="1">
+      <w:start w:val="1"/>
+      <w:numFmt w:val="decimal"/>
+      <w:lvlText w:val="%4."/>
+      <w:lvlJc w:val="left"/>
+      <w:pPr>
+        <w:ind w:left="3240" w:hanging="360"/>
+      </w:pPr>
+    </w:lvl>
+    <w:lvl w:ilvl="4" w:tplc="04090019" w:tentative="1">
+      <w:start w:val="1"/>
+      <w:numFmt w:val="lowerLetter"/>
+      <w:lvlText w:val="%5."/>
+      <w:lvlJc w:val="left"/>
+      <w:pPr>
+        <w:ind w:left="3960" w:hanging="360"/>
+      </w:pPr>
+    </w:lvl>
+    <w:lvl w:ilvl="5" w:tplc="0409001B" w:tentative="1">
+      <w:start w:val="1"/>
+      <w:numFmt w:val="lowerRoman"/>
+      <w:lvlText w:val="%6."/>
+      <w:lvlJc w:val="right"/>
+      <w:pPr>
+        <w:ind w:left="4680" w:hanging="180"/>
+      </w:pPr>
+    </w:lvl>
+    <w:lvl w:ilvl="6" w:tplc="0409000F" w:tentative="1">
+      <w:start w:val="1"/>
+      <w:numFmt w:val="decimal"/>
+      <w:lvlText w:val="%7."/>
+      <w:lvlJc w:val="left"/>
+      <w:pPr>
+        <w:ind w:left="5400" w:hanging="360"/>
+      </w:pPr>
+    </w:lvl>
+    <w:lvl w:ilvl="7" w:tplc="04090019" w:tentative="1">
+      <w:start w:val="1"/>
+      <w:numFmt w:val="lowerLetter"/>
+      <w:lvlText w:val="%8."/>
+      <w:lvlJc w:val="left"/>
+      <w:pPr>
+        <w:ind w:left="6120" w:hanging="360"/>
+      </w:pPr>
+    </w:lvl>
+    <w:lvl w:ilvl="8" w:tplc="0409001B" w:tentative="1">
+      <w:start w:val="1"/>
+      <w:numFmt w:val="lowerRoman"/>
+      <w:lvlText w:val="%9."/>
+      <w:lvlJc w:val="right"/>
+      <w:pPr>
+        <w:ind w:left="6840" w:hanging="180"/>
+      </w:pPr>
+    </w:lvl>
+  </w:abstractNum>
+  <w:abstractNum w:abstractNumId="30" w15:restartNumberingAfterBreak="0">
     <w:nsid w:val="5A3D1A24"/>
     <w:multiLevelType w:val="hybridMultilevel"/>
     <w:tmpl w:val="406E1A90"/>
@@ -12311,7 +14312,7 @@
       </w:pPr>
     </w:lvl>
   </w:abstractNum>
-  <w:abstractNum w:abstractNumId="30" w15:restartNumberingAfterBreak="0">
+  <w:abstractNum w:abstractNumId="31" w15:restartNumberingAfterBreak="0">
     <w:nsid w:val="5AD15962"/>
     <w:multiLevelType w:val="hybridMultilevel"/>
     <w:tmpl w:val="884AF92E"/>
@@ -12397,7 +14398,7 @@
       </w:pPr>
     </w:lvl>
   </w:abstractNum>
-  <w:abstractNum w:abstractNumId="31" w15:restartNumberingAfterBreak="0">
+  <w:abstractNum w:abstractNumId="32" w15:restartNumberingAfterBreak="0">
     <w:nsid w:val="6936075D"/>
     <w:multiLevelType w:val="hybridMultilevel"/>
     <w:tmpl w:val="385CB13E"/>
@@ -12488,7 +14489,7 @@
       </w:pPr>
     </w:lvl>
   </w:abstractNum>
-  <w:abstractNum w:abstractNumId="32" w15:restartNumberingAfterBreak="0">
+  <w:abstractNum w:abstractNumId="33" w15:restartNumberingAfterBreak="0">
     <w:nsid w:val="6AAA50FA"/>
     <w:multiLevelType w:val="hybridMultilevel"/>
     <w:tmpl w:val="829279AA"/>
@@ -12574,7 +14575,7 @@
       </w:pPr>
     </w:lvl>
   </w:abstractNum>
-  <w:abstractNum w:abstractNumId="33" w15:restartNumberingAfterBreak="0">
+  <w:abstractNum w:abstractNumId="34" w15:restartNumberingAfterBreak="0">
     <w:nsid w:val="6CD86F84"/>
     <w:multiLevelType w:val="multilevel"/>
     <w:tmpl w:val="EB06CA30"/>
@@ -12723,7 +14724,7 @@
       </w:rPr>
     </w:lvl>
   </w:abstractNum>
-  <w:abstractNum w:abstractNumId="34" w15:restartNumberingAfterBreak="0">
+  <w:abstractNum w:abstractNumId="35" w15:restartNumberingAfterBreak="0">
     <w:nsid w:val="6FB84637"/>
     <w:multiLevelType w:val="hybridMultilevel"/>
     <w:tmpl w:val="FCBE904E"/>
@@ -12809,7 +14810,7 @@
       </w:pPr>
     </w:lvl>
   </w:abstractNum>
-  <w:abstractNum w:abstractNumId="35" w15:restartNumberingAfterBreak="0">
+  <w:abstractNum w:abstractNumId="36" w15:restartNumberingAfterBreak="0">
     <w:nsid w:val="70BD47EB"/>
     <w:multiLevelType w:val="multilevel"/>
     <w:tmpl w:val="67CC5774"/>
@@ -12922,7 +14923,7 @@
       </w:pPr>
     </w:lvl>
   </w:abstractNum>
-  <w:abstractNum w:abstractNumId="36" w15:restartNumberingAfterBreak="0">
+  <w:abstractNum w:abstractNumId="37" w15:restartNumberingAfterBreak="0">
     <w:nsid w:val="72E21C6C"/>
     <w:multiLevelType w:val="hybridMultilevel"/>
     <w:tmpl w:val="A548623A"/>
@@ -13008,7 +15009,7 @@
       </w:pPr>
     </w:lvl>
   </w:abstractNum>
-  <w:abstractNum w:abstractNumId="37" w15:restartNumberingAfterBreak="0">
+  <w:abstractNum w:abstractNumId="38" w15:restartNumberingAfterBreak="0">
     <w:nsid w:val="78995124"/>
     <w:multiLevelType w:val="multilevel"/>
     <w:tmpl w:val="43FED306"/>
@@ -13157,7 +15158,7 @@
       </w:rPr>
     </w:lvl>
   </w:abstractNum>
-  <w:abstractNum w:abstractNumId="38" w15:restartNumberingAfterBreak="0">
+  <w:abstractNum w:abstractNumId="39" w15:restartNumberingAfterBreak="0">
     <w:nsid w:val="79521D66"/>
     <w:multiLevelType w:val="hybridMultilevel"/>
     <w:tmpl w:val="E86064F8"/>
@@ -13246,7 +15247,7 @@
       </w:pPr>
     </w:lvl>
   </w:abstractNum>
-  <w:abstractNum w:abstractNumId="39" w15:restartNumberingAfterBreak="0">
+  <w:abstractNum w:abstractNumId="40" w15:restartNumberingAfterBreak="0">
     <w:nsid w:val="79527ECA"/>
     <w:multiLevelType w:val="hybridMultilevel"/>
     <w:tmpl w:val="D5383D20"/>
@@ -13332,7 +15333,7 @@
       </w:pPr>
     </w:lvl>
   </w:abstractNum>
-  <w:abstractNum w:abstractNumId="40" w15:restartNumberingAfterBreak="0">
+  <w:abstractNum w:abstractNumId="41" w15:restartNumberingAfterBreak="0">
     <w:nsid w:val="7ABA1038"/>
     <w:multiLevelType w:val="hybridMultilevel"/>
     <w:tmpl w:val="CAE67AD6"/>
@@ -13418,7 +15419,7 @@
       </w:pPr>
     </w:lvl>
   </w:abstractNum>
-  <w:abstractNum w:abstractNumId="41" w15:restartNumberingAfterBreak="0">
+  <w:abstractNum w:abstractNumId="42" w15:restartNumberingAfterBreak="0">
     <w:nsid w:val="7FBE6D6A"/>
     <w:multiLevelType w:val="hybridMultilevel"/>
     <w:tmpl w:val="7D3272E4"/>
@@ -13523,13 +15524,13 @@
     <w:abstractNumId w:val="9"/>
   </w:num>
   <w:num w:numId="7" w16cid:durableId="1879052598">
-    <w:abstractNumId w:val="32"/>
+    <w:abstractNumId w:val="33"/>
   </w:num>
   <w:num w:numId="8" w16cid:durableId="1749188025">
     <w:abstractNumId w:val="14"/>
   </w:num>
   <w:num w:numId="9" w16cid:durableId="101462200">
-    <w:abstractNumId w:val="36"/>
+    <w:abstractNumId w:val="37"/>
   </w:num>
   <w:num w:numId="10" w16cid:durableId="57170953">
     <w:abstractNumId w:val="1"/>
@@ -13538,10 +15539,10 @@
     <w:abstractNumId w:val="11"/>
   </w:num>
   <w:num w:numId="12" w16cid:durableId="1752465261">
-    <w:abstractNumId w:val="30"/>
+    <w:abstractNumId w:val="31"/>
   </w:num>
   <w:num w:numId="13" w16cid:durableId="192882122">
-    <w:abstractNumId w:val="40"/>
+    <w:abstractNumId w:val="41"/>
   </w:num>
   <w:num w:numId="14" w16cid:durableId="1059592124">
     <w:abstractNumId w:val="20"/>
@@ -13556,7 +15557,7 @@
     <w:abstractNumId w:val="25"/>
   </w:num>
   <w:num w:numId="18" w16cid:durableId="1390882741">
-    <w:abstractNumId w:val="41"/>
+    <w:abstractNumId w:val="42"/>
   </w:num>
   <w:num w:numId="19" w16cid:durableId="1705986544">
     <w:abstractNumId w:val="15"/>
@@ -13571,19 +15572,19 @@
     <w:abstractNumId w:val="6"/>
   </w:num>
   <w:num w:numId="23" w16cid:durableId="112331395">
-    <w:abstractNumId w:val="39"/>
+    <w:abstractNumId w:val="40"/>
   </w:num>
   <w:num w:numId="24" w16cid:durableId="1911377728">
     <w:abstractNumId w:val="28"/>
   </w:num>
   <w:num w:numId="25" w16cid:durableId="576789641">
-    <w:abstractNumId w:val="33"/>
+    <w:abstractNumId w:val="34"/>
   </w:num>
   <w:num w:numId="26" w16cid:durableId="1242645648">
     <w:abstractNumId w:val="5"/>
   </w:num>
   <w:num w:numId="27" w16cid:durableId="39788084">
-    <w:abstractNumId w:val="34"/>
+    <w:abstractNumId w:val="35"/>
   </w:num>
   <w:num w:numId="28" w16cid:durableId="1485971932">
     <w:abstractNumId w:val="16"/>
@@ -13595,19 +15596,19 @@
     <w:abstractNumId w:val="4"/>
   </w:num>
   <w:num w:numId="31" w16cid:durableId="637685252">
-    <w:abstractNumId w:val="38"/>
+    <w:abstractNumId w:val="39"/>
   </w:num>
   <w:num w:numId="32" w16cid:durableId="1697849803">
-    <w:abstractNumId w:val="31"/>
+    <w:abstractNumId w:val="32"/>
   </w:num>
   <w:num w:numId="33" w16cid:durableId="1183087171">
-    <w:abstractNumId w:val="35"/>
+    <w:abstractNumId w:val="36"/>
   </w:num>
   <w:num w:numId="34" w16cid:durableId="175537492">
     <w:abstractNumId w:val="0"/>
   </w:num>
   <w:num w:numId="35" w16cid:durableId="639576823">
-    <w:abstractNumId w:val="37"/>
+    <w:abstractNumId w:val="38"/>
   </w:num>
   <w:num w:numId="36" w16cid:durableId="411976258">
     <w:abstractNumId w:val="3"/>
@@ -13628,6 +15629,9 @@
     <w:abstractNumId w:val="17"/>
   </w:num>
   <w:num w:numId="42" w16cid:durableId="2015761938">
+    <w:abstractNumId w:val="30"/>
+  </w:num>
+  <w:num w:numId="43" w16cid:durableId="1657762772">
     <w:abstractNumId w:val="29"/>
   </w:num>
 </w:numbering>

</xml_diff>

<commit_message>
finding subarrays of an array
</commit_message>
<xml_diff>
--- a/Questions.docx
+++ b/Questions.docx
@@ -11672,8 +11672,94 @@
     </w:p>
     <w:p>
       <w:pPr>
+        <w:rPr>
+          <w:rFonts w:ascii="Times New Roman" w:hAnsi="Times New Roman" w:cs="Times New Roman"/>
+          <w:sz w:val="28"/>
+          <w:szCs w:val="22"/>
+        </w:rPr>
+      </w:pPr>
+      <w:r>
+        <w:rPr>
+          <w:rFonts w:ascii="Times New Roman" w:hAnsi="Times New Roman" w:cs="Times New Roman"/>
+          <w:sz w:val="28"/>
+          <w:szCs w:val="22"/>
+        </w:rPr>
+        <w:br w:type="page"/>
+      </w:r>
+    </w:p>
+    <w:p>
+      <w:pPr>
+        <w:pStyle w:val="IntenseQuote"/>
+        <w:rPr>
+          <w:rFonts w:ascii="Times New Roman" w:hAnsi="Times New Roman" w:cs="Times New Roman"/>
+        </w:rPr>
+      </w:pPr>
+      <w:r>
+        <w:rPr>
+          <w:rFonts w:ascii="Times New Roman" w:hAnsi="Times New Roman" w:cs="Times New Roman"/>
+        </w:rPr>
+        <w:lastRenderedPageBreak/>
+        <w:t>30 – Days Java Practice Set</w:t>
+      </w:r>
+      <w:r>
+        <w:rPr>
+          <w:rFonts w:ascii="Times New Roman" w:hAnsi="Times New Roman" w:cs="Times New Roman"/>
+        </w:rPr>
+        <w:t>-2</w:t>
+      </w:r>
+      <w:r>
+        <w:rPr>
+          <w:rFonts w:ascii="Times New Roman" w:hAnsi="Times New Roman" w:cs="Times New Roman"/>
+        </w:rPr>
+        <w:t xml:space="preserve"> Questions</w:t>
+      </w:r>
+    </w:p>
+    <w:p>
+      <w:pPr>
+        <w:rPr>
+          <w:rFonts w:ascii="Times New Roman" w:hAnsi="Times New Roman" w:cs="Times New Roman"/>
+          <w:sz w:val="28"/>
+          <w:szCs w:val="22"/>
+        </w:rPr>
+      </w:pPr>
+      <w:r>
+        <w:rPr>
+          <w:rFonts w:ascii="Times New Roman" w:hAnsi="Times New Roman" w:cs="Times New Roman"/>
+          <w:sz w:val="28"/>
+          <w:szCs w:val="22"/>
+        </w:rPr>
+        <w:t>Day 1.1</w:t>
+      </w:r>
+    </w:p>
+    <w:p>
+      <w:pPr>
         <w:pStyle w:val="ListParagraph"/>
-        <w:ind w:left="1080"/>
+        <w:numPr>
+          <w:ilvl w:val="0"/>
+          <w:numId w:val="44"/>
+        </w:numPr>
+        <w:rPr>
+          <w:rFonts w:ascii="Times New Roman" w:hAnsi="Times New Roman" w:cs="Times New Roman"/>
+          <w:sz w:val="28"/>
+          <w:szCs w:val="22"/>
+        </w:rPr>
+      </w:pPr>
+      <w:r>
+        <w:rPr>
+          <w:rFonts w:ascii="Times New Roman" w:hAnsi="Times New Roman" w:cs="Times New Roman"/>
+          <w:sz w:val="28"/>
+          <w:szCs w:val="22"/>
+        </w:rPr>
+        <w:t>Write a java program to find subarray in an array.</w:t>
+      </w:r>
+    </w:p>
+    <w:p>
+      <w:pPr>
+        <w:pStyle w:val="ListParagraph"/>
+        <w:numPr>
+          <w:ilvl w:val="0"/>
+          <w:numId w:val="44"/>
+        </w:numPr>
         <w:rPr>
           <w:rFonts w:ascii="Times New Roman" w:hAnsi="Times New Roman" w:cs="Times New Roman"/>
           <w:sz w:val="28"/>
@@ -12516,7 +12602,7 @@
   <w:abstractNum w:abstractNumId="8" w15:restartNumberingAfterBreak="0">
     <w:nsid w:val="1F1F31F2"/>
     <w:multiLevelType w:val="hybridMultilevel"/>
-    <w:tmpl w:val="86C0DA00"/>
+    <w:tmpl w:val="144E68CA"/>
     <w:lvl w:ilvl="0" w:tplc="0409000F">
       <w:start w:val="1"/>
       <w:numFmt w:val="decimal"/>
@@ -14688,6 +14774,95 @@
     </w:lvl>
   </w:abstractNum>
   <w:abstractNum w:abstractNumId="32" w15:restartNumberingAfterBreak="0">
+    <w:nsid w:val="63D93535"/>
+    <w:multiLevelType w:val="hybridMultilevel"/>
+    <w:tmpl w:val="1E564BA0"/>
+    <w:lvl w:ilvl="0" w:tplc="04208454">
+      <w:start w:val="1"/>
+      <w:numFmt w:val="decimal"/>
+      <w:lvlText w:val="%1."/>
+      <w:lvlJc w:val="left"/>
+      <w:pPr>
+        <w:ind w:left="1080" w:hanging="360"/>
+      </w:pPr>
+      <w:rPr>
+        <w:rFonts w:hint="default"/>
+      </w:rPr>
+    </w:lvl>
+    <w:lvl w:ilvl="1" w:tplc="04090019" w:tentative="1">
+      <w:start w:val="1"/>
+      <w:numFmt w:val="lowerLetter"/>
+      <w:lvlText w:val="%2."/>
+      <w:lvlJc w:val="left"/>
+      <w:pPr>
+        <w:ind w:left="1800" w:hanging="360"/>
+      </w:pPr>
+    </w:lvl>
+    <w:lvl w:ilvl="2" w:tplc="0409001B" w:tentative="1">
+      <w:start w:val="1"/>
+      <w:numFmt w:val="lowerRoman"/>
+      <w:lvlText w:val="%3."/>
+      <w:lvlJc w:val="right"/>
+      <w:pPr>
+        <w:ind w:left="2520" w:hanging="180"/>
+      </w:pPr>
+    </w:lvl>
+    <w:lvl w:ilvl="3" w:tplc="0409000F" w:tentative="1">
+      <w:start w:val="1"/>
+      <w:numFmt w:val="decimal"/>
+      <w:lvlText w:val="%4."/>
+      <w:lvlJc w:val="left"/>
+      <w:pPr>
+        <w:ind w:left="3240" w:hanging="360"/>
+      </w:pPr>
+    </w:lvl>
+    <w:lvl w:ilvl="4" w:tplc="04090019" w:tentative="1">
+      <w:start w:val="1"/>
+      <w:numFmt w:val="lowerLetter"/>
+      <w:lvlText w:val="%5."/>
+      <w:lvlJc w:val="left"/>
+      <w:pPr>
+        <w:ind w:left="3960" w:hanging="360"/>
+      </w:pPr>
+    </w:lvl>
+    <w:lvl w:ilvl="5" w:tplc="0409001B" w:tentative="1">
+      <w:start w:val="1"/>
+      <w:numFmt w:val="lowerRoman"/>
+      <w:lvlText w:val="%6."/>
+      <w:lvlJc w:val="right"/>
+      <w:pPr>
+        <w:ind w:left="4680" w:hanging="180"/>
+      </w:pPr>
+    </w:lvl>
+    <w:lvl w:ilvl="6" w:tplc="0409000F" w:tentative="1">
+      <w:start w:val="1"/>
+      <w:numFmt w:val="decimal"/>
+      <w:lvlText w:val="%7."/>
+      <w:lvlJc w:val="left"/>
+      <w:pPr>
+        <w:ind w:left="5400" w:hanging="360"/>
+      </w:pPr>
+    </w:lvl>
+    <w:lvl w:ilvl="7" w:tplc="04090019" w:tentative="1">
+      <w:start w:val="1"/>
+      <w:numFmt w:val="lowerLetter"/>
+      <w:lvlText w:val="%8."/>
+      <w:lvlJc w:val="left"/>
+      <w:pPr>
+        <w:ind w:left="6120" w:hanging="360"/>
+      </w:pPr>
+    </w:lvl>
+    <w:lvl w:ilvl="8" w:tplc="0409001B" w:tentative="1">
+      <w:start w:val="1"/>
+      <w:numFmt w:val="lowerRoman"/>
+      <w:lvlText w:val="%9."/>
+      <w:lvlJc w:val="right"/>
+      <w:pPr>
+        <w:ind w:left="6840" w:hanging="180"/>
+      </w:pPr>
+    </w:lvl>
+  </w:abstractNum>
+  <w:abstractNum w:abstractNumId="33" w15:restartNumberingAfterBreak="0">
     <w:nsid w:val="6936075D"/>
     <w:multiLevelType w:val="hybridMultilevel"/>
     <w:tmpl w:val="385CB13E"/>
@@ -14778,7 +14953,7 @@
       </w:pPr>
     </w:lvl>
   </w:abstractNum>
-  <w:abstractNum w:abstractNumId="33" w15:restartNumberingAfterBreak="0">
+  <w:abstractNum w:abstractNumId="34" w15:restartNumberingAfterBreak="0">
     <w:nsid w:val="6AAA50FA"/>
     <w:multiLevelType w:val="hybridMultilevel"/>
     <w:tmpl w:val="829279AA"/>
@@ -14864,7 +15039,7 @@
       </w:pPr>
     </w:lvl>
   </w:abstractNum>
-  <w:abstractNum w:abstractNumId="34" w15:restartNumberingAfterBreak="0">
+  <w:abstractNum w:abstractNumId="35" w15:restartNumberingAfterBreak="0">
     <w:nsid w:val="6CD86F84"/>
     <w:multiLevelType w:val="multilevel"/>
     <w:tmpl w:val="EB06CA30"/>
@@ -15013,7 +15188,7 @@
       </w:rPr>
     </w:lvl>
   </w:abstractNum>
-  <w:abstractNum w:abstractNumId="35" w15:restartNumberingAfterBreak="0">
+  <w:abstractNum w:abstractNumId="36" w15:restartNumberingAfterBreak="0">
     <w:nsid w:val="6FB84637"/>
     <w:multiLevelType w:val="hybridMultilevel"/>
     <w:tmpl w:val="FCBE904E"/>
@@ -15099,7 +15274,7 @@
       </w:pPr>
     </w:lvl>
   </w:abstractNum>
-  <w:abstractNum w:abstractNumId="36" w15:restartNumberingAfterBreak="0">
+  <w:abstractNum w:abstractNumId="37" w15:restartNumberingAfterBreak="0">
     <w:nsid w:val="70BD47EB"/>
     <w:multiLevelType w:val="multilevel"/>
     <w:tmpl w:val="67CC5774"/>
@@ -15212,7 +15387,7 @@
       </w:pPr>
     </w:lvl>
   </w:abstractNum>
-  <w:abstractNum w:abstractNumId="37" w15:restartNumberingAfterBreak="0">
+  <w:abstractNum w:abstractNumId="38" w15:restartNumberingAfterBreak="0">
     <w:nsid w:val="72E21C6C"/>
     <w:multiLevelType w:val="hybridMultilevel"/>
     <w:tmpl w:val="A548623A"/>
@@ -15298,7 +15473,7 @@
       </w:pPr>
     </w:lvl>
   </w:abstractNum>
-  <w:abstractNum w:abstractNumId="38" w15:restartNumberingAfterBreak="0">
+  <w:abstractNum w:abstractNumId="39" w15:restartNumberingAfterBreak="0">
     <w:nsid w:val="78995124"/>
     <w:multiLevelType w:val="multilevel"/>
     <w:tmpl w:val="43FED306"/>
@@ -15447,7 +15622,7 @@
       </w:rPr>
     </w:lvl>
   </w:abstractNum>
-  <w:abstractNum w:abstractNumId="39" w15:restartNumberingAfterBreak="0">
+  <w:abstractNum w:abstractNumId="40" w15:restartNumberingAfterBreak="0">
     <w:nsid w:val="79521D66"/>
     <w:multiLevelType w:val="hybridMultilevel"/>
     <w:tmpl w:val="E86064F8"/>
@@ -15536,7 +15711,7 @@
       </w:pPr>
     </w:lvl>
   </w:abstractNum>
-  <w:abstractNum w:abstractNumId="40" w15:restartNumberingAfterBreak="0">
+  <w:abstractNum w:abstractNumId="41" w15:restartNumberingAfterBreak="0">
     <w:nsid w:val="79527ECA"/>
     <w:multiLevelType w:val="hybridMultilevel"/>
     <w:tmpl w:val="D5383D20"/>
@@ -15622,7 +15797,7 @@
       </w:pPr>
     </w:lvl>
   </w:abstractNum>
-  <w:abstractNum w:abstractNumId="41" w15:restartNumberingAfterBreak="0">
+  <w:abstractNum w:abstractNumId="42" w15:restartNumberingAfterBreak="0">
     <w:nsid w:val="7ABA1038"/>
     <w:multiLevelType w:val="hybridMultilevel"/>
     <w:tmpl w:val="CAE67AD6"/>
@@ -15708,7 +15883,7 @@
       </w:pPr>
     </w:lvl>
   </w:abstractNum>
-  <w:abstractNum w:abstractNumId="42" w15:restartNumberingAfterBreak="0">
+  <w:abstractNum w:abstractNumId="43" w15:restartNumberingAfterBreak="0">
     <w:nsid w:val="7FBE6D6A"/>
     <w:multiLevelType w:val="hybridMultilevel"/>
     <w:tmpl w:val="7D3272E4"/>
@@ -15813,13 +15988,13 @@
     <w:abstractNumId w:val="9"/>
   </w:num>
   <w:num w:numId="7" w16cid:durableId="1879052598">
-    <w:abstractNumId w:val="33"/>
+    <w:abstractNumId w:val="34"/>
   </w:num>
   <w:num w:numId="8" w16cid:durableId="1749188025">
     <w:abstractNumId w:val="14"/>
   </w:num>
   <w:num w:numId="9" w16cid:durableId="101462200">
-    <w:abstractNumId w:val="37"/>
+    <w:abstractNumId w:val="38"/>
   </w:num>
   <w:num w:numId="10" w16cid:durableId="57170953">
     <w:abstractNumId w:val="1"/>
@@ -15831,7 +16006,7 @@
     <w:abstractNumId w:val="31"/>
   </w:num>
   <w:num w:numId="13" w16cid:durableId="192882122">
-    <w:abstractNumId w:val="41"/>
+    <w:abstractNumId w:val="42"/>
   </w:num>
   <w:num w:numId="14" w16cid:durableId="1059592124">
     <w:abstractNumId w:val="20"/>
@@ -15846,7 +16021,7 @@
     <w:abstractNumId w:val="25"/>
   </w:num>
   <w:num w:numId="18" w16cid:durableId="1390882741">
-    <w:abstractNumId w:val="42"/>
+    <w:abstractNumId w:val="43"/>
   </w:num>
   <w:num w:numId="19" w16cid:durableId="1705986544">
     <w:abstractNumId w:val="15"/>
@@ -15861,19 +16036,19 @@
     <w:abstractNumId w:val="6"/>
   </w:num>
   <w:num w:numId="23" w16cid:durableId="112331395">
-    <w:abstractNumId w:val="40"/>
+    <w:abstractNumId w:val="41"/>
   </w:num>
   <w:num w:numId="24" w16cid:durableId="1911377728">
     <w:abstractNumId w:val="28"/>
   </w:num>
   <w:num w:numId="25" w16cid:durableId="576789641">
-    <w:abstractNumId w:val="34"/>
+    <w:abstractNumId w:val="35"/>
   </w:num>
   <w:num w:numId="26" w16cid:durableId="1242645648">
     <w:abstractNumId w:val="5"/>
   </w:num>
   <w:num w:numId="27" w16cid:durableId="39788084">
-    <w:abstractNumId w:val="35"/>
+    <w:abstractNumId w:val="36"/>
   </w:num>
   <w:num w:numId="28" w16cid:durableId="1485971932">
     <w:abstractNumId w:val="16"/>
@@ -15885,19 +16060,19 @@
     <w:abstractNumId w:val="4"/>
   </w:num>
   <w:num w:numId="31" w16cid:durableId="637685252">
-    <w:abstractNumId w:val="39"/>
+    <w:abstractNumId w:val="40"/>
   </w:num>
   <w:num w:numId="32" w16cid:durableId="1697849803">
-    <w:abstractNumId w:val="32"/>
+    <w:abstractNumId w:val="33"/>
   </w:num>
   <w:num w:numId="33" w16cid:durableId="1183087171">
-    <w:abstractNumId w:val="36"/>
+    <w:abstractNumId w:val="37"/>
   </w:num>
   <w:num w:numId="34" w16cid:durableId="175537492">
     <w:abstractNumId w:val="0"/>
   </w:num>
   <w:num w:numId="35" w16cid:durableId="639576823">
-    <w:abstractNumId w:val="38"/>
+    <w:abstractNumId w:val="39"/>
   </w:num>
   <w:num w:numId="36" w16cid:durableId="411976258">
     <w:abstractNumId w:val="3"/>
@@ -15922,6 +16097,9 @@
   </w:num>
   <w:num w:numId="43" w16cid:durableId="1657762772">
     <w:abstractNumId w:val="29"/>
+  </w:num>
+  <w:num w:numId="44" w16cid:durableId="969361359">
+    <w:abstractNumId w:val="32"/>
   </w:num>
 </w:numbering>
 </file>
@@ -16527,6 +16705,7 @@
   <w:style w:type="character" w:default="1" w:styleId="DefaultParagraphFont">
     <w:name w:val="Default Paragraph Font"/>
     <w:uiPriority w:val="1"/>
+    <w:semiHidden/>
     <w:unhideWhenUsed/>
   </w:style>
   <w:style w:type="table" w:default="1" w:styleId="TableNormal">

</xml_diff>

<commit_message>
Prefix sum and suffix sum
</commit_message>
<xml_diff>
--- a/Questions.docx
+++ b/Questions.docx
@@ -274,6 +274,7 @@
         </w:rPr>
         <w:br/>
       </w:r>
+      <w:proofErr w:type="spellStart"/>
       <w:proofErr w:type="gramStart"/>
       <w:r>
         <w:rPr>
@@ -281,7 +282,16 @@
           <w:color w:val="000000"/>
           <w:szCs w:val="24"/>
         </w:rPr>
-        <w:t>stringTimes(</w:t>
+        <w:t>stringTimes</w:t>
+      </w:r>
+      <w:proofErr w:type="spellEnd"/>
+      <w:r>
+        <w:rPr>
+          <w:rFonts w:ascii="Verdana" w:hAnsi="Verdana"/>
+          <w:color w:val="000000"/>
+          <w:szCs w:val="24"/>
+        </w:rPr>
+        <w:t>(</w:t>
       </w:r>
       <w:proofErr w:type="gramEnd"/>
       <w:r>
@@ -306,7 +316,25 @@
           <w:color w:val="000000"/>
           <w:szCs w:val="24"/>
         </w:rPr>
-        <w:t xml:space="preserve"> "HiHi"</w:t>
+        <w:t xml:space="preserve"> "</w:t>
+      </w:r>
+      <w:proofErr w:type="spellStart"/>
+      <w:r>
+        <w:rPr>
+          <w:rFonts w:ascii="Verdana" w:hAnsi="Verdana"/>
+          <w:color w:val="000000"/>
+          <w:szCs w:val="24"/>
+        </w:rPr>
+        <w:t>HiHi</w:t>
+      </w:r>
+      <w:proofErr w:type="spellEnd"/>
+      <w:r>
+        <w:rPr>
+          <w:rFonts w:ascii="Verdana" w:hAnsi="Verdana"/>
+          <w:color w:val="000000"/>
+          <w:szCs w:val="24"/>
+        </w:rPr>
+        <w:t>"</w:t>
       </w:r>
       <w:r>
         <w:rPr>
@@ -316,6 +344,7 @@
         </w:rPr>
         <w:br/>
       </w:r>
+      <w:proofErr w:type="spellStart"/>
       <w:proofErr w:type="gramStart"/>
       <w:r>
         <w:rPr>
@@ -323,7 +352,16 @@
           <w:color w:val="000000"/>
           <w:szCs w:val="24"/>
         </w:rPr>
-        <w:t>stringTimes(</w:t>
+        <w:t>stringTimes</w:t>
+      </w:r>
+      <w:proofErr w:type="spellEnd"/>
+      <w:r>
+        <w:rPr>
+          <w:rFonts w:ascii="Verdana" w:hAnsi="Verdana"/>
+          <w:color w:val="000000"/>
+          <w:szCs w:val="24"/>
+        </w:rPr>
+        <w:t>(</w:t>
       </w:r>
       <w:proofErr w:type="gramEnd"/>
       <w:r>
@@ -348,7 +386,25 @@
           <w:color w:val="000000"/>
           <w:szCs w:val="24"/>
         </w:rPr>
-        <w:t xml:space="preserve"> "HiHiHi"</w:t>
+        <w:t xml:space="preserve"> "</w:t>
+      </w:r>
+      <w:proofErr w:type="spellStart"/>
+      <w:r>
+        <w:rPr>
+          <w:rFonts w:ascii="Verdana" w:hAnsi="Verdana"/>
+          <w:color w:val="000000"/>
+          <w:szCs w:val="24"/>
+        </w:rPr>
+        <w:t>HiHiHi</w:t>
+      </w:r>
+      <w:proofErr w:type="spellEnd"/>
+      <w:r>
+        <w:rPr>
+          <w:rFonts w:ascii="Verdana" w:hAnsi="Verdana"/>
+          <w:color w:val="000000"/>
+          <w:szCs w:val="24"/>
+        </w:rPr>
+        <w:t>"</w:t>
       </w:r>
       <w:r>
         <w:rPr>
@@ -358,6 +414,7 @@
         </w:rPr>
         <w:br/>
       </w:r>
+      <w:proofErr w:type="spellStart"/>
       <w:proofErr w:type="gramStart"/>
       <w:r>
         <w:rPr>
@@ -365,7 +422,16 @@
           <w:color w:val="000000"/>
           <w:szCs w:val="24"/>
         </w:rPr>
-        <w:t>stringTimes(</w:t>
+        <w:t>stringTimes</w:t>
+      </w:r>
+      <w:proofErr w:type="spellEnd"/>
+      <w:r>
+        <w:rPr>
+          <w:rFonts w:ascii="Verdana" w:hAnsi="Verdana"/>
+          <w:color w:val="000000"/>
+          <w:szCs w:val="24"/>
+        </w:rPr>
+        <w:t>(</w:t>
       </w:r>
       <w:proofErr w:type="gramEnd"/>
       <w:r>
@@ -1155,6 +1221,7 @@
         </w:rPr>
         <w:t xml:space="preserve">Write a program to reverse the order of words in a string entered, for </w:t>
       </w:r>
+      <w:proofErr w:type="spellStart"/>
       <w:proofErr w:type="gramStart"/>
       <w:r>
         <w:rPr>
@@ -1163,7 +1230,17 @@
           <w:sz w:val="24"/>
           <w:szCs w:val="24"/>
         </w:rPr>
-        <w:t>eg :</w:t>
+        <w:t>eg</w:t>
+      </w:r>
+      <w:proofErr w:type="spellEnd"/>
+      <w:r>
+        <w:rPr>
+          <w:rFonts w:ascii="Verdana" w:hAnsi="Verdana"/>
+          <w:color w:val="000000"/>
+          <w:sz w:val="24"/>
+          <w:szCs w:val="24"/>
+        </w:rPr>
+        <w:t xml:space="preserve"> :</w:t>
       </w:r>
       <w:proofErr w:type="gramEnd"/>
       <w:r>
@@ -1738,7 +1815,31 @@
           <w:sz w:val="24"/>
           <w:szCs w:val="24"/>
         </w:rPr>
-        <w:t>only even digits</w:t>
+        <w:t xml:space="preserve">only </w:t>
+      </w:r>
+      <w:proofErr w:type="spellStart"/>
+      <w:r>
+        <w:rPr>
+          <w:rFonts w:ascii="Verdana" w:hAnsi="Verdana"/>
+          <w:b/>
+          <w:bCs/>
+          <w:color w:val="000000"/>
+          <w:sz w:val="24"/>
+          <w:szCs w:val="24"/>
+        </w:rPr>
+        <w:t>even</w:t>
+      </w:r>
+      <w:proofErr w:type="spellEnd"/>
+      <w:r>
+        <w:rPr>
+          <w:rFonts w:ascii="Verdana" w:hAnsi="Verdana"/>
+          <w:b/>
+          <w:bCs/>
+          <w:color w:val="000000"/>
+          <w:sz w:val="24"/>
+          <w:szCs w:val="24"/>
+        </w:rPr>
+        <w:t xml:space="preserve"> digits</w:t>
       </w:r>
       <w:r>
         <w:rPr>
@@ -2336,7 +2437,27 @@
           <w:sz w:val="24"/>
           <w:szCs w:val="24"/>
         </w:rPr>
-        <w:t>No Stringbuilder) (</w:t>
+        <w:t xml:space="preserve">No </w:t>
+      </w:r>
+      <w:proofErr w:type="spellStart"/>
+      <w:r>
+        <w:rPr>
+          <w:rFonts w:ascii="Verdana" w:hAnsi="Verdana"/>
+          <w:color w:val="000000"/>
+          <w:sz w:val="24"/>
+          <w:szCs w:val="24"/>
+        </w:rPr>
+        <w:t>Stringbuilder</w:t>
+      </w:r>
+      <w:proofErr w:type="spellEnd"/>
+      <w:r>
+        <w:rPr>
+          <w:rFonts w:ascii="Verdana" w:hAnsi="Verdana"/>
+          <w:color w:val="000000"/>
+          <w:sz w:val="24"/>
+          <w:szCs w:val="24"/>
+        </w:rPr>
+        <w:t>) (</w:t>
       </w:r>
       <w:r>
         <w:rPr>
@@ -2610,6 +2731,7 @@
         </w:rPr>
         <w:t xml:space="preserve">Traverse an </w:t>
       </w:r>
+      <w:proofErr w:type="spellStart"/>
       <w:proofErr w:type="gramStart"/>
       <w:r>
         <w:rPr>
@@ -2620,6 +2742,7 @@
         </w:rPr>
         <w:t>array.If</w:t>
       </w:r>
+      <w:proofErr w:type="spellEnd"/>
       <w:proofErr w:type="gramEnd"/>
       <w:r>
         <w:rPr>
@@ -3387,7 +3510,27 @@
           <w:sz w:val="24"/>
           <w:szCs w:val="24"/>
         </w:rPr>
-        <w:t xml:space="preserve"> thousand etc….</w:t>
+        <w:t xml:space="preserve"> thousand </w:t>
+      </w:r>
+      <w:proofErr w:type="spellStart"/>
+      <w:r>
+        <w:rPr>
+          <w:rFonts w:ascii="Verdana" w:hAnsi="Verdana"/>
+          <w:color w:val="000000"/>
+          <w:sz w:val="24"/>
+          <w:szCs w:val="24"/>
+        </w:rPr>
+        <w:t>etc</w:t>
+      </w:r>
+      <w:proofErr w:type="spellEnd"/>
+      <w:r>
+        <w:rPr>
+          <w:rFonts w:ascii="Verdana" w:hAnsi="Verdana"/>
+          <w:color w:val="000000"/>
+          <w:sz w:val="24"/>
+          <w:szCs w:val="24"/>
+        </w:rPr>
+        <w:t>….</w:t>
       </w:r>
     </w:p>
     <w:p>
@@ -3431,7 +3574,27 @@
           <w:sz w:val="24"/>
           <w:szCs w:val="24"/>
         </w:rPr>
-        <w:t xml:space="preserve"> and in output just reverse string upto that integer position part, or that prefix </w:t>
+        <w:t xml:space="preserve"> and in output just reverse string </w:t>
+      </w:r>
+      <w:proofErr w:type="spellStart"/>
+      <w:r>
+        <w:rPr>
+          <w:rFonts w:ascii="Verdana" w:hAnsi="Verdana"/>
+          <w:color w:val="000000"/>
+          <w:sz w:val="24"/>
+          <w:szCs w:val="24"/>
+        </w:rPr>
+        <w:t>upto</w:t>
+      </w:r>
+      <w:proofErr w:type="spellEnd"/>
+      <w:r>
+        <w:rPr>
+          <w:rFonts w:ascii="Verdana" w:hAnsi="Verdana"/>
+          <w:color w:val="000000"/>
+          <w:sz w:val="24"/>
+          <w:szCs w:val="24"/>
+        </w:rPr>
+        <w:t xml:space="preserve"> that integer position part, or that prefix </w:t>
       </w:r>
       <w:proofErr w:type="gramStart"/>
       <w:r>
@@ -4891,8 +5054,9 @@
           <w:szCs w:val="20"/>
           <w14:ligatures w14:val="none"/>
         </w:rPr>
-        <w:t>Given an array of integers nums and an integer target, return indices of the two numbers such that they add up to target.</w:t>
-      </w:r>
+        <w:t xml:space="preserve">Given an array of integers </w:t>
+      </w:r>
+      <w:proofErr w:type="spellStart"/>
       <w:r>
         <w:rPr>
           <w:rFonts w:ascii="Courier New" w:eastAsia="Times New Roman" w:hAnsi="Courier New" w:cs="Courier New"/>
@@ -4902,8 +5066,9 @@
           <w:szCs w:val="20"/>
           <w14:ligatures w14:val="none"/>
         </w:rPr>
-        <w:br/>
-      </w:r>
+        <w:t>nums</w:t>
+      </w:r>
+      <w:proofErr w:type="spellEnd"/>
       <w:r>
         <w:rPr>
           <w:rFonts w:ascii="Courier New" w:eastAsia="Times New Roman" w:hAnsi="Courier New" w:cs="Courier New"/>
@@ -4913,6 +5078,28 @@
           <w:szCs w:val="20"/>
           <w14:ligatures w14:val="none"/>
         </w:rPr>
+        <w:t xml:space="preserve"> and an integer target, return indices of the two numbers such that they add up to target.</w:t>
+      </w:r>
+      <w:r>
+        <w:rPr>
+          <w:rFonts w:ascii="Courier New" w:eastAsia="Times New Roman" w:hAnsi="Courier New" w:cs="Courier New"/>
+          <w:color w:val="F2F2F2" w:themeColor="background1" w:themeShade="F2"/>
+          <w:kern w:val="0"/>
+          <w:sz w:val="20"/>
+          <w:szCs w:val="20"/>
+          <w14:ligatures w14:val="none"/>
+        </w:rPr>
+        <w:br/>
+      </w:r>
+      <w:r>
+        <w:rPr>
+          <w:rFonts w:ascii="Courier New" w:eastAsia="Times New Roman" w:hAnsi="Courier New" w:cs="Courier New"/>
+          <w:color w:val="F2F2F2" w:themeColor="background1" w:themeShade="F2"/>
+          <w:kern w:val="0"/>
+          <w:sz w:val="20"/>
+          <w:szCs w:val="20"/>
+          <w14:ligatures w14:val="none"/>
+        </w:rPr>
         <w:br/>
         <w:t>You may assume that each input would have exactly one solution, and you may not use the same element twice.</w:t>
       </w:r>
@@ -4961,8 +5148,9 @@
           <w14:ligatures w14:val="none"/>
         </w:rPr>
         <w:br/>
-        <w:t>Input: nums = [2,7,11,15], target = 9</w:t>
-      </w:r>
+        <w:t xml:space="preserve">Input: </w:t>
+      </w:r>
+      <w:proofErr w:type="spellStart"/>
       <w:r>
         <w:rPr>
           <w:rFonts w:ascii="Courier New" w:eastAsia="Times New Roman" w:hAnsi="Courier New" w:cs="Courier New"/>
@@ -4972,6 +5160,29 @@
           <w:szCs w:val="20"/>
           <w14:ligatures w14:val="none"/>
         </w:rPr>
+        <w:t>nums</w:t>
+      </w:r>
+      <w:proofErr w:type="spellEnd"/>
+      <w:r>
+        <w:rPr>
+          <w:rFonts w:ascii="Courier New" w:eastAsia="Times New Roman" w:hAnsi="Courier New" w:cs="Courier New"/>
+          <w:color w:val="F2F2F2" w:themeColor="background1" w:themeShade="F2"/>
+          <w:kern w:val="0"/>
+          <w:sz w:val="20"/>
+          <w:szCs w:val="20"/>
+          <w14:ligatures w14:val="none"/>
+        </w:rPr>
+        <w:t xml:space="preserve"> = [2,7,11,15], target = 9</w:t>
+      </w:r>
+      <w:r>
+        <w:rPr>
+          <w:rFonts w:ascii="Courier New" w:eastAsia="Times New Roman" w:hAnsi="Courier New" w:cs="Courier New"/>
+          <w:color w:val="F2F2F2" w:themeColor="background1" w:themeShade="F2"/>
+          <w:kern w:val="0"/>
+          <w:sz w:val="20"/>
+          <w:szCs w:val="20"/>
+          <w14:ligatures w14:val="none"/>
+        </w:rPr>
         <w:br/>
         <w:t>Output: [0,1]</w:t>
       </w:r>
@@ -4985,8 +5196,9 @@
           <w14:ligatures w14:val="none"/>
         </w:rPr>
         <w:br/>
-        <w:t>Explanation: Because nums[0] + nums[1] == 9, we return [0, 1].</w:t>
-      </w:r>
+        <w:t xml:space="preserve">Explanation: Because </w:t>
+      </w:r>
+      <w:proofErr w:type="spellStart"/>
       <w:r>
         <w:rPr>
           <w:rFonts w:ascii="Courier New" w:eastAsia="Times New Roman" w:hAnsi="Courier New" w:cs="Courier New"/>
@@ -4996,6 +5208,53 @@
           <w:szCs w:val="20"/>
           <w14:ligatures w14:val="none"/>
         </w:rPr>
+        <w:t>nums</w:t>
+      </w:r>
+      <w:proofErr w:type="spellEnd"/>
+      <w:r>
+        <w:rPr>
+          <w:rFonts w:ascii="Courier New" w:eastAsia="Times New Roman" w:hAnsi="Courier New" w:cs="Courier New"/>
+          <w:color w:val="F2F2F2" w:themeColor="background1" w:themeShade="F2"/>
+          <w:kern w:val="0"/>
+          <w:sz w:val="20"/>
+          <w:szCs w:val="20"/>
+          <w14:ligatures w14:val="none"/>
+        </w:rPr>
+        <w:t xml:space="preserve">[0] + </w:t>
+      </w:r>
+      <w:proofErr w:type="spellStart"/>
+      <w:r>
+        <w:rPr>
+          <w:rFonts w:ascii="Courier New" w:eastAsia="Times New Roman" w:hAnsi="Courier New" w:cs="Courier New"/>
+          <w:color w:val="F2F2F2" w:themeColor="background1" w:themeShade="F2"/>
+          <w:kern w:val="0"/>
+          <w:sz w:val="20"/>
+          <w:szCs w:val="20"/>
+          <w14:ligatures w14:val="none"/>
+        </w:rPr>
+        <w:t>nums</w:t>
+      </w:r>
+      <w:proofErr w:type="spellEnd"/>
+      <w:r>
+        <w:rPr>
+          <w:rFonts w:ascii="Courier New" w:eastAsia="Times New Roman" w:hAnsi="Courier New" w:cs="Courier New"/>
+          <w:color w:val="F2F2F2" w:themeColor="background1" w:themeShade="F2"/>
+          <w:kern w:val="0"/>
+          <w:sz w:val="20"/>
+          <w:szCs w:val="20"/>
+          <w14:ligatures w14:val="none"/>
+        </w:rPr>
+        <w:t>[1] == 9, we return [0, 1].</w:t>
+      </w:r>
+      <w:r>
+        <w:rPr>
+          <w:rFonts w:ascii="Courier New" w:eastAsia="Times New Roman" w:hAnsi="Courier New" w:cs="Courier New"/>
+          <w:color w:val="F2F2F2" w:themeColor="background1" w:themeShade="F2"/>
+          <w:kern w:val="0"/>
+          <w:sz w:val="20"/>
+          <w:szCs w:val="20"/>
+          <w14:ligatures w14:val="none"/>
+        </w:rPr>
         <w:br/>
         <w:t>Example 2:</w:t>
       </w:r>
@@ -5009,7 +5268,31 @@
           <w14:ligatures w14:val="none"/>
         </w:rPr>
         <w:br/>
-        <w:t>Input: nums = [3,2,4], target = 6</w:t>
+        <w:t xml:space="preserve">Input: </w:t>
+      </w:r>
+      <w:proofErr w:type="spellStart"/>
+      <w:r>
+        <w:rPr>
+          <w:rFonts w:ascii="Courier New" w:eastAsia="Times New Roman" w:hAnsi="Courier New" w:cs="Courier New"/>
+          <w:color w:val="F2F2F2" w:themeColor="background1" w:themeShade="F2"/>
+          <w:kern w:val="0"/>
+          <w:sz w:val="20"/>
+          <w:szCs w:val="20"/>
+          <w14:ligatures w14:val="none"/>
+        </w:rPr>
+        <w:t>nums</w:t>
+      </w:r>
+      <w:proofErr w:type="spellEnd"/>
+      <w:r>
+        <w:rPr>
+          <w:rFonts w:ascii="Courier New" w:eastAsia="Times New Roman" w:hAnsi="Courier New" w:cs="Courier New"/>
+          <w:color w:val="F2F2F2" w:themeColor="background1" w:themeShade="F2"/>
+          <w:kern w:val="0"/>
+          <w:sz w:val="20"/>
+          <w:szCs w:val="20"/>
+          <w14:ligatures w14:val="none"/>
+        </w:rPr>
+        <w:t xml:space="preserve"> = [3,2,4], target = 6</w:t>
       </w:r>
       <w:r>
         <w:rPr>
@@ -6107,6 +6390,7 @@
         </w:rPr>
         <w:t xml:space="preserve">Use  </w:t>
       </w:r>
+      <w:proofErr w:type="spellStart"/>
       <w:r>
         <w:rPr>
           <w:rFonts w:ascii="Verdana" w:hAnsi="Verdana"/>
@@ -6116,6 +6400,7 @@
         </w:rPr>
         <w:t>toCharArray</w:t>
       </w:r>
+      <w:proofErr w:type="spellEnd"/>
       <w:proofErr w:type="gramEnd"/>
       <w:r>
         <w:rPr>
@@ -6124,16 +6409,56 @@
           <w:sz w:val="24"/>
           <w:szCs w:val="24"/>
         </w:rPr>
-        <w:t>(), Arrays.sort()</w:t>
-      </w:r>
-      <w:r>
-        <w:rPr>
-          <w:rFonts w:ascii="Verdana" w:hAnsi="Verdana"/>
-          <w:color w:val="000000"/>
-          <w:sz w:val="24"/>
-          <w:szCs w:val="24"/>
-        </w:rPr>
-        <w:t>, Arrays.equal()</w:t>
+        <w:t xml:space="preserve">(), </w:t>
+      </w:r>
+      <w:proofErr w:type="spellStart"/>
+      <w:r>
+        <w:rPr>
+          <w:rFonts w:ascii="Verdana" w:hAnsi="Verdana"/>
+          <w:color w:val="000000"/>
+          <w:sz w:val="24"/>
+          <w:szCs w:val="24"/>
+        </w:rPr>
+        <w:t>Arrays.sort</w:t>
+      </w:r>
+      <w:proofErr w:type="spellEnd"/>
+      <w:r>
+        <w:rPr>
+          <w:rFonts w:ascii="Verdana" w:hAnsi="Verdana"/>
+          <w:color w:val="000000"/>
+          <w:sz w:val="24"/>
+          <w:szCs w:val="24"/>
+        </w:rPr>
+        <w:t>()</w:t>
+      </w:r>
+      <w:r>
+        <w:rPr>
+          <w:rFonts w:ascii="Verdana" w:hAnsi="Verdana"/>
+          <w:color w:val="000000"/>
+          <w:sz w:val="24"/>
+          <w:szCs w:val="24"/>
+        </w:rPr>
+        <w:t xml:space="preserve">, </w:t>
+      </w:r>
+      <w:proofErr w:type="spellStart"/>
+      <w:r>
+        <w:rPr>
+          <w:rFonts w:ascii="Verdana" w:hAnsi="Verdana"/>
+          <w:color w:val="000000"/>
+          <w:sz w:val="24"/>
+          <w:szCs w:val="24"/>
+        </w:rPr>
+        <w:t>Arrays.equal</w:t>
+      </w:r>
+      <w:proofErr w:type="spellEnd"/>
+      <w:r>
+        <w:rPr>
+          <w:rFonts w:ascii="Verdana" w:hAnsi="Verdana"/>
+          <w:color w:val="000000"/>
+          <w:sz w:val="24"/>
+          <w:szCs w:val="24"/>
+        </w:rPr>
+        <w:t>()</w:t>
       </w:r>
       <w:r>
         <w:rPr>
@@ -6198,8 +6523,18 @@
           <w:color w:val="000000"/>
           <w:szCs w:val="24"/>
         </w:rPr>
-        <w:t>Input: "swiss</w:t>
-      </w:r>
+        <w:t>Input: "</w:t>
+      </w:r>
+      <w:proofErr w:type="spellStart"/>
+      <w:r>
+        <w:rPr>
+          <w:rFonts w:ascii="Verdana" w:hAnsi="Verdana"/>
+          <w:color w:val="000000"/>
+          <w:szCs w:val="24"/>
+        </w:rPr>
+        <w:t>swiss</w:t>
+      </w:r>
+      <w:proofErr w:type="spellEnd"/>
       <w:proofErr w:type="gramStart"/>
       <w:r>
         <w:rPr>
@@ -6358,7 +6693,27 @@
           <w:sz w:val="24"/>
           <w:szCs w:val="24"/>
         </w:rPr>
-        <w:t>0(Array and Arraylist)</w:t>
+        <w:t xml:space="preserve">0(Array and </w:t>
+      </w:r>
+      <w:proofErr w:type="spellStart"/>
+      <w:r>
+        <w:rPr>
+          <w:rFonts w:ascii="Verdana" w:hAnsi="Verdana"/>
+          <w:color w:val="000000"/>
+          <w:sz w:val="24"/>
+          <w:szCs w:val="24"/>
+        </w:rPr>
+        <w:t>Arraylist</w:t>
+      </w:r>
+      <w:proofErr w:type="spellEnd"/>
+      <w:r>
+        <w:rPr>
+          <w:rFonts w:ascii="Verdana" w:hAnsi="Verdana"/>
+          <w:color w:val="000000"/>
+          <w:sz w:val="24"/>
+          <w:szCs w:val="24"/>
+        </w:rPr>
+        <w:t>)</w:t>
       </w:r>
     </w:p>
     <w:p>
@@ -7270,7 +7625,29 @@
           <w:szCs w:val="20"/>
           <w14:ligatures w14:val="none"/>
         </w:rPr>
-        <w:t>Input: "HeLLoWorLD"</w:t>
+        <w:t>Input: "</w:t>
+      </w:r>
+      <w:proofErr w:type="spellStart"/>
+      <w:r>
+        <w:rPr>
+          <w:rFonts w:ascii="Mangal" w:eastAsia="Times New Roman" w:hAnsi="Mangal" w:cs="Mangal"/>
+          <w:kern w:val="0"/>
+          <w:sz w:val="20"/>
+          <w:szCs w:val="20"/>
+          <w14:ligatures w14:val="none"/>
+        </w:rPr>
+        <w:t>HeLLoWorLD</w:t>
+      </w:r>
+      <w:proofErr w:type="spellEnd"/>
+      <w:r>
+        <w:rPr>
+          <w:rFonts w:ascii="Mangal" w:eastAsia="Times New Roman" w:hAnsi="Mangal" w:cs="Mangal"/>
+          <w:kern w:val="0"/>
+          <w:sz w:val="20"/>
+          <w:szCs w:val="20"/>
+          <w14:ligatures w14:val="none"/>
+        </w:rPr>
+        <w:t>"</w:t>
       </w:r>
       <w:r>
         <w:rPr>
@@ -7382,7 +7759,29 @@
           <w14:ligatures w14:val="none"/>
         </w:rPr>
         <w:br/>
-        <w:t>Output: "IloveJava"</w:t>
+        <w:t>Output: "</w:t>
+      </w:r>
+      <w:proofErr w:type="spellStart"/>
+      <w:r>
+        <w:rPr>
+          <w:rFonts w:ascii="Mangal" w:eastAsia="Times New Roman" w:hAnsi="Mangal" w:cs="Mangal"/>
+          <w:kern w:val="0"/>
+          <w:sz w:val="20"/>
+          <w:szCs w:val="20"/>
+          <w14:ligatures w14:val="none"/>
+        </w:rPr>
+        <w:t>IloveJava</w:t>
+      </w:r>
+      <w:proofErr w:type="spellEnd"/>
+      <w:r>
+        <w:rPr>
+          <w:rFonts w:ascii="Mangal" w:eastAsia="Times New Roman" w:hAnsi="Mangal" w:cs="Mangal"/>
+          <w:kern w:val="0"/>
+          <w:sz w:val="20"/>
+          <w:szCs w:val="20"/>
+          <w14:ligatures w14:val="none"/>
+        </w:rPr>
+        <w:t>"</w:t>
       </w:r>
     </w:p>
     <w:p>
@@ -7947,7 +8346,29 @@
           <w:szCs w:val="20"/>
           <w14:ligatures w14:val="none"/>
         </w:rPr>
-        <w:t>Input: "JaVa"</w:t>
+        <w:t>Input: "</w:t>
+      </w:r>
+      <w:proofErr w:type="spellStart"/>
+      <w:r>
+        <w:rPr>
+          <w:rFonts w:ascii="Mangal" w:eastAsia="Times New Roman" w:hAnsi="Mangal" w:cs="Mangal"/>
+          <w:kern w:val="0"/>
+          <w:sz w:val="20"/>
+          <w:szCs w:val="20"/>
+          <w14:ligatures w14:val="none"/>
+        </w:rPr>
+        <w:t>JaVa</w:t>
+      </w:r>
+      <w:proofErr w:type="spellEnd"/>
+      <w:r>
+        <w:rPr>
+          <w:rFonts w:ascii="Mangal" w:eastAsia="Times New Roman" w:hAnsi="Mangal" w:cs="Mangal"/>
+          <w:kern w:val="0"/>
+          <w:sz w:val="20"/>
+          <w:szCs w:val="20"/>
+          <w14:ligatures w14:val="none"/>
+        </w:rPr>
+        <w:t>"</w:t>
       </w:r>
       <w:r>
         <w:rPr>
@@ -7958,7 +8379,29 @@
           <w14:ligatures w14:val="none"/>
         </w:rPr>
         <w:br/>
-        <w:t>Output: "jAvA"</w:t>
+        <w:t>Output: "</w:t>
+      </w:r>
+      <w:proofErr w:type="spellStart"/>
+      <w:r>
+        <w:rPr>
+          <w:rFonts w:ascii="Mangal" w:eastAsia="Times New Roman" w:hAnsi="Mangal" w:cs="Mangal"/>
+          <w:kern w:val="0"/>
+          <w:sz w:val="20"/>
+          <w:szCs w:val="20"/>
+          <w14:ligatures w14:val="none"/>
+        </w:rPr>
+        <w:t>jAvA</w:t>
+      </w:r>
+      <w:proofErr w:type="spellEnd"/>
+      <w:r>
+        <w:rPr>
+          <w:rFonts w:ascii="Mangal" w:eastAsia="Times New Roman" w:hAnsi="Mangal" w:cs="Mangal"/>
+          <w:kern w:val="0"/>
+          <w:sz w:val="20"/>
+          <w:szCs w:val="20"/>
+          <w14:ligatures w14:val="none"/>
+        </w:rPr>
+        <w:t>"</w:t>
       </w:r>
     </w:p>
     <w:p>
@@ -7993,15 +8436,27 @@
         </w:rPr>
         <w:t xml:space="preserve">  </w:t>
       </w:r>
-      <w:r>
-        <w:rPr>
-          <w:rFonts w:ascii="Mangal" w:eastAsia="Times New Roman" w:hAnsi="Mangal" w:cs="Mangal"/>
-          <w:kern w:val="0"/>
-          <w:sz w:val="20"/>
-          <w:szCs w:val="20"/>
-          <w14:ligatures w14:val="none"/>
-        </w:rPr>
-        <w:t>Character.isUpperCase(</w:t>
+      <w:proofErr w:type="spellStart"/>
+      <w:r>
+        <w:rPr>
+          <w:rFonts w:ascii="Mangal" w:eastAsia="Times New Roman" w:hAnsi="Mangal" w:cs="Mangal"/>
+          <w:kern w:val="0"/>
+          <w:sz w:val="20"/>
+          <w:szCs w:val="20"/>
+          <w14:ligatures w14:val="none"/>
+        </w:rPr>
+        <w:t>Character.isUpperCase</w:t>
+      </w:r>
+      <w:proofErr w:type="spellEnd"/>
+      <w:r>
+        <w:rPr>
+          <w:rFonts w:ascii="Mangal" w:eastAsia="Times New Roman" w:hAnsi="Mangal" w:cs="Mangal"/>
+          <w:kern w:val="0"/>
+          <w:sz w:val="20"/>
+          <w:szCs w:val="20"/>
+          <w14:ligatures w14:val="none"/>
+        </w:rPr>
+        <w:t>(</w:t>
       </w:r>
       <w:proofErr w:type="gramStart"/>
       <w:r>
@@ -8024,6 +8479,7 @@
         </w:rPr>
         <w:t xml:space="preserve">,  </w:t>
       </w:r>
+      <w:proofErr w:type="spellStart"/>
       <w:r>
         <w:rPr>
           <w:rFonts w:ascii="Mangal" w:eastAsia="Times New Roman" w:hAnsi="Mangal" w:cs="Mangal"/>
@@ -8034,6 +8490,7 @@
         </w:rPr>
         <w:t>toLowerCase</w:t>
       </w:r>
+      <w:proofErr w:type="spellEnd"/>
       <w:proofErr w:type="gramEnd"/>
       <w:r>
         <w:rPr>
@@ -8074,8 +8531,20 @@
           <w:szCs w:val="20"/>
           <w14:ligatures w14:val="none"/>
         </w:rPr>
-        <w:t xml:space="preserve"> toUpperCase</w:t>
-      </w:r>
+        <w:t xml:space="preserve"> </w:t>
+      </w:r>
+      <w:proofErr w:type="spellStart"/>
+      <w:r>
+        <w:rPr>
+          <w:rFonts w:ascii="Mangal" w:eastAsia="Times New Roman" w:hAnsi="Mangal" w:cs="Mangal"/>
+          <w:kern w:val="0"/>
+          <w:sz w:val="20"/>
+          <w:szCs w:val="20"/>
+          <w14:ligatures w14:val="none"/>
+        </w:rPr>
+        <w:t>toUpperCase</w:t>
+      </w:r>
+      <w:proofErr w:type="spellEnd"/>
       <w:proofErr w:type="gramEnd"/>
       <w:r>
         <w:rPr>
@@ -8702,7 +9171,31 @@
         </w:rPr>
       </w:pPr>
       <w:r>
-        <w:t>Write a class Circle containing private variable radius of type float, suitable constructors, and two methods findArea and findCircumference to find area and circumference of circles respectively. Write a separate class MyCircle containing main method to create and use circle objects.</w:t>
+        <w:t xml:space="preserve">Write a class Circle containing private variable radius of type float, suitable constructors, and two methods </w:t>
+      </w:r>
+      <w:proofErr w:type="spellStart"/>
+      <w:r>
+        <w:t>findArea</w:t>
+      </w:r>
+      <w:proofErr w:type="spellEnd"/>
+      <w:r>
+        <w:t xml:space="preserve"> and </w:t>
+      </w:r>
+      <w:proofErr w:type="spellStart"/>
+      <w:r>
+        <w:t>findCircumference</w:t>
+      </w:r>
+      <w:proofErr w:type="spellEnd"/>
+      <w:r>
+        <w:t xml:space="preserve"> to find area and circumference of circles respectively. Write a separate class </w:t>
+      </w:r>
+      <w:proofErr w:type="spellStart"/>
+      <w:r>
+        <w:t>MyCircle</w:t>
+      </w:r>
+      <w:proofErr w:type="spellEnd"/>
+      <w:r>
+        <w:t xml:space="preserve"> containing main method to create and use circle objects.</w:t>
       </w:r>
     </w:p>
     <w:p>
@@ -8766,7 +9259,31 @@
         </w:rPr>
       </w:pPr>
       <w:r>
-        <w:t>Write a class Distance containing private variables feet of type int and inches of type int, suitable constructors, and two methods addDistance and displayDistance for adding and displaying distance objects. Write a separate class MyDistance containing main method to create and use distance objects.</w:t>
+        <w:t xml:space="preserve">Write a class Distance containing private variables feet of type int and inches of type int, suitable constructors, and two methods </w:t>
+      </w:r>
+      <w:proofErr w:type="spellStart"/>
+      <w:r>
+        <w:t>addDistance</w:t>
+      </w:r>
+      <w:proofErr w:type="spellEnd"/>
+      <w:r>
+        <w:t xml:space="preserve"> and </w:t>
+      </w:r>
+      <w:proofErr w:type="spellStart"/>
+      <w:r>
+        <w:t>displayDistance</w:t>
+      </w:r>
+      <w:proofErr w:type="spellEnd"/>
+      <w:r>
+        <w:t xml:space="preserve"> for adding and displaying distance objects. Write a separate class </w:t>
+      </w:r>
+      <w:proofErr w:type="spellStart"/>
+      <w:r>
+        <w:t>MyDistance</w:t>
+      </w:r>
+      <w:proofErr w:type="spellEnd"/>
+      <w:r>
+        <w:t xml:space="preserve"> containing main method to create and use distance objects.</w:t>
       </w:r>
     </w:p>
     <w:p>
@@ -9165,7 +9682,29 @@
           <w:szCs w:val="20"/>
           <w14:ligatures w14:val="none"/>
         </w:rPr>
-        <w:t>Input: "aaabbccccd"</w:t>
+        <w:t>Input: "</w:t>
+      </w:r>
+      <w:proofErr w:type="spellStart"/>
+      <w:r>
+        <w:rPr>
+          <w:rFonts w:ascii="Mangal" w:eastAsia="Times New Roman" w:hAnsi="Mangal" w:cs="Mangal"/>
+          <w:kern w:val="0"/>
+          <w:sz w:val="20"/>
+          <w:szCs w:val="20"/>
+          <w14:ligatures w14:val="none"/>
+        </w:rPr>
+        <w:t>aaabbccccd</w:t>
+      </w:r>
+      <w:proofErr w:type="spellEnd"/>
+      <w:r>
+        <w:rPr>
+          <w:rFonts w:ascii="Mangal" w:eastAsia="Times New Roman" w:hAnsi="Mangal" w:cs="Mangal"/>
+          <w:kern w:val="0"/>
+          <w:sz w:val="20"/>
+          <w:szCs w:val="20"/>
+          <w14:ligatures w14:val="none"/>
+        </w:rPr>
+        <w:t>"</w:t>
       </w:r>
       <w:r>
         <w:rPr>
@@ -9176,7 +9715,29 @@
           <w14:ligatures w14:val="none"/>
         </w:rPr>
         <w:br/>
-        <w:t>Output: 4 (because of "cccc")</w:t>
+        <w:t>Output: 4 (because of "</w:t>
+      </w:r>
+      <w:proofErr w:type="spellStart"/>
+      <w:r>
+        <w:rPr>
+          <w:rFonts w:ascii="Mangal" w:eastAsia="Times New Roman" w:hAnsi="Mangal" w:cs="Mangal"/>
+          <w:kern w:val="0"/>
+          <w:sz w:val="20"/>
+          <w:szCs w:val="20"/>
+          <w14:ligatures w14:val="none"/>
+        </w:rPr>
+        <w:t>cccc</w:t>
+      </w:r>
+      <w:proofErr w:type="spellEnd"/>
+      <w:r>
+        <w:rPr>
+          <w:rFonts w:ascii="Mangal" w:eastAsia="Times New Roman" w:hAnsi="Mangal" w:cs="Mangal"/>
+          <w:kern w:val="0"/>
+          <w:sz w:val="20"/>
+          <w:szCs w:val="20"/>
+          <w14:ligatures w14:val="none"/>
+        </w:rPr>
+        <w:t>")</w:t>
       </w:r>
     </w:p>
     <w:p>
@@ -9259,7 +9820,51 @@
           <w:szCs w:val="20"/>
           <w14:ligatures w14:val="none"/>
         </w:rPr>
-        <w:t xml:space="preserve">Input: "abcd", "cdab" </w:t>
+        <w:t>Input: "</w:t>
+      </w:r>
+      <w:proofErr w:type="spellStart"/>
+      <w:r>
+        <w:rPr>
+          <w:rFonts w:ascii="Mangal" w:eastAsia="Times New Roman" w:hAnsi="Mangal" w:cs="Mangal"/>
+          <w:kern w:val="0"/>
+          <w:sz w:val="20"/>
+          <w:szCs w:val="20"/>
+          <w14:ligatures w14:val="none"/>
+        </w:rPr>
+        <w:t>abcd</w:t>
+      </w:r>
+      <w:proofErr w:type="spellEnd"/>
+      <w:r>
+        <w:rPr>
+          <w:rFonts w:ascii="Mangal" w:eastAsia="Times New Roman" w:hAnsi="Mangal" w:cs="Mangal"/>
+          <w:kern w:val="0"/>
+          <w:sz w:val="20"/>
+          <w:szCs w:val="20"/>
+          <w14:ligatures w14:val="none"/>
+        </w:rPr>
+        <w:t>", "</w:t>
+      </w:r>
+      <w:proofErr w:type="spellStart"/>
+      <w:r>
+        <w:rPr>
+          <w:rFonts w:ascii="Mangal" w:eastAsia="Times New Roman" w:hAnsi="Mangal" w:cs="Mangal"/>
+          <w:kern w:val="0"/>
+          <w:sz w:val="20"/>
+          <w:szCs w:val="20"/>
+          <w14:ligatures w14:val="none"/>
+        </w:rPr>
+        <w:t>cdab</w:t>
+      </w:r>
+      <w:proofErr w:type="spellEnd"/>
+      <w:r>
+        <w:rPr>
+          <w:rFonts w:ascii="Mangal" w:eastAsia="Times New Roman" w:hAnsi="Mangal" w:cs="Mangal"/>
+          <w:kern w:val="0"/>
+          <w:sz w:val="20"/>
+          <w:szCs w:val="20"/>
+          <w14:ligatures w14:val="none"/>
+        </w:rPr>
+        <w:t xml:space="preserve">" </w:t>
       </w:r>
       <w:r>
         <w:rPr>
@@ -9290,7 +9895,51 @@
           <w14:ligatures w14:val="none"/>
         </w:rPr>
         <w:br/>
-        <w:t xml:space="preserve">Input: "abcd", "acbd" </w:t>
+        <w:t>Input: "</w:t>
+      </w:r>
+      <w:proofErr w:type="spellStart"/>
+      <w:r>
+        <w:rPr>
+          <w:rFonts w:ascii="Mangal" w:eastAsia="Times New Roman" w:hAnsi="Mangal" w:cs="Mangal"/>
+          <w:kern w:val="0"/>
+          <w:sz w:val="20"/>
+          <w:szCs w:val="20"/>
+          <w14:ligatures w14:val="none"/>
+        </w:rPr>
+        <w:t>abcd</w:t>
+      </w:r>
+      <w:proofErr w:type="spellEnd"/>
+      <w:r>
+        <w:rPr>
+          <w:rFonts w:ascii="Mangal" w:eastAsia="Times New Roman" w:hAnsi="Mangal" w:cs="Mangal"/>
+          <w:kern w:val="0"/>
+          <w:sz w:val="20"/>
+          <w:szCs w:val="20"/>
+          <w14:ligatures w14:val="none"/>
+        </w:rPr>
+        <w:t>", "</w:t>
+      </w:r>
+      <w:proofErr w:type="spellStart"/>
+      <w:r>
+        <w:rPr>
+          <w:rFonts w:ascii="Mangal" w:eastAsia="Times New Roman" w:hAnsi="Mangal" w:cs="Mangal"/>
+          <w:kern w:val="0"/>
+          <w:sz w:val="20"/>
+          <w:szCs w:val="20"/>
+          <w14:ligatures w14:val="none"/>
+        </w:rPr>
+        <w:t>acbd</w:t>
+      </w:r>
+      <w:proofErr w:type="spellEnd"/>
+      <w:r>
+        <w:rPr>
+          <w:rFonts w:ascii="Mangal" w:eastAsia="Times New Roman" w:hAnsi="Mangal" w:cs="Mangal"/>
+          <w:kern w:val="0"/>
+          <w:sz w:val="20"/>
+          <w:szCs w:val="20"/>
+          <w14:ligatures w14:val="none"/>
+        </w:rPr>
+        <w:t xml:space="preserve">" </w:t>
       </w:r>
       <w:r>
         <w:rPr>
@@ -9986,6 +10635,7 @@
         </w:rPr>
         <w:t xml:space="preserve">Write a java program to find the majority element in an array </w:t>
       </w:r>
+      <w:proofErr w:type="spellStart"/>
       <w:proofErr w:type="gramStart"/>
       <w:r>
         <w:rPr>
@@ -9996,6 +10646,7 @@
         </w:rPr>
         <w:t>i,e</w:t>
       </w:r>
+      <w:proofErr w:type="spellEnd"/>
       <w:proofErr w:type="gramEnd"/>
       <w:r>
         <w:rPr>
@@ -10557,16 +11208,9 @@
           <w:sz w:val="28"/>
           <w:szCs w:val="28"/>
         </w:rPr>
-        <w:t>{"abc", "aaa", "kite", "pop"}</w:t>
-      </w:r>
-      <w:r>
-        <w:rPr>
-          <w:rFonts w:ascii="Times New Roman" w:hAnsi="Times New Roman" w:cs="Times New Roman"/>
-          <w:sz w:val="28"/>
-          <w:szCs w:val="28"/>
-        </w:rPr>
-        <w:t xml:space="preserve"> → Output: </w:t>
-      </w:r>
+        <w:t>{"</w:t>
+      </w:r>
+      <w:proofErr w:type="spellStart"/>
       <w:r>
         <w:rPr>
           <w:rStyle w:val="HTMLCode"/>
@@ -10574,16 +11218,9 @@
           <w:sz w:val="28"/>
           <w:szCs w:val="28"/>
         </w:rPr>
-        <w:t>2</w:t>
-      </w:r>
-      <w:r>
-        <w:rPr>
-          <w:rFonts w:ascii="Times New Roman" w:hAnsi="Times New Roman" w:cs="Times New Roman"/>
-          <w:sz w:val="28"/>
-          <w:szCs w:val="28"/>
-        </w:rPr>
-        <w:t xml:space="preserve"> (</w:t>
-      </w:r>
+        <w:t>abc</w:t>
+      </w:r>
+      <w:proofErr w:type="spellEnd"/>
       <w:r>
         <w:rPr>
           <w:rStyle w:val="HTMLCode"/>
@@ -10591,8 +11228,64 @@
           <w:sz w:val="28"/>
           <w:szCs w:val="28"/>
         </w:rPr>
+        <w:t>", "</w:t>
+      </w:r>
+      <w:proofErr w:type="spellStart"/>
+      <w:r>
+        <w:rPr>
+          <w:rStyle w:val="HTMLCode"/>
+          <w:rFonts w:ascii="Times New Roman" w:eastAsiaTheme="majorEastAsia" w:hAnsi="Times New Roman" w:cs="Times New Roman"/>
+          <w:sz w:val="28"/>
+          <w:szCs w:val="28"/>
+        </w:rPr>
         <w:t>aaa</w:t>
       </w:r>
+      <w:proofErr w:type="spellEnd"/>
+      <w:r>
+        <w:rPr>
+          <w:rStyle w:val="HTMLCode"/>
+          <w:rFonts w:ascii="Times New Roman" w:eastAsiaTheme="majorEastAsia" w:hAnsi="Times New Roman" w:cs="Times New Roman"/>
+          <w:sz w:val="28"/>
+          <w:szCs w:val="28"/>
+        </w:rPr>
+        <w:t>", "kite", "pop"}</w:t>
+      </w:r>
+      <w:r>
+        <w:rPr>
+          <w:rFonts w:ascii="Times New Roman" w:hAnsi="Times New Roman" w:cs="Times New Roman"/>
+          <w:sz w:val="28"/>
+          <w:szCs w:val="28"/>
+        </w:rPr>
+        <w:t xml:space="preserve"> → Output: </w:t>
+      </w:r>
+      <w:r>
+        <w:rPr>
+          <w:rStyle w:val="HTMLCode"/>
+          <w:rFonts w:ascii="Times New Roman" w:eastAsiaTheme="majorEastAsia" w:hAnsi="Times New Roman" w:cs="Times New Roman"/>
+          <w:sz w:val="28"/>
+          <w:szCs w:val="28"/>
+        </w:rPr>
+        <w:t>2</w:t>
+      </w:r>
+      <w:r>
+        <w:rPr>
+          <w:rFonts w:ascii="Times New Roman" w:hAnsi="Times New Roman" w:cs="Times New Roman"/>
+          <w:sz w:val="28"/>
+          <w:szCs w:val="28"/>
+        </w:rPr>
+        <w:t xml:space="preserve"> (</w:t>
+      </w:r>
+      <w:proofErr w:type="spellStart"/>
+      <w:r>
+        <w:rPr>
+          <w:rStyle w:val="HTMLCode"/>
+          <w:rFonts w:ascii="Times New Roman" w:eastAsiaTheme="majorEastAsia" w:hAnsi="Times New Roman" w:cs="Times New Roman"/>
+          <w:sz w:val="28"/>
+          <w:szCs w:val="28"/>
+        </w:rPr>
+        <w:t>aaa</w:t>
+      </w:r>
+      <w:proofErr w:type="spellEnd"/>
       <w:r>
         <w:rPr>
           <w:rFonts w:ascii="Times New Roman" w:hAnsi="Times New Roman" w:cs="Times New Roman"/>
@@ -10727,7 +11420,25 @@
           <w:sz w:val="28"/>
           <w:szCs w:val="22"/>
         </w:rPr>
-        <w:t>Input: "aaabbc"</w:t>
+        <w:t>Input: "</w:t>
+      </w:r>
+      <w:proofErr w:type="spellStart"/>
+      <w:r>
+        <w:rPr>
+          <w:rFonts w:ascii="Times New Roman" w:hAnsi="Times New Roman" w:cs="Times New Roman"/>
+          <w:sz w:val="28"/>
+          <w:szCs w:val="22"/>
+        </w:rPr>
+        <w:t>aaabbc</w:t>
+      </w:r>
+      <w:proofErr w:type="spellEnd"/>
+      <w:r>
+        <w:rPr>
+          <w:rFonts w:ascii="Times New Roman" w:hAnsi="Times New Roman" w:cs="Times New Roman"/>
+          <w:sz w:val="28"/>
+          <w:szCs w:val="22"/>
+        </w:rPr>
+        <w:t>"</w:t>
       </w:r>
       <w:r>
         <w:rPr>
@@ -10781,7 +11492,25 @@
           <w:sz w:val="28"/>
           <w:szCs w:val="22"/>
         </w:rPr>
-        <w:t>Input: "abcde" → true</w:t>
+        <w:t>Input: "</w:t>
+      </w:r>
+      <w:proofErr w:type="spellStart"/>
+      <w:r>
+        <w:rPr>
+          <w:rFonts w:ascii="Times New Roman" w:hAnsi="Times New Roman" w:cs="Times New Roman"/>
+          <w:sz w:val="28"/>
+          <w:szCs w:val="22"/>
+        </w:rPr>
+        <w:t>abcde</w:t>
+      </w:r>
+      <w:proofErr w:type="spellEnd"/>
+      <w:r>
+        <w:rPr>
+          <w:rFonts w:ascii="Times New Roman" w:hAnsi="Times New Roman" w:cs="Times New Roman"/>
+          <w:sz w:val="28"/>
+          <w:szCs w:val="22"/>
+        </w:rPr>
+        <w:t>" → true</w:t>
       </w:r>
       <w:r>
         <w:rPr>
@@ -11380,23 +12109,7 @@
           <w:sz w:val="28"/>
           <w:szCs w:val="28"/>
         </w:rPr>
-        <w:t>Output: 3 (because sum left of index 3 = 1+7+3 = 11, sum right of index 3 = 5+6 = 11)</w:t>
-      </w:r>
-      <w:r>
-        <w:rPr>
-          <w:rFonts w:ascii="Times New Roman" w:hAnsi="Times New Roman" w:cs="Times New Roman"/>
-          <w:sz w:val="28"/>
-          <w:szCs w:val="28"/>
-        </w:rPr>
-        <w:t xml:space="preserve">. </w:t>
-      </w:r>
-      <w:r>
-        <w:rPr>
-          <w:rFonts w:ascii="Times New Roman" w:hAnsi="Times New Roman" w:cs="Times New Roman"/>
-          <w:sz w:val="28"/>
-          <w:szCs w:val="28"/>
-        </w:rPr>
-        <w:t>If no such index exists, return -1</w:t>
+        <w:t>Output: 3 (because sum left of index 3 = 1+7+3 = 11, sum right of index 3 = 5+6 = 11). If no such index exists, return -1</w:t>
       </w:r>
     </w:p>
     <w:p>
@@ -11439,7 +12152,25 @@
           <w:sz w:val="28"/>
           <w:szCs w:val="28"/>
         </w:rPr>
-        <w:t>Input: arr = {1, 4, 20, 3, 10, 5}, K = 33</w:t>
+        <w:t xml:space="preserve">Input: </w:t>
+      </w:r>
+      <w:proofErr w:type="spellStart"/>
+      <w:r>
+        <w:rPr>
+          <w:rFonts w:ascii="Times New Roman" w:hAnsi="Times New Roman" w:cs="Times New Roman"/>
+          <w:sz w:val="28"/>
+          <w:szCs w:val="28"/>
+        </w:rPr>
+        <w:t>arr</w:t>
+      </w:r>
+      <w:proofErr w:type="spellEnd"/>
+      <w:r>
+        <w:rPr>
+          <w:rFonts w:ascii="Times New Roman" w:hAnsi="Times New Roman" w:cs="Times New Roman"/>
+          <w:sz w:val="28"/>
+          <w:szCs w:val="28"/>
+        </w:rPr>
+        <w:t xml:space="preserve"> = {1, 4, 20, 3, 10, 5}, K = 33</w:t>
       </w:r>
     </w:p>
     <w:p>
@@ -11479,7 +12210,25 @@
           <w:sz w:val="28"/>
           <w:szCs w:val="28"/>
         </w:rPr>
-        <w:t xml:space="preserve"> Input: arr = {1, 4, 20, 3, 10, 5}, K = 18</w:t>
+        <w:t xml:space="preserve"> Input: </w:t>
+      </w:r>
+      <w:proofErr w:type="spellStart"/>
+      <w:r>
+        <w:rPr>
+          <w:rFonts w:ascii="Times New Roman" w:hAnsi="Times New Roman" w:cs="Times New Roman"/>
+          <w:sz w:val="28"/>
+          <w:szCs w:val="28"/>
+        </w:rPr>
+        <w:t>arr</w:t>
+      </w:r>
+      <w:proofErr w:type="spellEnd"/>
+      <w:r>
+        <w:rPr>
+          <w:rFonts w:ascii="Times New Roman" w:hAnsi="Times New Roman" w:cs="Times New Roman"/>
+          <w:sz w:val="28"/>
+          <w:szCs w:val="28"/>
+        </w:rPr>
+        <w:t xml:space="preserve"> = {1, 4, 20, 3, 10, 5}, K = 18</w:t>
       </w:r>
     </w:p>
     <w:p>
@@ -11507,23 +12256,7 @@
           <w:sz w:val="28"/>
           <w:szCs w:val="28"/>
         </w:rPr>
-        <w:t xml:space="preserve"> (</w:t>
-      </w:r>
-      <w:r>
-        <w:rPr>
-          <w:rFonts w:ascii="Times New Roman" w:hAnsi="Times New Roman" w:cs="Times New Roman"/>
-          <w:sz w:val="28"/>
-          <w:szCs w:val="28"/>
-        </w:rPr>
-        <w:t>Hint: Use prefix sum and check if prefix[j] - prefix[i-1] == K</w:t>
-      </w:r>
-      <w:r>
-        <w:rPr>
-          <w:rFonts w:ascii="Times New Roman" w:hAnsi="Times New Roman" w:cs="Times New Roman"/>
-          <w:sz w:val="28"/>
-          <w:szCs w:val="28"/>
-        </w:rPr>
-        <w:t>)</w:t>
+        <w:t xml:space="preserve"> (Hint: Use prefix sum and check if prefix[j] - prefix[i-1] == K)</w:t>
       </w:r>
     </w:p>
     <w:p>
@@ -11588,18 +12321,14 @@
         </w:rPr>
         <w:t>Output:</w:t>
       </w:r>
-    </w:p>
-    <w:p>
-      <w:pPr>
-        <w:pStyle w:val="ListParagraph"/>
-        <w:spacing w:line="276" w:lineRule="auto"/>
-        <w:ind w:left="1080"/>
+      <w:r>
         <w:rPr>
           <w:rFonts w:ascii="Times New Roman" w:hAnsi="Times New Roman" w:cs="Times New Roman"/>
           <w:sz w:val="28"/>
           <w:szCs w:val="28"/>
         </w:rPr>
-      </w:pPr>
+        <w:t xml:space="preserve">  </w:t>
+      </w:r>
       <w:r>
         <w:rPr>
           <w:rFonts w:ascii="Times New Roman" w:hAnsi="Times New Roman" w:cs="Times New Roman"/>
@@ -11784,24 +12513,143 @@
           <w:sz w:val="28"/>
           <w:szCs w:val="28"/>
         </w:rPr>
-        <w:t xml:space="preserve"> (</w:t>
-      </w:r>
-      <w:r>
+        <w:t xml:space="preserve"> (Count how many subarrays give sum K.)</w:t>
+      </w:r>
+    </w:p>
+    <w:p>
+      <w:pPr>
+        <w:pStyle w:val="ListParagraph"/>
+        <w:numPr>
+          <w:ilvl w:val="0"/>
+          <w:numId w:val="44"/>
+        </w:numPr>
+        <w:spacing w:line="276" w:lineRule="auto"/>
         <w:rPr>
           <w:rFonts w:ascii="Times New Roman" w:hAnsi="Times New Roman" w:cs="Times New Roman"/>
           <w:sz w:val="28"/>
           <w:szCs w:val="28"/>
         </w:rPr>
-        <w:t>Count how many subarrays give sum K.</w:t>
-      </w:r>
+      </w:pPr>
       <w:r>
         <w:rPr>
           <w:rFonts w:ascii="Times New Roman" w:hAnsi="Times New Roman" w:cs="Times New Roman"/>
           <w:sz w:val="28"/>
           <w:szCs w:val="28"/>
         </w:rPr>
+        <w:t xml:space="preserve">Find the </w:t>
+      </w:r>
+      <w:r>
+        <w:rPr>
+          <w:rFonts w:ascii="Times New Roman" w:hAnsi="Times New Roman" w:cs="Times New Roman"/>
+          <w:sz w:val="28"/>
+          <w:szCs w:val="28"/>
+        </w:rPr>
+        <w:t>equilibrium index of an array</w:t>
+      </w:r>
+      <w:r>
+        <w:rPr>
+          <w:rFonts w:ascii="Times New Roman" w:hAnsi="Times New Roman" w:cs="Times New Roman"/>
+          <w:sz w:val="28"/>
+          <w:szCs w:val="28"/>
+        </w:rPr>
+        <w:t>.</w:t>
+      </w:r>
+    </w:p>
+    <w:p>
+      <w:pPr>
+        <w:pStyle w:val="ListParagraph"/>
+        <w:numPr>
+          <w:ilvl w:val="0"/>
+          <w:numId w:val="44"/>
+        </w:numPr>
+        <w:spacing w:line="276" w:lineRule="auto"/>
+        <w:rPr>
+          <w:rFonts w:ascii="Times New Roman" w:hAnsi="Times New Roman" w:cs="Times New Roman"/>
+          <w:sz w:val="28"/>
+          <w:szCs w:val="28"/>
+        </w:rPr>
+      </w:pPr>
+      <w:r>
+        <w:rPr>
+          <w:rFonts w:ascii="Times New Roman" w:hAnsi="Times New Roman" w:cs="Times New Roman"/>
+          <w:b/>
+          <w:bCs/>
+          <w:sz w:val="28"/>
+          <w:szCs w:val="28"/>
+        </w:rPr>
+        <w:t>Given an array, print prefix sum and suffix sum for each index.</w:t>
+      </w:r>
+      <w:r>
+        <w:rPr>
+          <w:rFonts w:ascii="Times New Roman" w:hAnsi="Times New Roman" w:cs="Times New Roman"/>
+          <w:b/>
+          <w:bCs/>
+          <w:sz w:val="28"/>
+          <w:szCs w:val="28"/>
+        </w:rPr>
+        <w:t xml:space="preserve"> </w:t>
+      </w:r>
+      <w:proofErr w:type="gramStart"/>
+      <w:r>
+        <w:rPr>
+          <w:rFonts w:ascii="Times New Roman" w:hAnsi="Times New Roman" w:cs="Times New Roman"/>
+          <w:sz w:val="28"/>
+          <w:szCs w:val="28"/>
+        </w:rPr>
+        <w:t>(</w:t>
+      </w:r>
+      <w:r>
+        <w:rPr>
+          <w:rFonts w:ascii="Segoe UI" w:hAnsi="Segoe UI" w:cs="Segoe UI"/>
+          <w:b/>
+          <w:bCs/>
+          <w:color w:val="F9FAFB"/>
+          <w:szCs w:val="24"/>
+          <w:shd w:val="clear" w:color="auto" w:fill="151517"/>
+        </w:rPr>
+        <w:t xml:space="preserve"> </w:t>
+      </w:r>
+      <w:r>
+        <w:rPr>
+          <w:rFonts w:ascii="Times New Roman" w:hAnsi="Times New Roman" w:cs="Times New Roman"/>
+          <w:b/>
+          <w:bCs/>
+          <w:sz w:val="28"/>
+          <w:szCs w:val="28"/>
+        </w:rPr>
+        <w:t>Calculate</w:t>
+      </w:r>
+      <w:proofErr w:type="gramEnd"/>
+      <w:r>
+        <w:rPr>
+          <w:rFonts w:ascii="Times New Roman" w:hAnsi="Times New Roman" w:cs="Times New Roman"/>
+          <w:b/>
+          <w:bCs/>
+          <w:sz w:val="28"/>
+          <w:szCs w:val="28"/>
+        </w:rPr>
+        <w:t xml:space="preserve"> prefix sum and suffix sum of an array</w:t>
+      </w:r>
+      <w:r>
+        <w:rPr>
+          <w:rFonts w:ascii="Times New Roman" w:hAnsi="Times New Roman" w:cs="Times New Roman"/>
+          <w:sz w:val="28"/>
+          <w:szCs w:val="28"/>
+        </w:rPr>
         <w:t>)</w:t>
       </w:r>
+    </w:p>
+    <w:p>
+      <w:pPr>
+        <w:pStyle w:val="ListParagraph"/>
+        <w:spacing w:line="276" w:lineRule="auto"/>
+        <w:ind w:left="1080"/>
+        <w:rPr>
+          <w:rFonts w:ascii="Times New Roman" w:hAnsi="Times New Roman" w:cs="Times New Roman"/>
+          <w:sz w:val="28"/>
+          <w:szCs w:val="28"/>
+        </w:rPr>
+      </w:pPr>
     </w:p>
     <w:p>
       <w:pPr>

</xml_diff>

<commit_message>
day 3.1 in progress
</commit_message>
<xml_diff>
--- a/Questions.docx
+++ b/Questions.docx
@@ -10609,13 +10609,13 @@
           <w:rFonts w:ascii="Times New Roman" w:hAnsi="Times New Roman" w:cs="Times New Roman"/>
         </w:rPr>
         <w:lastRenderedPageBreak/>
-        <w:t>Questions Day1.</w:t>
-      </w:r>
-      <w:r>
-        <w:rPr>
-          <w:rFonts w:ascii="Times New Roman" w:hAnsi="Times New Roman" w:cs="Times New Roman"/>
-        </w:rPr>
-        <w:t>2</w:t>
+        <w:t>Questions Day</w:t>
+      </w:r>
+      <w:r>
+        <w:rPr>
+          <w:rFonts w:ascii="Times New Roman" w:hAnsi="Times New Roman" w:cs="Times New Roman"/>
+        </w:rPr>
+        <w:t>2.1</w:t>
       </w:r>
       <w:r>
         <w:rPr>
@@ -10644,6 +10644,109 @@
           <w:szCs w:val="22"/>
         </w:rPr>
         <w:t>Two sum problem.</w:t>
+      </w:r>
+    </w:p>
+    <w:p>
+      <w:pPr>
+        <w:pStyle w:val="ListParagraph"/>
+        <w:rPr>
+          <w:rFonts w:ascii="Times New Roman" w:hAnsi="Times New Roman" w:cs="Times New Roman"/>
+          <w:sz w:val="28"/>
+          <w:szCs w:val="22"/>
+        </w:rPr>
+      </w:pPr>
+    </w:p>
+    <w:p>
+      <w:pPr>
+        <w:pStyle w:val="IntenseQuote"/>
+      </w:pPr>
+      <w:r>
+        <w:t>Questions Day3.1 (Leetcode Array Basic)</w:t>
+      </w:r>
+    </w:p>
+    <w:p>
+      <w:pPr>
+        <w:pStyle w:val="ListParagraph"/>
+        <w:numPr>
+          <w:ilvl w:val="0"/>
+          <w:numId w:val="46"/>
+        </w:numPr>
+      </w:pPr>
+      <w:r>
+        <w:rPr>
+          <w:rFonts w:ascii="Times New Roman" w:hAnsi="Times New Roman" w:cs="Times New Roman"/>
+          <w:sz w:val="28"/>
+          <w:szCs w:val="22"/>
+        </w:rPr>
+        <w:t>Concatenation of an array.</w:t>
+      </w:r>
+    </w:p>
+    <w:p>
+      <w:pPr>
+        <w:pStyle w:val="ListParagraph"/>
+        <w:numPr>
+          <w:ilvl w:val="0"/>
+          <w:numId w:val="46"/>
+        </w:numPr>
+      </w:pPr>
+      <w:r>
+        <w:rPr>
+          <w:rFonts w:ascii="Times New Roman" w:hAnsi="Times New Roman" w:cs="Times New Roman"/>
+          <w:sz w:val="28"/>
+          <w:szCs w:val="22"/>
+        </w:rPr>
+        <w:t>Maximum value of an array.</w:t>
+      </w:r>
+    </w:p>
+    <w:p>
+      <w:pPr>
+        <w:pStyle w:val="ListParagraph"/>
+        <w:numPr>
+          <w:ilvl w:val="0"/>
+          <w:numId w:val="46"/>
+        </w:numPr>
+      </w:pPr>
+      <w:r>
+        <w:rPr>
+          <w:rFonts w:ascii="Times New Roman" w:hAnsi="Times New Roman" w:cs="Times New Roman"/>
+          <w:sz w:val="28"/>
+          <w:szCs w:val="22"/>
+        </w:rPr>
+        <w:t>Maximum value within a range of an array.</w:t>
+      </w:r>
+    </w:p>
+    <w:p>
+      <w:pPr>
+        <w:pStyle w:val="ListParagraph"/>
+        <w:numPr>
+          <w:ilvl w:val="0"/>
+          <w:numId w:val="46"/>
+        </w:numPr>
+      </w:pPr>
+      <w:r>
+        <w:rPr>
+          <w:rFonts w:ascii="Times New Roman" w:hAnsi="Times New Roman" w:cs="Times New Roman"/>
+          <w:sz w:val="28"/>
+          <w:szCs w:val="22"/>
+        </w:rPr>
+        <w:t>Swapping value in an array.</w:t>
+      </w:r>
+    </w:p>
+    <w:p>
+      <w:pPr>
+        <w:pStyle w:val="ListParagraph"/>
+        <w:numPr>
+          <w:ilvl w:val="0"/>
+          <w:numId w:val="46"/>
+        </w:numPr>
+      </w:pPr>
+      <w:r>
+        <w:rPr>
+          <w:rFonts w:ascii="Times New Roman" w:hAnsi="Times New Roman" w:cs="Times New Roman"/>
+          <w:sz w:val="28"/>
+          <w:szCs w:val="22"/>
+        </w:rPr>
+        <w:t>Reverse a given array.</w:t>
       </w:r>
     </w:p>
     <w:sectPr>
@@ -11565,6 +11668,95 @@
     </w:lvl>
   </w:abstractNum>
   <w:abstractNum w:abstractNumId="9" w15:restartNumberingAfterBreak="0">
+    <w:nsid w:val="21097C81"/>
+    <w:multiLevelType w:val="hybridMultilevel"/>
+    <w:tmpl w:val="EA0EC0D6"/>
+    <w:lvl w:ilvl="0" w:tplc="0409000F">
+      <w:start w:val="1"/>
+      <w:numFmt w:val="decimal"/>
+      <w:lvlText w:val="%1."/>
+      <w:lvlJc w:val="left"/>
+      <w:pPr>
+        <w:ind w:left="720" w:hanging="360"/>
+      </w:pPr>
+      <w:rPr>
+        <w:rFonts w:hint="default"/>
+      </w:rPr>
+    </w:lvl>
+    <w:lvl w:ilvl="1" w:tplc="04090019" w:tentative="1">
+      <w:start w:val="1"/>
+      <w:numFmt w:val="lowerLetter"/>
+      <w:lvlText w:val="%2."/>
+      <w:lvlJc w:val="left"/>
+      <w:pPr>
+        <w:ind w:left="1440" w:hanging="360"/>
+      </w:pPr>
+    </w:lvl>
+    <w:lvl w:ilvl="2" w:tplc="0409001B" w:tentative="1">
+      <w:start w:val="1"/>
+      <w:numFmt w:val="lowerRoman"/>
+      <w:lvlText w:val="%3."/>
+      <w:lvlJc w:val="right"/>
+      <w:pPr>
+        <w:ind w:left="2160" w:hanging="180"/>
+      </w:pPr>
+    </w:lvl>
+    <w:lvl w:ilvl="3" w:tplc="0409000F" w:tentative="1">
+      <w:start w:val="1"/>
+      <w:numFmt w:val="decimal"/>
+      <w:lvlText w:val="%4."/>
+      <w:lvlJc w:val="left"/>
+      <w:pPr>
+        <w:ind w:left="2880" w:hanging="360"/>
+      </w:pPr>
+    </w:lvl>
+    <w:lvl w:ilvl="4" w:tplc="04090019" w:tentative="1">
+      <w:start w:val="1"/>
+      <w:numFmt w:val="lowerLetter"/>
+      <w:lvlText w:val="%5."/>
+      <w:lvlJc w:val="left"/>
+      <w:pPr>
+        <w:ind w:left="3600" w:hanging="360"/>
+      </w:pPr>
+    </w:lvl>
+    <w:lvl w:ilvl="5" w:tplc="0409001B" w:tentative="1">
+      <w:start w:val="1"/>
+      <w:numFmt w:val="lowerRoman"/>
+      <w:lvlText w:val="%6."/>
+      <w:lvlJc w:val="right"/>
+      <w:pPr>
+        <w:ind w:left="4320" w:hanging="180"/>
+      </w:pPr>
+    </w:lvl>
+    <w:lvl w:ilvl="6" w:tplc="0409000F" w:tentative="1">
+      <w:start w:val="1"/>
+      <w:numFmt w:val="decimal"/>
+      <w:lvlText w:val="%7."/>
+      <w:lvlJc w:val="left"/>
+      <w:pPr>
+        <w:ind w:left="5040" w:hanging="360"/>
+      </w:pPr>
+    </w:lvl>
+    <w:lvl w:ilvl="7" w:tplc="04090019" w:tentative="1">
+      <w:start w:val="1"/>
+      <w:numFmt w:val="lowerLetter"/>
+      <w:lvlText w:val="%8."/>
+      <w:lvlJc w:val="left"/>
+      <w:pPr>
+        <w:ind w:left="5760" w:hanging="360"/>
+      </w:pPr>
+    </w:lvl>
+    <w:lvl w:ilvl="8" w:tplc="0409001B" w:tentative="1">
+      <w:start w:val="1"/>
+      <w:numFmt w:val="lowerRoman"/>
+      <w:lvlText w:val="%9."/>
+      <w:lvlJc w:val="right"/>
+      <w:pPr>
+        <w:ind w:left="6480" w:hanging="180"/>
+      </w:pPr>
+    </w:lvl>
+  </w:abstractNum>
+  <w:abstractNum w:abstractNumId="10" w15:restartNumberingAfterBreak="0">
     <w:nsid w:val="25916D50"/>
     <w:multiLevelType w:val="hybridMultilevel"/>
     <w:tmpl w:val="DBE2118A"/>
@@ -11650,7 +11842,7 @@
       </w:pPr>
     </w:lvl>
   </w:abstractNum>
-  <w:abstractNum w:abstractNumId="10" w15:restartNumberingAfterBreak="0">
+  <w:abstractNum w:abstractNumId="11" w15:restartNumberingAfterBreak="0">
     <w:nsid w:val="25C7788F"/>
     <w:multiLevelType w:val="hybridMultilevel"/>
     <w:tmpl w:val="BA6C4D96"/>
@@ -11736,7 +11928,7 @@
       </w:pPr>
     </w:lvl>
   </w:abstractNum>
-  <w:abstractNum w:abstractNumId="11" w15:restartNumberingAfterBreak="0">
+  <w:abstractNum w:abstractNumId="12" w15:restartNumberingAfterBreak="0">
     <w:nsid w:val="27D1368A"/>
     <w:multiLevelType w:val="hybridMultilevel"/>
     <w:tmpl w:val="24846766"/>
@@ -11822,7 +12014,7 @@
       </w:pPr>
     </w:lvl>
   </w:abstractNum>
-  <w:abstractNum w:abstractNumId="12" w15:restartNumberingAfterBreak="0">
+  <w:abstractNum w:abstractNumId="13" w15:restartNumberingAfterBreak="0">
     <w:nsid w:val="2AEC65C4"/>
     <w:multiLevelType w:val="hybridMultilevel"/>
     <w:tmpl w:val="C87E1036"/>
@@ -11908,7 +12100,7 @@
       </w:pPr>
     </w:lvl>
   </w:abstractNum>
-  <w:abstractNum w:abstractNumId="13" w15:restartNumberingAfterBreak="0">
+  <w:abstractNum w:abstractNumId="14" w15:restartNumberingAfterBreak="0">
     <w:nsid w:val="2EFB147E"/>
     <w:multiLevelType w:val="hybridMultilevel"/>
     <w:tmpl w:val="3620DFC0"/>
@@ -11994,7 +12186,7 @@
       </w:pPr>
     </w:lvl>
   </w:abstractNum>
-  <w:abstractNum w:abstractNumId="14" w15:restartNumberingAfterBreak="0">
+  <w:abstractNum w:abstractNumId="15" w15:restartNumberingAfterBreak="0">
     <w:nsid w:val="32F93CDD"/>
     <w:multiLevelType w:val="multilevel"/>
     <w:tmpl w:val="45B0D78C"/>
@@ -12107,7 +12299,7 @@
       </w:pPr>
     </w:lvl>
   </w:abstractNum>
-  <w:abstractNum w:abstractNumId="15" w15:restartNumberingAfterBreak="0">
+  <w:abstractNum w:abstractNumId="16" w15:restartNumberingAfterBreak="0">
     <w:nsid w:val="386C5883"/>
     <w:multiLevelType w:val="hybridMultilevel"/>
     <w:tmpl w:val="B388E582"/>
@@ -12193,7 +12385,7 @@
       </w:pPr>
     </w:lvl>
   </w:abstractNum>
-  <w:abstractNum w:abstractNumId="16" w15:restartNumberingAfterBreak="0">
+  <w:abstractNum w:abstractNumId="17" w15:restartNumberingAfterBreak="0">
     <w:nsid w:val="39967108"/>
     <w:multiLevelType w:val="hybridMultilevel"/>
     <w:tmpl w:val="B2F85186"/>
@@ -12279,7 +12471,7 @@
       </w:pPr>
     </w:lvl>
   </w:abstractNum>
-  <w:abstractNum w:abstractNumId="17" w15:restartNumberingAfterBreak="0">
+  <w:abstractNum w:abstractNumId="18" w15:restartNumberingAfterBreak="0">
     <w:nsid w:val="3DA117DE"/>
     <w:multiLevelType w:val="hybridMultilevel"/>
     <w:tmpl w:val="822672BC"/>
@@ -12368,7 +12560,7 @@
       </w:pPr>
     </w:lvl>
   </w:abstractNum>
-  <w:abstractNum w:abstractNumId="18" w15:restartNumberingAfterBreak="0">
+  <w:abstractNum w:abstractNumId="19" w15:restartNumberingAfterBreak="0">
     <w:nsid w:val="40275F85"/>
     <w:multiLevelType w:val="hybridMultilevel"/>
     <w:tmpl w:val="8DCC4EBE"/>
@@ -12454,7 +12646,7 @@
       </w:pPr>
     </w:lvl>
   </w:abstractNum>
-  <w:abstractNum w:abstractNumId="19" w15:restartNumberingAfterBreak="0">
+  <w:abstractNum w:abstractNumId="20" w15:restartNumberingAfterBreak="0">
     <w:nsid w:val="40C50921"/>
     <w:multiLevelType w:val="hybridMultilevel"/>
     <w:tmpl w:val="AF0A9ABA"/>
@@ -12540,7 +12732,7 @@
       </w:pPr>
     </w:lvl>
   </w:abstractNum>
-  <w:abstractNum w:abstractNumId="20" w15:restartNumberingAfterBreak="0">
+  <w:abstractNum w:abstractNumId="21" w15:restartNumberingAfterBreak="0">
     <w:nsid w:val="41214A0C"/>
     <w:multiLevelType w:val="hybridMultilevel"/>
     <w:tmpl w:val="DC0E80FA"/>
@@ -12626,7 +12818,7 @@
       </w:pPr>
     </w:lvl>
   </w:abstractNum>
-  <w:abstractNum w:abstractNumId="21" w15:restartNumberingAfterBreak="0">
+  <w:abstractNum w:abstractNumId="22" w15:restartNumberingAfterBreak="0">
     <w:nsid w:val="424A52A2"/>
     <w:multiLevelType w:val="hybridMultilevel"/>
     <w:tmpl w:val="A16657D4"/>
@@ -12712,7 +12904,7 @@
       </w:pPr>
     </w:lvl>
   </w:abstractNum>
-  <w:abstractNum w:abstractNumId="22" w15:restartNumberingAfterBreak="0">
+  <w:abstractNum w:abstractNumId="23" w15:restartNumberingAfterBreak="0">
     <w:nsid w:val="47F5408E"/>
     <w:multiLevelType w:val="hybridMultilevel"/>
     <w:tmpl w:val="A16657D4"/>
@@ -12798,7 +12990,7 @@
       </w:pPr>
     </w:lvl>
   </w:abstractNum>
-  <w:abstractNum w:abstractNumId="23" w15:restartNumberingAfterBreak="0">
+  <w:abstractNum w:abstractNumId="24" w15:restartNumberingAfterBreak="0">
     <w:nsid w:val="49173750"/>
     <w:multiLevelType w:val="hybridMultilevel"/>
     <w:tmpl w:val="6FEADD56"/>
@@ -12884,7 +13076,7 @@
       </w:pPr>
     </w:lvl>
   </w:abstractNum>
-  <w:abstractNum w:abstractNumId="24" w15:restartNumberingAfterBreak="0">
+  <w:abstractNum w:abstractNumId="25" w15:restartNumberingAfterBreak="0">
     <w:nsid w:val="4CF81C89"/>
     <w:multiLevelType w:val="hybridMultilevel"/>
     <w:tmpl w:val="B45EFFA6"/>
@@ -12973,7 +13165,7 @@
       </w:pPr>
     </w:lvl>
   </w:abstractNum>
-  <w:abstractNum w:abstractNumId="25" w15:restartNumberingAfterBreak="0">
+  <w:abstractNum w:abstractNumId="26" w15:restartNumberingAfterBreak="0">
     <w:nsid w:val="4E100B8B"/>
     <w:multiLevelType w:val="hybridMultilevel"/>
     <w:tmpl w:val="1D5460BE"/>
@@ -13059,7 +13251,7 @@
       </w:pPr>
     </w:lvl>
   </w:abstractNum>
-  <w:abstractNum w:abstractNumId="26" w15:restartNumberingAfterBreak="0">
+  <w:abstractNum w:abstractNumId="27" w15:restartNumberingAfterBreak="0">
     <w:nsid w:val="4E1E25BC"/>
     <w:multiLevelType w:val="hybridMultilevel"/>
     <w:tmpl w:val="15969A4A"/>
@@ -13150,7 +13342,7 @@
       </w:pPr>
     </w:lvl>
   </w:abstractNum>
-  <w:abstractNum w:abstractNumId="27" w15:restartNumberingAfterBreak="0">
+  <w:abstractNum w:abstractNumId="28" w15:restartNumberingAfterBreak="0">
     <w:nsid w:val="50064A5B"/>
     <w:multiLevelType w:val="hybridMultilevel"/>
     <w:tmpl w:val="F074500E"/>
@@ -13239,7 +13431,7 @@
       </w:pPr>
     </w:lvl>
   </w:abstractNum>
-  <w:abstractNum w:abstractNumId="28" w15:restartNumberingAfterBreak="0">
+  <w:abstractNum w:abstractNumId="29" w15:restartNumberingAfterBreak="0">
     <w:nsid w:val="547D03A2"/>
     <w:multiLevelType w:val="multilevel"/>
     <w:tmpl w:val="3B42AD1E"/>
@@ -13388,7 +13580,7 @@
       </w:rPr>
     </w:lvl>
   </w:abstractNum>
-  <w:abstractNum w:abstractNumId="29" w15:restartNumberingAfterBreak="0">
+  <w:abstractNum w:abstractNumId="30" w15:restartNumberingAfterBreak="0">
     <w:nsid w:val="589D3BEE"/>
     <w:multiLevelType w:val="hybridMultilevel"/>
     <w:tmpl w:val="8788DCAE"/>
@@ -13477,7 +13669,7 @@
       </w:pPr>
     </w:lvl>
   </w:abstractNum>
-  <w:abstractNum w:abstractNumId="30" w15:restartNumberingAfterBreak="0">
+  <w:abstractNum w:abstractNumId="31" w15:restartNumberingAfterBreak="0">
     <w:nsid w:val="5A3D1A24"/>
     <w:multiLevelType w:val="hybridMultilevel"/>
     <w:tmpl w:val="406E1A90"/>
@@ -13566,7 +13758,7 @@
       </w:pPr>
     </w:lvl>
   </w:abstractNum>
-  <w:abstractNum w:abstractNumId="31" w15:restartNumberingAfterBreak="0">
+  <w:abstractNum w:abstractNumId="32" w15:restartNumberingAfterBreak="0">
     <w:nsid w:val="5AD15962"/>
     <w:multiLevelType w:val="hybridMultilevel"/>
     <w:tmpl w:val="884AF92E"/>
@@ -13652,7 +13844,7 @@
       </w:pPr>
     </w:lvl>
   </w:abstractNum>
-  <w:abstractNum w:abstractNumId="32" w15:restartNumberingAfterBreak="0">
+  <w:abstractNum w:abstractNumId="33" w15:restartNumberingAfterBreak="0">
     <w:nsid w:val="63D93535"/>
     <w:multiLevelType w:val="hybridMultilevel"/>
     <w:tmpl w:val="1E564BA0"/>
@@ -13741,7 +13933,7 @@
       </w:pPr>
     </w:lvl>
   </w:abstractNum>
-  <w:abstractNum w:abstractNumId="33" w15:restartNumberingAfterBreak="0">
+  <w:abstractNum w:abstractNumId="34" w15:restartNumberingAfterBreak="0">
     <w:nsid w:val="6887545F"/>
     <w:multiLevelType w:val="hybridMultilevel"/>
     <w:tmpl w:val="C2EA408A"/>
@@ -13830,7 +14022,7 @@
       </w:pPr>
     </w:lvl>
   </w:abstractNum>
-  <w:abstractNum w:abstractNumId="34" w15:restartNumberingAfterBreak="0">
+  <w:abstractNum w:abstractNumId="35" w15:restartNumberingAfterBreak="0">
     <w:nsid w:val="6936075D"/>
     <w:multiLevelType w:val="hybridMultilevel"/>
     <w:tmpl w:val="385CB13E"/>
@@ -13921,7 +14113,7 @@
       </w:pPr>
     </w:lvl>
   </w:abstractNum>
-  <w:abstractNum w:abstractNumId="35" w15:restartNumberingAfterBreak="0">
+  <w:abstractNum w:abstractNumId="36" w15:restartNumberingAfterBreak="0">
     <w:nsid w:val="6AAA50FA"/>
     <w:multiLevelType w:val="hybridMultilevel"/>
     <w:tmpl w:val="829279AA"/>
@@ -14007,7 +14199,7 @@
       </w:pPr>
     </w:lvl>
   </w:abstractNum>
-  <w:abstractNum w:abstractNumId="36" w15:restartNumberingAfterBreak="0">
+  <w:abstractNum w:abstractNumId="37" w15:restartNumberingAfterBreak="0">
     <w:nsid w:val="6CD86F84"/>
     <w:multiLevelType w:val="multilevel"/>
     <w:tmpl w:val="EB06CA30"/>
@@ -14156,7 +14348,7 @@
       </w:rPr>
     </w:lvl>
   </w:abstractNum>
-  <w:abstractNum w:abstractNumId="37" w15:restartNumberingAfterBreak="0">
+  <w:abstractNum w:abstractNumId="38" w15:restartNumberingAfterBreak="0">
     <w:nsid w:val="6FB84637"/>
     <w:multiLevelType w:val="hybridMultilevel"/>
     <w:tmpl w:val="FCBE904E"/>
@@ -14242,7 +14434,7 @@
       </w:pPr>
     </w:lvl>
   </w:abstractNum>
-  <w:abstractNum w:abstractNumId="38" w15:restartNumberingAfterBreak="0">
+  <w:abstractNum w:abstractNumId="39" w15:restartNumberingAfterBreak="0">
     <w:nsid w:val="70BD47EB"/>
     <w:multiLevelType w:val="multilevel"/>
     <w:tmpl w:val="67CC5774"/>
@@ -14355,7 +14547,7 @@
       </w:pPr>
     </w:lvl>
   </w:abstractNum>
-  <w:abstractNum w:abstractNumId="39" w15:restartNumberingAfterBreak="0">
+  <w:abstractNum w:abstractNumId="40" w15:restartNumberingAfterBreak="0">
     <w:nsid w:val="72E21C6C"/>
     <w:multiLevelType w:val="hybridMultilevel"/>
     <w:tmpl w:val="A548623A"/>
@@ -14441,7 +14633,7 @@
       </w:pPr>
     </w:lvl>
   </w:abstractNum>
-  <w:abstractNum w:abstractNumId="40" w15:restartNumberingAfterBreak="0">
+  <w:abstractNum w:abstractNumId="41" w15:restartNumberingAfterBreak="0">
     <w:nsid w:val="78995124"/>
     <w:multiLevelType w:val="multilevel"/>
     <w:tmpl w:val="43FED306"/>
@@ -14590,7 +14782,7 @@
       </w:rPr>
     </w:lvl>
   </w:abstractNum>
-  <w:abstractNum w:abstractNumId="41" w15:restartNumberingAfterBreak="0">
+  <w:abstractNum w:abstractNumId="42" w15:restartNumberingAfterBreak="0">
     <w:nsid w:val="79521D66"/>
     <w:multiLevelType w:val="hybridMultilevel"/>
     <w:tmpl w:val="E86064F8"/>
@@ -14679,7 +14871,7 @@
       </w:pPr>
     </w:lvl>
   </w:abstractNum>
-  <w:abstractNum w:abstractNumId="42" w15:restartNumberingAfterBreak="0">
+  <w:abstractNum w:abstractNumId="43" w15:restartNumberingAfterBreak="0">
     <w:nsid w:val="79527ECA"/>
     <w:multiLevelType w:val="hybridMultilevel"/>
     <w:tmpl w:val="D5383D20"/>
@@ -14765,7 +14957,7 @@
       </w:pPr>
     </w:lvl>
   </w:abstractNum>
-  <w:abstractNum w:abstractNumId="43" w15:restartNumberingAfterBreak="0">
+  <w:abstractNum w:abstractNumId="44" w15:restartNumberingAfterBreak="0">
     <w:nsid w:val="7ABA1038"/>
     <w:multiLevelType w:val="hybridMultilevel"/>
     <w:tmpl w:val="CAE67AD6"/>
@@ -14851,7 +15043,7 @@
       </w:pPr>
     </w:lvl>
   </w:abstractNum>
-  <w:abstractNum w:abstractNumId="44" w15:restartNumberingAfterBreak="0">
+  <w:abstractNum w:abstractNumId="45" w15:restartNumberingAfterBreak="0">
     <w:nsid w:val="7FBE6D6A"/>
     <w:multiLevelType w:val="hybridMultilevel"/>
     <w:tmpl w:val="7D3272E4"/>
@@ -14938,88 +15130,88 @@
     </w:lvl>
   </w:abstractNum>
   <w:num w:numId="1" w16cid:durableId="2067530903">
-    <w:abstractNumId w:val="18"/>
+    <w:abstractNumId w:val="19"/>
   </w:num>
   <w:num w:numId="2" w16cid:durableId="1527332407">
-    <w:abstractNumId w:val="13"/>
+    <w:abstractNumId w:val="14"/>
   </w:num>
   <w:num w:numId="3" w16cid:durableId="992101742">
+    <w:abstractNumId w:val="23"/>
+  </w:num>
+  <w:num w:numId="4" w16cid:durableId="271985620">
+    <w:abstractNumId w:val="11"/>
+  </w:num>
+  <w:num w:numId="5" w16cid:durableId="1301619490">
     <w:abstractNumId w:val="22"/>
   </w:num>
-  <w:num w:numId="4" w16cid:durableId="271985620">
+  <w:num w:numId="6" w16cid:durableId="1738437273">
     <w:abstractNumId w:val="10"/>
   </w:num>
-  <w:num w:numId="5" w16cid:durableId="1301619490">
-    <w:abstractNumId w:val="21"/>
-  </w:num>
-  <w:num w:numId="6" w16cid:durableId="1738437273">
-    <w:abstractNumId w:val="9"/>
-  </w:num>
   <w:num w:numId="7" w16cid:durableId="1879052598">
-    <w:abstractNumId w:val="35"/>
+    <w:abstractNumId w:val="36"/>
   </w:num>
   <w:num w:numId="8" w16cid:durableId="1749188025">
-    <w:abstractNumId w:val="14"/>
+    <w:abstractNumId w:val="15"/>
   </w:num>
   <w:num w:numId="9" w16cid:durableId="101462200">
-    <w:abstractNumId w:val="39"/>
+    <w:abstractNumId w:val="40"/>
   </w:num>
   <w:num w:numId="10" w16cid:durableId="57170953">
     <w:abstractNumId w:val="1"/>
   </w:num>
   <w:num w:numId="11" w16cid:durableId="1837259699">
-    <w:abstractNumId w:val="11"/>
+    <w:abstractNumId w:val="12"/>
   </w:num>
   <w:num w:numId="12" w16cid:durableId="1752465261">
-    <w:abstractNumId w:val="31"/>
+    <w:abstractNumId w:val="32"/>
   </w:num>
   <w:num w:numId="13" w16cid:durableId="192882122">
-    <w:abstractNumId w:val="43"/>
+    <w:abstractNumId w:val="44"/>
   </w:num>
   <w:num w:numId="14" w16cid:durableId="1059592124">
-    <w:abstractNumId w:val="20"/>
+    <w:abstractNumId w:val="21"/>
   </w:num>
   <w:num w:numId="15" w16cid:durableId="973172513">
     <w:abstractNumId w:val="7"/>
   </w:num>
   <w:num w:numId="16" w16cid:durableId="1242788342">
-    <w:abstractNumId w:val="19"/>
+    <w:abstractNumId w:val="20"/>
   </w:num>
   <w:num w:numId="17" w16cid:durableId="1172834706">
-    <w:abstractNumId w:val="25"/>
+    <w:abstractNumId w:val="26"/>
   </w:num>
   <w:num w:numId="18" w16cid:durableId="1390882741">
-    <w:abstractNumId w:val="44"/>
+    <w:abstractNumId w:val="45"/>
   </w:num>
   <w:num w:numId="19" w16cid:durableId="1705986544">
-    <w:abstractNumId w:val="15"/>
+    <w:abstractNumId w:val="16"/>
   </w:num>
   <w:num w:numId="20" w16cid:durableId="178937250">
-    <w:abstractNumId w:val="23"/>
+    <w:abstractNumId w:val="24"/>
   </w:num>
   <w:num w:numId="21" w16cid:durableId="1320034700">
-    <w:abstractNumId w:val="12"/>
+    <w:abstractNumId w:val="13"/>
   </w:num>
   <w:num w:numId="22" w16cid:durableId="1867669987">
     <w:abstractNumId w:val="6"/>
   </w:num>
   <w:num w:numId="23" w16cid:durableId="112331395">
-    <w:abstractNumId w:val="42"/>
+    <w:abstractNumId w:val="43"/>
   </w:num>
   <w:num w:numId="24" w16cid:durableId="1911377728">
-    <w:abstractNumId w:val="28"/>
+    <w:abstractNumId w:val="29"/>
   </w:num>
   <w:num w:numId="25" w16cid:durableId="576789641">
-    <w:abstractNumId w:val="36"/>
+    <w:abstractNumId w:val="37"/>
   </w:num>
   <w:num w:numId="26" w16cid:durableId="1242645648">
     <w:abstractNumId w:val="5"/>
   </w:num>
   <w:num w:numId="27" w16cid:durableId="39788084">
-    <w:abstractNumId w:val="37"/>
+    <w:abstractNumId w:val="38"/>
   </w:num>
   <w:num w:numId="28" w16cid:durableId="1485971932">
-    <w:abstractNumId w:val="16"/>
+    <w:abstractNumId w:val="17"/>
   </w:num>
   <w:num w:numId="29" w16cid:durableId="464662197">
     <w:abstractNumId w:val="8"/>
@@ -15028,49 +15220,52 @@
     <w:abstractNumId w:val="4"/>
   </w:num>
   <w:num w:numId="31" w16cid:durableId="637685252">
-    <w:abstractNumId w:val="41"/>
+    <w:abstractNumId w:val="42"/>
   </w:num>
   <w:num w:numId="32" w16cid:durableId="1697849803">
-    <w:abstractNumId w:val="34"/>
+    <w:abstractNumId w:val="35"/>
   </w:num>
   <w:num w:numId="33" w16cid:durableId="1183087171">
-    <w:abstractNumId w:val="38"/>
+    <w:abstractNumId w:val="39"/>
   </w:num>
   <w:num w:numId="34" w16cid:durableId="175537492">
     <w:abstractNumId w:val="0"/>
   </w:num>
   <w:num w:numId="35" w16cid:durableId="639576823">
-    <w:abstractNumId w:val="40"/>
+    <w:abstractNumId w:val="41"/>
   </w:num>
   <w:num w:numId="36" w16cid:durableId="411976258">
     <w:abstractNumId w:val="3"/>
   </w:num>
   <w:num w:numId="37" w16cid:durableId="1778598144">
-    <w:abstractNumId w:val="26"/>
+    <w:abstractNumId w:val="27"/>
   </w:num>
   <w:num w:numId="38" w16cid:durableId="1668944241">
-    <w:abstractNumId w:val="24"/>
+    <w:abstractNumId w:val="25"/>
   </w:num>
   <w:num w:numId="39" w16cid:durableId="79497419">
-    <w:abstractNumId w:val="27"/>
+    <w:abstractNumId w:val="28"/>
   </w:num>
   <w:num w:numId="40" w16cid:durableId="1520779727">
     <w:abstractNumId w:val="2"/>
   </w:num>
   <w:num w:numId="41" w16cid:durableId="1847136618">
-    <w:abstractNumId w:val="17"/>
+    <w:abstractNumId w:val="18"/>
   </w:num>
   <w:num w:numId="42" w16cid:durableId="2015761938">
+    <w:abstractNumId w:val="31"/>
+  </w:num>
+  <w:num w:numId="43" w16cid:durableId="1657762772">
     <w:abstractNumId w:val="30"/>
   </w:num>
-  <w:num w:numId="43" w16cid:durableId="1657762772">
-    <w:abstractNumId w:val="29"/>
-  </w:num>
   <w:num w:numId="44" w16cid:durableId="969361359">
-    <w:abstractNumId w:val="32"/>
+    <w:abstractNumId w:val="33"/>
   </w:num>
   <w:num w:numId="45" w16cid:durableId="747270544">
-    <w:abstractNumId w:val="33"/>
+    <w:abstractNumId w:val="34"/>
+  </w:num>
+  <w:num w:numId="46" w16cid:durableId="1180658788">
+    <w:abstractNumId w:val="9"/>
   </w:num>
 </w:numbering>
 </file>

</xml_diff>

<commit_message>
Running sum of 1D Array
</commit_message>
<xml_diff>
--- a/Questions.docx
+++ b/Questions.docx
@@ -10649,6 +10649,10 @@
     <w:p>
       <w:pPr>
         <w:pStyle w:val="ListParagraph"/>
+        <w:numPr>
+          <w:ilvl w:val="0"/>
+          <w:numId w:val="45"/>
+        </w:numPr>
         <w:rPr>
           <w:rFonts w:ascii="Times New Roman" w:hAnsi="Times New Roman" w:cs="Times New Roman"/>
           <w:sz w:val="28"/>
@@ -10658,6 +10662,16 @@
     </w:p>
     <w:p>
       <w:pPr>
+        <w:pStyle w:val="ListParagraph"/>
+        <w:rPr>
+          <w:rFonts w:ascii="Times New Roman" w:hAnsi="Times New Roman" w:cs="Times New Roman"/>
+          <w:sz w:val="28"/>
+          <w:szCs w:val="22"/>
+        </w:rPr>
+      </w:pPr>
+    </w:p>
+    <w:p>
+      <w:pPr>
         <w:pStyle w:val="IntenseQuote"/>
       </w:pPr>
       <w:r>
@@ -10748,6 +10762,33 @@
         </w:rPr>
         <w:t>Reverse a given array.</w:t>
       </w:r>
+    </w:p>
+    <w:p>
+      <w:pPr>
+        <w:pStyle w:val="ListParagraph"/>
+        <w:numPr>
+          <w:ilvl w:val="0"/>
+          <w:numId w:val="46"/>
+        </w:numPr>
+      </w:pPr>
+      <w:r>
+        <w:rPr>
+          <w:rFonts w:ascii="Times New Roman" w:hAnsi="Times New Roman" w:cs="Times New Roman"/>
+          <w:sz w:val="28"/>
+          <w:szCs w:val="22"/>
+        </w:rPr>
+        <w:t>Running Sum of 1D Array.</w:t>
+      </w:r>
+    </w:p>
+    <w:p>
+      <w:pPr>
+        <w:ind w:left="360"/>
+        <w:rPr>
+          <w:rFonts w:ascii="Times New Roman" w:hAnsi="Times New Roman" w:cs="Times New Roman"/>
+          <w:sz w:val="28"/>
+          <w:szCs w:val="22"/>
+        </w:rPr>
+      </w:pPr>
     </w:p>
     <w:sectPr>
       <w:pgSz w:w="11906" w:h="16838"/>

</xml_diff>

<commit_message>
substring in string, spiral print
</commit_message>
<xml_diff>
--- a/Questions.docx
+++ b/Questions.docx
@@ -52,8 +52,18 @@
           <w:sz w:val="28"/>
           <w:szCs w:val="22"/>
         </w:rPr>
-        <w:t>Write a java program to check input validation for integer constraints :</w:t>
-      </w:r>
+        <w:t xml:space="preserve">Write a java program to check input validation for integer </w:t>
+      </w:r>
+      <w:proofErr w:type="gramStart"/>
+      <w:r>
+        <w:rPr>
+          <w:rFonts w:ascii="Times New Roman" w:hAnsi="Times New Roman" w:cs="Times New Roman"/>
+          <w:sz w:val="28"/>
+          <w:szCs w:val="22"/>
+        </w:rPr>
+        <w:t>constraints :</w:t>
+      </w:r>
+      <w:proofErr w:type="gramEnd"/>
     </w:p>
     <w:p>
       <w:pPr>
@@ -72,6 +82,7 @@
         </w:rPr>
         <w:t>N&lt;</w:t>
       </w:r>
+      <w:proofErr w:type="gramStart"/>
       <w:r>
         <w:rPr>
           <w:rFonts w:ascii="Times New Roman" w:hAnsi="Times New Roman" w:cs="Times New Roman"/>
@@ -102,15 +113,42 @@
           <w:sz w:val="28"/>
           <w:szCs w:val="22"/>
         </w:rPr>
-        <w:t>N&gt;</w:t>
-      </w:r>
+        <w:t>N</w:t>
+      </w:r>
+      <w:proofErr w:type="gramEnd"/>
       <w:r>
         <w:rPr>
           <w:rFonts w:ascii="Times New Roman" w:hAnsi="Times New Roman" w:cs="Times New Roman"/>
           <w:sz w:val="28"/>
           <w:szCs w:val="22"/>
         </w:rPr>
-        <w:t xml:space="preserve">0, for string constraints : </w:t>
+        <w:t>&gt;</w:t>
+      </w:r>
+      <w:r>
+        <w:rPr>
+          <w:rFonts w:ascii="Times New Roman" w:hAnsi="Times New Roman" w:cs="Times New Roman"/>
+          <w:sz w:val="28"/>
+          <w:szCs w:val="22"/>
+        </w:rPr>
+        <w:t xml:space="preserve">0, for string </w:t>
+      </w:r>
+      <w:proofErr w:type="gramStart"/>
+      <w:r>
+        <w:rPr>
+          <w:rFonts w:ascii="Times New Roman" w:hAnsi="Times New Roman" w:cs="Times New Roman"/>
+          <w:sz w:val="28"/>
+          <w:szCs w:val="22"/>
+        </w:rPr>
+        <w:t>constraints :</w:t>
+      </w:r>
+      <w:proofErr w:type="gramEnd"/>
+      <w:r>
+        <w:rPr>
+          <w:rFonts w:ascii="Times New Roman" w:hAnsi="Times New Roman" w:cs="Times New Roman"/>
+          <w:sz w:val="28"/>
+          <w:szCs w:val="22"/>
+        </w:rPr>
+        <w:t xml:space="preserve"> </w:t>
       </w:r>
       <w:r>
         <w:rPr>
@@ -235,7 +273,34 @@
           <w:szCs w:val="24"/>
         </w:rPr>
         <w:br/>
-        <w:t xml:space="preserve">stringTimes("Hi", 2) </w:t>
+      </w:r>
+      <w:proofErr w:type="spellStart"/>
+      <w:proofErr w:type="gramStart"/>
+      <w:r>
+        <w:rPr>
+          <w:rFonts w:ascii="Verdana" w:hAnsi="Verdana"/>
+          <w:color w:val="000000"/>
+          <w:szCs w:val="24"/>
+        </w:rPr>
+        <w:t>stringTimes</w:t>
+      </w:r>
+      <w:proofErr w:type="spellEnd"/>
+      <w:r>
+        <w:rPr>
+          <w:rFonts w:ascii="Verdana" w:hAnsi="Verdana"/>
+          <w:color w:val="000000"/>
+          <w:szCs w:val="24"/>
+        </w:rPr>
+        <w:t>(</w:t>
+      </w:r>
+      <w:proofErr w:type="gramEnd"/>
+      <w:r>
+        <w:rPr>
+          <w:rFonts w:ascii="Verdana" w:hAnsi="Verdana"/>
+          <w:color w:val="000000"/>
+          <w:szCs w:val="24"/>
+        </w:rPr>
+        <w:t xml:space="preserve">"Hi", 2) </w:t>
       </w:r>
       <w:r>
         <w:rPr>
@@ -251,7 +316,25 @@
           <w:color w:val="000000"/>
           <w:szCs w:val="24"/>
         </w:rPr>
-        <w:t xml:space="preserve"> "HiHi"</w:t>
+        <w:t xml:space="preserve"> "</w:t>
+      </w:r>
+      <w:proofErr w:type="spellStart"/>
+      <w:r>
+        <w:rPr>
+          <w:rFonts w:ascii="Verdana" w:hAnsi="Verdana"/>
+          <w:color w:val="000000"/>
+          <w:szCs w:val="24"/>
+        </w:rPr>
+        <w:t>HiHi</w:t>
+      </w:r>
+      <w:proofErr w:type="spellEnd"/>
+      <w:r>
+        <w:rPr>
+          <w:rFonts w:ascii="Verdana" w:hAnsi="Verdana"/>
+          <w:color w:val="000000"/>
+          <w:szCs w:val="24"/>
+        </w:rPr>
+        <w:t>"</w:t>
       </w:r>
       <w:r>
         <w:rPr>
@@ -260,7 +343,34 @@
           <w:szCs w:val="24"/>
         </w:rPr>
         <w:br/>
-        <w:t xml:space="preserve">stringTimes("Hi", 3) </w:t>
+      </w:r>
+      <w:proofErr w:type="spellStart"/>
+      <w:proofErr w:type="gramStart"/>
+      <w:r>
+        <w:rPr>
+          <w:rFonts w:ascii="Verdana" w:hAnsi="Verdana"/>
+          <w:color w:val="000000"/>
+          <w:szCs w:val="24"/>
+        </w:rPr>
+        <w:t>stringTimes</w:t>
+      </w:r>
+      <w:proofErr w:type="spellEnd"/>
+      <w:r>
+        <w:rPr>
+          <w:rFonts w:ascii="Verdana" w:hAnsi="Verdana"/>
+          <w:color w:val="000000"/>
+          <w:szCs w:val="24"/>
+        </w:rPr>
+        <w:t>(</w:t>
+      </w:r>
+      <w:proofErr w:type="gramEnd"/>
+      <w:r>
+        <w:rPr>
+          <w:rFonts w:ascii="Verdana" w:hAnsi="Verdana"/>
+          <w:color w:val="000000"/>
+          <w:szCs w:val="24"/>
+        </w:rPr>
+        <w:t xml:space="preserve">"Hi", 3) </w:t>
       </w:r>
       <w:r>
         <w:rPr>
@@ -276,7 +386,25 @@
           <w:color w:val="000000"/>
           <w:szCs w:val="24"/>
         </w:rPr>
-        <w:t xml:space="preserve"> "HiHiHi"</w:t>
+        <w:t xml:space="preserve"> "</w:t>
+      </w:r>
+      <w:proofErr w:type="spellStart"/>
+      <w:r>
+        <w:rPr>
+          <w:rFonts w:ascii="Verdana" w:hAnsi="Verdana"/>
+          <w:color w:val="000000"/>
+          <w:szCs w:val="24"/>
+        </w:rPr>
+        <w:t>HiHiHi</w:t>
+      </w:r>
+      <w:proofErr w:type="spellEnd"/>
+      <w:r>
+        <w:rPr>
+          <w:rFonts w:ascii="Verdana" w:hAnsi="Verdana"/>
+          <w:color w:val="000000"/>
+          <w:szCs w:val="24"/>
+        </w:rPr>
+        <w:t>"</w:t>
       </w:r>
       <w:r>
         <w:rPr>
@@ -285,7 +413,34 @@
           <w:szCs w:val="24"/>
         </w:rPr>
         <w:br/>
-        <w:t xml:space="preserve">stringTimes("Hi", 1) </w:t>
+      </w:r>
+      <w:proofErr w:type="spellStart"/>
+      <w:proofErr w:type="gramStart"/>
+      <w:r>
+        <w:rPr>
+          <w:rFonts w:ascii="Verdana" w:hAnsi="Verdana"/>
+          <w:color w:val="000000"/>
+          <w:szCs w:val="24"/>
+        </w:rPr>
+        <w:t>stringTimes</w:t>
+      </w:r>
+      <w:proofErr w:type="spellEnd"/>
+      <w:r>
+        <w:rPr>
+          <w:rFonts w:ascii="Verdana" w:hAnsi="Verdana"/>
+          <w:color w:val="000000"/>
+          <w:szCs w:val="24"/>
+        </w:rPr>
+        <w:t>(</w:t>
+      </w:r>
+      <w:proofErr w:type="gramEnd"/>
+      <w:r>
+        <w:rPr>
+          <w:rFonts w:ascii="Verdana" w:hAnsi="Verdana"/>
+          <w:color w:val="000000"/>
+          <w:szCs w:val="24"/>
+        </w:rPr>
+        <w:t xml:space="preserve">"Hi", 1) </w:t>
       </w:r>
       <w:r>
         <w:rPr>
@@ -644,7 +799,27 @@
           <w:sz w:val="24"/>
           <w:szCs w:val="24"/>
         </w:rPr>
-        <w:t>Write a java program to find the multiplication of a input number.</w:t>
+        <w:t xml:space="preserve">Write a java program to find the multiplication of </w:t>
+      </w:r>
+      <w:proofErr w:type="gramStart"/>
+      <w:r>
+        <w:rPr>
+          <w:rFonts w:ascii="Verdana" w:hAnsi="Verdana"/>
+          <w:color w:val="000000"/>
+          <w:sz w:val="24"/>
+          <w:szCs w:val="24"/>
+        </w:rPr>
+        <w:t>a</w:t>
+      </w:r>
+      <w:proofErr w:type="gramEnd"/>
+      <w:r>
+        <w:rPr>
+          <w:rFonts w:ascii="Verdana" w:hAnsi="Verdana"/>
+          <w:color w:val="000000"/>
+          <w:sz w:val="24"/>
+          <w:szCs w:val="24"/>
+        </w:rPr>
+        <w:t xml:space="preserve"> input number.</w:t>
       </w:r>
     </w:p>
     <w:p>
@@ -677,7 +852,27 @@
           <w:sz w:val="24"/>
           <w:szCs w:val="24"/>
         </w:rPr>
-        <w:t xml:space="preserve">alculate factorial of a </w:t>
+        <w:t xml:space="preserve">alculate factorial of </w:t>
+      </w:r>
+      <w:proofErr w:type="gramStart"/>
+      <w:r>
+        <w:rPr>
+          <w:rFonts w:ascii="Verdana" w:hAnsi="Verdana"/>
+          <w:color w:val="000000"/>
+          <w:sz w:val="24"/>
+          <w:szCs w:val="24"/>
+        </w:rPr>
+        <w:t>a</w:t>
+      </w:r>
+      <w:proofErr w:type="gramEnd"/>
+      <w:r>
+        <w:rPr>
+          <w:rFonts w:ascii="Verdana" w:hAnsi="Verdana"/>
+          <w:color w:val="000000"/>
+          <w:sz w:val="24"/>
+          <w:szCs w:val="24"/>
+        </w:rPr>
+        <w:t xml:space="preserve"> </w:t>
       </w:r>
       <w:r>
         <w:rPr>
@@ -860,7 +1055,27 @@
           <w:sz w:val="24"/>
           <w:szCs w:val="24"/>
         </w:rPr>
-        <w:t>Write a java to count and sum of digits in a input number.</w:t>
+        <w:t xml:space="preserve">Write a java to count and sum of digits in </w:t>
+      </w:r>
+      <w:proofErr w:type="gramStart"/>
+      <w:r>
+        <w:rPr>
+          <w:rFonts w:ascii="Verdana" w:hAnsi="Verdana"/>
+          <w:color w:val="000000"/>
+          <w:sz w:val="24"/>
+          <w:szCs w:val="24"/>
+        </w:rPr>
+        <w:t>a</w:t>
+      </w:r>
+      <w:proofErr w:type="gramEnd"/>
+      <w:r>
+        <w:rPr>
+          <w:rFonts w:ascii="Verdana" w:hAnsi="Verdana"/>
+          <w:color w:val="000000"/>
+          <w:sz w:val="24"/>
+          <w:szCs w:val="24"/>
+        </w:rPr>
+        <w:t xml:space="preserve"> input number.</w:t>
       </w:r>
     </w:p>
     <w:p>
@@ -1004,7 +1219,58 @@
           <w:sz w:val="24"/>
           <w:szCs w:val="24"/>
         </w:rPr>
-        <w:t xml:space="preserve">Write a program to reverse the order of words in a string entered, for eg : I am Ram  to  Ram am I </w:t>
+        <w:t xml:space="preserve">Write a program to reverse the order of words in a string entered, for </w:t>
+      </w:r>
+      <w:proofErr w:type="spellStart"/>
+      <w:proofErr w:type="gramStart"/>
+      <w:r>
+        <w:rPr>
+          <w:rFonts w:ascii="Verdana" w:hAnsi="Verdana"/>
+          <w:color w:val="000000"/>
+          <w:sz w:val="24"/>
+          <w:szCs w:val="24"/>
+        </w:rPr>
+        <w:t>eg</w:t>
+      </w:r>
+      <w:proofErr w:type="spellEnd"/>
+      <w:r>
+        <w:rPr>
+          <w:rFonts w:ascii="Verdana" w:hAnsi="Verdana"/>
+          <w:color w:val="000000"/>
+          <w:sz w:val="24"/>
+          <w:szCs w:val="24"/>
+        </w:rPr>
+        <w:t xml:space="preserve"> :</w:t>
+      </w:r>
+      <w:proofErr w:type="gramEnd"/>
+      <w:r>
+        <w:rPr>
+          <w:rFonts w:ascii="Verdana" w:hAnsi="Verdana"/>
+          <w:color w:val="000000"/>
+          <w:sz w:val="24"/>
+          <w:szCs w:val="24"/>
+        </w:rPr>
+        <w:t xml:space="preserve"> I am </w:t>
+      </w:r>
+      <w:proofErr w:type="gramStart"/>
+      <w:r>
+        <w:rPr>
+          <w:rFonts w:ascii="Verdana" w:hAnsi="Verdana"/>
+          <w:color w:val="000000"/>
+          <w:sz w:val="24"/>
+          <w:szCs w:val="24"/>
+        </w:rPr>
+        <w:t>Ram  to</w:t>
+      </w:r>
+      <w:proofErr w:type="gramEnd"/>
+      <w:r>
+        <w:rPr>
+          <w:rFonts w:ascii="Verdana" w:hAnsi="Verdana"/>
+          <w:color w:val="000000"/>
+          <w:sz w:val="24"/>
+          <w:szCs w:val="24"/>
+        </w:rPr>
+        <w:t xml:space="preserve">  Ram am I </w:t>
       </w:r>
     </w:p>
     <w:p>
@@ -1549,7 +1815,31 @@
           <w:sz w:val="24"/>
           <w:szCs w:val="24"/>
         </w:rPr>
-        <w:t>only even digits</w:t>
+        <w:t xml:space="preserve">only </w:t>
+      </w:r>
+      <w:proofErr w:type="spellStart"/>
+      <w:r>
+        <w:rPr>
+          <w:rFonts w:ascii="Verdana" w:hAnsi="Verdana"/>
+          <w:b/>
+          <w:bCs/>
+          <w:color w:val="000000"/>
+          <w:sz w:val="24"/>
+          <w:szCs w:val="24"/>
+        </w:rPr>
+        <w:t>even</w:t>
+      </w:r>
+      <w:proofErr w:type="spellEnd"/>
+      <w:r>
+        <w:rPr>
+          <w:rFonts w:ascii="Verdana" w:hAnsi="Verdana"/>
+          <w:b/>
+          <w:bCs/>
+          <w:color w:val="000000"/>
+          <w:sz w:val="24"/>
+          <w:szCs w:val="24"/>
+        </w:rPr>
+        <w:t xml:space="preserve"> digits</w:t>
       </w:r>
       <w:r>
         <w:rPr>
@@ -1640,17 +1930,48 @@
           <w:sz w:val="24"/>
           <w:szCs w:val="24"/>
         </w:rPr>
-        <w:t>Day 08</w:t>
-      </w:r>
-      <w:r>
-        <w:rPr>
-          <w:rFonts w:ascii="Verdana" w:hAnsi="Verdana"/>
-          <w:color w:val="000000"/>
-          <w:sz w:val="24"/>
-          <w:szCs w:val="24"/>
-        </w:rPr>
-        <w:t>( stop condition value-based vs count-based )</w:t>
-      </w:r>
+        <w:t xml:space="preserve">Day </w:t>
+      </w:r>
+      <w:proofErr w:type="gramStart"/>
+      <w:r>
+        <w:rPr>
+          <w:rFonts w:ascii="Verdana" w:hAnsi="Verdana"/>
+          <w:color w:val="000000"/>
+          <w:sz w:val="24"/>
+          <w:szCs w:val="24"/>
+        </w:rPr>
+        <w:t>08</w:t>
+      </w:r>
+      <w:r>
+        <w:rPr>
+          <w:rFonts w:ascii="Verdana" w:hAnsi="Verdana"/>
+          <w:color w:val="000000"/>
+          <w:sz w:val="24"/>
+          <w:szCs w:val="24"/>
+        </w:rPr>
+        <w:t>( stop</w:t>
+      </w:r>
+      <w:proofErr w:type="gramEnd"/>
+      <w:r>
+        <w:rPr>
+          <w:rFonts w:ascii="Verdana" w:hAnsi="Verdana"/>
+          <w:color w:val="000000"/>
+          <w:sz w:val="24"/>
+          <w:szCs w:val="24"/>
+        </w:rPr>
+        <w:t xml:space="preserve"> condition value-based vs count-</w:t>
+      </w:r>
+      <w:proofErr w:type="gramStart"/>
+      <w:r>
+        <w:rPr>
+          <w:rFonts w:ascii="Verdana" w:hAnsi="Verdana"/>
+          <w:color w:val="000000"/>
+          <w:sz w:val="24"/>
+          <w:szCs w:val="24"/>
+        </w:rPr>
+        <w:t>based )</w:t>
+      </w:r>
+      <w:proofErr w:type="gramEnd"/>
     </w:p>
     <w:p>
       <w:pPr>
@@ -1993,7 +2314,17 @@
           <w:sz w:val="24"/>
           <w:szCs w:val="24"/>
         </w:rPr>
-        <w:t xml:space="preserve"> it contains.</w:t>
+        <w:t xml:space="preserve"> it </w:t>
+      </w:r>
+      <w:proofErr w:type="gramStart"/>
+      <w:r>
+        <w:rPr>
+          <w:rFonts w:ascii="Verdana" w:hAnsi="Verdana"/>
+          <w:color w:val="000000"/>
+          <w:sz w:val="24"/>
+          <w:szCs w:val="24"/>
+        </w:rPr>
+        <w:t>contains.</w:t>
       </w:r>
       <w:r>
         <w:rPr>
@@ -2004,6 +2335,7 @@
         </w:rPr>
         <w:t>(</w:t>
       </w:r>
+      <w:proofErr w:type="gramEnd"/>
       <w:r>
         <w:rPr>
           <w:rFonts w:asciiTheme="minorHAnsi" w:eastAsiaTheme="minorHAnsi" w:hAnsiTheme="minorHAnsi" w:cstheme="minorBidi"/>
@@ -2065,7 +2397,19 @@
           <w:sz w:val="24"/>
           <w:szCs w:val="24"/>
         </w:rPr>
-        <w:t>using loop only</w:t>
+        <w:t xml:space="preserve">using loop </w:t>
+      </w:r>
+      <w:proofErr w:type="gramStart"/>
+      <w:r>
+        <w:rPr>
+          <w:rFonts w:ascii="Verdana" w:hAnsi="Verdana"/>
+          <w:b/>
+          <w:bCs/>
+          <w:color w:val="000000"/>
+          <w:sz w:val="24"/>
+          <w:szCs w:val="24"/>
+        </w:rPr>
+        <w:t>only</w:t>
       </w:r>
       <w:r>
         <w:rPr>
@@ -2083,7 +2427,37 @@
           <w:sz w:val="24"/>
           <w:szCs w:val="24"/>
         </w:rPr>
-        <w:t>(No Stringbuilder) (</w:t>
+        <w:t>(</w:t>
+      </w:r>
+      <w:proofErr w:type="gramEnd"/>
+      <w:r>
+        <w:rPr>
+          <w:rFonts w:ascii="Verdana" w:hAnsi="Verdana"/>
+          <w:color w:val="000000"/>
+          <w:sz w:val="24"/>
+          <w:szCs w:val="24"/>
+        </w:rPr>
+        <w:t xml:space="preserve">No </w:t>
+      </w:r>
+      <w:proofErr w:type="spellStart"/>
+      <w:r>
+        <w:rPr>
+          <w:rFonts w:ascii="Verdana" w:hAnsi="Verdana"/>
+          <w:color w:val="000000"/>
+          <w:sz w:val="24"/>
+          <w:szCs w:val="24"/>
+        </w:rPr>
+        <w:t>Stringbuilder</w:t>
+      </w:r>
+      <w:proofErr w:type="spellEnd"/>
+      <w:r>
+        <w:rPr>
+          <w:rFonts w:ascii="Verdana" w:hAnsi="Verdana"/>
+          <w:color w:val="000000"/>
+          <w:sz w:val="24"/>
+          <w:szCs w:val="24"/>
+        </w:rPr>
+        <w:t>) (</w:t>
       </w:r>
       <w:r>
         <w:rPr>
@@ -2136,7 +2510,19 @@
           <w:sz w:val="24"/>
           <w:szCs w:val="24"/>
         </w:rPr>
-        <w:t>greater than 50</w:t>
+        <w:t xml:space="preserve">greater than </w:t>
+      </w:r>
+      <w:proofErr w:type="gramStart"/>
+      <w:r>
+        <w:rPr>
+          <w:rFonts w:ascii="Verdana" w:hAnsi="Verdana"/>
+          <w:b/>
+          <w:bCs/>
+          <w:color w:val="000000"/>
+          <w:sz w:val="24"/>
+          <w:szCs w:val="24"/>
+        </w:rPr>
+        <w:t>50</w:t>
       </w:r>
       <w:r>
         <w:rPr>
@@ -2156,6 +2542,7 @@
         </w:rPr>
         <w:t>(</w:t>
       </w:r>
+      <w:proofErr w:type="gramEnd"/>
       <w:r>
         <w:rPr>
           <w:rFonts w:asciiTheme="minorHAnsi" w:eastAsiaTheme="minorHAnsi" w:hAnsiTheme="minorHAnsi" w:cstheme="minorBidi"/>
@@ -2270,7 +2657,17 @@
           <w:sz w:val="24"/>
           <w:szCs w:val="24"/>
         </w:rPr>
-        <w:t>Count Even Digits in Each Array Element</w:t>
+        <w:t xml:space="preserve">Count Even Digits in Each Array </w:t>
+      </w:r>
+      <w:proofErr w:type="gramStart"/>
+      <w:r>
+        <w:rPr>
+          <w:rFonts w:ascii="Verdana" w:hAnsi="Verdana"/>
+          <w:color w:val="000000"/>
+          <w:sz w:val="24"/>
+          <w:szCs w:val="24"/>
+        </w:rPr>
+        <w:t>Element</w:t>
       </w:r>
       <w:r>
         <w:rPr>
@@ -2281,6 +2678,7 @@
         </w:rPr>
         <w:t>.(</w:t>
       </w:r>
+      <w:proofErr w:type="gramEnd"/>
       <w:r>
         <w:rPr>
           <w:rFonts w:asciiTheme="minorHAnsi" w:eastAsiaTheme="minorHAnsi" w:hAnsiTheme="minorHAnsi" w:cstheme="minorBidi"/>
@@ -2331,7 +2729,29 @@
           <w:sz w:val="24"/>
           <w:szCs w:val="24"/>
         </w:rPr>
-        <w:t xml:space="preserve">Traverse an array.If </w:t>
+        <w:t xml:space="preserve">Traverse an </w:t>
+      </w:r>
+      <w:proofErr w:type="spellStart"/>
+      <w:proofErr w:type="gramStart"/>
+      <w:r>
+        <w:rPr>
+          <w:rFonts w:ascii="Verdana" w:hAnsi="Verdana"/>
+          <w:color w:val="000000"/>
+          <w:sz w:val="24"/>
+          <w:szCs w:val="24"/>
+        </w:rPr>
+        <w:t>array.If</w:t>
+      </w:r>
+      <w:proofErr w:type="spellEnd"/>
+      <w:proofErr w:type="gramEnd"/>
+      <w:r>
+        <w:rPr>
+          <w:rFonts w:ascii="Verdana" w:hAnsi="Verdana"/>
+          <w:color w:val="000000"/>
+          <w:sz w:val="24"/>
+          <w:szCs w:val="24"/>
+        </w:rPr>
+        <w:t xml:space="preserve"> </w:t>
       </w:r>
       <w:r>
         <w:rPr>
@@ -2351,7 +2771,17 @@
           <w:sz w:val="24"/>
           <w:szCs w:val="24"/>
         </w:rPr>
-        <w:t>, stop immediately.</w:t>
+        <w:t xml:space="preserve">, stop </w:t>
+      </w:r>
+      <w:proofErr w:type="gramStart"/>
+      <w:r>
+        <w:rPr>
+          <w:rFonts w:ascii="Verdana" w:hAnsi="Verdana"/>
+          <w:color w:val="000000"/>
+          <w:sz w:val="24"/>
+          <w:szCs w:val="24"/>
+        </w:rPr>
+        <w:t>immediately.</w:t>
       </w:r>
       <w:r>
         <w:rPr>
@@ -2362,6 +2792,7 @@
         </w:rPr>
         <w:t>(</w:t>
       </w:r>
+      <w:proofErr w:type="gramEnd"/>
       <w:r>
         <w:rPr>
           <w:rFonts w:asciiTheme="minorHAnsi" w:eastAsiaTheme="minorHAnsi" w:hAnsiTheme="minorHAnsi" w:cstheme="minorBidi"/>
@@ -2506,7 +2937,17 @@
           <w:sz w:val="24"/>
           <w:szCs w:val="24"/>
         </w:rPr>
-        <w:t xml:space="preserve"> in a string</w:t>
+        <w:t xml:space="preserve"> in a </w:t>
+      </w:r>
+      <w:proofErr w:type="gramStart"/>
+      <w:r>
+        <w:rPr>
+          <w:rFonts w:ascii="Verdana" w:hAnsi="Verdana"/>
+          <w:color w:val="000000"/>
+          <w:sz w:val="24"/>
+          <w:szCs w:val="24"/>
+        </w:rPr>
+        <w:t>string</w:t>
       </w:r>
       <w:r>
         <w:rPr>
@@ -2526,6 +2967,7 @@
         </w:rPr>
         <w:t>(</w:t>
       </w:r>
+      <w:proofErr w:type="gramEnd"/>
       <w:r>
         <w:rPr>
           <w:rFonts w:asciiTheme="minorHAnsi" w:eastAsiaTheme="minorHAnsi" w:hAnsiTheme="minorHAnsi" w:cstheme="minorBidi"/>
@@ -2593,7 +3035,19 @@
           <w:sz w:val="24"/>
           <w:szCs w:val="24"/>
         </w:rPr>
-        <w:t>without using reverse methods</w:t>
+        <w:t xml:space="preserve">without using reverse </w:t>
+      </w:r>
+      <w:proofErr w:type="gramStart"/>
+      <w:r>
+        <w:rPr>
+          <w:rFonts w:ascii="Verdana" w:hAnsi="Verdana"/>
+          <w:b/>
+          <w:bCs/>
+          <w:color w:val="000000"/>
+          <w:sz w:val="24"/>
+          <w:szCs w:val="24"/>
+        </w:rPr>
+        <w:t>methods</w:t>
       </w:r>
       <w:r>
         <w:rPr>
@@ -2613,6 +3067,7 @@
         </w:rPr>
         <w:t>(</w:t>
       </w:r>
+      <w:proofErr w:type="gramEnd"/>
       <w:r>
         <w:rPr>
           <w:rFonts w:asciiTheme="minorHAnsi" w:eastAsiaTheme="minorHAnsi" w:hAnsiTheme="minorHAnsi" w:cstheme="minorBidi"/>
@@ -2663,7 +3118,17 @@
           <w:sz w:val="24"/>
           <w:szCs w:val="24"/>
         </w:rPr>
-        <w:t>Given an array and a number x, count how many times x appears.</w:t>
+        <w:t xml:space="preserve">Given an array and a number x, count how many times x </w:t>
+      </w:r>
+      <w:proofErr w:type="gramStart"/>
+      <w:r>
+        <w:rPr>
+          <w:rFonts w:ascii="Verdana" w:hAnsi="Verdana"/>
+          <w:color w:val="000000"/>
+          <w:sz w:val="24"/>
+          <w:szCs w:val="24"/>
+        </w:rPr>
+        <w:t>appears.</w:t>
       </w:r>
       <w:r>
         <w:rPr>
@@ -2674,6 +3139,7 @@
         </w:rPr>
         <w:t>(</w:t>
       </w:r>
+      <w:proofErr w:type="gramEnd"/>
       <w:r>
         <w:rPr>
           <w:rFonts w:asciiTheme="minorHAnsi" w:eastAsiaTheme="minorHAnsi" w:hAnsiTheme="minorHAnsi" w:cstheme="minorBidi"/>
@@ -2735,7 +3201,19 @@
           <w:sz w:val="24"/>
           <w:szCs w:val="24"/>
         </w:rPr>
-        <w:t>ascending order</w:t>
+        <w:t xml:space="preserve">ascending </w:t>
+      </w:r>
+      <w:proofErr w:type="gramStart"/>
+      <w:r>
+        <w:rPr>
+          <w:rFonts w:ascii="Verdana" w:hAnsi="Verdana"/>
+          <w:b/>
+          <w:bCs/>
+          <w:color w:val="000000"/>
+          <w:sz w:val="24"/>
+          <w:szCs w:val="24"/>
+        </w:rPr>
+        <w:t>order</w:t>
       </w:r>
       <w:r>
         <w:rPr>
@@ -2755,6 +3233,7 @@
         </w:rPr>
         <w:t>(</w:t>
       </w:r>
+      <w:proofErr w:type="gramEnd"/>
       <w:r>
         <w:rPr>
           <w:rFonts w:asciiTheme="minorHAnsi" w:eastAsiaTheme="minorHAnsi" w:hAnsiTheme="minorHAnsi" w:cstheme="minorBidi"/>
@@ -2816,7 +3295,19 @@
           <w:sz w:val="24"/>
           <w:szCs w:val="24"/>
         </w:rPr>
-        <w:t>sum of digits of each element</w:t>
+        <w:t xml:space="preserve">sum of digits of each </w:t>
+      </w:r>
+      <w:proofErr w:type="gramStart"/>
+      <w:r>
+        <w:rPr>
+          <w:rFonts w:ascii="Verdana" w:hAnsi="Verdana"/>
+          <w:b/>
+          <w:bCs/>
+          <w:color w:val="000000"/>
+          <w:sz w:val="24"/>
+          <w:szCs w:val="24"/>
+        </w:rPr>
+        <w:t>element</w:t>
       </w:r>
       <w:r>
         <w:rPr>
@@ -2836,6 +3327,7 @@
         </w:rPr>
         <w:t>(</w:t>
       </w:r>
+      <w:proofErr w:type="gramEnd"/>
       <w:r>
         <w:rPr>
           <w:rFonts w:asciiTheme="minorHAnsi" w:eastAsiaTheme="minorHAnsi" w:hAnsiTheme="minorHAnsi" w:cstheme="minorBidi"/>
@@ -2906,7 +3398,17 @@
           <w:sz w:val="24"/>
           <w:szCs w:val="24"/>
         </w:rPr>
-        <w:t>, then stop.</w:t>
+        <w:t xml:space="preserve">, then </w:t>
+      </w:r>
+      <w:proofErr w:type="gramStart"/>
+      <w:r>
+        <w:rPr>
+          <w:rFonts w:ascii="Verdana" w:hAnsi="Verdana"/>
+          <w:color w:val="000000"/>
+          <w:sz w:val="24"/>
+          <w:szCs w:val="24"/>
+        </w:rPr>
+        <w:t>stop.</w:t>
       </w:r>
       <w:r>
         <w:rPr>
@@ -2917,6 +3419,7 @@
         </w:rPr>
         <w:t>(</w:t>
       </w:r>
+      <w:proofErr w:type="gramEnd"/>
       <w:r>
         <w:rPr>
           <w:rFonts w:asciiTheme="minorHAnsi" w:eastAsiaTheme="minorHAnsi" w:hAnsiTheme="minorHAnsi" w:cstheme="minorBidi"/>
@@ -2987,7 +3490,47 @@
           <w:sz w:val="24"/>
           <w:szCs w:val="24"/>
         </w:rPr>
-        <w:t>Write a program to find out whether entered number is place at ones, tens, hundred , thousand etc….</w:t>
+        <w:t xml:space="preserve">Write a program to find out whether entered number is place at ones, tens, </w:t>
+      </w:r>
+      <w:proofErr w:type="gramStart"/>
+      <w:r>
+        <w:rPr>
+          <w:rFonts w:ascii="Verdana" w:hAnsi="Verdana"/>
+          <w:color w:val="000000"/>
+          <w:sz w:val="24"/>
+          <w:szCs w:val="24"/>
+        </w:rPr>
+        <w:t>hundred ,</w:t>
+      </w:r>
+      <w:proofErr w:type="gramEnd"/>
+      <w:r>
+        <w:rPr>
+          <w:rFonts w:ascii="Verdana" w:hAnsi="Verdana"/>
+          <w:color w:val="000000"/>
+          <w:sz w:val="24"/>
+          <w:szCs w:val="24"/>
+        </w:rPr>
+        <w:t xml:space="preserve"> thousand </w:t>
+      </w:r>
+      <w:proofErr w:type="spellStart"/>
+      <w:r>
+        <w:rPr>
+          <w:rFonts w:ascii="Verdana" w:hAnsi="Verdana"/>
+          <w:color w:val="000000"/>
+          <w:sz w:val="24"/>
+          <w:szCs w:val="24"/>
+        </w:rPr>
+        <w:t>etc</w:t>
+      </w:r>
+      <w:proofErr w:type="spellEnd"/>
+      <w:r>
+        <w:rPr>
+          <w:rFonts w:ascii="Verdana" w:hAnsi="Verdana"/>
+          <w:color w:val="000000"/>
+          <w:sz w:val="24"/>
+          <w:szCs w:val="24"/>
+        </w:rPr>
+        <w:t>….</w:t>
       </w:r>
     </w:p>
     <w:p>
@@ -3011,16 +3554,96 @@
           <w:sz w:val="24"/>
           <w:szCs w:val="24"/>
         </w:rPr>
-        <w:t>Write a program to take a string and a number / integer as prefix for that word or string , and in output just reverse string upto that integer position part, or that prefix part.</w:t>
-      </w:r>
-      <w:r>
-        <w:rPr>
-          <w:rFonts w:ascii="Verdana" w:hAnsi="Verdana"/>
-          <w:color w:val="000000"/>
-          <w:sz w:val="24"/>
-          <w:szCs w:val="24"/>
-        </w:rPr>
-        <w:t>(Practice confusion with size of an array to index of an array ).</w:t>
+        <w:t xml:space="preserve">Write a program to take a string and a number / integer as prefix for that word or </w:t>
+      </w:r>
+      <w:proofErr w:type="gramStart"/>
+      <w:r>
+        <w:rPr>
+          <w:rFonts w:ascii="Verdana" w:hAnsi="Verdana"/>
+          <w:color w:val="000000"/>
+          <w:sz w:val="24"/>
+          <w:szCs w:val="24"/>
+        </w:rPr>
+        <w:t>string ,</w:t>
+      </w:r>
+      <w:proofErr w:type="gramEnd"/>
+      <w:r>
+        <w:rPr>
+          <w:rFonts w:ascii="Verdana" w:hAnsi="Verdana"/>
+          <w:color w:val="000000"/>
+          <w:sz w:val="24"/>
+          <w:szCs w:val="24"/>
+        </w:rPr>
+        <w:t xml:space="preserve"> and in output just reverse string </w:t>
+      </w:r>
+      <w:proofErr w:type="spellStart"/>
+      <w:r>
+        <w:rPr>
+          <w:rFonts w:ascii="Verdana" w:hAnsi="Verdana"/>
+          <w:color w:val="000000"/>
+          <w:sz w:val="24"/>
+          <w:szCs w:val="24"/>
+        </w:rPr>
+        <w:t>upto</w:t>
+      </w:r>
+      <w:proofErr w:type="spellEnd"/>
+      <w:r>
+        <w:rPr>
+          <w:rFonts w:ascii="Verdana" w:hAnsi="Verdana"/>
+          <w:color w:val="000000"/>
+          <w:sz w:val="24"/>
+          <w:szCs w:val="24"/>
+        </w:rPr>
+        <w:t xml:space="preserve"> that integer position part, or that prefix </w:t>
+      </w:r>
+      <w:proofErr w:type="gramStart"/>
+      <w:r>
+        <w:rPr>
+          <w:rFonts w:ascii="Verdana" w:hAnsi="Verdana"/>
+          <w:color w:val="000000"/>
+          <w:sz w:val="24"/>
+          <w:szCs w:val="24"/>
+        </w:rPr>
+        <w:t>part.</w:t>
+      </w:r>
+      <w:r>
+        <w:rPr>
+          <w:rFonts w:ascii="Verdana" w:hAnsi="Verdana"/>
+          <w:color w:val="000000"/>
+          <w:sz w:val="24"/>
+          <w:szCs w:val="24"/>
+        </w:rPr>
+        <w:t>(</w:t>
+      </w:r>
+      <w:proofErr w:type="gramEnd"/>
+      <w:r>
+        <w:rPr>
+          <w:rFonts w:ascii="Verdana" w:hAnsi="Verdana"/>
+          <w:color w:val="000000"/>
+          <w:sz w:val="24"/>
+          <w:szCs w:val="24"/>
+        </w:rPr>
+        <w:t xml:space="preserve">Practice confusion with size of an array to index of an </w:t>
+      </w:r>
+      <w:proofErr w:type="gramStart"/>
+      <w:r>
+        <w:rPr>
+          <w:rFonts w:ascii="Verdana" w:hAnsi="Verdana"/>
+          <w:color w:val="000000"/>
+          <w:sz w:val="24"/>
+          <w:szCs w:val="24"/>
+        </w:rPr>
+        <w:t>array )</w:t>
+      </w:r>
+      <w:proofErr w:type="gramEnd"/>
+      <w:r>
+        <w:rPr>
+          <w:rFonts w:ascii="Verdana" w:hAnsi="Verdana"/>
+          <w:color w:val="000000"/>
+          <w:sz w:val="24"/>
+          <w:szCs w:val="24"/>
+        </w:rPr>
+        <w:t>.</w:t>
       </w:r>
     </w:p>
     <w:p>
@@ -3044,7 +3667,17 @@
           <w:sz w:val="24"/>
           <w:szCs w:val="24"/>
         </w:rPr>
-        <w:t>Count Words in a String (Single Spaces Only)</w:t>
+        <w:t>Count Words in a String (Single Spaces Only</w:t>
+      </w:r>
+      <w:proofErr w:type="gramStart"/>
+      <w:r>
+        <w:rPr>
+          <w:rFonts w:ascii="Verdana" w:hAnsi="Verdana"/>
+          <w:color w:val="000000"/>
+          <w:sz w:val="24"/>
+          <w:szCs w:val="24"/>
+        </w:rPr>
+        <w:t>)</w:t>
       </w:r>
       <w:r>
         <w:rPr>
@@ -3055,6 +3688,7 @@
         </w:rPr>
         <w:t>.(</w:t>
       </w:r>
+      <w:proofErr w:type="gramEnd"/>
       <w:r>
         <w:rPr>
           <w:rFonts w:asciiTheme="minorHAnsi" w:eastAsiaTheme="minorHAnsi" w:hAnsiTheme="minorHAnsi" w:cstheme="minorBidi"/>
@@ -3130,7 +3764,17 @@
           <w:szCs w:val="24"/>
         </w:rPr>
         <w:lastRenderedPageBreak/>
-        <w:t>Given a string, remove all numeric characters and print the result.</w:t>
+        <w:t xml:space="preserve">Given a string, remove all numeric characters and print the </w:t>
+      </w:r>
+      <w:proofErr w:type="gramStart"/>
+      <w:r>
+        <w:rPr>
+          <w:rFonts w:ascii="Verdana" w:hAnsi="Verdana"/>
+          <w:color w:val="000000"/>
+          <w:sz w:val="24"/>
+          <w:szCs w:val="24"/>
+        </w:rPr>
+        <w:t>result.</w:t>
       </w:r>
       <w:r>
         <w:rPr>
@@ -3141,6 +3785,7 @@
         </w:rPr>
         <w:t>(</w:t>
       </w:r>
+      <w:proofErr w:type="gramEnd"/>
       <w:r>
         <w:rPr>
           <w:rFonts w:asciiTheme="minorHAnsi" w:eastAsiaTheme="minorHAnsi" w:hAnsiTheme="minorHAnsi" w:cstheme="minorBidi"/>
@@ -3238,25 +3883,55 @@
           <w:sz w:val="24"/>
           <w:szCs w:val="24"/>
         </w:rPr>
-        <w:t>Find (maximum – minimum)</w:t>
-      </w:r>
-      <w:r>
-        <w:rPr>
-          <w:rFonts w:ascii="Verdana" w:hAnsi="Verdana"/>
-          <w:color w:val="000000"/>
-          <w:sz w:val="24"/>
-          <w:szCs w:val="24"/>
-        </w:rPr>
-        <w:t>difference between MAX and MIN</w:t>
-      </w:r>
-      <w:r>
-        <w:rPr>
-          <w:rFonts w:ascii="Verdana" w:hAnsi="Verdana"/>
-          <w:color w:val="000000"/>
-          <w:sz w:val="24"/>
-          <w:szCs w:val="24"/>
-        </w:rPr>
-        <w:t xml:space="preserve"> from an integer array.</w:t>
+        <w:t xml:space="preserve">Find (maximum – </w:t>
+      </w:r>
+      <w:proofErr w:type="gramStart"/>
+      <w:r>
+        <w:rPr>
+          <w:rFonts w:ascii="Verdana" w:hAnsi="Verdana"/>
+          <w:color w:val="000000"/>
+          <w:sz w:val="24"/>
+          <w:szCs w:val="24"/>
+        </w:rPr>
+        <w:t>minimum)</w:t>
+      </w:r>
+      <w:r>
+        <w:rPr>
+          <w:rFonts w:ascii="Verdana" w:hAnsi="Verdana"/>
+          <w:color w:val="000000"/>
+          <w:sz w:val="24"/>
+          <w:szCs w:val="24"/>
+        </w:rPr>
+        <w:t>difference</w:t>
+      </w:r>
+      <w:proofErr w:type="gramEnd"/>
+      <w:r>
+        <w:rPr>
+          <w:rFonts w:ascii="Verdana" w:hAnsi="Verdana"/>
+          <w:color w:val="000000"/>
+          <w:sz w:val="24"/>
+          <w:szCs w:val="24"/>
+        </w:rPr>
+        <w:t xml:space="preserve"> between MAX and MIN</w:t>
+      </w:r>
+      <w:r>
+        <w:rPr>
+          <w:rFonts w:ascii="Verdana" w:hAnsi="Verdana"/>
+          <w:color w:val="000000"/>
+          <w:sz w:val="24"/>
+          <w:szCs w:val="24"/>
+        </w:rPr>
+        <w:t xml:space="preserve"> from an integer </w:t>
+      </w:r>
+      <w:proofErr w:type="gramStart"/>
+      <w:r>
+        <w:rPr>
+          <w:rFonts w:ascii="Verdana" w:hAnsi="Verdana"/>
+          <w:color w:val="000000"/>
+          <w:sz w:val="24"/>
+          <w:szCs w:val="24"/>
+        </w:rPr>
+        <w:t>array.</w:t>
       </w:r>
       <w:r>
         <w:rPr>
@@ -3267,6 +3942,7 @@
         </w:rPr>
         <w:t>(</w:t>
       </w:r>
+      <w:proofErr w:type="gramEnd"/>
       <w:r>
         <w:rPr>
           <w:rFonts w:asciiTheme="minorHAnsi" w:eastAsiaTheme="minorHAnsi" w:hAnsiTheme="minorHAnsi" w:cstheme="minorBidi"/>
@@ -3328,7 +4004,19 @@
           <w:sz w:val="24"/>
           <w:szCs w:val="24"/>
         </w:rPr>
-        <w:t>without using extra array</w:t>
+        <w:t xml:space="preserve">without using extra </w:t>
+      </w:r>
+      <w:proofErr w:type="gramStart"/>
+      <w:r>
+        <w:rPr>
+          <w:rFonts w:ascii="Verdana" w:hAnsi="Verdana"/>
+          <w:b/>
+          <w:bCs/>
+          <w:color w:val="000000"/>
+          <w:sz w:val="24"/>
+          <w:szCs w:val="24"/>
+        </w:rPr>
+        <w:t>array</w:t>
       </w:r>
       <w:r>
         <w:rPr>
@@ -3348,6 +4036,7 @@
         </w:rPr>
         <w:t>(</w:t>
       </w:r>
+      <w:proofErr w:type="gramEnd"/>
       <w:r>
         <w:rPr>
           <w:rFonts w:asciiTheme="minorHAnsi" w:eastAsiaTheme="minorHAnsi" w:hAnsiTheme="minorHAnsi" w:cstheme="minorBidi"/>
@@ -3424,7 +4113,17 @@
           <w:sz w:val="24"/>
           <w:szCs w:val="24"/>
         </w:rPr>
-        <w:t xml:space="preserve"> (2, 3, 5, 7) across all elements.</w:t>
+        <w:t xml:space="preserve"> (2, 3, 5, 7) across all </w:t>
+      </w:r>
+      <w:proofErr w:type="gramStart"/>
+      <w:r>
+        <w:rPr>
+          <w:rFonts w:ascii="Verdana" w:hAnsi="Verdana"/>
+          <w:color w:val="000000"/>
+          <w:sz w:val="24"/>
+          <w:szCs w:val="24"/>
+        </w:rPr>
+        <w:t>elements.</w:t>
       </w:r>
       <w:r>
         <w:rPr>
@@ -3435,6 +4134,7 @@
         </w:rPr>
         <w:t>(</w:t>
       </w:r>
+      <w:proofErr w:type="gramEnd"/>
       <w:r>
         <w:rPr>
           <w:rFonts w:asciiTheme="minorHAnsi" w:eastAsiaTheme="minorHAnsi" w:hAnsiTheme="minorHAnsi" w:cstheme="minorBidi"/>
@@ -3503,7 +4203,17 @@
           <w:sz w:val="24"/>
           <w:szCs w:val="24"/>
         </w:rPr>
-        <w:t>Stop when a string contains "java" (case-insensitive).</w:t>
+        <w:t>Stop when a string contains "java" (case-insensitive</w:t>
+      </w:r>
+      <w:proofErr w:type="gramStart"/>
+      <w:r>
+        <w:rPr>
+          <w:rFonts w:ascii="Verdana" w:hAnsi="Verdana"/>
+          <w:color w:val="000000"/>
+          <w:sz w:val="24"/>
+          <w:szCs w:val="24"/>
+        </w:rPr>
+        <w:t>).</w:t>
       </w:r>
       <w:r>
         <w:rPr>
@@ -3514,6 +4224,7 @@
         </w:rPr>
         <w:t>(</w:t>
       </w:r>
+      <w:proofErr w:type="gramEnd"/>
       <w:r>
         <w:rPr>
           <w:rFonts w:asciiTheme="minorHAnsi" w:eastAsiaTheme="minorHAnsi" w:hAnsiTheme="minorHAnsi" w:cstheme="minorBidi"/>
@@ -3620,8 +4331,19 @@
           <w:sz w:val="24"/>
           <w:szCs w:val="24"/>
         </w:rPr>
-        <w:t>Count how many letters are repeated in a string or word, or maybe array of characters.(</w:t>
-      </w:r>
+        <w:t xml:space="preserve">Count how many letters are repeated in a string or word, or maybe array of </w:t>
+      </w:r>
+      <w:proofErr w:type="gramStart"/>
+      <w:r>
+        <w:rPr>
+          <w:rFonts w:ascii="Verdana" w:hAnsi="Verdana"/>
+          <w:color w:val="000000"/>
+          <w:sz w:val="24"/>
+          <w:szCs w:val="24"/>
+        </w:rPr>
+        <w:t>characters.(</w:t>
+      </w:r>
+      <w:proofErr w:type="gramEnd"/>
       <w:r>
         <w:rPr>
           <w:rFonts w:asciiTheme="minorHAnsi" w:eastAsiaTheme="minorHAnsi" w:hAnsiTheme="minorHAnsi" w:cstheme="minorBidi"/>
@@ -3705,8 +4427,19 @@
           <w:sz w:val="24"/>
           <w:szCs w:val="24"/>
         </w:rPr>
-        <w:t xml:space="preserve"> in a word.(</w:t>
-      </w:r>
+        <w:t xml:space="preserve"> in a </w:t>
+      </w:r>
+      <w:proofErr w:type="gramStart"/>
+      <w:r>
+        <w:rPr>
+          <w:rFonts w:ascii="Verdana" w:hAnsi="Verdana"/>
+          <w:color w:val="000000"/>
+          <w:sz w:val="24"/>
+          <w:szCs w:val="24"/>
+        </w:rPr>
+        <w:t>word.(</w:t>
+      </w:r>
+      <w:proofErr w:type="gramEnd"/>
       <w:r>
         <w:rPr>
           <w:rFonts w:asciiTheme="minorHAnsi" w:eastAsiaTheme="minorHAnsi" w:hAnsiTheme="minorHAnsi" w:cstheme="minorBidi"/>
@@ -3792,8 +4525,19 @@
           <w:sz w:val="24"/>
           <w:szCs w:val="24"/>
         </w:rPr>
-        <w:t>Write a program to count and print unique or non-repeated characters / number in an array.(</w:t>
-      </w:r>
+        <w:t xml:space="preserve">Write a program to count and print unique or non-repeated characters / number in an </w:t>
+      </w:r>
+      <w:proofErr w:type="gramStart"/>
+      <w:r>
+        <w:rPr>
+          <w:rFonts w:ascii="Verdana" w:hAnsi="Verdana"/>
+          <w:color w:val="000000"/>
+          <w:sz w:val="24"/>
+          <w:szCs w:val="24"/>
+        </w:rPr>
+        <w:t>array.(</w:t>
+      </w:r>
+      <w:proofErr w:type="gramEnd"/>
       <w:r>
         <w:rPr>
           <w:rFonts w:ascii="Verdana" w:hAnsi="Verdana"/>
@@ -3898,7 +4642,17 @@
           <w:sz w:val="24"/>
           <w:szCs w:val="24"/>
         </w:rPr>
-        <w:t xml:space="preserve"> in an array.</w:t>
+        <w:t xml:space="preserve"> in an </w:t>
+      </w:r>
+      <w:proofErr w:type="gramStart"/>
+      <w:r>
+        <w:rPr>
+          <w:rFonts w:ascii="Verdana" w:hAnsi="Verdana"/>
+          <w:color w:val="000000"/>
+          <w:sz w:val="24"/>
+          <w:szCs w:val="24"/>
+        </w:rPr>
+        <w:t>array.</w:t>
       </w:r>
       <w:r>
         <w:rPr>
@@ -3909,6 +4663,7 @@
         </w:rPr>
         <w:t>(</w:t>
       </w:r>
+      <w:proofErr w:type="gramEnd"/>
       <w:r>
         <w:rPr>
           <w:rFonts w:asciiTheme="minorHAnsi" w:eastAsiaTheme="minorHAnsi" w:hAnsiTheme="minorHAnsi" w:cstheme="minorBidi"/>
@@ -4018,7 +4773,17 @@
           <w:sz w:val="24"/>
           <w:szCs w:val="24"/>
         </w:rPr>
-        <w:t>Remove Duplicates (Print Only Unique Elements)</w:t>
+        <w:t>Remove Duplicates (Print Only Unique Elements</w:t>
+      </w:r>
+      <w:proofErr w:type="gramStart"/>
+      <w:r>
+        <w:rPr>
+          <w:rFonts w:ascii="Verdana" w:hAnsi="Verdana"/>
+          <w:color w:val="000000"/>
+          <w:sz w:val="24"/>
+          <w:szCs w:val="24"/>
+        </w:rPr>
+        <w:t>)</w:t>
       </w:r>
       <w:r>
         <w:rPr>
@@ -4029,6 +4794,7 @@
         </w:rPr>
         <w:t>.(</w:t>
       </w:r>
+      <w:proofErr w:type="gramEnd"/>
       <w:r>
         <w:rPr>
           <w:rFonts w:asciiTheme="minorHAnsi" w:eastAsiaTheme="minorHAnsi" w:hAnsiTheme="minorHAnsi" w:cstheme="minorBidi"/>
@@ -4209,8 +4975,39 @@
           <w:szCs w:val="24"/>
         </w:rPr>
         <w:lastRenderedPageBreak/>
-        <w:t>DSA Foundation questions(Day 16) :</w:t>
-      </w:r>
+        <w:t xml:space="preserve">DSA Foundation </w:t>
+      </w:r>
+      <w:proofErr w:type="gramStart"/>
+      <w:r>
+        <w:rPr>
+          <w:rFonts w:ascii="Verdana" w:hAnsi="Verdana"/>
+          <w:color w:val="000000"/>
+          <w:sz w:val="24"/>
+          <w:szCs w:val="24"/>
+        </w:rPr>
+        <w:t>questions(</w:t>
+      </w:r>
+      <w:proofErr w:type="gramEnd"/>
+      <w:r>
+        <w:rPr>
+          <w:rFonts w:ascii="Verdana" w:hAnsi="Verdana"/>
+          <w:color w:val="000000"/>
+          <w:sz w:val="24"/>
+          <w:szCs w:val="24"/>
+        </w:rPr>
+        <w:t>Day 16</w:t>
+      </w:r>
+      <w:proofErr w:type="gramStart"/>
+      <w:r>
+        <w:rPr>
+          <w:rFonts w:ascii="Verdana" w:hAnsi="Verdana"/>
+          <w:color w:val="000000"/>
+          <w:sz w:val="24"/>
+          <w:szCs w:val="24"/>
+        </w:rPr>
+        <w:t>) :</w:t>
+      </w:r>
+      <w:proofErr w:type="gramEnd"/>
     </w:p>
     <w:p>
       <w:pPr>
@@ -4257,8 +5054,9 @@
           <w:szCs w:val="20"/>
           <w14:ligatures w14:val="none"/>
         </w:rPr>
-        <w:t>Given an array of integers nums and an integer target, return indices of the two numbers such that they add up to target.</w:t>
-      </w:r>
+        <w:t xml:space="preserve">Given an array of integers </w:t>
+      </w:r>
+      <w:proofErr w:type="spellStart"/>
       <w:r>
         <w:rPr>
           <w:rFonts w:ascii="Courier New" w:eastAsia="Times New Roman" w:hAnsi="Courier New" w:cs="Courier New"/>
@@ -4268,8 +5066,9 @@
           <w:szCs w:val="20"/>
           <w14:ligatures w14:val="none"/>
         </w:rPr>
-        <w:br/>
-      </w:r>
+        <w:t>nums</w:t>
+      </w:r>
+      <w:proofErr w:type="spellEnd"/>
       <w:r>
         <w:rPr>
           <w:rFonts w:ascii="Courier New" w:eastAsia="Times New Roman" w:hAnsi="Courier New" w:cs="Courier New"/>
@@ -4279,6 +5078,28 @@
           <w:szCs w:val="20"/>
           <w14:ligatures w14:val="none"/>
         </w:rPr>
+        <w:t xml:space="preserve"> and an integer target, return indices of the two numbers such that they add up to target.</w:t>
+      </w:r>
+      <w:r>
+        <w:rPr>
+          <w:rFonts w:ascii="Courier New" w:eastAsia="Times New Roman" w:hAnsi="Courier New" w:cs="Courier New"/>
+          <w:color w:val="F2F2F2" w:themeColor="background1" w:themeShade="F2"/>
+          <w:kern w:val="0"/>
+          <w:sz w:val="20"/>
+          <w:szCs w:val="20"/>
+          <w14:ligatures w14:val="none"/>
+        </w:rPr>
+        <w:br/>
+      </w:r>
+      <w:r>
+        <w:rPr>
+          <w:rFonts w:ascii="Courier New" w:eastAsia="Times New Roman" w:hAnsi="Courier New" w:cs="Courier New"/>
+          <w:color w:val="F2F2F2" w:themeColor="background1" w:themeShade="F2"/>
+          <w:kern w:val="0"/>
+          <w:sz w:val="20"/>
+          <w:szCs w:val="20"/>
+          <w14:ligatures w14:val="none"/>
+        </w:rPr>
         <w:br/>
         <w:t>You may assume that each input would have exactly one solution, and you may not use the same element twice.</w:t>
       </w:r>
@@ -4327,8 +5148,9 @@
           <w14:ligatures w14:val="none"/>
         </w:rPr>
         <w:br/>
-        <w:t>Input: nums = [2,7,11,15], target = 9</w:t>
-      </w:r>
+        <w:t xml:space="preserve">Input: </w:t>
+      </w:r>
+      <w:proofErr w:type="spellStart"/>
       <w:r>
         <w:rPr>
           <w:rFonts w:ascii="Courier New" w:eastAsia="Times New Roman" w:hAnsi="Courier New" w:cs="Courier New"/>
@@ -4338,6 +5160,29 @@
           <w:szCs w:val="20"/>
           <w14:ligatures w14:val="none"/>
         </w:rPr>
+        <w:t>nums</w:t>
+      </w:r>
+      <w:proofErr w:type="spellEnd"/>
+      <w:r>
+        <w:rPr>
+          <w:rFonts w:ascii="Courier New" w:eastAsia="Times New Roman" w:hAnsi="Courier New" w:cs="Courier New"/>
+          <w:color w:val="F2F2F2" w:themeColor="background1" w:themeShade="F2"/>
+          <w:kern w:val="0"/>
+          <w:sz w:val="20"/>
+          <w:szCs w:val="20"/>
+          <w14:ligatures w14:val="none"/>
+        </w:rPr>
+        <w:t xml:space="preserve"> = [2,7,11,15], target = 9</w:t>
+      </w:r>
+      <w:r>
+        <w:rPr>
+          <w:rFonts w:ascii="Courier New" w:eastAsia="Times New Roman" w:hAnsi="Courier New" w:cs="Courier New"/>
+          <w:color w:val="F2F2F2" w:themeColor="background1" w:themeShade="F2"/>
+          <w:kern w:val="0"/>
+          <w:sz w:val="20"/>
+          <w:szCs w:val="20"/>
+          <w14:ligatures w14:val="none"/>
+        </w:rPr>
         <w:br/>
         <w:t>Output: [0,1]</w:t>
       </w:r>
@@ -4351,8 +5196,9 @@
           <w14:ligatures w14:val="none"/>
         </w:rPr>
         <w:br/>
-        <w:t>Explanation: Because nums[0] + nums[1] == 9, we return [0, 1].</w:t>
-      </w:r>
+        <w:t xml:space="preserve">Explanation: Because </w:t>
+      </w:r>
+      <w:proofErr w:type="spellStart"/>
       <w:r>
         <w:rPr>
           <w:rFonts w:ascii="Courier New" w:eastAsia="Times New Roman" w:hAnsi="Courier New" w:cs="Courier New"/>
@@ -4362,6 +5208,53 @@
           <w:szCs w:val="20"/>
           <w14:ligatures w14:val="none"/>
         </w:rPr>
+        <w:t>nums</w:t>
+      </w:r>
+      <w:proofErr w:type="spellEnd"/>
+      <w:r>
+        <w:rPr>
+          <w:rFonts w:ascii="Courier New" w:eastAsia="Times New Roman" w:hAnsi="Courier New" w:cs="Courier New"/>
+          <w:color w:val="F2F2F2" w:themeColor="background1" w:themeShade="F2"/>
+          <w:kern w:val="0"/>
+          <w:sz w:val="20"/>
+          <w:szCs w:val="20"/>
+          <w14:ligatures w14:val="none"/>
+        </w:rPr>
+        <w:t xml:space="preserve">[0] + </w:t>
+      </w:r>
+      <w:proofErr w:type="spellStart"/>
+      <w:r>
+        <w:rPr>
+          <w:rFonts w:ascii="Courier New" w:eastAsia="Times New Roman" w:hAnsi="Courier New" w:cs="Courier New"/>
+          <w:color w:val="F2F2F2" w:themeColor="background1" w:themeShade="F2"/>
+          <w:kern w:val="0"/>
+          <w:sz w:val="20"/>
+          <w:szCs w:val="20"/>
+          <w14:ligatures w14:val="none"/>
+        </w:rPr>
+        <w:t>nums</w:t>
+      </w:r>
+      <w:proofErr w:type="spellEnd"/>
+      <w:r>
+        <w:rPr>
+          <w:rFonts w:ascii="Courier New" w:eastAsia="Times New Roman" w:hAnsi="Courier New" w:cs="Courier New"/>
+          <w:color w:val="F2F2F2" w:themeColor="background1" w:themeShade="F2"/>
+          <w:kern w:val="0"/>
+          <w:sz w:val="20"/>
+          <w:szCs w:val="20"/>
+          <w14:ligatures w14:val="none"/>
+        </w:rPr>
+        <w:t>[1] == 9, we return [0, 1].</w:t>
+      </w:r>
+      <w:r>
+        <w:rPr>
+          <w:rFonts w:ascii="Courier New" w:eastAsia="Times New Roman" w:hAnsi="Courier New" w:cs="Courier New"/>
+          <w:color w:val="F2F2F2" w:themeColor="background1" w:themeShade="F2"/>
+          <w:kern w:val="0"/>
+          <w:sz w:val="20"/>
+          <w:szCs w:val="20"/>
+          <w14:ligatures w14:val="none"/>
+        </w:rPr>
         <w:br/>
         <w:t>Example 2:</w:t>
       </w:r>
@@ -4375,7 +5268,31 @@
           <w14:ligatures w14:val="none"/>
         </w:rPr>
         <w:br/>
-        <w:t>Input: nums = [3,2,4], target = 6</w:t>
+        <w:t xml:space="preserve">Input: </w:t>
+      </w:r>
+      <w:proofErr w:type="spellStart"/>
+      <w:r>
+        <w:rPr>
+          <w:rFonts w:ascii="Courier New" w:eastAsia="Times New Roman" w:hAnsi="Courier New" w:cs="Courier New"/>
+          <w:color w:val="F2F2F2" w:themeColor="background1" w:themeShade="F2"/>
+          <w:kern w:val="0"/>
+          <w:sz w:val="20"/>
+          <w:szCs w:val="20"/>
+          <w14:ligatures w14:val="none"/>
+        </w:rPr>
+        <w:t>nums</w:t>
+      </w:r>
+      <w:proofErr w:type="spellEnd"/>
+      <w:r>
+        <w:rPr>
+          <w:rFonts w:ascii="Courier New" w:eastAsia="Times New Roman" w:hAnsi="Courier New" w:cs="Courier New"/>
+          <w:color w:val="F2F2F2" w:themeColor="background1" w:themeShade="F2"/>
+          <w:kern w:val="0"/>
+          <w:sz w:val="20"/>
+          <w:szCs w:val="20"/>
+          <w14:ligatures w14:val="none"/>
+        </w:rPr>
+        <w:t xml:space="preserve"> = [3,2,4], target = 6</w:t>
       </w:r>
       <w:r>
         <w:rPr>
@@ -4559,14 +5476,25 @@
         </w:rPr>
         <w:t xml:space="preserve">Day 17(Array in DSA </w:t>
       </w:r>
-      <w:r>
-        <w:rPr>
-          <w:rFonts w:ascii="Verdana" w:hAnsi="Verdana"/>
-          <w:color w:val="000000"/>
-          <w:sz w:val="24"/>
-          <w:szCs w:val="24"/>
-        </w:rPr>
-        <w:t>basic : sorting, searching and reversing</w:t>
+      <w:proofErr w:type="gramStart"/>
+      <w:r>
+        <w:rPr>
+          <w:rFonts w:ascii="Verdana" w:hAnsi="Verdana"/>
+          <w:color w:val="000000"/>
+          <w:sz w:val="24"/>
+          <w:szCs w:val="24"/>
+        </w:rPr>
+        <w:t>basic :</w:t>
+      </w:r>
+      <w:proofErr w:type="gramEnd"/>
+      <w:r>
+        <w:rPr>
+          <w:rFonts w:ascii="Verdana" w:hAnsi="Verdana"/>
+          <w:color w:val="000000"/>
+          <w:sz w:val="24"/>
+          <w:szCs w:val="24"/>
+        </w:rPr>
+        <w:t xml:space="preserve"> sorting, searching and reversing</w:t>
       </w:r>
       <w:r>
         <w:rPr>
@@ -4600,16 +5528,36 @@
           <w:sz w:val="24"/>
           <w:szCs w:val="24"/>
         </w:rPr>
-        <w:t>Write a program to find the largest element in an array using both brute force and optimal solution possible.</w:t>
-      </w:r>
-      <w:r>
-        <w:rPr>
-          <w:rFonts w:ascii="Verdana" w:hAnsi="Verdana"/>
-          <w:color w:val="000000"/>
-          <w:sz w:val="24"/>
-          <w:szCs w:val="24"/>
-        </w:rPr>
-        <w:t>(Sorting)</w:t>
+        <w:t xml:space="preserve">Write a program to find the largest element in an array using both brute force and optimal solution </w:t>
+      </w:r>
+      <w:proofErr w:type="gramStart"/>
+      <w:r>
+        <w:rPr>
+          <w:rFonts w:ascii="Verdana" w:hAnsi="Verdana"/>
+          <w:color w:val="000000"/>
+          <w:sz w:val="24"/>
+          <w:szCs w:val="24"/>
+        </w:rPr>
+        <w:t>possible.</w:t>
+      </w:r>
+      <w:r>
+        <w:rPr>
+          <w:rFonts w:ascii="Verdana" w:hAnsi="Verdana"/>
+          <w:color w:val="000000"/>
+          <w:sz w:val="24"/>
+          <w:szCs w:val="24"/>
+        </w:rPr>
+        <w:t>(</w:t>
+      </w:r>
+      <w:proofErr w:type="gramEnd"/>
+      <w:r>
+        <w:rPr>
+          <w:rFonts w:ascii="Verdana" w:hAnsi="Verdana"/>
+          <w:color w:val="000000"/>
+          <w:sz w:val="24"/>
+          <w:szCs w:val="24"/>
+        </w:rPr>
+        <w:t>Sorting)</w:t>
       </w:r>
     </w:p>
     <w:bookmarkEnd w:id="0"/>
@@ -4814,6 +5762,7 @@
         </w:rPr>
         <w:t>Given an array, </w:t>
       </w:r>
+      <w:proofErr w:type="gramStart"/>
       <w:r>
         <w:rPr>
           <w:rFonts w:ascii="Verdana" w:hAnsi="Verdana"/>
@@ -4823,17 +5772,9 @@
           <w:sz w:val="24"/>
           <w:szCs w:val="24"/>
         </w:rPr>
-        <w:t>a[]</w:t>
-      </w:r>
-      <w:r>
-        <w:rPr>
-          <w:rFonts w:ascii="Verdana" w:hAnsi="Verdana"/>
-          <w:color w:val="000000"/>
-          <w:sz w:val="24"/>
-          <w:szCs w:val="24"/>
-        </w:rPr>
-        <w:t> of n integers, and an integer element </w:t>
-      </w:r>
+        <w:t>a[</w:t>
+      </w:r>
+      <w:proofErr w:type="gramEnd"/>
       <w:r>
         <w:rPr>
           <w:rFonts w:ascii="Verdana" w:hAnsi="Verdana"/>
@@ -4843,6 +5784,26 @@
           <w:sz w:val="24"/>
           <w:szCs w:val="24"/>
         </w:rPr>
+        <w:t>]</w:t>
+      </w:r>
+      <w:r>
+        <w:rPr>
+          <w:rFonts w:ascii="Verdana" w:hAnsi="Verdana"/>
+          <w:color w:val="000000"/>
+          <w:sz w:val="24"/>
+          <w:szCs w:val="24"/>
+        </w:rPr>
+        <w:t> of n integers, and an integer element </w:t>
+      </w:r>
+      <w:r>
+        <w:rPr>
+          <w:rFonts w:ascii="Verdana" w:hAnsi="Verdana"/>
+          <w:b/>
+          <w:bCs/>
+          <w:color w:val="000000"/>
+          <w:sz w:val="24"/>
+          <w:szCs w:val="24"/>
+        </w:rPr>
         <w:t>x</w:t>
       </w:r>
       <w:r>
@@ -4890,7 +5851,47 @@
           <w:sz w:val="24"/>
           <w:szCs w:val="24"/>
         </w:rPr>
-        <w:t xml:space="preserve"> ( Array in DSA part 2 : bubble sorting</w:t>
+        <w:t xml:space="preserve"> </w:t>
+      </w:r>
+      <w:proofErr w:type="gramStart"/>
+      <w:r>
+        <w:rPr>
+          <w:rFonts w:ascii="Verdana" w:hAnsi="Verdana"/>
+          <w:color w:val="000000"/>
+          <w:sz w:val="24"/>
+          <w:szCs w:val="24"/>
+        </w:rPr>
+        <w:t>( Array</w:t>
+      </w:r>
+      <w:proofErr w:type="gramEnd"/>
+      <w:r>
+        <w:rPr>
+          <w:rFonts w:ascii="Verdana" w:hAnsi="Verdana"/>
+          <w:color w:val="000000"/>
+          <w:sz w:val="24"/>
+          <w:szCs w:val="24"/>
+        </w:rPr>
+        <w:t xml:space="preserve"> in DSA part </w:t>
+      </w:r>
+      <w:proofErr w:type="gramStart"/>
+      <w:r>
+        <w:rPr>
+          <w:rFonts w:ascii="Verdana" w:hAnsi="Verdana"/>
+          <w:color w:val="000000"/>
+          <w:sz w:val="24"/>
+          <w:szCs w:val="24"/>
+        </w:rPr>
+        <w:t>2 :</w:t>
+      </w:r>
+      <w:proofErr w:type="gramEnd"/>
+      <w:r>
+        <w:rPr>
+          <w:rFonts w:ascii="Verdana" w:hAnsi="Verdana"/>
+          <w:color w:val="000000"/>
+          <w:sz w:val="24"/>
+          <w:szCs w:val="24"/>
+        </w:rPr>
+        <w:t xml:space="preserve"> bubble sorting</w:t>
       </w:r>
       <w:r>
         <w:rPr>
@@ -5047,8 +6048,9 @@
           <w:szCs w:val="27"/>
           <w14:ligatures w14:val="none"/>
         </w:rPr>
-        <w:t>Rotate Array Right by 1 (In-place)</w:t>
-      </w:r>
+        <w:t>Rotate Array Right by 1 (In-place</w:t>
+      </w:r>
+      <w:proofErr w:type="gramStart"/>
       <w:r>
         <w:rPr>
           <w:rFonts w:ascii="Mangal" w:eastAsia="Times New Roman" w:hAnsi="Mangal" w:cs="Mangal"/>
@@ -5059,8 +6061,21 @@
           <w:szCs w:val="27"/>
           <w14:ligatures w14:val="none"/>
         </w:rPr>
+        <w:t>)</w:t>
+      </w:r>
+      <w:r>
+        <w:rPr>
+          <w:rFonts w:ascii="Mangal" w:eastAsia="Times New Roman" w:hAnsi="Mangal" w:cs="Mangal"/>
+          <w:b/>
+          <w:bCs/>
+          <w:kern w:val="0"/>
+          <w:sz w:val="27"/>
+          <w:szCs w:val="27"/>
+          <w14:ligatures w14:val="none"/>
+        </w:rPr>
         <w:t>.(</w:t>
       </w:r>
+      <w:proofErr w:type="gramEnd"/>
       <w:r>
         <w:rPr>
           <w:rFonts w:ascii="Mangal" w:eastAsia="Times New Roman" w:hAnsi="Mangal" w:cs="Mangal"/>
@@ -5301,7 +6316,27 @@
           <w:sz w:val="24"/>
           <w:szCs w:val="24"/>
         </w:rPr>
-        <w:t>. Use split().</w:t>
+        <w:t xml:space="preserve">. Use </w:t>
+      </w:r>
+      <w:proofErr w:type="gramStart"/>
+      <w:r>
+        <w:rPr>
+          <w:rFonts w:ascii="Verdana" w:hAnsi="Verdana"/>
+          <w:color w:val="000000"/>
+          <w:sz w:val="24"/>
+          <w:szCs w:val="24"/>
+        </w:rPr>
+        <w:t>split(</w:t>
+      </w:r>
+      <w:proofErr w:type="gramEnd"/>
+      <w:r>
+        <w:rPr>
+          <w:rFonts w:ascii="Verdana" w:hAnsi="Verdana"/>
+          <w:color w:val="000000"/>
+          <w:sz w:val="24"/>
+          <w:szCs w:val="24"/>
+        </w:rPr>
+        <w:t>).</w:t>
       </w:r>
     </w:p>
     <w:p>
@@ -5343,25 +6378,87 @@
           <w:sz w:val="24"/>
           <w:szCs w:val="24"/>
         </w:rPr>
-        <w:t xml:space="preserve">. Use  </w:t>
-      </w:r>
-      <w:r>
-        <w:rPr>
-          <w:rFonts w:ascii="Verdana" w:hAnsi="Verdana"/>
-          <w:color w:val="000000"/>
-          <w:sz w:val="24"/>
-          <w:szCs w:val="24"/>
-        </w:rPr>
-        <w:t>toCharArray(), Arrays.sort()</w:t>
-      </w:r>
-      <w:r>
-        <w:rPr>
-          <w:rFonts w:ascii="Verdana" w:hAnsi="Verdana"/>
-          <w:color w:val="000000"/>
-          <w:sz w:val="24"/>
-          <w:szCs w:val="24"/>
-        </w:rPr>
-        <w:t>, Arrays.equal()</w:t>
+        <w:t xml:space="preserve">. </w:t>
+      </w:r>
+      <w:proofErr w:type="gramStart"/>
+      <w:r>
+        <w:rPr>
+          <w:rFonts w:ascii="Verdana" w:hAnsi="Verdana"/>
+          <w:color w:val="000000"/>
+          <w:sz w:val="24"/>
+          <w:szCs w:val="24"/>
+        </w:rPr>
+        <w:t xml:space="preserve">Use  </w:t>
+      </w:r>
+      <w:proofErr w:type="spellStart"/>
+      <w:r>
+        <w:rPr>
+          <w:rFonts w:ascii="Verdana" w:hAnsi="Verdana"/>
+          <w:color w:val="000000"/>
+          <w:sz w:val="24"/>
+          <w:szCs w:val="24"/>
+        </w:rPr>
+        <w:t>toCharArray</w:t>
+      </w:r>
+      <w:proofErr w:type="spellEnd"/>
+      <w:proofErr w:type="gramEnd"/>
+      <w:r>
+        <w:rPr>
+          <w:rFonts w:ascii="Verdana" w:hAnsi="Verdana"/>
+          <w:color w:val="000000"/>
+          <w:sz w:val="24"/>
+          <w:szCs w:val="24"/>
+        </w:rPr>
+        <w:t xml:space="preserve">(), </w:t>
+      </w:r>
+      <w:proofErr w:type="spellStart"/>
+      <w:r>
+        <w:rPr>
+          <w:rFonts w:ascii="Verdana" w:hAnsi="Verdana"/>
+          <w:color w:val="000000"/>
+          <w:sz w:val="24"/>
+          <w:szCs w:val="24"/>
+        </w:rPr>
+        <w:t>Arrays.sort</w:t>
+      </w:r>
+      <w:proofErr w:type="spellEnd"/>
+      <w:r>
+        <w:rPr>
+          <w:rFonts w:ascii="Verdana" w:hAnsi="Verdana"/>
+          <w:color w:val="000000"/>
+          <w:sz w:val="24"/>
+          <w:szCs w:val="24"/>
+        </w:rPr>
+        <w:t>()</w:t>
+      </w:r>
+      <w:r>
+        <w:rPr>
+          <w:rFonts w:ascii="Verdana" w:hAnsi="Verdana"/>
+          <w:color w:val="000000"/>
+          <w:sz w:val="24"/>
+          <w:szCs w:val="24"/>
+        </w:rPr>
+        <w:t xml:space="preserve">, </w:t>
+      </w:r>
+      <w:proofErr w:type="spellStart"/>
+      <w:r>
+        <w:rPr>
+          <w:rFonts w:ascii="Verdana" w:hAnsi="Verdana"/>
+          <w:color w:val="000000"/>
+          <w:sz w:val="24"/>
+          <w:szCs w:val="24"/>
+        </w:rPr>
+        <w:t>Arrays.equal</w:t>
+      </w:r>
+      <w:proofErr w:type="spellEnd"/>
+      <w:r>
+        <w:rPr>
+          <w:rFonts w:ascii="Verdana" w:hAnsi="Verdana"/>
+          <w:color w:val="000000"/>
+          <w:sz w:val="24"/>
+          <w:szCs w:val="24"/>
+        </w:rPr>
+        <w:t>()</w:t>
       </w:r>
       <w:r>
         <w:rPr>
@@ -5426,7 +6523,35 @@
           <w:color w:val="000000"/>
           <w:szCs w:val="24"/>
         </w:rPr>
-        <w:t>Input: "swiss"  Output: 'w'</w:t>
+        <w:t>Input: "</w:t>
+      </w:r>
+      <w:proofErr w:type="spellStart"/>
+      <w:r>
+        <w:rPr>
+          <w:rFonts w:ascii="Verdana" w:hAnsi="Verdana"/>
+          <w:color w:val="000000"/>
+          <w:szCs w:val="24"/>
+        </w:rPr>
+        <w:t>swiss</w:t>
+      </w:r>
+      <w:proofErr w:type="spellEnd"/>
+      <w:proofErr w:type="gramStart"/>
+      <w:r>
+        <w:rPr>
+          <w:rFonts w:ascii="Verdana" w:hAnsi="Verdana"/>
+          <w:color w:val="000000"/>
+          <w:szCs w:val="24"/>
+        </w:rPr>
+        <w:t>"  Output</w:t>
+      </w:r>
+      <w:proofErr w:type="gramEnd"/>
+      <w:r>
+        <w:rPr>
+          <w:rFonts w:ascii="Verdana" w:hAnsi="Verdana"/>
+          <w:color w:val="000000"/>
+          <w:szCs w:val="24"/>
+        </w:rPr>
+        <w:t>: 'w'</w:t>
       </w:r>
       <w:r>
         <w:rPr>
@@ -5568,7 +6693,27 @@
           <w:sz w:val="24"/>
           <w:szCs w:val="24"/>
         </w:rPr>
-        <w:t>0(Array and Arraylist)</w:t>
+        <w:t xml:space="preserve">0(Array and </w:t>
+      </w:r>
+      <w:proofErr w:type="spellStart"/>
+      <w:r>
+        <w:rPr>
+          <w:rFonts w:ascii="Verdana" w:hAnsi="Verdana"/>
+          <w:color w:val="000000"/>
+          <w:sz w:val="24"/>
+          <w:szCs w:val="24"/>
+        </w:rPr>
+        <w:t>Arraylist</w:t>
+      </w:r>
+      <w:proofErr w:type="spellEnd"/>
+      <w:r>
+        <w:rPr>
+          <w:rFonts w:ascii="Verdana" w:hAnsi="Verdana"/>
+          <w:color w:val="000000"/>
+          <w:sz w:val="24"/>
+          <w:szCs w:val="24"/>
+        </w:rPr>
+        <w:t>)</w:t>
       </w:r>
     </w:p>
     <w:p>
@@ -6133,8 +7278,36 @@
           <w:sz w:val="28"/>
           <w:szCs w:val="22"/>
         </w:rPr>
-        <w:t xml:space="preserve"> ( Array in Java Lab – 5 )</w:t>
-      </w:r>
+        <w:t xml:space="preserve"> </w:t>
+      </w:r>
+      <w:proofErr w:type="gramStart"/>
+      <w:r>
+        <w:rPr>
+          <w:rFonts w:ascii="Times New Roman" w:hAnsi="Times New Roman" w:cs="Times New Roman"/>
+          <w:sz w:val="28"/>
+          <w:szCs w:val="22"/>
+        </w:rPr>
+        <w:t>( Array</w:t>
+      </w:r>
+      <w:proofErr w:type="gramEnd"/>
+      <w:r>
+        <w:rPr>
+          <w:rFonts w:ascii="Times New Roman" w:hAnsi="Times New Roman" w:cs="Times New Roman"/>
+          <w:sz w:val="28"/>
+          <w:szCs w:val="22"/>
+        </w:rPr>
+        <w:t xml:space="preserve"> in Java Lab – </w:t>
+      </w:r>
+      <w:proofErr w:type="gramStart"/>
+      <w:r>
+        <w:rPr>
+          <w:rFonts w:ascii="Times New Roman" w:hAnsi="Times New Roman" w:cs="Times New Roman"/>
+          <w:sz w:val="28"/>
+          <w:szCs w:val="22"/>
+        </w:rPr>
+        <w:t>5 )</w:t>
+      </w:r>
+      <w:proofErr w:type="gramEnd"/>
     </w:p>
     <w:p>
       <w:pPr>
@@ -6452,7 +7625,29 @@
           <w:szCs w:val="20"/>
           <w14:ligatures w14:val="none"/>
         </w:rPr>
-        <w:t>Input: "HeLLoWorLD"</w:t>
+        <w:t>Input: "</w:t>
+      </w:r>
+      <w:proofErr w:type="spellStart"/>
+      <w:r>
+        <w:rPr>
+          <w:rFonts w:ascii="Mangal" w:eastAsia="Times New Roman" w:hAnsi="Mangal" w:cs="Mangal"/>
+          <w:kern w:val="0"/>
+          <w:sz w:val="20"/>
+          <w:szCs w:val="20"/>
+          <w14:ligatures w14:val="none"/>
+        </w:rPr>
+        <w:t>HeLLoWorLD</w:t>
+      </w:r>
+      <w:proofErr w:type="spellEnd"/>
+      <w:r>
+        <w:rPr>
+          <w:rFonts w:ascii="Mangal" w:eastAsia="Times New Roman" w:hAnsi="Mangal" w:cs="Mangal"/>
+          <w:kern w:val="0"/>
+          <w:sz w:val="20"/>
+          <w:szCs w:val="20"/>
+          <w14:ligatures w14:val="none"/>
+        </w:rPr>
+        <w:t>"</w:t>
       </w:r>
       <w:r>
         <w:rPr>
@@ -6463,8 +7658,42 @@
           <w14:ligatures w14:val="none"/>
         </w:rPr>
         <w:br/>
-        <w:t>Output: Upper = ?, Lower = ?</w:t>
-      </w:r>
+        <w:t xml:space="preserve">Output: Upper </w:t>
+      </w:r>
+      <w:proofErr w:type="gramStart"/>
+      <w:r>
+        <w:rPr>
+          <w:rFonts w:ascii="Mangal" w:eastAsia="Times New Roman" w:hAnsi="Mangal" w:cs="Mangal"/>
+          <w:kern w:val="0"/>
+          <w:sz w:val="20"/>
+          <w:szCs w:val="20"/>
+          <w14:ligatures w14:val="none"/>
+        </w:rPr>
+        <w:t>= ?</w:t>
+      </w:r>
+      <w:proofErr w:type="gramEnd"/>
+      <w:r>
+        <w:rPr>
+          <w:rFonts w:ascii="Mangal" w:eastAsia="Times New Roman" w:hAnsi="Mangal" w:cs="Mangal"/>
+          <w:kern w:val="0"/>
+          <w:sz w:val="20"/>
+          <w:szCs w:val="20"/>
+          <w14:ligatures w14:val="none"/>
+        </w:rPr>
+        <w:t xml:space="preserve">, Lower </w:t>
+      </w:r>
+      <w:proofErr w:type="gramStart"/>
+      <w:r>
+        <w:rPr>
+          <w:rFonts w:ascii="Mangal" w:eastAsia="Times New Roman" w:hAnsi="Mangal" w:cs="Mangal"/>
+          <w:kern w:val="0"/>
+          <w:sz w:val="20"/>
+          <w:szCs w:val="20"/>
+          <w14:ligatures w14:val="none"/>
+        </w:rPr>
+        <w:t>= ?</w:t>
+      </w:r>
+      <w:proofErr w:type="gramEnd"/>
     </w:p>
     <w:p>
       <w:pPr>
@@ -6530,7 +7759,29 @@
           <w14:ligatures w14:val="none"/>
         </w:rPr>
         <w:br/>
-        <w:t>Output: "IloveJava"</w:t>
+        <w:t>Output: "</w:t>
+      </w:r>
+      <w:proofErr w:type="spellStart"/>
+      <w:r>
+        <w:rPr>
+          <w:rFonts w:ascii="Mangal" w:eastAsia="Times New Roman" w:hAnsi="Mangal" w:cs="Mangal"/>
+          <w:kern w:val="0"/>
+          <w:sz w:val="20"/>
+          <w:szCs w:val="20"/>
+          <w14:ligatures w14:val="none"/>
+        </w:rPr>
+        <w:t>IloveJava</w:t>
+      </w:r>
+      <w:proofErr w:type="spellEnd"/>
+      <w:r>
+        <w:rPr>
+          <w:rFonts w:ascii="Mangal" w:eastAsia="Times New Roman" w:hAnsi="Mangal" w:cs="Mangal"/>
+          <w:kern w:val="0"/>
+          <w:sz w:val="20"/>
+          <w:szCs w:val="20"/>
+          <w14:ligatures w14:val="none"/>
+        </w:rPr>
+        <w:t>"</w:t>
       </w:r>
     </w:p>
     <w:p>
@@ -6763,7 +8014,27 @@
           <w:sz w:val="24"/>
           <w:szCs w:val="24"/>
         </w:rPr>
-        <w:t>Given an array, write a java program to right rotate it by k elements, let elements be 1,2,3,4,5,6,7,8,9,10. If k = 3, after right rotation it becomes 8, 9, 10, 1 , 2, 3, 4, 5, 6, 7.</w:t>
+        <w:t xml:space="preserve">Given an array, write a java program to right rotate it by k elements, let elements be 1,2,3,4,5,6,7,8,9,10. If k = 3, after right rotation it becomes 8, 9, 10, </w:t>
+      </w:r>
+      <w:proofErr w:type="gramStart"/>
+      <w:r>
+        <w:rPr>
+          <w:rFonts w:ascii="Verdana" w:hAnsi="Verdana"/>
+          <w:color w:val="000000"/>
+          <w:sz w:val="24"/>
+          <w:szCs w:val="24"/>
+        </w:rPr>
+        <w:t>1 ,</w:t>
+      </w:r>
+      <w:proofErr w:type="gramEnd"/>
+      <w:r>
+        <w:rPr>
+          <w:rFonts w:ascii="Verdana" w:hAnsi="Verdana"/>
+          <w:color w:val="000000"/>
+          <w:sz w:val="24"/>
+          <w:szCs w:val="24"/>
+        </w:rPr>
+        <w:t xml:space="preserve"> 2, 3, 4, 5, 6, 7.</w:t>
       </w:r>
     </w:p>
     <w:p>
@@ -6980,17 +8251,39 @@
           <w:szCs w:val="20"/>
           <w14:ligatures w14:val="none"/>
         </w:rPr>
-        <w:t>Find average</w:t>
-      </w:r>
-      <w:r>
-        <w:rPr>
-          <w:rFonts w:ascii="Mangal" w:eastAsia="Times New Roman" w:hAnsi="Mangal" w:cs="Mangal"/>
-          <w:kern w:val="0"/>
-          <w:sz w:val="20"/>
-          <w:szCs w:val="20"/>
-          <w14:ligatures w14:val="none"/>
-        </w:rPr>
-        <w:t xml:space="preserve"> , </w:t>
+        <w:t xml:space="preserve">Find </w:t>
+      </w:r>
+      <w:proofErr w:type="gramStart"/>
+      <w:r>
+        <w:rPr>
+          <w:rFonts w:ascii="Mangal" w:eastAsia="Times New Roman" w:hAnsi="Mangal" w:cs="Mangal"/>
+          <w:kern w:val="0"/>
+          <w:sz w:val="20"/>
+          <w:szCs w:val="20"/>
+          <w14:ligatures w14:val="none"/>
+        </w:rPr>
+        <w:t>average</w:t>
+      </w:r>
+      <w:r>
+        <w:rPr>
+          <w:rFonts w:ascii="Mangal" w:eastAsia="Times New Roman" w:hAnsi="Mangal" w:cs="Mangal"/>
+          <w:kern w:val="0"/>
+          <w:sz w:val="20"/>
+          <w:szCs w:val="20"/>
+          <w14:ligatures w14:val="none"/>
+        </w:rPr>
+        <w:t xml:space="preserve"> ,</w:t>
+      </w:r>
+      <w:proofErr w:type="gramEnd"/>
+      <w:r>
+        <w:rPr>
+          <w:rFonts w:ascii="Mangal" w:eastAsia="Times New Roman" w:hAnsi="Mangal" w:cs="Mangal"/>
+          <w:kern w:val="0"/>
+          <w:sz w:val="20"/>
+          <w:szCs w:val="20"/>
+          <w14:ligatures w14:val="none"/>
+        </w:rPr>
+        <w:t xml:space="preserve"> </w:t>
       </w:r>
       <w:r>
         <w:rPr>
@@ -7053,7 +8346,29 @@
           <w:szCs w:val="20"/>
           <w14:ligatures w14:val="none"/>
         </w:rPr>
-        <w:t>Input: "JaVa"</w:t>
+        <w:t>Input: "</w:t>
+      </w:r>
+      <w:proofErr w:type="spellStart"/>
+      <w:r>
+        <w:rPr>
+          <w:rFonts w:ascii="Mangal" w:eastAsia="Times New Roman" w:hAnsi="Mangal" w:cs="Mangal"/>
+          <w:kern w:val="0"/>
+          <w:sz w:val="20"/>
+          <w:szCs w:val="20"/>
+          <w14:ligatures w14:val="none"/>
+        </w:rPr>
+        <w:t>JaVa</w:t>
+      </w:r>
+      <w:proofErr w:type="spellEnd"/>
+      <w:r>
+        <w:rPr>
+          <w:rFonts w:ascii="Mangal" w:eastAsia="Times New Roman" w:hAnsi="Mangal" w:cs="Mangal"/>
+          <w:kern w:val="0"/>
+          <w:sz w:val="20"/>
+          <w:szCs w:val="20"/>
+          <w14:ligatures w14:val="none"/>
+        </w:rPr>
+        <w:t>"</w:t>
       </w:r>
       <w:r>
         <w:rPr>
@@ -7064,7 +8379,29 @@
           <w14:ligatures w14:val="none"/>
         </w:rPr>
         <w:br/>
-        <w:t>Output: "jAvA"</w:t>
+        <w:t>Output: "</w:t>
+      </w:r>
+      <w:proofErr w:type="spellStart"/>
+      <w:r>
+        <w:rPr>
+          <w:rFonts w:ascii="Mangal" w:eastAsia="Times New Roman" w:hAnsi="Mangal" w:cs="Mangal"/>
+          <w:kern w:val="0"/>
+          <w:sz w:val="20"/>
+          <w:szCs w:val="20"/>
+          <w14:ligatures w14:val="none"/>
+        </w:rPr>
+        <w:t>jAvA</w:t>
+      </w:r>
+      <w:proofErr w:type="spellEnd"/>
+      <w:r>
+        <w:rPr>
+          <w:rFonts w:ascii="Mangal" w:eastAsia="Times New Roman" w:hAnsi="Mangal" w:cs="Mangal"/>
+          <w:kern w:val="0"/>
+          <w:sz w:val="20"/>
+          <w:szCs w:val="20"/>
+          <w14:ligatures w14:val="none"/>
+        </w:rPr>
+        <w:t>"</w:t>
       </w:r>
     </w:p>
     <w:p>
@@ -7099,15 +8436,38 @@
         </w:rPr>
         <w:t xml:space="preserve">  </w:t>
       </w:r>
-      <w:r>
-        <w:rPr>
-          <w:rFonts w:ascii="Mangal" w:eastAsia="Times New Roman" w:hAnsi="Mangal" w:cs="Mangal"/>
-          <w:kern w:val="0"/>
-          <w:sz w:val="20"/>
-          <w:szCs w:val="20"/>
-          <w14:ligatures w14:val="none"/>
-        </w:rPr>
-        <w:t>Character.isUpperCase()</w:t>
+      <w:proofErr w:type="spellStart"/>
+      <w:r>
+        <w:rPr>
+          <w:rFonts w:ascii="Mangal" w:eastAsia="Times New Roman" w:hAnsi="Mangal" w:cs="Mangal"/>
+          <w:kern w:val="0"/>
+          <w:sz w:val="20"/>
+          <w:szCs w:val="20"/>
+          <w14:ligatures w14:val="none"/>
+        </w:rPr>
+        <w:t>Character.isUpperCase</w:t>
+      </w:r>
+      <w:proofErr w:type="spellEnd"/>
+      <w:r>
+        <w:rPr>
+          <w:rFonts w:ascii="Mangal" w:eastAsia="Times New Roman" w:hAnsi="Mangal" w:cs="Mangal"/>
+          <w:kern w:val="0"/>
+          <w:sz w:val="20"/>
+          <w:szCs w:val="20"/>
+          <w14:ligatures w14:val="none"/>
+        </w:rPr>
+        <w:t>(</w:t>
+      </w:r>
+      <w:proofErr w:type="gramStart"/>
+      <w:r>
+        <w:rPr>
+          <w:rFonts w:ascii="Mangal" w:eastAsia="Times New Roman" w:hAnsi="Mangal" w:cs="Mangal"/>
+          <w:kern w:val="0"/>
+          <w:sz w:val="20"/>
+          <w:szCs w:val="20"/>
+          <w14:ligatures w14:val="none"/>
+        </w:rPr>
+        <w:t>)</w:t>
       </w:r>
       <w:r>
         <w:rPr>
@@ -7119,15 +8479,39 @@
         </w:rPr>
         <w:t xml:space="preserve">,  </w:t>
       </w:r>
-      <w:r>
-        <w:rPr>
-          <w:rFonts w:ascii="Mangal" w:eastAsia="Times New Roman" w:hAnsi="Mangal" w:cs="Mangal"/>
-          <w:kern w:val="0"/>
-          <w:sz w:val="20"/>
-          <w:szCs w:val="20"/>
-          <w14:ligatures w14:val="none"/>
-        </w:rPr>
-        <w:t>toLowerCase(),</w:t>
+      <w:proofErr w:type="spellStart"/>
+      <w:r>
+        <w:rPr>
+          <w:rFonts w:ascii="Mangal" w:eastAsia="Times New Roman" w:hAnsi="Mangal" w:cs="Mangal"/>
+          <w:kern w:val="0"/>
+          <w:sz w:val="20"/>
+          <w:szCs w:val="20"/>
+          <w14:ligatures w14:val="none"/>
+        </w:rPr>
+        <w:t>toLowerCase</w:t>
+      </w:r>
+      <w:proofErr w:type="spellEnd"/>
+      <w:proofErr w:type="gramEnd"/>
+      <w:r>
+        <w:rPr>
+          <w:rFonts w:ascii="Mangal" w:eastAsia="Times New Roman" w:hAnsi="Mangal" w:cs="Mangal"/>
+          <w:kern w:val="0"/>
+          <w:sz w:val="20"/>
+          <w:szCs w:val="20"/>
+          <w14:ligatures w14:val="none"/>
+        </w:rPr>
+        <w:t>(</w:t>
+      </w:r>
+      <w:proofErr w:type="gramStart"/>
+      <w:r>
+        <w:rPr>
+          <w:rFonts w:ascii="Mangal" w:eastAsia="Times New Roman" w:hAnsi="Mangal" w:cs="Mangal"/>
+          <w:kern w:val="0"/>
+          <w:sz w:val="20"/>
+          <w:szCs w:val="20"/>
+          <w14:ligatures w14:val="none"/>
+        </w:rPr>
+        <w:t>),</w:t>
       </w:r>
       <w:r>
         <w:rPr>
@@ -7147,7 +8531,30 @@
           <w:szCs w:val="20"/>
           <w14:ligatures w14:val="none"/>
         </w:rPr>
-        <w:t xml:space="preserve"> toUpperCase()</w:t>
+        <w:t xml:space="preserve"> </w:t>
+      </w:r>
+      <w:proofErr w:type="spellStart"/>
+      <w:r>
+        <w:rPr>
+          <w:rFonts w:ascii="Mangal" w:eastAsia="Times New Roman" w:hAnsi="Mangal" w:cs="Mangal"/>
+          <w:kern w:val="0"/>
+          <w:sz w:val="20"/>
+          <w:szCs w:val="20"/>
+          <w14:ligatures w14:val="none"/>
+        </w:rPr>
+        <w:t>toUpperCase</w:t>
+      </w:r>
+      <w:proofErr w:type="spellEnd"/>
+      <w:proofErr w:type="gramEnd"/>
+      <w:r>
+        <w:rPr>
+          <w:rFonts w:ascii="Mangal" w:eastAsia="Times New Roman" w:hAnsi="Mangal" w:cs="Mangal"/>
+          <w:kern w:val="0"/>
+          <w:sz w:val="20"/>
+          <w:szCs w:val="20"/>
+          <w14:ligatures w14:val="none"/>
+        </w:rPr>
+        <w:t>()</w:t>
       </w:r>
     </w:p>
     <w:p>
@@ -7232,6 +8639,7 @@
         </w:rPr>
         <w:t xml:space="preserve"> = </w:t>
       </w:r>
+      <w:proofErr w:type="gramStart"/>
       <w:r>
         <w:rPr>
           <w:rStyle w:val="hljs-number"/>
@@ -7253,6 +8661,7 @@
         </w:rPr>
         <w:t>a</w:t>
       </w:r>
+      <w:proofErr w:type="gramEnd"/>
       <w:r>
         <w:rPr>
           <w:rStyle w:val="HTMLCode"/>
@@ -7260,6 +8669,7 @@
         </w:rPr>
         <w:t xml:space="preserve"> = </w:t>
       </w:r>
+      <w:proofErr w:type="gramStart"/>
       <w:r>
         <w:rPr>
           <w:rStyle w:val="hljs-number"/>
@@ -7281,6 +8691,7 @@
         </w:rPr>
         <w:t>n</w:t>
       </w:r>
+      <w:proofErr w:type="gramEnd"/>
       <w:r>
         <w:rPr>
           <w:rStyle w:val="HTMLCode"/>
@@ -7307,12 +8718,21 @@
       <w:r>
         <w:t xml:space="preserve">You can use:  Nested loops (manual) Or </w:t>
       </w:r>
+      <w:proofErr w:type="gramStart"/>
       <w:r>
         <w:rPr>
           <w:rStyle w:val="HTMLCode"/>
           <w:rFonts w:eastAsiaTheme="majorEastAsia"/>
         </w:rPr>
-        <w:t>int[256]</w:t>
+        <w:t>int[</w:t>
+      </w:r>
+      <w:proofErr w:type="gramEnd"/>
+      <w:r>
+        <w:rPr>
+          <w:rStyle w:val="HTMLCode"/>
+          <w:rFonts w:eastAsiaTheme="majorEastAsia"/>
+        </w:rPr>
+        <w:t>256]</w:t>
       </w:r>
       <w:r>
         <w:t xml:space="preserve"> frequency array (smart)</w:t>
@@ -7751,7 +9171,31 @@
         </w:rPr>
       </w:pPr>
       <w:r>
-        <w:t>Write a class Circle containing private variable radius of type float, suitable constructors, and two methods findArea and findCircumference to find area and circumference of circles respectively. Write a separate class MyCircle containing main method to create and use circle objects.</w:t>
+        <w:t xml:space="preserve">Write a class Circle containing private variable radius of type float, suitable constructors, and two methods </w:t>
+      </w:r>
+      <w:proofErr w:type="spellStart"/>
+      <w:r>
+        <w:t>findArea</w:t>
+      </w:r>
+      <w:proofErr w:type="spellEnd"/>
+      <w:r>
+        <w:t xml:space="preserve"> and </w:t>
+      </w:r>
+      <w:proofErr w:type="spellStart"/>
+      <w:r>
+        <w:t>findCircumference</w:t>
+      </w:r>
+      <w:proofErr w:type="spellEnd"/>
+      <w:r>
+        <w:t xml:space="preserve"> to find area and circumference of circles respectively. Write a separate class </w:t>
+      </w:r>
+      <w:proofErr w:type="spellStart"/>
+      <w:r>
+        <w:t>MyCircle</w:t>
+      </w:r>
+      <w:proofErr w:type="spellEnd"/>
+      <w:r>
+        <w:t xml:space="preserve"> containing main method to create and use circle objects.</w:t>
       </w:r>
     </w:p>
     <w:p>
@@ -7769,7 +9213,15 @@
         </w:rPr>
       </w:pPr>
       <w:r>
-        <w:t>Write a Java program to create a class student having property name, address and roll. Set default and user defined value of these property using constructors and then display values of these property.</w:t>
+        <w:t xml:space="preserve">Write a Java program to create a class student having property name, address and roll. Set default and user defined value of these property using constructors and then display values of </w:t>
+      </w:r>
+      <w:proofErr w:type="gramStart"/>
+      <w:r>
+        <w:t>these property</w:t>
+      </w:r>
+      <w:proofErr w:type="gramEnd"/>
+      <w:r>
+        <w:t>.</w:t>
       </w:r>
     </w:p>
     <w:p>
@@ -7781,7 +9233,15 @@
         </w:numPr>
       </w:pPr>
       <w:r>
-        <w:t>Write a class Box with private variables width, height and depth and methods to find volume and surface area. Use suitable constructors. Implement the class to find volume and surface area of two boxes.</w:t>
+        <w:t xml:space="preserve">Write a class </w:t>
+      </w:r>
+      <w:proofErr w:type="gramStart"/>
+      <w:r>
+        <w:t>Box</w:t>
+      </w:r>
+      <w:proofErr w:type="gramEnd"/>
+      <w:r>
+        <w:t xml:space="preserve"> with private variables width, height and depth and methods to find volume and surface area. Use suitable constructors. Implement the class to find volume and surface area of two boxes.</w:t>
       </w:r>
     </w:p>
     <w:p>
@@ -7799,7 +9259,31 @@
         </w:rPr>
       </w:pPr>
       <w:r>
-        <w:t>Write a class Distance containing private variables feet of type int and inches of type int, suitable constructors, and two methods addDistance and displayDistance for adding and displaying distance objects. Write a separate class MyDistance containing main method to create and use distance objects.</w:t>
+        <w:t xml:space="preserve">Write a class Distance containing private variables feet of type int and inches of type int, suitable constructors, and two methods </w:t>
+      </w:r>
+      <w:proofErr w:type="spellStart"/>
+      <w:r>
+        <w:t>addDistance</w:t>
+      </w:r>
+      <w:proofErr w:type="spellEnd"/>
+      <w:r>
+        <w:t xml:space="preserve"> and </w:t>
+      </w:r>
+      <w:proofErr w:type="spellStart"/>
+      <w:r>
+        <w:t>displayDistance</w:t>
+      </w:r>
+      <w:proofErr w:type="spellEnd"/>
+      <w:r>
+        <w:t xml:space="preserve"> for adding and displaying distance objects. Write a separate class </w:t>
+      </w:r>
+      <w:proofErr w:type="spellStart"/>
+      <w:r>
+        <w:t>MyDistance</w:t>
+      </w:r>
+      <w:proofErr w:type="spellEnd"/>
+      <w:r>
+        <w:t xml:space="preserve"> containing main method to create and use distance objects.</w:t>
       </w:r>
     </w:p>
     <w:p>
@@ -7817,7 +9301,23 @@
         </w:rPr>
       </w:pPr>
       <w:r>
-        <w:t>Create a Java class Time with three attributes hours, minutes, and seconds. Use appropriate constructors to initialize instance variables. Use methods to display time in HH:MM:SS format, add and subtract two time objects. Implement the class to add, subtract and display time objects.</w:t>
+        <w:t>Create a Java class Time with three attributes hours, minutes, and seconds. Use appropriate constructors to initialize instance variables. Use methods to display time in HH:</w:t>
+      </w:r>
+      <w:proofErr w:type="gramStart"/>
+      <w:r>
+        <w:t>MM:SS</w:t>
+      </w:r>
+      <w:proofErr w:type="gramEnd"/>
+      <w:r>
+        <w:t xml:space="preserve"> format, add and subtract </w:t>
+      </w:r>
+      <w:proofErr w:type="gramStart"/>
+      <w:r>
+        <w:t>two time</w:t>
+      </w:r>
+      <w:proofErr w:type="gramEnd"/>
+      <w:r>
+        <w:t xml:space="preserve"> objects. Implement the class to add, subtract and display time objects.</w:t>
       </w:r>
     </w:p>
     <w:p>
@@ -7863,7 +9363,29 @@
           <w:color w:val="000000"/>
           <w:szCs w:val="24"/>
         </w:rPr>
-        <w:t>Find Pair With Given Sum</w:t>
+        <w:t xml:space="preserve">Find Pair </w:t>
+      </w:r>
+      <w:proofErr w:type="gramStart"/>
+      <w:r>
+        <w:rPr>
+          <w:rFonts w:ascii="Verdana" w:hAnsi="Verdana"/>
+          <w:b/>
+          <w:bCs/>
+          <w:color w:val="000000"/>
+          <w:szCs w:val="24"/>
+        </w:rPr>
+        <w:t>With</w:t>
+      </w:r>
+      <w:proofErr w:type="gramEnd"/>
+      <w:r>
+        <w:rPr>
+          <w:rFonts w:ascii="Verdana" w:hAnsi="Verdana"/>
+          <w:b/>
+          <w:bCs/>
+          <w:color w:val="000000"/>
+          <w:szCs w:val="24"/>
+        </w:rPr>
+        <w:t xml:space="preserve"> Given Sum</w:t>
       </w:r>
     </w:p>
     <w:p>
@@ -7910,7 +9432,16 @@
           <w:color w:val="000000"/>
           <w:szCs w:val="24"/>
         </w:rPr>
-        <w:t>Use nested loop (basic)</w:t>
+        <w:t>Use nested loop (</w:t>
+      </w:r>
+      <w:proofErr w:type="gramStart"/>
+      <w:r>
+        <w:rPr>
+          <w:rFonts w:ascii="Verdana" w:hAnsi="Verdana"/>
+          <w:color w:val="000000"/>
+          <w:szCs w:val="24"/>
+        </w:rPr>
+        <w:t>basic)</w:t>
       </w:r>
       <w:r>
         <w:rPr>
@@ -7920,6 +9451,7 @@
         </w:rPr>
         <w:t xml:space="preserve">   </w:t>
       </w:r>
+      <w:proofErr w:type="gramEnd"/>
       <w:r>
         <w:rPr>
           <w:rFonts w:ascii="Verdana" w:hAnsi="Verdana"/>
@@ -8019,7 +9551,18 @@
           <w14:ligatures w14:val="none"/>
         </w:rPr>
         <w:br/>
-        <w:t>Output: {2,2}</w:t>
+        <w:t>Output: {2,2</w:t>
+      </w:r>
+      <w:proofErr w:type="gramStart"/>
+      <w:r>
+        <w:rPr>
+          <w:rFonts w:ascii="Mangal" w:eastAsia="Times New Roman" w:hAnsi="Mangal" w:cs="Mangal"/>
+          <w:kern w:val="0"/>
+          <w:sz w:val="20"/>
+          <w:szCs w:val="20"/>
+          <w14:ligatures w14:val="none"/>
+        </w:rPr>
+        <w:t>}</w:t>
       </w:r>
       <w:r>
         <w:rPr>
@@ -8039,7 +9582,18 @@
           <w:szCs w:val="20"/>
           <w14:ligatures w14:val="none"/>
         </w:rPr>
-        <w:t>Don’t create a new array if possible.</w:t>
+        <w:t>Don’t</w:t>
+      </w:r>
+      <w:proofErr w:type="gramEnd"/>
+      <w:r>
+        <w:rPr>
+          <w:rFonts w:ascii="Mangal" w:eastAsia="Times New Roman" w:hAnsi="Mangal" w:cs="Mangal"/>
+          <w:kern w:val="0"/>
+          <w:sz w:val="20"/>
+          <w:szCs w:val="20"/>
+          <w14:ligatures w14:val="none"/>
+        </w:rPr>
+        <w:t xml:space="preserve"> create a new array if possible.</w:t>
       </w:r>
     </w:p>
     <w:p>
@@ -8128,7 +9682,29 @@
           <w:szCs w:val="20"/>
           <w14:ligatures w14:val="none"/>
         </w:rPr>
-        <w:t>Input: "aaabbccccd"</w:t>
+        <w:t>Input: "</w:t>
+      </w:r>
+      <w:proofErr w:type="spellStart"/>
+      <w:r>
+        <w:rPr>
+          <w:rFonts w:ascii="Mangal" w:eastAsia="Times New Roman" w:hAnsi="Mangal" w:cs="Mangal"/>
+          <w:kern w:val="0"/>
+          <w:sz w:val="20"/>
+          <w:szCs w:val="20"/>
+          <w14:ligatures w14:val="none"/>
+        </w:rPr>
+        <w:t>aaabbccccd</w:t>
+      </w:r>
+      <w:proofErr w:type="spellEnd"/>
+      <w:r>
+        <w:rPr>
+          <w:rFonts w:ascii="Mangal" w:eastAsia="Times New Roman" w:hAnsi="Mangal" w:cs="Mangal"/>
+          <w:kern w:val="0"/>
+          <w:sz w:val="20"/>
+          <w:szCs w:val="20"/>
+          <w14:ligatures w14:val="none"/>
+        </w:rPr>
+        <w:t>"</w:t>
       </w:r>
       <w:r>
         <w:rPr>
@@ -8139,7 +9715,29 @@
           <w14:ligatures w14:val="none"/>
         </w:rPr>
         <w:br/>
-        <w:t>Output: 4 (because of "cccc")</w:t>
+        <w:t>Output: 4 (because of "</w:t>
+      </w:r>
+      <w:proofErr w:type="spellStart"/>
+      <w:r>
+        <w:rPr>
+          <w:rFonts w:ascii="Mangal" w:eastAsia="Times New Roman" w:hAnsi="Mangal" w:cs="Mangal"/>
+          <w:kern w:val="0"/>
+          <w:sz w:val="20"/>
+          <w:szCs w:val="20"/>
+          <w14:ligatures w14:val="none"/>
+        </w:rPr>
+        <w:t>cccc</w:t>
+      </w:r>
+      <w:proofErr w:type="spellEnd"/>
+      <w:r>
+        <w:rPr>
+          <w:rFonts w:ascii="Mangal" w:eastAsia="Times New Roman" w:hAnsi="Mangal" w:cs="Mangal"/>
+          <w:kern w:val="0"/>
+          <w:sz w:val="20"/>
+          <w:szCs w:val="20"/>
+          <w14:ligatures w14:val="none"/>
+        </w:rPr>
+        <w:t>")</w:t>
       </w:r>
     </w:p>
     <w:p>
@@ -8222,7 +9820,51 @@
           <w:szCs w:val="20"/>
           <w14:ligatures w14:val="none"/>
         </w:rPr>
-        <w:t xml:space="preserve">Input: "abcd", "cdab" </w:t>
+        <w:t>Input: "</w:t>
+      </w:r>
+      <w:proofErr w:type="spellStart"/>
+      <w:r>
+        <w:rPr>
+          <w:rFonts w:ascii="Mangal" w:eastAsia="Times New Roman" w:hAnsi="Mangal" w:cs="Mangal"/>
+          <w:kern w:val="0"/>
+          <w:sz w:val="20"/>
+          <w:szCs w:val="20"/>
+          <w14:ligatures w14:val="none"/>
+        </w:rPr>
+        <w:t>abcd</w:t>
+      </w:r>
+      <w:proofErr w:type="spellEnd"/>
+      <w:r>
+        <w:rPr>
+          <w:rFonts w:ascii="Mangal" w:eastAsia="Times New Roman" w:hAnsi="Mangal" w:cs="Mangal"/>
+          <w:kern w:val="0"/>
+          <w:sz w:val="20"/>
+          <w:szCs w:val="20"/>
+          <w14:ligatures w14:val="none"/>
+        </w:rPr>
+        <w:t>", "</w:t>
+      </w:r>
+      <w:proofErr w:type="spellStart"/>
+      <w:r>
+        <w:rPr>
+          <w:rFonts w:ascii="Mangal" w:eastAsia="Times New Roman" w:hAnsi="Mangal" w:cs="Mangal"/>
+          <w:kern w:val="0"/>
+          <w:sz w:val="20"/>
+          <w:szCs w:val="20"/>
+          <w14:ligatures w14:val="none"/>
+        </w:rPr>
+        <w:t>cdab</w:t>
+      </w:r>
+      <w:proofErr w:type="spellEnd"/>
+      <w:r>
+        <w:rPr>
+          <w:rFonts w:ascii="Mangal" w:eastAsia="Times New Roman" w:hAnsi="Mangal" w:cs="Mangal"/>
+          <w:kern w:val="0"/>
+          <w:sz w:val="20"/>
+          <w:szCs w:val="20"/>
+          <w14:ligatures w14:val="none"/>
+        </w:rPr>
+        <w:t xml:space="preserve">" </w:t>
       </w:r>
       <w:r>
         <w:rPr>
@@ -8253,7 +9895,51 @@
           <w14:ligatures w14:val="none"/>
         </w:rPr>
         <w:br/>
-        <w:t xml:space="preserve">Input: "abcd", "acbd" </w:t>
+        <w:t>Input: "</w:t>
+      </w:r>
+      <w:proofErr w:type="spellStart"/>
+      <w:r>
+        <w:rPr>
+          <w:rFonts w:ascii="Mangal" w:eastAsia="Times New Roman" w:hAnsi="Mangal" w:cs="Mangal"/>
+          <w:kern w:val="0"/>
+          <w:sz w:val="20"/>
+          <w:szCs w:val="20"/>
+          <w14:ligatures w14:val="none"/>
+        </w:rPr>
+        <w:t>abcd</w:t>
+      </w:r>
+      <w:proofErr w:type="spellEnd"/>
+      <w:r>
+        <w:rPr>
+          <w:rFonts w:ascii="Mangal" w:eastAsia="Times New Roman" w:hAnsi="Mangal" w:cs="Mangal"/>
+          <w:kern w:val="0"/>
+          <w:sz w:val="20"/>
+          <w:szCs w:val="20"/>
+          <w14:ligatures w14:val="none"/>
+        </w:rPr>
+        <w:t>", "</w:t>
+      </w:r>
+      <w:proofErr w:type="spellStart"/>
+      <w:r>
+        <w:rPr>
+          <w:rFonts w:ascii="Mangal" w:eastAsia="Times New Roman" w:hAnsi="Mangal" w:cs="Mangal"/>
+          <w:kern w:val="0"/>
+          <w:sz w:val="20"/>
+          <w:szCs w:val="20"/>
+          <w14:ligatures w14:val="none"/>
+        </w:rPr>
+        <w:t>acbd</w:t>
+      </w:r>
+      <w:proofErr w:type="spellEnd"/>
+      <w:r>
+        <w:rPr>
+          <w:rFonts w:ascii="Mangal" w:eastAsia="Times New Roman" w:hAnsi="Mangal" w:cs="Mangal"/>
+          <w:kern w:val="0"/>
+          <w:sz w:val="20"/>
+          <w:szCs w:val="20"/>
+          <w14:ligatures w14:val="none"/>
+        </w:rPr>
+        <w:t xml:space="preserve">" </w:t>
       </w:r>
       <w:r>
         <w:rPr>
@@ -8821,7 +10507,27 @@
           <w:szCs w:val="24"/>
           <w14:ligatures w14:val="none"/>
         </w:rPr>
-        <w:t>Find All Pairs With Given Sum</w:t>
+        <w:t xml:space="preserve">Find All Pairs </w:t>
+      </w:r>
+      <w:proofErr w:type="gramStart"/>
+      <w:r>
+        <w:rPr>
+          <w:rFonts w:ascii="Times New Roman" w:eastAsia="Times New Roman" w:hAnsi="Times New Roman" w:cs="Times New Roman"/>
+          <w:kern w:val="0"/>
+          <w:szCs w:val="24"/>
+          <w14:ligatures w14:val="none"/>
+        </w:rPr>
+        <w:t>With</w:t>
+      </w:r>
+      <w:proofErr w:type="gramEnd"/>
+      <w:r>
+        <w:rPr>
+          <w:rFonts w:ascii="Times New Roman" w:eastAsia="Times New Roman" w:hAnsi="Times New Roman" w:cs="Times New Roman"/>
+          <w:kern w:val="0"/>
+          <w:szCs w:val="24"/>
+          <w14:ligatures w14:val="none"/>
+        </w:rPr>
+        <w:t xml:space="preserve"> Given Sum</w:t>
       </w:r>
       <w:r>
         <w:rPr>
@@ -8927,7 +10633,29 @@
           <w:szCs w:val="24"/>
           <w14:ligatures w14:val="none"/>
         </w:rPr>
-        <w:t>Write a java program to find the majority element in an array i,e; which appears more than (n/2) times. Can use either frequency array or simple counting logic.</w:t>
+        <w:t xml:space="preserve">Write a java program to find the majority element in an array </w:t>
+      </w:r>
+      <w:proofErr w:type="spellStart"/>
+      <w:proofErr w:type="gramStart"/>
+      <w:r>
+        <w:rPr>
+          <w:rFonts w:ascii="Times New Roman" w:eastAsia="Times New Roman" w:hAnsi="Times New Roman" w:cs="Times New Roman"/>
+          <w:kern w:val="0"/>
+          <w:szCs w:val="24"/>
+          <w14:ligatures w14:val="none"/>
+        </w:rPr>
+        <w:t>i,e</w:t>
+      </w:r>
+      <w:proofErr w:type="spellEnd"/>
+      <w:proofErr w:type="gramEnd"/>
+      <w:r>
+        <w:rPr>
+          <w:rFonts w:ascii="Times New Roman" w:eastAsia="Times New Roman" w:hAnsi="Times New Roman" w:cs="Times New Roman"/>
+          <w:kern w:val="0"/>
+          <w:szCs w:val="24"/>
+          <w14:ligatures w14:val="none"/>
+        </w:rPr>
+        <w:t>; which appears more than (n/2) times. Can use either frequency array or simple counting logic.</w:t>
       </w:r>
     </w:p>
     <w:p>
@@ -9123,8 +10851,9 @@
           <w:sz w:val="22"/>
           <w:szCs w:val="22"/>
         </w:rPr>
-        <w:t xml:space="preserve"> And also count all occurrence of each unique el</w:t>
-      </w:r>
+        <w:t xml:space="preserve"> And also count all occurrence of each unique </w:t>
+      </w:r>
+      <w:proofErr w:type="gramStart"/>
       <w:r>
         <w:rPr>
           <w:rFonts w:ascii="Verdana" w:hAnsi="Verdana"/>
@@ -9132,7 +10861,7 @@
           <w:sz w:val="22"/>
           <w:szCs w:val="22"/>
         </w:rPr>
-        <w:t>e</w:t>
+        <w:t>el</w:t>
       </w:r>
       <w:r>
         <w:rPr>
@@ -9141,7 +10870,26 @@
           <w:sz w:val="22"/>
           <w:szCs w:val="22"/>
         </w:rPr>
-        <w:t>ments.</w:t>
+        <w:t>e</w:t>
+      </w:r>
+      <w:r>
+        <w:rPr>
+          <w:rFonts w:ascii="Verdana" w:hAnsi="Verdana"/>
+          <w:color w:val="000000"/>
+          <w:sz w:val="22"/>
+          <w:szCs w:val="22"/>
+        </w:rPr>
+        <w:t>ments</w:t>
+      </w:r>
+      <w:proofErr w:type="gramEnd"/>
+      <w:r>
+        <w:rPr>
+          <w:rFonts w:ascii="Verdana" w:hAnsi="Verdana"/>
+          <w:color w:val="000000"/>
+          <w:sz w:val="22"/>
+          <w:szCs w:val="22"/>
+        </w:rPr>
+        <w:t>.</w:t>
       </w:r>
     </w:p>
     <w:p>
@@ -9168,7 +10916,27 @@
           <w:sz w:val="22"/>
           <w:szCs w:val="22"/>
         </w:rPr>
-        <w:t>Write program to find the first repeating elements in an array and print it’s index to make sure.</w:t>
+        <w:t xml:space="preserve">Write program to find the first repeating elements in an array and print </w:t>
+      </w:r>
+      <w:proofErr w:type="gramStart"/>
+      <w:r>
+        <w:rPr>
+          <w:rFonts w:ascii="Verdana" w:hAnsi="Verdana"/>
+          <w:color w:val="000000"/>
+          <w:sz w:val="22"/>
+          <w:szCs w:val="22"/>
+        </w:rPr>
+        <w:t>it’s</w:t>
+      </w:r>
+      <w:proofErr w:type="gramEnd"/>
+      <w:r>
+        <w:rPr>
+          <w:rFonts w:ascii="Verdana" w:hAnsi="Verdana"/>
+          <w:color w:val="000000"/>
+          <w:sz w:val="22"/>
+          <w:szCs w:val="22"/>
+        </w:rPr>
+        <w:t xml:space="preserve"> index to make sure.</w:t>
       </w:r>
     </w:p>
     <w:p>
@@ -9198,7 +10966,33 @@
           <w:sz w:val="22"/>
           <w:szCs w:val="22"/>
         </w:rPr>
-        <w:t>Write a program to count how many pairs have difference of 2 in [ 1, 3, 5, 3, 7 ].</w:t>
+        <w:t xml:space="preserve">Write a program to count how many pairs have difference of 2 in [ 1, 3, 5, 3, </w:t>
+      </w:r>
+      <w:proofErr w:type="gramStart"/>
+      <w:r>
+        <w:rPr>
+          <w:rStyle w:val="Strong"/>
+          <w:rFonts w:ascii="Verdana" w:hAnsi="Verdana"/>
+          <w:b w:val="0"/>
+          <w:bCs w:val="0"/>
+          <w:color w:val="000000"/>
+          <w:sz w:val="22"/>
+          <w:szCs w:val="22"/>
+        </w:rPr>
+        <w:t>7 ]</w:t>
+      </w:r>
+      <w:proofErr w:type="gramEnd"/>
+      <w:r>
+        <w:rPr>
+          <w:rStyle w:val="Strong"/>
+          <w:rFonts w:ascii="Verdana" w:hAnsi="Verdana"/>
+          <w:b w:val="0"/>
+          <w:bCs w:val="0"/>
+          <w:color w:val="000000"/>
+          <w:sz w:val="22"/>
+          <w:szCs w:val="22"/>
+        </w:rPr>
+        <w:t>.</w:t>
       </w:r>
     </w:p>
     <w:p>
@@ -9377,7 +11171,27 @@
           <w:sz w:val="28"/>
           <w:szCs w:val="28"/>
         </w:rPr>
-        <w:t xml:space="preserve">Count Strings Starting and Ending With Same Character. </w:t>
+        <w:t xml:space="preserve">Count Strings Starting and Ending </w:t>
+      </w:r>
+      <w:proofErr w:type="gramStart"/>
+      <w:r>
+        <w:rPr>
+          <w:rStyle w:val="Strong"/>
+          <w:rFonts w:ascii="Times New Roman" w:eastAsiaTheme="majorEastAsia" w:hAnsi="Times New Roman" w:cs="Times New Roman"/>
+          <w:sz w:val="28"/>
+          <w:szCs w:val="28"/>
+        </w:rPr>
+        <w:t>With</w:t>
+      </w:r>
+      <w:proofErr w:type="gramEnd"/>
+      <w:r>
+        <w:rPr>
+          <w:rStyle w:val="Strong"/>
+          <w:rFonts w:ascii="Times New Roman" w:eastAsiaTheme="majorEastAsia" w:hAnsi="Times New Roman" w:cs="Times New Roman"/>
+          <w:sz w:val="28"/>
+          <w:szCs w:val="28"/>
+        </w:rPr>
+        <w:t xml:space="preserve"> Same Character. </w:t>
       </w:r>
       <w:r>
         <w:rPr>
@@ -9394,16 +11208,9 @@
           <w:sz w:val="28"/>
           <w:szCs w:val="28"/>
         </w:rPr>
-        <w:t>{"abc", "aaa", "kite", "pop"}</w:t>
-      </w:r>
-      <w:r>
-        <w:rPr>
-          <w:rFonts w:ascii="Times New Roman" w:hAnsi="Times New Roman" w:cs="Times New Roman"/>
-          <w:sz w:val="28"/>
-          <w:szCs w:val="28"/>
-        </w:rPr>
-        <w:t xml:space="preserve"> → Output: </w:t>
-      </w:r>
+        <w:t>{"</w:t>
+      </w:r>
+      <w:proofErr w:type="spellStart"/>
       <w:r>
         <w:rPr>
           <w:rStyle w:val="HTMLCode"/>
@@ -9411,16 +11218,9 @@
           <w:sz w:val="28"/>
           <w:szCs w:val="28"/>
         </w:rPr>
-        <w:t>2</w:t>
-      </w:r>
-      <w:r>
-        <w:rPr>
-          <w:rFonts w:ascii="Times New Roman" w:hAnsi="Times New Roman" w:cs="Times New Roman"/>
-          <w:sz w:val="28"/>
-          <w:szCs w:val="28"/>
-        </w:rPr>
-        <w:t xml:space="preserve"> (</w:t>
-      </w:r>
+        <w:t>abc</w:t>
+      </w:r>
+      <w:proofErr w:type="spellEnd"/>
       <w:r>
         <w:rPr>
           <w:rStyle w:val="HTMLCode"/>
@@ -9428,8 +11228,64 @@
           <w:sz w:val="28"/>
           <w:szCs w:val="28"/>
         </w:rPr>
+        <w:t>", "</w:t>
+      </w:r>
+      <w:proofErr w:type="spellStart"/>
+      <w:r>
+        <w:rPr>
+          <w:rStyle w:val="HTMLCode"/>
+          <w:rFonts w:ascii="Times New Roman" w:eastAsiaTheme="majorEastAsia" w:hAnsi="Times New Roman" w:cs="Times New Roman"/>
+          <w:sz w:val="28"/>
+          <w:szCs w:val="28"/>
+        </w:rPr>
         <w:t>aaa</w:t>
       </w:r>
+      <w:proofErr w:type="spellEnd"/>
+      <w:r>
+        <w:rPr>
+          <w:rStyle w:val="HTMLCode"/>
+          <w:rFonts w:ascii="Times New Roman" w:eastAsiaTheme="majorEastAsia" w:hAnsi="Times New Roman" w:cs="Times New Roman"/>
+          <w:sz w:val="28"/>
+          <w:szCs w:val="28"/>
+        </w:rPr>
+        <w:t>", "kite", "pop"}</w:t>
+      </w:r>
+      <w:r>
+        <w:rPr>
+          <w:rFonts w:ascii="Times New Roman" w:hAnsi="Times New Roman" w:cs="Times New Roman"/>
+          <w:sz w:val="28"/>
+          <w:szCs w:val="28"/>
+        </w:rPr>
+        <w:t xml:space="preserve"> → Output: </w:t>
+      </w:r>
+      <w:r>
+        <w:rPr>
+          <w:rStyle w:val="HTMLCode"/>
+          <w:rFonts w:ascii="Times New Roman" w:eastAsiaTheme="majorEastAsia" w:hAnsi="Times New Roman" w:cs="Times New Roman"/>
+          <w:sz w:val="28"/>
+          <w:szCs w:val="28"/>
+        </w:rPr>
+        <w:t>2</w:t>
+      </w:r>
+      <w:r>
+        <w:rPr>
+          <w:rFonts w:ascii="Times New Roman" w:hAnsi="Times New Roman" w:cs="Times New Roman"/>
+          <w:sz w:val="28"/>
+          <w:szCs w:val="28"/>
+        </w:rPr>
+        <w:t xml:space="preserve"> (</w:t>
+      </w:r>
+      <w:proofErr w:type="spellStart"/>
+      <w:r>
+        <w:rPr>
+          <w:rStyle w:val="HTMLCode"/>
+          <w:rFonts w:ascii="Times New Roman" w:eastAsiaTheme="majorEastAsia" w:hAnsi="Times New Roman" w:cs="Times New Roman"/>
+          <w:sz w:val="28"/>
+          <w:szCs w:val="28"/>
+        </w:rPr>
+        <w:t>aaa</w:t>
+      </w:r>
+      <w:proofErr w:type="spellEnd"/>
       <w:r>
         <w:rPr>
           <w:rFonts w:ascii="Times New Roman" w:hAnsi="Times New Roman" w:cs="Times New Roman"/>
@@ -9564,7 +11420,25 @@
           <w:sz w:val="28"/>
           <w:szCs w:val="22"/>
         </w:rPr>
-        <w:t>Input: "aaabbc"</w:t>
+        <w:t>Input: "</w:t>
+      </w:r>
+      <w:proofErr w:type="spellStart"/>
+      <w:r>
+        <w:rPr>
+          <w:rFonts w:ascii="Times New Roman" w:hAnsi="Times New Roman" w:cs="Times New Roman"/>
+          <w:sz w:val="28"/>
+          <w:szCs w:val="22"/>
+        </w:rPr>
+        <w:t>aaabbc</w:t>
+      </w:r>
+      <w:proofErr w:type="spellEnd"/>
+      <w:r>
+        <w:rPr>
+          <w:rFonts w:ascii="Times New Roman" w:hAnsi="Times New Roman" w:cs="Times New Roman"/>
+          <w:sz w:val="28"/>
+          <w:szCs w:val="22"/>
+        </w:rPr>
+        <w:t>"</w:t>
       </w:r>
       <w:r>
         <w:rPr>
@@ -9618,7 +11492,25 @@
           <w:sz w:val="28"/>
           <w:szCs w:val="22"/>
         </w:rPr>
-        <w:t>Input: "abcde" → true</w:t>
+        <w:t>Input: "</w:t>
+      </w:r>
+      <w:proofErr w:type="spellStart"/>
+      <w:r>
+        <w:rPr>
+          <w:rFonts w:ascii="Times New Roman" w:hAnsi="Times New Roman" w:cs="Times New Roman"/>
+          <w:sz w:val="28"/>
+          <w:szCs w:val="22"/>
+        </w:rPr>
+        <w:t>abcde</w:t>
+      </w:r>
+      <w:proofErr w:type="spellEnd"/>
+      <w:r>
+        <w:rPr>
+          <w:rFonts w:ascii="Times New Roman" w:hAnsi="Times New Roman" w:cs="Times New Roman"/>
+          <w:sz w:val="28"/>
+          <w:szCs w:val="22"/>
+        </w:rPr>
+        <w:t>" → true</w:t>
       </w:r>
       <w:r>
         <w:rPr>
@@ -9896,8 +11788,9 @@
           <w:szCs w:val="28"/>
           <w14:ligatures w14:val="none"/>
         </w:rPr>
-        <w:t>Input: {−2,1,−3,4,−1,2,1,−5,4}</w:t>
-      </w:r>
+        <w:t>Input: {−2,</w:t>
+      </w:r>
+      <w:proofErr w:type="gramStart"/>
       <w:r>
         <w:rPr>
           <w:rFonts w:ascii="Times New Roman" w:eastAsia="Times New Roman" w:hAnsi="Times New Roman" w:cs="Times New Roman"/>
@@ -9906,8 +11799,95 @@
           <w:szCs w:val="28"/>
           <w14:ligatures w14:val="none"/>
         </w:rPr>
+        <w:t>1,−</w:t>
+      </w:r>
+      <w:proofErr w:type="gramEnd"/>
+      <w:r>
+        <w:rPr>
+          <w:rFonts w:ascii="Times New Roman" w:eastAsia="Times New Roman" w:hAnsi="Times New Roman" w:cs="Times New Roman"/>
+          <w:kern w:val="0"/>
+          <w:sz w:val="28"/>
+          <w:szCs w:val="28"/>
+          <w14:ligatures w14:val="none"/>
+        </w:rPr>
+        <w:t>3,</w:t>
+      </w:r>
+      <w:proofErr w:type="gramStart"/>
+      <w:r>
+        <w:rPr>
+          <w:rFonts w:ascii="Times New Roman" w:eastAsia="Times New Roman" w:hAnsi="Times New Roman" w:cs="Times New Roman"/>
+          <w:kern w:val="0"/>
+          <w:sz w:val="28"/>
+          <w:szCs w:val="28"/>
+          <w14:ligatures w14:val="none"/>
+        </w:rPr>
+        <w:t>4,−</w:t>
+      </w:r>
+      <w:proofErr w:type="gramEnd"/>
+      <w:r>
+        <w:rPr>
+          <w:rFonts w:ascii="Times New Roman" w:eastAsia="Times New Roman" w:hAnsi="Times New Roman" w:cs="Times New Roman"/>
+          <w:kern w:val="0"/>
+          <w:sz w:val="28"/>
+          <w:szCs w:val="28"/>
+          <w14:ligatures w14:val="none"/>
+        </w:rPr>
+        <w:t>1,2,</w:t>
+      </w:r>
+      <w:proofErr w:type="gramStart"/>
+      <w:r>
+        <w:rPr>
+          <w:rFonts w:ascii="Times New Roman" w:eastAsia="Times New Roman" w:hAnsi="Times New Roman" w:cs="Times New Roman"/>
+          <w:kern w:val="0"/>
+          <w:sz w:val="28"/>
+          <w:szCs w:val="28"/>
+          <w14:ligatures w14:val="none"/>
+        </w:rPr>
+        <w:t>1,−</w:t>
+      </w:r>
+      <w:proofErr w:type="gramEnd"/>
+      <w:r>
+        <w:rPr>
+          <w:rFonts w:ascii="Times New Roman" w:eastAsia="Times New Roman" w:hAnsi="Times New Roman" w:cs="Times New Roman"/>
+          <w:kern w:val="0"/>
+          <w:sz w:val="28"/>
+          <w:szCs w:val="28"/>
+          <w14:ligatures w14:val="none"/>
+        </w:rPr>
+        <w:t>5,4}</w:t>
+      </w:r>
+      <w:r>
+        <w:rPr>
+          <w:rFonts w:ascii="Times New Roman" w:eastAsia="Times New Roman" w:hAnsi="Times New Roman" w:cs="Times New Roman"/>
+          <w:kern w:val="0"/>
+          <w:sz w:val="28"/>
+          <w:szCs w:val="28"/>
+          <w14:ligatures w14:val="none"/>
+        </w:rPr>
         <w:br/>
-        <w:t>Output: 6 (because subarray {4,−1,2,1})</w:t>
+        <w:t>Output: 6 (because subarray {</w:t>
+      </w:r>
+      <w:proofErr w:type="gramStart"/>
+      <w:r>
+        <w:rPr>
+          <w:rFonts w:ascii="Times New Roman" w:eastAsia="Times New Roman" w:hAnsi="Times New Roman" w:cs="Times New Roman"/>
+          <w:kern w:val="0"/>
+          <w:sz w:val="28"/>
+          <w:szCs w:val="28"/>
+          <w14:ligatures w14:val="none"/>
+        </w:rPr>
+        <w:t>4,−</w:t>
+      </w:r>
+      <w:proofErr w:type="gramEnd"/>
+      <w:r>
+        <w:rPr>
+          <w:rFonts w:ascii="Times New Roman" w:eastAsia="Times New Roman" w:hAnsi="Times New Roman" w:cs="Times New Roman"/>
+          <w:kern w:val="0"/>
+          <w:sz w:val="28"/>
+          <w:szCs w:val="28"/>
+          <w14:ligatures w14:val="none"/>
+        </w:rPr>
+        <w:t>1,2,1})</w:t>
       </w:r>
     </w:p>
     <w:p>
@@ -10045,7 +12025,25 @@
           <w:sz w:val="28"/>
           <w:szCs w:val="28"/>
         </w:rPr>
-        <w:t>Output: Sum[1 to 3] = 2+3+4 = 9</w:t>
+        <w:t xml:space="preserve">Output: </w:t>
+      </w:r>
+      <w:proofErr w:type="gramStart"/>
+      <w:r>
+        <w:rPr>
+          <w:rFonts w:ascii="Times New Roman" w:hAnsi="Times New Roman" w:cs="Times New Roman"/>
+          <w:sz w:val="28"/>
+          <w:szCs w:val="28"/>
+        </w:rPr>
+        <w:t>Sum[</w:t>
+      </w:r>
+      <w:proofErr w:type="gramEnd"/>
+      <w:r>
+        <w:rPr>
+          <w:rFonts w:ascii="Times New Roman" w:hAnsi="Times New Roman" w:cs="Times New Roman"/>
+          <w:sz w:val="28"/>
+          <w:szCs w:val="28"/>
+        </w:rPr>
+        <w:t>1 to 3] = 2+3+4 = 9</w:t>
       </w:r>
     </w:p>
     <w:p>
@@ -10151,7 +12149,25 @@
           <w:sz w:val="28"/>
           <w:szCs w:val="28"/>
         </w:rPr>
-        <w:t>Input: arr = {1, 4, 20, 3, 10, 5}, K = 33</w:t>
+        <w:t xml:space="preserve">Input: </w:t>
+      </w:r>
+      <w:proofErr w:type="spellStart"/>
+      <w:r>
+        <w:rPr>
+          <w:rFonts w:ascii="Times New Roman" w:hAnsi="Times New Roman" w:cs="Times New Roman"/>
+          <w:sz w:val="28"/>
+          <w:szCs w:val="28"/>
+        </w:rPr>
+        <w:t>arr</w:t>
+      </w:r>
+      <w:proofErr w:type="spellEnd"/>
+      <w:r>
+        <w:rPr>
+          <w:rFonts w:ascii="Times New Roman" w:hAnsi="Times New Roman" w:cs="Times New Roman"/>
+          <w:sz w:val="28"/>
+          <w:szCs w:val="28"/>
+        </w:rPr>
+        <w:t xml:space="preserve"> = {1, 4, 20, 3, 10, 5}, K = 33</w:t>
       </w:r>
     </w:p>
     <w:p>
@@ -10191,7 +12207,25 @@
           <w:sz w:val="28"/>
           <w:szCs w:val="28"/>
         </w:rPr>
-        <w:t xml:space="preserve"> Input: arr = {1, 4, 20, 3, 10, 5}, K = 18</w:t>
+        <w:t xml:space="preserve"> Input: </w:t>
+      </w:r>
+      <w:proofErr w:type="spellStart"/>
+      <w:r>
+        <w:rPr>
+          <w:rFonts w:ascii="Times New Roman" w:hAnsi="Times New Roman" w:cs="Times New Roman"/>
+          <w:sz w:val="28"/>
+          <w:szCs w:val="28"/>
+        </w:rPr>
+        <w:t>arr</w:t>
+      </w:r>
+      <w:proofErr w:type="spellEnd"/>
+      <w:r>
+        <w:rPr>
+          <w:rFonts w:ascii="Times New Roman" w:hAnsi="Times New Roman" w:cs="Times New Roman"/>
+          <w:sz w:val="28"/>
+          <w:szCs w:val="28"/>
+        </w:rPr>
+        <w:t xml:space="preserve"> = {1, 4, 20, 3, 10, 5}, K = 18</w:t>
       </w:r>
     </w:p>
     <w:p>
@@ -10421,7 +12455,25 @@
           <w:sz w:val="28"/>
           <w:szCs w:val="28"/>
         </w:rPr>
-        <w:t>Count Subarrays With Sum = K</w:t>
+        <w:t xml:space="preserve">Count Subarrays </w:t>
+      </w:r>
+      <w:proofErr w:type="gramStart"/>
+      <w:r>
+        <w:rPr>
+          <w:rFonts w:ascii="Times New Roman" w:hAnsi="Times New Roman" w:cs="Times New Roman"/>
+          <w:sz w:val="28"/>
+          <w:szCs w:val="28"/>
+        </w:rPr>
+        <w:t>With</w:t>
+      </w:r>
+      <w:proofErr w:type="gramEnd"/>
+      <w:r>
+        <w:rPr>
+          <w:rFonts w:ascii="Times New Roman" w:hAnsi="Times New Roman" w:cs="Times New Roman"/>
+          <w:sz w:val="28"/>
+          <w:szCs w:val="28"/>
+        </w:rPr>
+        <w:t xml:space="preserve"> Sum = K</w:t>
       </w:r>
     </w:p>
     <w:p>
@@ -10534,6 +12586,7 @@
         </w:rPr>
         <w:t xml:space="preserve"> </w:t>
       </w:r>
+      <w:proofErr w:type="gramStart"/>
       <w:r>
         <w:rPr>
           <w:rFonts w:ascii="Times New Roman" w:hAnsi="Times New Roman" w:cs="Times New Roman"/>
@@ -10561,7 +12614,18 @@
           <w:sz w:val="28"/>
           <w:szCs w:val="28"/>
         </w:rPr>
-        <w:t>Calculate prefix sum and suffix sum of an array</w:t>
+        <w:t>Calculate</w:t>
+      </w:r>
+      <w:proofErr w:type="gramEnd"/>
+      <w:r>
+        <w:rPr>
+          <w:rFonts w:ascii="Times New Roman" w:hAnsi="Times New Roman" w:cs="Times New Roman"/>
+          <w:b/>
+          <w:bCs/>
+          <w:sz w:val="28"/>
+          <w:szCs w:val="28"/>
+        </w:rPr>
+        <w:t xml:space="preserve"> prefix sum and suffix sum of an array</w:t>
       </w:r>
       <w:r>
         <w:rPr>
@@ -10659,10 +12723,386 @@
           <w:szCs w:val="22"/>
         </w:rPr>
       </w:pPr>
+      <w:r>
+        <w:rPr>
+          <w:rFonts w:ascii="Times New Roman" w:hAnsi="Times New Roman" w:cs="Times New Roman"/>
+          <w:sz w:val="28"/>
+          <w:szCs w:val="22"/>
+        </w:rPr>
+        <w:t>Print all substrings of string.</w:t>
+      </w:r>
     </w:p>
     <w:p>
       <w:pPr>
         <w:pStyle w:val="ListParagraph"/>
+        <w:numPr>
+          <w:ilvl w:val="0"/>
+          <w:numId w:val="45"/>
+        </w:numPr>
+        <w:spacing w:before="100" w:beforeAutospacing="1" w:after="100" w:afterAutospacing="1" w:line="240" w:lineRule="auto"/>
+        <w:outlineLvl w:val="1"/>
+        <w:rPr>
+          <w:rFonts w:ascii="Times New Roman" w:eastAsia="Times New Roman" w:hAnsi="Times New Roman" w:cs="Times New Roman"/>
+          <w:kern w:val="0"/>
+          <w:sz w:val="28"/>
+          <w:szCs w:val="28"/>
+          <w14:ligatures w14:val="none"/>
+        </w:rPr>
+      </w:pPr>
+      <w:r>
+        <w:rPr>
+          <w:rFonts w:ascii="Times New Roman" w:eastAsia="Times New Roman" w:hAnsi="Times New Roman" w:cs="Times New Roman"/>
+          <w:kern w:val="0"/>
+          <w:sz w:val="28"/>
+          <w:szCs w:val="28"/>
+          <w14:ligatures w14:val="none"/>
+        </w:rPr>
+        <w:t>Longest Substring Without Repeating Characters (Basic Version)</w:t>
+      </w:r>
+    </w:p>
+    <w:p>
+      <w:pPr>
+        <w:pStyle w:val="ListParagraph"/>
+        <w:spacing w:before="100" w:beforeAutospacing="1" w:after="100" w:afterAutospacing="1" w:line="240" w:lineRule="auto"/>
+        <w:rPr>
+          <w:rFonts w:ascii="Times New Roman" w:eastAsia="Times New Roman" w:hAnsi="Times New Roman" w:cs="Times New Roman"/>
+          <w:kern w:val="0"/>
+          <w:sz w:val="20"/>
+          <w:szCs w:val="20"/>
+          <w14:ligatures w14:val="none"/>
+        </w:rPr>
+      </w:pPr>
+      <w:r>
+        <w:rPr>
+          <w:rFonts w:ascii="Times New Roman" w:eastAsia="Times New Roman" w:hAnsi="Times New Roman" w:cs="Times New Roman"/>
+          <w:kern w:val="0"/>
+          <w:sz w:val="20"/>
+          <w:szCs w:val="20"/>
+          <w14:ligatures w14:val="none"/>
+        </w:rPr>
+        <w:t>Input: "</w:t>
+      </w:r>
+      <w:proofErr w:type="spellStart"/>
+      <w:r>
+        <w:rPr>
+          <w:rFonts w:ascii="Times New Roman" w:eastAsia="Times New Roman" w:hAnsi="Times New Roman" w:cs="Times New Roman"/>
+          <w:kern w:val="0"/>
+          <w:sz w:val="20"/>
+          <w:szCs w:val="20"/>
+          <w14:ligatures w14:val="none"/>
+        </w:rPr>
+        <w:t>abcabcbb</w:t>
+      </w:r>
+      <w:proofErr w:type="spellEnd"/>
+      <w:r>
+        <w:rPr>
+          <w:rFonts w:ascii="Times New Roman" w:eastAsia="Times New Roman" w:hAnsi="Times New Roman" w:cs="Times New Roman"/>
+          <w:kern w:val="0"/>
+          <w:sz w:val="20"/>
+          <w:szCs w:val="20"/>
+          <w14:ligatures w14:val="none"/>
+        </w:rPr>
+        <w:t>"</w:t>
+      </w:r>
+      <w:r>
+        <w:rPr>
+          <w:rFonts w:ascii="Times New Roman" w:eastAsia="Times New Roman" w:hAnsi="Times New Roman" w:cs="Times New Roman"/>
+          <w:kern w:val="0"/>
+          <w:sz w:val="20"/>
+          <w:szCs w:val="20"/>
+          <w14:ligatures w14:val="none"/>
+        </w:rPr>
+        <w:br/>
+        <w:t>Output: 3 ("</w:t>
+      </w:r>
+      <w:proofErr w:type="spellStart"/>
+      <w:r>
+        <w:rPr>
+          <w:rFonts w:ascii="Times New Roman" w:eastAsia="Times New Roman" w:hAnsi="Times New Roman" w:cs="Times New Roman"/>
+          <w:kern w:val="0"/>
+          <w:sz w:val="20"/>
+          <w:szCs w:val="20"/>
+          <w14:ligatures w14:val="none"/>
+        </w:rPr>
+        <w:t>abc</w:t>
+      </w:r>
+      <w:proofErr w:type="spellEnd"/>
+      <w:r>
+        <w:rPr>
+          <w:rFonts w:ascii="Times New Roman" w:eastAsia="Times New Roman" w:hAnsi="Times New Roman" w:cs="Times New Roman"/>
+          <w:kern w:val="0"/>
+          <w:sz w:val="20"/>
+          <w:szCs w:val="20"/>
+          <w14:ligatures w14:val="none"/>
+        </w:rPr>
+        <w:t>")</w:t>
+      </w:r>
+    </w:p>
+    <w:p>
+      <w:pPr>
+        <w:pStyle w:val="ListParagraph"/>
+        <w:numPr>
+          <w:ilvl w:val="0"/>
+          <w:numId w:val="45"/>
+        </w:numPr>
+        <w:spacing w:before="100" w:beforeAutospacing="1" w:after="100" w:afterAutospacing="1" w:line="240" w:lineRule="auto"/>
+        <w:outlineLvl w:val="1"/>
+        <w:rPr>
+          <w:rFonts w:ascii="Times New Roman" w:eastAsia="Times New Roman" w:hAnsi="Times New Roman" w:cs="Times New Roman"/>
+          <w:kern w:val="0"/>
+          <w:sz w:val="28"/>
+          <w:szCs w:val="28"/>
+          <w14:ligatures w14:val="none"/>
+        </w:rPr>
+      </w:pPr>
+      <w:r>
+        <w:rPr>
+          <w:rFonts w:ascii="Times New Roman" w:eastAsia="Times New Roman" w:hAnsi="Times New Roman" w:cs="Times New Roman"/>
+          <w:kern w:val="0"/>
+          <w:sz w:val="28"/>
+          <w:szCs w:val="28"/>
+          <w14:ligatures w14:val="none"/>
+        </w:rPr>
+        <w:t xml:space="preserve">Check If One String Is Substring of Another (Without </w:t>
+      </w:r>
+      <w:proofErr w:type="gramStart"/>
+      <w:r>
+        <w:rPr>
+          <w:rFonts w:ascii="Times New Roman" w:eastAsia="Times New Roman" w:hAnsi="Times New Roman" w:cs="Times New Roman"/>
+          <w:kern w:val="0"/>
+          <w:sz w:val="28"/>
+          <w:szCs w:val="28"/>
+          <w14:ligatures w14:val="none"/>
+        </w:rPr>
+        <w:t>contains(</w:t>
+      </w:r>
+      <w:proofErr w:type="gramEnd"/>
+      <w:r>
+        <w:rPr>
+          <w:rFonts w:ascii="Times New Roman" w:eastAsia="Times New Roman" w:hAnsi="Times New Roman" w:cs="Times New Roman"/>
+          <w:kern w:val="0"/>
+          <w:sz w:val="28"/>
+          <w:szCs w:val="28"/>
+          <w14:ligatures w14:val="none"/>
+        </w:rPr>
+        <w:t>))</w:t>
+      </w:r>
+    </w:p>
+    <w:p>
+      <w:pPr>
+        <w:pStyle w:val="ListParagraph"/>
+        <w:spacing w:before="100" w:beforeAutospacing="1" w:after="100" w:afterAutospacing="1" w:line="240" w:lineRule="auto"/>
+        <w:rPr>
+          <w:rFonts w:ascii="Mangal" w:eastAsia="Times New Roman" w:hAnsi="Mangal" w:cs="Mangal"/>
+          <w:kern w:val="0"/>
+          <w:sz w:val="20"/>
+          <w:szCs w:val="20"/>
+          <w14:ligatures w14:val="none"/>
+        </w:rPr>
+      </w:pPr>
+      <w:r>
+        <w:rPr>
+          <w:rFonts w:ascii="Mangal" w:eastAsia="Times New Roman" w:hAnsi="Mangal" w:cs="Mangal"/>
+          <w:kern w:val="0"/>
+          <w:sz w:val="20"/>
+          <w:szCs w:val="20"/>
+          <w14:ligatures w14:val="none"/>
+        </w:rPr>
+        <w:t xml:space="preserve">Input: "hello", "ell" </w:t>
+      </w:r>
+      <w:r>
+        <w:rPr>
+          <w:rFonts w:ascii="Times New Roman" w:eastAsia="Times New Roman" w:hAnsi="Times New Roman" w:cs="Times New Roman"/>
+          <w:kern w:val="0"/>
+          <w:sz w:val="20"/>
+          <w:szCs w:val="20"/>
+          <w14:ligatures w14:val="none"/>
+        </w:rPr>
+        <w:t>→</w:t>
+      </w:r>
+      <w:r>
+        <w:rPr>
+          <w:rFonts w:ascii="Mangal" w:eastAsia="Times New Roman" w:hAnsi="Mangal" w:cs="Mangal"/>
+          <w:kern w:val="0"/>
+          <w:sz w:val="20"/>
+          <w:szCs w:val="20"/>
+          <w14:ligatures w14:val="none"/>
+        </w:rPr>
+        <w:t xml:space="preserve"> true</w:t>
+      </w:r>
+    </w:p>
+    <w:p>
+      <w:pPr>
+        <w:pStyle w:val="ListParagraph"/>
+        <w:numPr>
+          <w:ilvl w:val="0"/>
+          <w:numId w:val="45"/>
+        </w:numPr>
+        <w:spacing w:before="100" w:beforeAutospacing="1" w:after="100" w:afterAutospacing="1" w:line="240" w:lineRule="auto"/>
+        <w:outlineLvl w:val="1"/>
+        <w:rPr>
+          <w:rFonts w:ascii="Times New Roman" w:eastAsia="Times New Roman" w:hAnsi="Times New Roman" w:cs="Times New Roman"/>
+          <w:kern w:val="0"/>
+          <w:sz w:val="28"/>
+          <w:szCs w:val="28"/>
+          <w14:ligatures w14:val="none"/>
+        </w:rPr>
+      </w:pPr>
+      <w:r>
+        <w:rPr>
+          <w:rFonts w:ascii="Times New Roman" w:eastAsia="Times New Roman" w:hAnsi="Times New Roman" w:cs="Times New Roman"/>
+          <w:kern w:val="0"/>
+          <w:sz w:val="28"/>
+          <w:szCs w:val="28"/>
+          <w14:ligatures w14:val="none"/>
+        </w:rPr>
+        <w:t>Spiral Print 2D Matrix (Intro Level)</w:t>
+      </w:r>
+    </w:p>
+    <w:p>
+      <w:pPr>
+        <w:pStyle w:val="ListParagraph"/>
+        <w:spacing w:before="100" w:beforeAutospacing="1" w:after="100" w:afterAutospacing="1" w:line="240" w:lineRule="auto"/>
+        <w:rPr>
+          <w:rFonts w:ascii="Mangal" w:eastAsia="Times New Roman" w:hAnsi="Mangal" w:cs="Mangal"/>
+          <w:kern w:val="0"/>
+          <w:sz w:val="20"/>
+          <w:szCs w:val="20"/>
+          <w14:ligatures w14:val="none"/>
+        </w:rPr>
+      </w:pPr>
+      <w:r>
+        <w:rPr>
+          <w:rFonts w:ascii="Mangal" w:eastAsia="Times New Roman" w:hAnsi="Mangal" w:cs="Mangal"/>
+          <w:kern w:val="0"/>
+          <w:sz w:val="20"/>
+          <w:szCs w:val="20"/>
+          <w14:ligatures w14:val="none"/>
+        </w:rPr>
+        <w:t>Input:</w:t>
+      </w:r>
+    </w:p>
+    <w:p>
+      <w:pPr>
+        <w:pStyle w:val="ListParagraph"/>
+        <w:tabs>
+          <w:tab w:val="left" w:pos="916"/>
+          <w:tab w:val="left" w:pos="1832"/>
+          <w:tab w:val="left" w:pos="2748"/>
+          <w:tab w:val="left" w:pos="3664"/>
+          <w:tab w:val="left" w:pos="4580"/>
+          <w:tab w:val="left" w:pos="5496"/>
+          <w:tab w:val="left" w:pos="6412"/>
+          <w:tab w:val="left" w:pos="7328"/>
+          <w:tab w:val="left" w:pos="8244"/>
+          <w:tab w:val="left" w:pos="9160"/>
+          <w:tab w:val="left" w:pos="10076"/>
+          <w:tab w:val="left" w:pos="10992"/>
+          <w:tab w:val="left" w:pos="11908"/>
+          <w:tab w:val="left" w:pos="12824"/>
+          <w:tab w:val="left" w:pos="13740"/>
+          <w:tab w:val="left" w:pos="14656"/>
+        </w:tabs>
+        <w:spacing w:after="0" w:line="240" w:lineRule="auto"/>
+        <w:rPr>
+          <w:rFonts w:ascii="Mangal" w:eastAsia="Times New Roman" w:hAnsi="Mangal" w:cs="Mangal"/>
+          <w:kern w:val="0"/>
+          <w:sz w:val="20"/>
+          <w:szCs w:val="20"/>
+          <w14:ligatures w14:val="none"/>
+        </w:rPr>
+      </w:pPr>
+      <w:r>
+        <w:rPr>
+          <w:rFonts w:ascii="Mangal" w:eastAsia="Times New Roman" w:hAnsi="Mangal" w:cs="Mangal"/>
+          <w:kern w:val="0"/>
+          <w:sz w:val="20"/>
+          <w:szCs w:val="20"/>
+          <w14:ligatures w14:val="none"/>
+        </w:rPr>
+        <w:t>1 2 3</w:t>
+      </w:r>
+      <w:r>
+        <w:rPr>
+          <w:rFonts w:ascii="Mangal" w:eastAsia="Times New Roman" w:hAnsi="Mangal" w:cs="Mangal"/>
+          <w:kern w:val="0"/>
+          <w:sz w:val="20"/>
+          <w:szCs w:val="20"/>
+          <w14:ligatures w14:val="none"/>
+        </w:rPr>
+        <w:br/>
+        <w:t>4 5 6</w:t>
+      </w:r>
+      <w:r>
+        <w:rPr>
+          <w:rFonts w:ascii="Mangal" w:eastAsia="Times New Roman" w:hAnsi="Mangal" w:cs="Mangal"/>
+          <w:kern w:val="0"/>
+          <w:sz w:val="20"/>
+          <w:szCs w:val="20"/>
+          <w14:ligatures w14:val="none"/>
+        </w:rPr>
+        <w:br/>
+        <w:t>7 8 9</w:t>
+      </w:r>
+    </w:p>
+    <w:p>
+      <w:pPr>
+        <w:pStyle w:val="ListParagraph"/>
+        <w:tabs>
+          <w:tab w:val="left" w:pos="916"/>
+          <w:tab w:val="left" w:pos="1832"/>
+          <w:tab w:val="left" w:pos="2748"/>
+          <w:tab w:val="left" w:pos="3664"/>
+          <w:tab w:val="left" w:pos="4580"/>
+          <w:tab w:val="left" w:pos="5496"/>
+          <w:tab w:val="left" w:pos="6412"/>
+          <w:tab w:val="left" w:pos="7328"/>
+          <w:tab w:val="left" w:pos="8244"/>
+          <w:tab w:val="left" w:pos="9160"/>
+          <w:tab w:val="left" w:pos="10076"/>
+          <w:tab w:val="left" w:pos="10992"/>
+          <w:tab w:val="left" w:pos="11908"/>
+          <w:tab w:val="left" w:pos="12824"/>
+          <w:tab w:val="left" w:pos="13740"/>
+          <w:tab w:val="left" w:pos="14656"/>
+        </w:tabs>
+        <w:spacing w:after="0" w:line="240" w:lineRule="auto"/>
+        <w:rPr>
+          <w:rFonts w:ascii="Mangal" w:eastAsia="Times New Roman" w:hAnsi="Mangal" w:cs="Mangal"/>
+          <w:kern w:val="0"/>
+          <w:sz w:val="20"/>
+          <w:szCs w:val="20"/>
+          <w14:ligatures w14:val="none"/>
+        </w:rPr>
+      </w:pPr>
+      <w:r>
+        <w:rPr>
+          <w:rFonts w:ascii="Mangal" w:eastAsia="Times New Roman" w:hAnsi="Mangal" w:cs="Mangal"/>
+          <w:kern w:val="0"/>
+          <w:sz w:val="20"/>
+          <w:szCs w:val="20"/>
+          <w14:ligatures w14:val="none"/>
+        </w:rPr>
+        <w:t xml:space="preserve">Output: </w:t>
+      </w:r>
+      <w:r>
+        <w:rPr>
+          <w:rFonts w:ascii="Mangal" w:eastAsia="Times New Roman" w:hAnsi="Mangal" w:cs="Mangal"/>
+          <w:kern w:val="0"/>
+          <w:sz w:val="20"/>
+          <w:szCs w:val="20"/>
+          <w14:ligatures w14:val="none"/>
+        </w:rPr>
+        <w:t>1 2 3 6 9 8 7 4 5</w:t>
+      </w:r>
+    </w:p>
+    <w:p>
+      <w:pPr>
+        <w:pStyle w:val="ListParagraph"/>
+        <w:numPr>
+          <w:ilvl w:val="0"/>
+          <w:numId w:val="45"/>
+        </w:numPr>
         <w:rPr>
           <w:rFonts w:ascii="Times New Roman" w:hAnsi="Times New Roman" w:cs="Times New Roman"/>
           <w:sz w:val="28"/>
@@ -10672,10 +13112,28 @@
     </w:p>
     <w:p>
       <w:pPr>
+        <w:pStyle w:val="ListParagraph"/>
+        <w:rPr>
+          <w:rFonts w:ascii="Times New Roman" w:hAnsi="Times New Roman" w:cs="Times New Roman"/>
+          <w:sz w:val="28"/>
+          <w:szCs w:val="22"/>
+        </w:rPr>
+      </w:pPr>
+    </w:p>
+    <w:p>
+      <w:pPr>
         <w:pStyle w:val="IntenseQuote"/>
       </w:pPr>
       <w:r>
-        <w:t>Questions Day3.1 (Leetcode Array Basic)</w:t>
+        <w:t>Questions Day3.1 (</w:t>
+      </w:r>
+      <w:proofErr w:type="spellStart"/>
+      <w:r>
+        <w:t>Leetcode</w:t>
+      </w:r>
+      <w:proofErr w:type="spellEnd"/>
+      <w:r>
+        <w:t xml:space="preserve"> Array Basic)</w:t>
       </w:r>
     </w:p>
     <w:p>
@@ -15912,7 +18370,6 @@
   <w:style w:type="character" w:default="1" w:styleId="DefaultParagraphFont">
     <w:name w:val="Default Paragraph Font"/>
     <w:uiPriority w:val="1"/>
-    <w:semiHidden/>
     <w:unhideWhenUsed/>
   </w:style>
   <w:style w:type="table" w:default="1" w:styleId="TableNormal">

</xml_diff>

<commit_message>
RotateArrayLeftbyKPositions completed using extra array
</commit_message>
<xml_diff>
--- a/Questions.docx
+++ b/Questions.docx
@@ -13103,6 +13103,87 @@
           <w:ilvl w:val="0"/>
           <w:numId w:val="45"/>
         </w:numPr>
+        <w:spacing w:before="100" w:beforeAutospacing="1" w:after="100" w:afterAutospacing="1" w:line="240" w:lineRule="auto"/>
+        <w:outlineLvl w:val="1"/>
+        <w:rPr>
+          <w:rFonts w:ascii="Times New Roman" w:eastAsia="Times New Roman" w:hAnsi="Times New Roman" w:cs="Times New Roman"/>
+          <w:kern w:val="0"/>
+          <w:sz w:val="28"/>
+          <w:szCs w:val="28"/>
+          <w14:ligatures w14:val="none"/>
+        </w:rPr>
+      </w:pPr>
+      <w:r>
+        <w:rPr>
+          <w:rFonts w:ascii="Times New Roman" w:eastAsia="Times New Roman" w:hAnsi="Times New Roman" w:cs="Times New Roman"/>
+          <w:kern w:val="0"/>
+          <w:sz w:val="28"/>
+          <w:szCs w:val="28"/>
+          <w14:ligatures w14:val="none"/>
+        </w:rPr>
+        <w:t>Rotate Array Left by K Positions</w:t>
+      </w:r>
+    </w:p>
+    <w:p>
+      <w:pPr>
+        <w:pStyle w:val="ListParagraph"/>
+        <w:spacing w:before="100" w:beforeAutospacing="1" w:after="100" w:afterAutospacing="1" w:line="240" w:lineRule="auto"/>
+        <w:rPr>
+          <w:rFonts w:ascii="Mangal" w:eastAsia="Times New Roman" w:hAnsi="Mangal" w:cs="Mangal"/>
+          <w:kern w:val="0"/>
+          <w:sz w:val="20"/>
+          <w:szCs w:val="20"/>
+          <w14:ligatures w14:val="none"/>
+        </w:rPr>
+      </w:pPr>
+      <w:r>
+        <w:rPr>
+          <w:rFonts w:ascii="Mangal" w:eastAsia="Times New Roman" w:hAnsi="Mangal" w:cs="Mangal"/>
+          <w:kern w:val="0"/>
+          <w:sz w:val="20"/>
+          <w:szCs w:val="20"/>
+          <w14:ligatures w14:val="none"/>
+        </w:rPr>
+        <w:t>Input: {1,2,3,4,5}, K = 2</w:t>
+      </w:r>
+      <w:r>
+        <w:rPr>
+          <w:rFonts w:ascii="Mangal" w:eastAsia="Times New Roman" w:hAnsi="Mangal" w:cs="Mangal"/>
+          <w:kern w:val="0"/>
+          <w:sz w:val="20"/>
+          <w:szCs w:val="20"/>
+          <w14:ligatures w14:val="none"/>
+        </w:rPr>
+        <w:br/>
+        <w:t>Output: {3,4,5,1,2}</w:t>
+      </w:r>
+    </w:p>
+    <w:p>
+      <w:pPr>
+        <w:pStyle w:val="ListParagraph"/>
+        <w:spacing w:before="100" w:beforeAutospacing="1" w:after="100" w:afterAutospacing="1" w:line="240" w:lineRule="auto"/>
+        <w:rPr>
+          <w:rFonts w:ascii="Mangal" w:eastAsia="Times New Roman" w:hAnsi="Mangal" w:cs="Mangal"/>
+          <w:kern w:val="0"/>
+          <w:sz w:val="20"/>
+          <w:szCs w:val="20"/>
+          <w14:ligatures w14:val="none"/>
+        </w:rPr>
+      </w:pPr>
+      <w:r>
+        <w:rPr>
+          <w:rFonts w:ascii="Mangal" w:eastAsia="Times New Roman" w:hAnsi="Mangal" w:cs="Mangal"/>
+          <w:kern w:val="0"/>
+          <w:sz w:val="20"/>
+          <w:szCs w:val="20"/>
+          <w14:ligatures w14:val="none"/>
+        </w:rPr>
+        <w:t>Can use extra array OR in-place logic.</w:t>
+      </w:r>
+    </w:p>
+    <w:p>
+      <w:pPr>
+        <w:pStyle w:val="ListParagraph"/>
         <w:rPr>
           <w:rFonts w:ascii="Times New Roman" w:hAnsi="Times New Roman" w:cs="Times New Roman"/>
           <w:sz w:val="28"/>
@@ -18370,6 +18451,7 @@
   <w:style w:type="character" w:default="1" w:styleId="DefaultParagraphFont">
     <w:name w:val="Default Paragraph Font"/>
     <w:uiPriority w:val="1"/>
+    <w:semiHidden/>
     <w:unhideWhenUsed/>
   </w:style>
   <w:style w:type="table" w:default="1" w:styleId="TableNormal">

</xml_diff>